<commit_message>
RFAs: Definition/Instructions review updates
</commit_message>
<xml_diff>
--- a/Filings/RequestForAdmission/FirstSet/Plaintiffs_First_Set_of_Requests_for_Admission_to_FIE.docx
+++ b/Filings/RequestForAdmission/FirstSet/Plaintiffs_First_Set_of_Requests_for_Admission_to_FIE.docx
@@ -230,7 +230,7 @@
         <w:t xml:space="preserve">"Defendant," "Farmers," "FIE," "You," and "Your" </w:t>
       </w:r>
       <w:r>
-        <w:t xml:space="preserve">mean Fire Insurance Exchange, its attorney-in-fact Fire Underwriters Association (and, to the extent it acted as attorney-in-fact in connection with The Policy, Farmers Underwriters Association), and each of their present and former agents, adjusters, employees, representatives, attorneys, third-party administrators, and any other person acting on their behalf.</w:t>
+        <w:t xml:space="preserve">mean Fire Insurance Exchange, its attorney-in-fact Fire Underwriters Association (and, to the extent it acted as attorney-in-fact in connection with The Policy, Farmers Underwriters Association), and their employees, adjusters, and agents, acting in connection with The Policy, The Claim, or The 2020 Claim.</w:t>
       </w:r>
     </w:p>
     <w:p>
@@ -278,7 +278,7 @@
         <w:t xml:space="preserve">"The Claim" </w:t>
       </w:r>
       <w:r>
-        <w:t xml:space="preserve">means Farmers claim number 7007986837-1-1, arising from the July 13, 2024 hail loss.</w:t>
+        <w:t xml:space="preserve">means Farmers claim number 7007986837-1-1, date of loss July 13, 2024.</w:t>
       </w:r>
     </w:p>
     <w:p>
@@ -403,10 +403,10 @@
           <w:b/>
           <w:bCs/>
         </w:rPr>
-        <w:t xml:space="preserve">"The September 3, 2024 Letter Package" </w:t>
-      </w:r>
-      <w:r>
-        <w:t xml:space="preserve">means Your September 3, 2024 letter to Plaintiffs together with its "Coverage Outcome – Policy Provisions" attachment and the photograph log enclosed with it, as You re-transmitted the same to Plaintiffs on October 10, 2025.</w:t>
+        <w:t xml:space="preserve">"The September 3, 2024 Denial Package" </w:t>
+      </w:r>
+      <w:r>
+        <w:t xml:space="preserve">means the 74-page PDF document dated September 3, 2024 that Plaintiffs received from You, consisting of Your September 3, 2024 letter to Plaintiffs (pages 1–2), a two-page document titled "Coverage Outcome – Policy Provisions" (pages 3–4; a different document from The Coverage Outcome Attachment), a one-page Hancock Claims Consultants roof diagram (page 5), and the two photograph logs defined below (pages 6–74).</w:t>
       </w:r>
     </w:p>
     <w:p>
@@ -422,7 +422,7 @@
         <w:t xml:space="preserve">"The First Photo Set" </w:t>
       </w:r>
       <w:r>
-        <w:t xml:space="preserve">means the 19-page photograph log enclosed with The September 3, 2024 Letter Package, bearing the page-footer date August 30, 2024 and containing photographs numbered 1 through 38.</w:t>
+        <w:t xml:space="preserve">means the 19-page photograph log at pages 6 through 24 of The September 3, 2024 Denial Package, bearing the page-footer date 8/30/2024 and containing photographs numbered 1 through 38.</w:t>
       </w:r>
     </w:p>
     <w:p>
@@ -438,7 +438,7 @@
         <w:t xml:space="preserve">"The Second Photo Set" </w:t>
       </w:r>
       <w:r>
-        <w:t xml:space="preserve">means the 50-page photograph log enclosed with The September 3, 2024 Letter Package, bearing the page-footer date August 31, 2024 and containing photographs numbered 1 through 100.</w:t>
+        <w:t xml:space="preserve">means the 50-page photograph log at pages 25 through 74 of The September 3, 2024 Denial Package, bearing the page-footer date 8/31/2024 and containing photographs numbered 1 through 100.</w:t>
       </w:r>
     </w:p>
     <w:p>
@@ -470,7 +470,7 @@
         <w:t xml:space="preserve">"The Appraisal Award" </w:t>
       </w:r>
       <w:r>
-        <w:t xml:space="preserve">means the appraisal award entered September 12, 2025 under Minn. Stat. § 65A.01.</w:t>
+        <w:t xml:space="preserve">means the written appraisal award concerning The Claim dated on or about September 12, 2025.</w:t>
       </w:r>
     </w:p>
     <w:p>
@@ -486,7 +486,7 @@
         <w:t xml:space="preserve">"Document" and "Documents" </w:t>
       </w:r>
       <w:r>
-        <w:t xml:space="preserve">have the broadest meaning permitted by Minn. R. Civ. P. 34.01 and include all writings, photographs, recordings, images, and electronically stored information stored in any medium, together with all metadata and non-identical drafts and copies.</w:t>
+        <w:t xml:space="preserve">mean any writing, photograph, note, or electronically stored record, including any entry in Your electronic claim file.</w:t>
       </w:r>
     </w:p>
     <w:p>
@@ -607,7 +607,7 @@
         <w:t xml:space="preserve">Effect of non-response. </w:t>
       </w:r>
       <w:r>
-        <w:t xml:space="preserve">Pursuant to Minn. R. Civ. P. 36.01, any matter not timely answered or objected to is deemed admitted, and any matter admitted is conclusively established for purposes of this action under Minn. R. Civ. P. 36.02. If the Court determines that an answer does not comply with the requirements of Minn. R. Civ. P. 36.01, it may order either that the matter is admitted or that an amended answer be served. Minn. R. Civ. P. 36.01.</w:t>
+        <w:t xml:space="preserve">Pursuant to Minn. R. Civ. P. 36.01, any matter not timely answered or objected to is deemed admitted, and any matter admitted is conclusively established for purposes of this action unless the Court on motion permits withdrawal or amendment of the admission. Minn. R. Civ. P. 36.02. If the Court determines that an answer does not comply with the requirements of Minn. R. Civ. P. 36.01, it may order either that the matter is admitted or that an amended answer be served. Minn. R. Civ. P. 36.01.</w:t>
       </w:r>
     </w:p>
     <w:p>
@@ -637,7 +637,7 @@
         <w:t xml:space="preserve">Continuing duty. </w:t>
       </w:r>
       <w:r>
-        <w:t xml:space="preserve">If Defendant later learns that an answer was incorrect or incomplete, it must seasonably amend or supplement the answer pursuant to Minn. R. Civ. P. 26.05.</w:t>
+        <w:t xml:space="preserve">Defendant must supplement or correct its responses as required by Minn. R. Civ. P. 26.05(a). A matter admitted, however, is conclusively established and may be withdrawn or amended only by order of the Court on motion under Minn. R. Civ. P. 36.02.</w:t>
       </w:r>
     </w:p>
     <w:p>
@@ -727,7 +727,7 @@
         <w:t xml:space="preserve">Cost of an unfounded denial. </w:t>
       </w:r>
       <w:r>
-        <w:t xml:space="preserve">If Defendant fails to admit any matter requested herein and Plaintiffs thereafter prove the truth of that matter, Plaintiffs will apply to the Court for an order requiring Defendant to pay the reasonable expenses incurred in making that proof, including reasonable attorney fees, pursuant to Minn. R. Civ. P. 37.03(b).</w:t>
+        <w:t xml:space="preserve">If Defendant fails to admit any matter requested herein and Plaintiffs thereafter prove the truth of that matter, Plaintiffs will apply to the Court for an order requiring Defendant to pay the reasonable expenses incurred in making that proof, including any reasonable attorney fees, pursuant to Minn. R. Civ. P. 37.03(b).</w:t>
       </w:r>
     </w:p>
     <w:p>
@@ -757,7 +757,7 @@
         <w:t xml:space="preserve">No attachments. </w:t>
       </w:r>
       <w:r>
-        <w:t xml:space="preserve">No document is attached to or served with this set. Each request refers to a term defined above, to a document or record in Defendant's own possession, custody, or control, or to the publicly available National Weather Service web page identified by its address in Request No. 60.</w:t>
+        <w:t xml:space="preserve">No document is attached to or served with this set. Each request refers to a term defined above, to a document or record in Defendant's own possession, custody, or control, or to the publicly available National Weather Service web page identified by its address in Request No. 60. Plaintiffs will provide a copy of any document referred to in these requests promptly upon Defendant's request.</w:t>
       </w:r>
     </w:p>
     <w:p>
@@ -787,7 +787,7 @@
         <w:t xml:space="preserve">Answering on behalf of others. </w:t>
       </w:r>
       <w:r>
-        <w:t xml:space="preserve">If Defendant does not answer on behalf of every person within the definition of "You," it must state which persons it has excluded, and identify, as to each answer affected, the person who has the information withheld on that basis. Where a request asks which person or entity performed an act, made a decision, or sent a communication, Defendant must identify the specific legal entity by name; attributing the act to "Farmers," "Defendant," or the Exchange collectively is not a complete answer.</w:t>
+        <w:t xml:space="preserve">If Defendant answers any request on behalf of fewer than all persons within the definition of "You," it must say so in that answer and state which persons are excluded.</w:t>
       </w:r>
     </w:p>
     <w:p>
@@ -3787,7 +3787,7 @@
         <w:t xml:space="preserve">REQUEST FOR ADMISSION NO. 152:  </w:t>
       </w:r>
       <w:r>
-        <w:t xml:space="preserve">Admit that The September 3, 2024 Letter Package enclosed The First Photo Set and The Second Photo Set.</w:t>
+        <w:t xml:space="preserve">Admit that You sent The September 3, 2024 Denial Package to Plaintiffs on or about September 3, 2024.</w:t>
       </w:r>
     </w:p>
     <w:p>

</xml_diff>

<commit_message>
Add o new RFA: **REQUEST FOR ADMISSION NO. 173:** Admit that, in its dealings with Plaintiffs concerning The Policy and The Claim, Fire Insurance Exchange did business under the name "Farmers Insurance."
</commit_message>
<xml_diff>
--- a/Filings/RequestForAdmission/FirstSet/Plaintiffs_First_Set_of_Requests_for_Admission_to_FIE.docx
+++ b/Filings/RequestForAdmission/FirstSet/Plaintiffs_First_Set_of_Requests_for_Admission_to_FIE.docx
@@ -4192,6 +4192,23 @@
         <w:t xml:space="preserve">REQUEST FOR ADMISSION NO. 173:  </w:t>
       </w:r>
       <w:r>
+        <w:t xml:space="preserve">Admit that, in its dealings with Plaintiffs concerning The Policy and The Claim, Fire Insurance Exchange did business under the name "Farmers Insurance."</w:t>
+      </w:r>
+    </w:p>
+    <w:p>
+      <w:pPr>
+        <w:keepLines/>
+        <w:spacing w:after="160"/>
+        <w:ind w:left="720" w:hanging="576"/>
+      </w:pPr>
+      <w:r>
+        <w:rPr>
+          <w:b/>
+          <w:bCs/>
+        </w:rPr>
+        <w:t xml:space="preserve">REQUEST FOR ADMISSION NO. 174:  </w:t>
+      </w:r>
+      <w:r>
         <w:t xml:space="preserve">Admit that Zorphlon Miller was employed or engaged by Fire Insurance Exchange on October 10, 2025.</w:t>
       </w:r>
     </w:p>
@@ -4206,7 +4223,7 @@
           <w:b/>
           <w:bCs/>
         </w:rPr>
-        <w:t xml:space="preserve">REQUEST FOR ADMISSION NO. 174:  </w:t>
+        <w:t xml:space="preserve">REQUEST FOR ADMISSION NO. 175:  </w:t>
       </w:r>
       <w:r>
         <w:t xml:space="preserve">Admit that Peter Pietila acted as Your agent in connection with The Policy.</w:t>
@@ -4223,7 +4240,7 @@
           <w:b/>
           <w:bCs/>
         </w:rPr>
-        <w:t xml:space="preserve">REQUEST FOR ADMISSION NO. 175:  </w:t>
+        <w:t xml:space="preserve">REQUEST FOR ADMISSION NO. 176:  </w:t>
       </w:r>
       <w:r>
         <w:t xml:space="preserve">Admit that Jayden Grimm performed the August 29, 2024 inspection of The Property on behalf of Hancock Claims Consultants.</w:t>
@@ -4240,7 +4257,7 @@
           <w:b/>
           <w:bCs/>
         </w:rPr>
-        <w:t xml:space="preserve">REQUEST FOR ADMISSION NO. 176:  </w:t>
+        <w:t xml:space="preserve">REQUEST FOR ADMISSION NO. 177:  </w:t>
       </w:r>
       <w:r>
         <w:t xml:space="preserve">Admit that Jayden Grimm was the only person who inspected The Property on behalf of Hancock Claims Consultants on August 29, 2024.</w:t>
@@ -4288,7 +4305,7 @@
           <w:b/>
           <w:bCs/>
         </w:rPr>
-        <w:t xml:space="preserve">REQUEST FOR ADMISSION NO. 177:  </w:t>
+        <w:t xml:space="preserve">REQUEST FOR ADMISSION NO. 178:  </w:t>
       </w:r>
       <w:r>
         <w:t xml:space="preserve">Admit that The Policy Form, at "General Conditions Applying to The Entire Policy," provision 15 ("Reciprocal provisions"), states: "We may sue or be sued in our own name, as though we were an individual, if necessary to enforce any claims which arise under this policy."</w:t>
@@ -4305,7 +4322,7 @@
           <w:b/>
           <w:bCs/>
         </w:rPr>
-        <w:t xml:space="preserve">REQUEST FOR ADMISSION NO. 178:  </w:t>
+        <w:t xml:space="preserve">REQUEST FOR ADMISSION NO. 179:  </w:t>
       </w:r>
       <w:r>
         <w:t xml:space="preserve">Admit that The Policy Form, at "General Conditions Applying to The Entire Policy," provision 15 ("Reciprocal provisions"), states: "In any suit against us, service of process shall be upon the Attorney-in-Fact as shown in your Subscription Agreement."</w:t>
@@ -4322,7 +4339,7 @@
           <w:b/>
           <w:bCs/>
         </w:rPr>
-        <w:t xml:space="preserve">REQUEST FOR ADMISSION NO. 179:  </w:t>
+        <w:t xml:space="preserve">REQUEST FOR ADMISSION NO. 180:  </w:t>
       </w:r>
       <w:r>
         <w:t xml:space="preserve">Admit that The Policy Form, at "General Conditions Applying to The Entire Policy," provision 11 ("What law will apply"), states: "The laws of the state where the residence premises is located shall govern any and all claims or disputes in any way related to this policy."</w:t>
@@ -4339,7 +4356,7 @@
           <w:b/>
           <w:bCs/>
         </w:rPr>
-        <w:t xml:space="preserve">REQUEST FOR ADMISSION NO. 180:  </w:t>
+        <w:t xml:space="preserve">REQUEST FOR ADMISSION NO. 181:  </w:t>
       </w:r>
       <w:r>
         <w:t xml:space="preserve">Admit that the text of The Policy Form in force on July 13, 2024 is identical to the text of Form 56-5543 2nd Edition (7-08) included in the "Home Insurance New Policy" documents for The Policy that You sent to Plaintiff Yibiao Lu under a cover letter dated December 8, 2014.</w:t>
@@ -4356,7 +4373,7 @@
           <w:b/>
           <w:bCs/>
         </w:rPr>
-        <w:t xml:space="preserve">REQUEST FOR ADMISSION NO. 181:  </w:t>
+        <w:t xml:space="preserve">REQUEST FOR ADMISSION NO. 182:  </w:t>
       </w:r>
       <w:r>
         <w:t xml:space="preserve">Admit that Fire Insurance Exchange was licensed by the Minnesota Department of Commerce to transact insurance business in Minnesota on July 13, 2024.</w:t>
@@ -4373,7 +4390,7 @@
           <w:b/>
           <w:bCs/>
         </w:rPr>
-        <w:t xml:space="preserve">REQUEST FOR ADMISSION NO. 182:  </w:t>
+        <w:t xml:space="preserve">REQUEST FOR ADMISSION NO. 183:  </w:t>
       </w:r>
       <w:r>
         <w:t xml:space="preserve">Admit that the Application for Insurance and Subscription Agreement executed by Plaintiff Yibiao Lu on October 21, 2014 in connection with The Policy designates Farmers Underwriters Association as attorney-in-fact.</w:t>
@@ -4390,7 +4407,7 @@
           <w:b/>
           <w:bCs/>
         </w:rPr>
-        <w:t xml:space="preserve">REQUEST FOR ADMISSION NO. 183:  </w:t>
+        <w:t xml:space="preserve">REQUEST FOR ADMISSION NO. 184:  </w:t>
       </w:r>
       <w:r>
         <w:t xml:space="preserve">Admit that the "Subscription Agreement Notice" included in Your renewal documents for The Policy for the policy period October 22, 2023 to October 22, 2024 designates Fire Underwriters Association as attorney-in-fact.</w:t>
@@ -4438,7 +4455,7 @@
           <w:b/>
           <w:bCs/>
         </w:rPr>
-        <w:t xml:space="preserve">REQUEST FOR ADMISSION NO. 184:  </w:t>
+        <w:t xml:space="preserve">REQUEST FOR ADMISSION NO. 185:  </w:t>
       </w:r>
       <w:r>
         <w:t xml:space="preserve">Admit that service of the Summons and Complaint in this action upon Fire Insurance Exchange under Minn. Stat. § 45.028 was effective no later than July 8, 2026.</w:t>
@@ -4455,7 +4472,7 @@
           <w:b/>
           <w:bCs/>
         </w:rPr>
-        <w:t xml:space="preserve">REQUEST FOR ADMISSION NO. 185:  </w:t>
+        <w:t xml:space="preserve">REQUEST FOR ADMISSION NO. 186:  </w:t>
       </w:r>
       <w:r>
         <w:t xml:space="preserve">Admit that You do not contend that service of the Summons and Complaint upon Fire Insurance Exchange was insufficient.</w:t>
@@ -4472,7 +4489,7 @@
           <w:b/>
           <w:bCs/>
         </w:rPr>
-        <w:t xml:space="preserve">REQUEST FOR ADMISSION NO. 186:  </w:t>
+        <w:t xml:space="preserve">REQUEST FOR ADMISSION NO. 187:  </w:t>
       </w:r>
       <w:r>
         <w:t xml:space="preserve">Admit that You do not contend that this Court lacks personal jurisdiction over Fire Insurance Exchange.</w:t>
@@ -4520,7 +4537,7 @@
           <w:b/>
           <w:bCs/>
         </w:rPr>
-        <w:t xml:space="preserve">REQUEST FOR ADMISSION NO. 187:  </w:t>
+        <w:t xml:space="preserve">REQUEST FOR ADMISSION NO. 188:  </w:t>
       </w:r>
       <w:r>
         <w:t xml:space="preserve">Admit that The Policy Form, under "Definitions," states: "Throughout this policy, 'you' and 'your' mean the 'named insured' shown in the Declarations or renewal notice and your spouse or registered domestic partner under applicable state law if a resident of the same household with you."</w:t>
@@ -4537,7 +4554,7 @@
           <w:b/>
           <w:bCs/>
         </w:rPr>
-        <w:t xml:space="preserve">REQUEST FOR ADMISSION NO. 188:  </w:t>
+        <w:t xml:space="preserve">REQUEST FOR ADMISSION NO. 189:  </w:t>
       </w:r>
       <w:r>
         <w:t xml:space="preserve">Admit that on July 13, 2024, Jie Hu was the spouse of Yibiao Lu.</w:t>
@@ -4554,7 +4571,7 @@
           <w:b/>
           <w:bCs/>
         </w:rPr>
-        <w:t xml:space="preserve">REQUEST FOR ADMISSION NO. 189:  </w:t>
+        <w:t xml:space="preserve">REQUEST FOR ADMISSION NO. 190:  </w:t>
       </w:r>
       <w:r>
         <w:t xml:space="preserve">Admit that on July 13, 2024, Jie Hu resided at The Property in the same household as Yibiao Lu.</w:t>
@@ -4571,7 +4588,7 @@
           <w:b/>
           <w:bCs/>
         </w:rPr>
-        <w:t xml:space="preserve">REQUEST FOR ADMISSION NO. 190:  </w:t>
+        <w:t xml:space="preserve">REQUEST FOR ADMISSION NO. 191:  </w:t>
       </w:r>
       <w:r>
         <w:t xml:space="preserve">Admit that Jie Hu is an insured under The Policy with respect to The Claim.</w:t>
@@ -4588,7 +4605,7 @@
           <w:b/>
           <w:bCs/>
         </w:rPr>
-        <w:t xml:space="preserve">REQUEST FOR ADMISSION NO. 191:  </w:t>
+        <w:t xml:space="preserve">REQUEST FOR ADMISSION NO. 192:  </w:t>
       </w:r>
       <w:r>
         <w:t xml:space="preserve">Admit that You do not contend that Jie Hu lacks standing to assert a claim under The Policy arising from The Claim.</w:t>
@@ -4605,7 +4622,7 @@
           <w:b/>
           <w:bCs/>
         </w:rPr>
-        <w:t xml:space="preserve">REQUEST FOR ADMISSION NO. 192:  </w:t>
+        <w:t xml:space="preserve">REQUEST FOR ADMISSION NO. 193:  </w:t>
       </w:r>
       <w:r>
         <w:t xml:space="preserve">Admit that You do not contend that Jie Hu is not a proper party plaintiff in this action.</w:t>
@@ -4613,6 +4630,7 @@
     </w:p>
     <w:p>
       <w:pPr>
+        <w:keepNext/>
         <w:spacing w:after="160" w:line="276" w:lineRule="auto"/>
       </w:pPr>
       <w:r>
@@ -4681,6 +4699,7 @@
     </w:p>
     <w:p>
       <w:pPr>
+        <w:keepNext/>
         <w:spacing w:before="120"/>
       </w:pPr>
       <w:r>

</xml_diff>

<commit_message>
the new "Person" definition; the No. 177 wording; the No. 172 rewrite; the companion request, which would renumber; the optional misnomer request, which would also renumber.
</commit_message>
<xml_diff>
--- a/Filings/RequestForAdmission/FirstSet/Plaintiffs_First_Set_of_Requests_for_Admission_to_FIE.docx
+++ b/Filings/RequestForAdmission/FirstSet/Plaintiffs_First_Set_of_Requests_for_Admission_to_FIE.docx
@@ -191,7 +191,7 @@
         <w:t xml:space="preserve">TO: </w:t>
       </w:r>
       <w:r>
-        <w:t>Defendant Fire Insurance Exchange, by and through its attorney-in-fact Fire Underwriters Association, and its attorneys of record.</w:t>
+        <w:t xml:space="preserve">Defendant Fire Insurance Exchange, by and through its attorney-in-fact Fire Underwriters Association, and its attorneys of record.</w:t>
       </w:r>
     </w:p>
     <w:p>
@@ -199,7 +199,7 @@
         <w:spacing w:after="160" w:line="276" w:lineRule="auto"/>
       </w:pPr>
       <w:r>
-        <w:t>PLEASE TAKE NOTICE that, pursuant to Rules 26 and 36 of the Minnesota Rules of Civil Procedure, Plaintiffs Yibiao Lu and Jie Hu request that Defendant admit, for purposes of this action only, the truth of each of the following matters within thirty (30) days after service. Each matter is admitted unless, within that period, Defendant serves a written answer or objection addressed to the matter, signed by the party or its attorney, as required by Minn. R. Civ. P. 36.01.</w:t>
+        <w:t xml:space="preserve">PLEASE TAKE NOTICE that, pursuant to Rules 26 and 36 of the Minnesota Rules of Civil Procedure, Plaintiffs Yibiao Lu and Jie Hu request that Defendant admit, for purposes of this action only, the truth of each of the following matters within thirty (30) days after service. Each matter is admitted unless, within that period, Defendant serves a written answer or objection addressed to the matter, signed by the party or its attorney, as required by Minn. R. Civ. P. 36.01.</w:t>
       </w:r>
     </w:p>
     <w:p>
@@ -230,7 +230,7 @@
         <w:t xml:space="preserve">"Defendant," "Farmers," "FIE," "You," and "Your" </w:t>
       </w:r>
       <w:r>
-        <w:t>mean Fire Insurance Exchange, its attorney-in-fact Fire Underwriters Association (and, to the extent it acted as attorney-in-fact in connection with The Policy, Farmers Underwriters Association), and their employees, adjusters, and agents, acting in connection with The Policy, The Claim, or The 2020 Claim.</w:t>
+        <w:t xml:space="preserve">mean Fire Insurance Exchange, its attorney-in-fact Fire Underwriters Association (and, to the extent it acted as attorney-in-fact in connection with The Policy, Farmers Underwriters Association), and their employees, adjusters, and agents, acting in connection with The Policy, The Claim, or The 2020 Claim.</w:t>
       </w:r>
     </w:p>
     <w:p>
@@ -246,7 +246,7 @@
         <w:t xml:space="preserve">"Fire Insurance Exchange" </w:t>
       </w:r>
       <w:r>
-        <w:t>means that entity only when used alone and spelled in full, and does not include its attorney-in-fact, any affiliate, or any other person within the preceding definition.</w:t>
+        <w:t xml:space="preserve">means that entity only when used alone and spelled in full, and does not include its attorney-in-fact, any affiliate, or any other person within the preceding definition.</w:t>
       </w:r>
     </w:p>
     <w:p>
@@ -262,7 +262,7 @@
         <w:t xml:space="preserve">"Plaintiffs" </w:t>
       </w:r>
       <w:r>
-        <w:t>means Yibiao Lu and Jie Hu.</w:t>
+        <w:t xml:space="preserve">means Yibiao Lu and Jie Hu.</w:t>
       </w:r>
     </w:p>
     <w:p>
@@ -278,7 +278,7 @@
         <w:t xml:space="preserve">"The Claim" </w:t>
       </w:r>
       <w:r>
-        <w:t>means Farmers claim number 7007986837-1-1, date of loss July 13, 2024.</w:t>
+        <w:t xml:space="preserve">means Farmers claim number 7007986837-1-1, date of loss July 13, 2024.</w:t>
       </w:r>
     </w:p>
     <w:p>
@@ -294,7 +294,7 @@
         <w:t xml:space="preserve">"The 2020 Claim" </w:t>
       </w:r>
       <w:r>
-        <w:t>means Farmers claim number 3013539499-1.</w:t>
+        <w:t xml:space="preserve">means Farmers claim number 3013539499-1.</w:t>
       </w:r>
     </w:p>
     <w:p>
@@ -307,11 +307,10 @@
           <w:b/>
           <w:bCs/>
         </w:rPr>
-        <w:lastRenderedPageBreak/>
         <w:t xml:space="preserve">"The Policy" </w:t>
       </w:r>
       <w:r>
-        <w:t>means homeowner's Policy 98055-49-65 (shown on Defendant's correspondence as 0980554965), including all endorsements, in force on July 13, 2024.</w:t>
+        <w:t xml:space="preserve">means homeowner's Policy 98055-49-65 (shown on Defendant's correspondence as 0980554965), including all endorsements, in force on July 13, 2024.</w:t>
       </w:r>
     </w:p>
     <w:p>
@@ -327,7 +326,7 @@
         <w:t xml:space="preserve">"The Policy Form" </w:t>
       </w:r>
       <w:r>
-        <w:t>means the Farmers Next Generation Homeowners Policy Minnesota, Form 56-5543 2nd Edition, as listed in the Declarations of The Policy effective October 22, 2023.</w:t>
+        <w:t xml:space="preserve">means the Farmers Next Generation Homeowners Policy Minnesota, Form 56-5543 2nd Edition, as listed in the Declarations of The Policy effective October 22, 2023.</w:t>
       </w:r>
     </w:p>
     <w:p>
@@ -343,7 +342,7 @@
         <w:t xml:space="preserve">"The Property" </w:t>
       </w:r>
       <w:r>
-        <w:t>means the insured dwelling at 17756 George Moran Dr., Eden Prairie, Minnesota 55347.</w:t>
+        <w:t xml:space="preserve">means the insured dwelling at 17756 George Moran Dr., Eden Prairie, Minnesota 55347.</w:t>
       </w:r>
     </w:p>
     <w:p>
@@ -359,7 +358,7 @@
         <w:t xml:space="preserve">"The Prieve Report" </w:t>
       </w:r>
       <w:r>
-        <w:t>means the seven-page report of Prieve Engineering, LLC titled "Evaluation of Condition of Windows as Relates to Hail," File Number 241008, report date November 4, 2024, as transmitted with Your November 4, 2024 letter to Plaintiffs.</w:t>
+        <w:t xml:space="preserve">means the seven-page report of Prieve Engineering, LLC titled "Evaluation of Condition of Windows as Relates to Hail," File Number 241008, report date November 4, 2024, as transmitted with Your November 4, 2024 letter to Plaintiffs.</w:t>
       </w:r>
     </w:p>
     <w:p>
@@ -375,7 +374,7 @@
         <w:t xml:space="preserve">"Photo Appendix A" </w:t>
       </w:r>
       <w:r>
-        <w:t>means the 110-page photographic appendix to The Prieve Report, titled "PHOTO APPENDIX A" and bearing File Number 241008 and site visit date October 9, 2024, containing photographs numbered A-1 through A-217.</w:t>
+        <w:t xml:space="preserve">means the 110-page photographic appendix to The Prieve Report, titled "PHOTO APPENDIX A" and bearing File Number 241008 and site visit date October 9, 2024, containing photographs numbered A-1 through A-217.</w:t>
       </w:r>
     </w:p>
     <w:p>
@@ -391,7 +390,7 @@
         <w:t xml:space="preserve">"The Coverage Outcome Attachment" </w:t>
       </w:r>
       <w:r>
-        <w:t>means the document titled "Coverage Outcome – Policy Provisions" transmitted with Your November 4, 2024 letter to Plaintiffs.</w:t>
+        <w:t xml:space="preserve">means the document titled "Coverage Outcome – Policy Provisions" transmitted with Your November 4, 2024 letter to Plaintiffs.</w:t>
       </w:r>
     </w:p>
     <w:p>
@@ -407,7 +406,7 @@
         <w:t xml:space="preserve">"The September 3, 2024 Denial Package" </w:t>
       </w:r>
       <w:r>
-        <w:t>means the 74-page PDF document dated September 3, 2024 that Plaintiffs received from You, consisting of Your September 3, 2024 letter to Plaintiffs (pages 1–2), a two-page document titled "Coverage Outcome – Policy Provisions" (pages 3–4; a different document from The Coverage Outcome Attachment), a one-page Hancock Claims Consultants roof diagram (page 5), and the two photograph logs defined below (pages 6–74).</w:t>
+        <w:t xml:space="preserve">means the 74-page PDF document dated September 3, 2024 that Plaintiffs received from You, consisting of Your September 3, 2024 letter to Plaintiffs (pages 1–2), a two-page document titled "Coverage Outcome – Policy Provisions" (pages 3–4; a different document from The Coverage Outcome Attachment), a one-page Hancock Claims Consultants roof diagram (page 5), and the two photograph logs defined below (pages 6–74).</w:t>
       </w:r>
     </w:p>
     <w:p>
@@ -423,7 +422,7 @@
         <w:t xml:space="preserve">"The First Photo Set" </w:t>
       </w:r>
       <w:r>
-        <w:t>means the 19-page photograph log at pages 6 through 24 of The September 3, 2024 Denial Package, bearing the page-footer date 8/30/2024 and containing photographs numbered 1 through 38.</w:t>
+        <w:t xml:space="preserve">means the 19-page photograph log at pages 6 through 24 of The September 3, 2024 Denial Package, bearing the page-footer date 8/30/2024 and containing photographs numbered 1 through 38.</w:t>
       </w:r>
     </w:p>
     <w:p>
@@ -439,7 +438,7 @@
         <w:t xml:space="preserve">"The Second Photo Set" </w:t>
       </w:r>
       <w:r>
-        <w:t>means the 50-page photograph log at pages 25 through 74 of The September 3, 2024 Denial Package, bearing the page-footer date 8/31/2024 and containing photographs numbered 1 through 100.</w:t>
+        <w:t xml:space="preserve">means the 50-page photograph log at pages 25 through 74 of The September 3, 2024 Denial Package, bearing the page-footer date 8/31/2024 and containing photographs numbered 1 through 100.</w:t>
       </w:r>
     </w:p>
     <w:p>
@@ -455,7 +454,7 @@
         <w:t xml:space="preserve">"No-Damage Caption" </w:t>
       </w:r>
       <w:r>
-        <w:t>means a caption of a photograph in The First Photo Set or The Second Photo Set that ends with the word "No," either standing alone or followed by an underscore and one or more numerals, whether one digit or two (for example, "Window Wrap North Damaged - No_7" and "Window Wrap North Damaged - No_20").</w:t>
+        <w:t xml:space="preserve">means a caption of a photograph in The First Photo Set or The Second Photo Set that ends with the word "No," either standing alone or followed by an underscore and one or more numerals, whether one digit or two (for example, "Window Wrap North Damaged - No_7" and "Window Wrap North Damaged - No_20").</w:t>
       </w:r>
     </w:p>
     <w:p>
@@ -471,7 +470,7 @@
         <w:t xml:space="preserve">"The Appraisal Award" </w:t>
       </w:r>
       <w:r>
-        <w:t>means the written appraisal award concerning The Claim dated on or about September 12, 2025.</w:t>
+        <w:t xml:space="preserve">means the written appraisal award concerning The Claim dated on or about September 12, 2025.</w:t>
       </w:r>
     </w:p>
     <w:p>
@@ -487,7 +486,7 @@
         <w:t xml:space="preserve">"Document" and "Documents" </w:t>
       </w:r>
       <w:r>
-        <w:t>mean any writing, photograph, note, or electronically stored record, including any entry in Your electronic claim file.</w:t>
+        <w:t xml:space="preserve">mean any writing, photograph, note, or electronically stored record, including any entry in Your electronic claim file.</w:t>
       </w:r>
     </w:p>
     <w:p>
@@ -500,11 +499,10 @@
           <w:b/>
           <w:bCs/>
         </w:rPr>
-        <w:lastRenderedPageBreak/>
-        <w:t xml:space="preserve">"Person" </w:t>
-      </w:r>
-      <w:r>
-        <w:t>means any natural person or any business, legal, or governmental entity.</w:t>
+        <w:t xml:space="preserve">"Person" and "person" </w:t>
+      </w:r>
+      <w:r>
+        <w:t xml:space="preserve">mean any natural person or group of natural persons, and any business, legal, or governmental entity of any form, whether or not incorporated, including any corporation, partnership, limited liability company, association, reciprocal or interinsurance exchange, attorney-in-fact, trust, or joint venture.</w:t>
       </w:r>
     </w:p>
     <w:p>
@@ -540,10 +538,16 @@
           <w:bCs/>
         </w:rPr>
         <w:tab/>
+      </w:r>
+      <w:r>
+        <w:rPr>
+          <w:b/>
+          <w:bCs/>
+        </w:rPr>
         <w:t xml:space="preserve">Answering. </w:t>
       </w:r>
       <w:r>
-        <w:t>As to each request, Defendant must specifically admit or deny the matter or set forth in detail the reasons why it cannot truthfully admit or deny it. A denial must fairly meet the substance of the requested admission, and when good faith requires that Defendant qualify an answer or deny only a part of a matter, it must specify so much as is true and qualify or deny the remainder. Minn. R. Civ. P. 36.01.</w:t>
+        <w:t xml:space="preserve">As to each request, Defendant must specifically admit or deny the matter or set forth in detail the reasons why it cannot truthfully admit or deny it. A denial must fairly meet the substance of the requested admission, and when good faith requires that Defendant qualify an answer or deny only a part of a matter, it must specify so much as is true and qualify or deny the remainder. Minn. R. Civ. P. 36.01.</w:t>
       </w:r>
     </w:p>
     <w:p>
@@ -564,10 +568,16 @@
           <w:bCs/>
         </w:rPr>
         <w:tab/>
+      </w:r>
+      <w:r>
+        <w:rPr>
+          <w:b/>
+          <w:bCs/>
+        </w:rPr>
         <w:t xml:space="preserve">Lack of knowledge. </w:t>
       </w:r>
       <w:r>
-        <w:t>Defendant may not give lack of information or knowledge as a reason for failure to admit or deny unless it states that it has made reasonable inquiry and that the information known or readily obtainable by it is insufficient to enable it to admit or deny. Minn. R. Civ. P. 36.01.</w:t>
+        <w:t xml:space="preserve">Defendant may not give lack of information or knowledge as a reason for failure to admit or deny unless it states that it has made reasonable inquiry and that the information known or readily obtainable by it is insufficient to enable it to admit or deny. Minn. R. Civ. P. 36.01.</w:t>
       </w:r>
     </w:p>
     <w:p>
@@ -588,10 +598,16 @@
           <w:bCs/>
         </w:rPr>
         <w:tab/>
+      </w:r>
+      <w:r>
+        <w:rPr>
+          <w:b/>
+          <w:bCs/>
+        </w:rPr>
         <w:t xml:space="preserve">Effect of non-response. </w:t>
       </w:r>
       <w:r>
-        <w:t>Pursuant to Minn. R. Civ. P. 36.01, any matter not timely answered or objected to is deemed admitted, and any matter admitted is conclusively established for purposes of this action unless the Court on motion permits withdrawal or amendment of the admission. Minn. R. Civ. P. 36.02. If the Court determines that an answer does not comply with the requirements of Minn. R. Civ. P. 36.01, it may order either that the matter is admitted or that an amended answer be served. Minn. R. Civ. P. 36.01.</w:t>
+        <w:t xml:space="preserve">Pursuant to Minn. R. Civ. P. 36.01, any matter not timely answered or objected to is deemed admitted, and any matter admitted is conclusively established for purposes of this action unless the Court on motion permits withdrawal or amendment of the admission. Minn. R. Civ. P. 36.02. If the Court determines that an answer does not comply with the requirements of Minn. R. Civ. P. 36.01, it may order either that the matter is admitted or that an amended answer be served. Minn. R. Civ. P. 36.01.</w:t>
       </w:r>
     </w:p>
     <w:p>
@@ -612,10 +628,16 @@
           <w:bCs/>
         </w:rPr>
         <w:tab/>
+      </w:r>
+      <w:r>
+        <w:rPr>
+          <w:b/>
+          <w:bCs/>
+        </w:rPr>
         <w:t xml:space="preserve">Continuing duty. </w:t>
       </w:r>
       <w:r>
-        <w:t>Defendant must supplement or correct its responses as required by Minn. R. Civ. P. 26.05(a). A matter admitted, however, is conclusively established and may be withdrawn or amended only by order of the Court on motion under Minn. R. Civ. P. 36.02.</w:t>
+        <w:t xml:space="preserve">Defendant must supplement or correct its responses as required by Minn. R. Civ. P. 26.05(a). A matter admitted, however, is conclusively established and may be withdrawn or amended only by order of the Court on motion under Minn. R. Civ. P. 36.02.</w:t>
       </w:r>
     </w:p>
     <w:p>
@@ -636,10 +658,16 @@
           <w:bCs/>
         </w:rPr>
         <w:tab/>
+      </w:r>
+      <w:r>
+        <w:rPr>
+          <w:b/>
+          <w:bCs/>
+        </w:rPr>
         <w:t xml:space="preserve">Objections. </w:t>
       </w:r>
       <w:r>
-        <w:t>If Defendant objects to a request, it must state the reasons for the objection; it may not object solely on the ground that the request presents a genuine issue for trial. Minn. R. Civ. P. 36.01.</w:t>
+        <w:t xml:space="preserve">If Defendant objects to a request, it must state the reasons for the objection; it may not object solely on the ground that the request presents a genuine issue for trial. Minn. R. Civ. P. 36.01.</w:t>
       </w:r>
     </w:p>
     <w:p>
@@ -660,10 +688,16 @@
           <w:bCs/>
         </w:rPr>
         <w:tab/>
+      </w:r>
+      <w:r>
+        <w:rPr>
+          <w:b/>
+          <w:bCs/>
+        </w:rPr>
         <w:t xml:space="preserve">Dates. </w:t>
       </w:r>
       <w:r>
-        <w:t>A date used to identify a communication, document, or event reflects Plaintiffs' best information and is approximate. If Defendant's records show a different date for a communication, document, or event otherwise matching the description, Defendant must answer as to that communication, document, or event and state the date its records show, rather than deny the request on the basis of the date alone.</w:t>
+        <w:t xml:space="preserve">A date used to identify a communication, document, or event reflects Plaintiffs' best information and is approximate. If Defendant's records show a different date for a communication, document, or event otherwise matching the description, Defendant must answer as to that communication, document, or event and state the date its records show, rather than deny the request on the basis of the date alone.</w:t>
       </w:r>
     </w:p>
     <w:p>
@@ -684,10 +718,16 @@
           <w:bCs/>
         </w:rPr>
         <w:tab/>
+      </w:r>
+      <w:r>
+        <w:rPr>
+          <w:b/>
+          <w:bCs/>
+        </w:rPr>
         <w:t xml:space="preserve">Cost of an unfounded denial. </w:t>
       </w:r>
       <w:r>
-        <w:t>If Defendant fails to admit any matter requested herein and Plaintiffs thereafter prove the truth of that matter, Plaintiffs will apply to the Court for an order requiring Defendant to pay the reasonable expenses incurred in making that proof, including any reasonable attorney fees, pursuant to Minn. R. Civ. P. 37.03(b).</w:t>
+        <w:t xml:space="preserve">If Defendant fails to admit any matter requested herein and Plaintiffs thereafter prove the truth of that matter, Plaintiffs will apply to the Court for an order requiring Defendant to pay the reasonable expenses incurred in making that proof, including any reasonable attorney fees, pursuant to Minn. R. Civ. P. 37.03(b).</w:t>
       </w:r>
     </w:p>
     <w:p>
@@ -708,14 +748,16 @@
           <w:bCs/>
         </w:rPr>
         <w:tab/>
+      </w:r>
+      <w:r>
+        <w:rPr>
+          <w:b/>
+          <w:bCs/>
+        </w:rPr>
         <w:t xml:space="preserve">No attachments. </w:t>
       </w:r>
       <w:r>
-        <w:t xml:space="preserve">No document is attached to or served with this set. Each request refers to a term defined above, to a document or record in Defendant's own possession, custody, </w:t>
-      </w:r>
-      <w:r>
-        <w:lastRenderedPageBreak/>
-        <w:t>or control, or to the publicly available National Weather Service web page identified by its address in Request No. 60. Plaintiffs will provide a copy of any document referred to in these requests promptly upon Defendant's request.</w:t>
+        <w:t xml:space="preserve">No document is attached to or served with this set. Each request refers to a term defined above, to a document or record in Defendant's own possession, custody, or control, or to the publicly available National Weather Service web page identified by its address in Request No. 60. Plaintiffs will provide a copy of any document referred to in these requests promptly upon Defendant's request.</w:t>
       </w:r>
     </w:p>
     <w:p>
@@ -736,10 +778,16 @@
           <w:bCs/>
         </w:rPr>
         <w:tab/>
+      </w:r>
+      <w:r>
+        <w:rPr>
+          <w:b/>
+          <w:bCs/>
+        </w:rPr>
         <w:t xml:space="preserve">Answering on behalf of others. </w:t>
       </w:r>
       <w:r>
-        <w:t>If Defendant answers any request on behalf of fewer than all persons within the definition of "You," it must say so in that answer and state which persons are excluded.</w:t>
+        <w:t xml:space="preserve">If Defendant answers any request on behalf of fewer than all persons within the definition of "You," it must say so in that answer and state which persons are excluded.</w:t>
       </w:r>
     </w:p>
     <w:p>
@@ -760,10 +808,16 @@
           <w:bCs/>
         </w:rPr>
         <w:tab/>
+      </w:r>
+      <w:r>
+        <w:rPr>
+          <w:b/>
+          <w:bCs/>
+        </w:rPr>
         <w:t xml:space="preserve">Attorney-client communications and litigation counsel. </w:t>
       </w:r>
       <w:r>
-        <w:t>No request seeks information protected by the attorney-client privilege or by Minn. R. Civ. P. 26.02(d). No request is directed to communications solely between Defendant and its counsel of record in this action dated on or after July 8, 2026.</w:t>
+        <w:t xml:space="preserve">No request seeks information protected by the attorney-client privilege or by Minn. R. Civ. P. 26.02(d). No request is directed to communications solely between Defendant and its counsel of record in this action dated on or after July 8, 2026.</w:t>
       </w:r>
     </w:p>
     <w:p>
@@ -794,7 +848,7 @@
           <w:i/>
           <w:iCs/>
         </w:rPr>
-        <w:t>A.  The Policy and the coverage grant</w:t>
+        <w:t xml:space="preserve">A.  The Policy and the coverage grant</w:t>
       </w:r>
     </w:p>
     <w:p>
@@ -811,7 +865,7 @@
         <w:t xml:space="preserve">REQUEST FOR ADMISSION NO. 1:  </w:t>
       </w:r>
       <w:r>
-        <w:t>Admit that The Policy was a valid and enforceable contract in force on July 13, 2024.</w:t>
+        <w:t xml:space="preserve">Admit that The Policy was a valid and enforceable contract in force on July 13, 2024.</w:t>
       </w:r>
     </w:p>
     <w:p>
@@ -828,7 +882,7 @@
         <w:t xml:space="preserve">REQUEST FOR ADMISSION NO. 2:  </w:t>
       </w:r>
       <w:r>
-        <w:t>Admit that the windstorm/hail deductible applicable to The Claim is $17,720.</w:t>
+        <w:t xml:space="preserve">Admit that the windstorm/hail deductible applicable to The Claim is $17,720.</w:t>
       </w:r>
     </w:p>
     <w:p>
@@ -845,7 +899,7 @@
         <w:t xml:space="preserve">REQUEST FOR ADMISSION NO. 3:  </w:t>
       </w:r>
       <w:r>
-        <w:t>Admit that Your September 3, 2024 letter to Plaintiffs stated, "our investigation found your policy provides coverage for direct physical loss to insured property, less uninsured or excluded."</w:t>
+        <w:t xml:space="preserve">Admit that Your September 3, 2024 letter to Plaintiffs stated, "our investigation found your policy provides coverage for direct physical loss to insured property, less uninsured or excluded."</w:t>
       </w:r>
     </w:p>
     <w:p>
@@ -862,7 +916,7 @@
         <w:t xml:space="preserve">REQUEST FOR ADMISSION NO. 4:  </w:t>
       </w:r>
       <w:r>
-        <w:t>Admit that The Policy Form, at "Section I - Loss or Damage Insured," states: "We insure accidental direct physical loss or damage to that property described in Section I - Types of Property Insured."</w:t>
+        <w:t xml:space="preserve">Admit that The Policy Form, at "Section I - Loss or Damage Insured," states: "We insure accidental direct physical loss or damage to that property described in Section I - Types of Property Insured."</w:t>
       </w:r>
     </w:p>
     <w:p>
@@ -879,7 +933,7 @@
         <w:t xml:space="preserve">REQUEST FOR ADMISSION NO. 5:  </w:t>
       </w:r>
       <w:r>
-        <w:t>Admit that item 26 ("Windstorm or hail") of subsection B of Section I – Uninsured Loss or Damage and Excluded Causes of Loss or Damage of The Policy Form does not apply to loss or damage to the windows of the dwelling at The Property.</w:t>
+        <w:t xml:space="preserve">Admit that item 26 ("Windstorm or hail") of subsection B of Section I – Uninsured Loss or Damage and Excluded Causes of Loss or Damage of The Policy Form does not apply to loss or damage to the windows of the dwelling at The Property.</w:t>
       </w:r>
     </w:p>
     <w:p>
@@ -896,7 +950,7 @@
         <w:t xml:space="preserve">REQUEST FOR ADMISSION NO. 6:  </w:t>
       </w:r>
       <w:r>
-        <w:t>Admit that The Policy contains no provision requiring that evidence supporting a claim be provided by an engineer.</w:t>
+        <w:t xml:space="preserve">Admit that The Policy contains no provision requiring that evidence supporting a claim be provided by an engineer.</w:t>
       </w:r>
     </w:p>
     <w:p>
@@ -912,7 +966,7 @@
           <w:i/>
           <w:iCs/>
         </w:rPr>
-        <w:t>B.  Identity and capacity of the acting entity</w:t>
+        <w:t xml:space="preserve">B.  Identity and capacity of the acting entity</w:t>
       </w:r>
     </w:p>
     <w:p>
@@ -927,7 +981,7 @@
           <w:i/>
           <w:iCs/>
         </w:rPr>
-        <w:t>Relevant to Defendant's First Affirmative Defense, which alleges "there exists a lack of jurisdiction over Defendant FIE."</w:t>
+        <w:t xml:space="preserve">Relevant to Defendant's First Affirmative Defense, which alleges "there exists a lack of jurisdiction over Defendant FIE."</w:t>
       </w:r>
     </w:p>
     <w:p>
@@ -944,7 +998,7 @@
         <w:t xml:space="preserve">REQUEST FOR ADMISSION NO. 7:  </w:t>
       </w:r>
       <w:r>
-        <w:t>Admit that Fire Insurance Exchange issued and underwrote The Policy.</w:t>
+        <w:t xml:space="preserve">Admit that Fire Insurance Exchange issued and underwrote The Policy.</w:t>
       </w:r>
     </w:p>
     <w:p>
@@ -961,25 +1015,24 @@
         <w:t xml:space="preserve">REQUEST FOR ADMISSION NO. 8:  </w:t>
       </w:r>
       <w:r>
-        <w:t>Admit that Christian Dudley was employed or engaged by Fire Insurance Exchange at the time of his involvement in The Claim.</w:t>
-      </w:r>
-    </w:p>
-    <w:p>
-      <w:pPr>
-        <w:keepLines/>
-        <w:spacing w:after="160"/>
-        <w:ind w:left="720" w:hanging="576"/>
-      </w:pPr>
-      <w:r>
-        <w:rPr>
-          <w:b/>
-          <w:bCs/>
-        </w:rPr>
-        <w:lastRenderedPageBreak/>
+        <w:t xml:space="preserve">Admit that Christian Dudley was employed or engaged by Fire Insurance Exchange at the time of his involvement in The Claim.</w:t>
+      </w:r>
+    </w:p>
+    <w:p>
+      <w:pPr>
+        <w:keepLines/>
+        <w:spacing w:after="160"/>
+        <w:ind w:left="720" w:hanging="576"/>
+      </w:pPr>
+      <w:r>
+        <w:rPr>
+          <w:b/>
+          <w:bCs/>
+        </w:rPr>
         <w:t xml:space="preserve">REQUEST FOR ADMISSION NO. 9:  </w:t>
       </w:r>
       <w:r>
-        <w:t>Admit that Nicholas Brau was employed or engaged by Fire Insurance Exchange at the time of his September 6, 2024 inspection of The Property.</w:t>
+        <w:t xml:space="preserve">Admit that Nicholas Brau was employed or engaged by Fire Insurance Exchange at the time of his September 6, 2024 inspection of The Property.</w:t>
       </w:r>
     </w:p>
     <w:p>
@@ -996,7 +1049,7 @@
         <w:t xml:space="preserve">REQUEST FOR ADMISSION NO. 10:  </w:t>
       </w:r>
       <w:r>
-        <w:t>Admit that Bradlee Monson was employed or engaged by Fire Insurance Exchange at the time of his involvement in The Claim.</w:t>
+        <w:t xml:space="preserve">Admit that Bradlee Monson was employed or engaged by Fire Insurance Exchange at the time of his involvement in The Claim.</w:t>
       </w:r>
     </w:p>
     <w:p>
@@ -1013,7 +1066,7 @@
         <w:t xml:space="preserve">REQUEST FOR ADMISSION NO. 11:  </w:t>
       </w:r>
       <w:r>
-        <w:t>Admit that Fire Insurance Exchange made the coverage decision communicated in Your September 3, 2024 letter to Plaintiffs.</w:t>
+        <w:t xml:space="preserve">Admit that Fire Insurance Exchange made the coverage decision communicated in Your September 3, 2024 letter to Plaintiffs.</w:t>
       </w:r>
     </w:p>
     <w:p>
@@ -1030,7 +1083,7 @@
         <w:t xml:space="preserve">REQUEST FOR ADMISSION NO. 12:  </w:t>
       </w:r>
       <w:r>
-        <w:t>Admit that Fire Insurance Exchange made the coverage decision communicated in Your November 4, 2024 letter to Plaintiffs.</w:t>
+        <w:t xml:space="preserve">Admit that Fire Insurance Exchange made the coverage decision communicated in Your November 4, 2024 letter to Plaintiffs.</w:t>
       </w:r>
     </w:p>
     <w:p>
@@ -1047,7 +1100,7 @@
         <w:t xml:space="preserve">REQUEST FOR ADMISSION NO. 13:  </w:t>
       </w:r>
       <w:r>
-        <w:t>Admit that Fire Insurance Exchange retained Hancock Claims Consultants to inspect The Property.</w:t>
+        <w:t xml:space="preserve">Admit that Fire Insurance Exchange retained Hancock Claims Consultants to inspect The Property.</w:t>
       </w:r>
     </w:p>
     <w:p>
@@ -1064,7 +1117,7 @@
         <w:t xml:space="preserve">REQUEST FOR ADMISSION NO. 14:  </w:t>
       </w:r>
       <w:r>
-        <w:t>Admit that Fire Insurance Exchange retained Prieve Engineering, LLC to inspect The Property.</w:t>
+        <w:t xml:space="preserve">Admit that Fire Insurance Exchange retained Prieve Engineering, LLC to inspect The Property.</w:t>
       </w:r>
     </w:p>
     <w:p>
@@ -1081,7 +1134,7 @@
         <w:t xml:space="preserve">REQUEST FOR ADMISSION NO. 15:  </w:t>
       </w:r>
       <w:r>
-        <w:t>Admit that Fire Insurance Exchange maintains the claim file for The Claim.</w:t>
+        <w:t xml:space="preserve">Admit that Fire Insurance Exchange maintains the claim file for The Claim.</w:t>
       </w:r>
     </w:p>
     <w:p>
@@ -1098,7 +1151,7 @@
         <w:t xml:space="preserve">REQUEST FOR ADMISSION NO. 16:  </w:t>
       </w:r>
       <w:r>
-        <w:t>Admit that Fire Insurance Exchange maintains the claim file for The 2020 Claim.</w:t>
+        <w:t xml:space="preserve">Admit that Fire Insurance Exchange maintains the claim file for The 2020 Claim.</w:t>
       </w:r>
     </w:p>
     <w:p>
@@ -1115,7 +1168,7 @@
         <w:t xml:space="preserve">REQUEST FOR ADMISSION NO. 17:  </w:t>
       </w:r>
       <w:r>
-        <w:t>Admit that Fire Insurance Exchange appointed Greg Tomes as its appraiser in the appraisal that resulted in The Appraisal Award.</w:t>
+        <w:t xml:space="preserve">Admit that Fire Insurance Exchange appointed Greg Tomes as its appraiser in the appraisal that resulted in The Appraisal Award.</w:t>
       </w:r>
     </w:p>
     <w:p>
@@ -1132,7 +1185,7 @@
         <w:t xml:space="preserve">REQUEST FOR ADMISSION NO. 18:  </w:t>
       </w:r>
       <w:r>
-        <w:t>Admit that Fire Underwriters Association acts as attorney-in-fact for Fire Insurance Exchange pursuant to a written instrument.</w:t>
+        <w:t xml:space="preserve">Admit that Fire Underwriters Association acts as attorney-in-fact for Fire Insurance Exchange pursuant to a written instrument.</w:t>
       </w:r>
     </w:p>
     <w:p>
@@ -1148,7 +1201,7 @@
           <w:i/>
           <w:iCs/>
         </w:rPr>
-        <w:t>C.  The Appraisal Award</w:t>
+        <w:t xml:space="preserve">C.  The Appraisal Award</w:t>
       </w:r>
     </w:p>
     <w:p>
@@ -1165,7 +1218,7 @@
         <w:t xml:space="preserve">REQUEST FOR ADMISSION NO. 19:  </w:t>
       </w:r>
       <w:r>
-        <w:t>Admit that The Appraisal Award identified hail as the cause of loss for the two windows it awarded.</w:t>
+        <w:t xml:space="preserve">Admit that The Appraisal Award identified hail as the cause of loss for the two windows it awarded.</w:t>
       </w:r>
     </w:p>
     <w:p>
@@ -1182,7 +1235,7 @@
         <w:t xml:space="preserve">REQUEST FOR ADMISSION NO. 20:  </w:t>
       </w:r>
       <w:r>
-        <w:t>Admit that The Appraisal Award identifies the two awarded windows only by the designations “F1.7” and “B1.2.”</w:t>
+        <w:t xml:space="preserve">Admit that The Appraisal Award identifies the two awarded windows only by the designations “F1.7” and “B1.2.”</w:t>
       </w:r>
     </w:p>
     <w:p>
@@ -1199,7 +1252,7 @@
         <w:t xml:space="preserve">REQUEST FOR ADMISSION NO. 21:  </w:t>
       </w:r>
       <w:r>
-        <w:t>Admit that The Appraisal Award states a Replacement Cost Value of $12,800 and an Actual Cash Value of $6,400 on a single line, the item description of which reads "Windows F1.7 B1.2."</w:t>
+        <w:t xml:space="preserve">Admit that The Appraisal Award states a Replacement Cost Value of $12,800 and an Actual Cash Value of $6,400 on a single line, the item description of which reads "Windows F1.7 B1.2."</w:t>
       </w:r>
     </w:p>
     <w:p>
@@ -1216,7 +1269,7 @@
         <w:t xml:space="preserve">REQUEST FOR ADMISSION NO. 22:  </w:t>
       </w:r>
       <w:r>
-        <w:t>Admit that The Appraisal Award does not state separately an actual value or a loss for the window designated "F1.7."</w:t>
+        <w:t xml:space="preserve">Admit that The Appraisal Award does not state separately an actual value or a loss for the window designated "F1.7."</w:t>
       </w:r>
     </w:p>
     <w:p>
@@ -1233,7 +1286,7 @@
         <w:t xml:space="preserve">REQUEST FOR ADMISSION NO. 23:  </w:t>
       </w:r>
       <w:r>
-        <w:t>Admit that The Appraisal Award does not state separately an actual value or a loss for the window designated "B1.2."</w:t>
+        <w:t xml:space="preserve">Admit that The Appraisal Award does not state separately an actual value or a loss for the window designated "B1.2."</w:t>
       </w:r>
     </w:p>
     <w:p>
@@ -1250,25 +1303,24 @@
         <w:t xml:space="preserve">REQUEST FOR ADMISSION NO. 24:  </w:t>
       </w:r>
       <w:r>
-        <w:t>Admit that The Appraisal Award does not state an actual value or a loss for any window at The Property other than the two windows designated “F1.7” and “B1.2.”</w:t>
-      </w:r>
-    </w:p>
-    <w:p>
-      <w:pPr>
-        <w:keepLines/>
-        <w:spacing w:after="160"/>
-        <w:ind w:left="720" w:hanging="576"/>
-      </w:pPr>
-      <w:r>
-        <w:rPr>
-          <w:b/>
-          <w:bCs/>
-        </w:rPr>
-        <w:lastRenderedPageBreak/>
+        <w:t xml:space="preserve">Admit that The Appraisal Award does not state an actual value or a loss for any window at The Property other than the two windows designated “F1.7” and “B1.2.”</w:t>
+      </w:r>
+    </w:p>
+    <w:p>
+      <w:pPr>
+        <w:keepLines/>
+        <w:spacing w:after="160"/>
+        <w:ind w:left="720" w:hanging="576"/>
+      </w:pPr>
+      <w:r>
+        <w:rPr>
+          <w:b/>
+          <w:bCs/>
+        </w:rPr>
         <w:t xml:space="preserve">REQUEST FOR ADMISSION NO. 25:  </w:t>
       </w:r>
       <w:r>
-        <w:t>Admit that You are bound by The Appraisal Award's determination that hail was the cause of loss to the windows designated "F1.7" and "B1.2."</w:t>
+        <w:t xml:space="preserve">Admit that You are bound by The Appraisal Award's determination that hail was the cause of loss to the windows designated "F1.7" and "B1.2."</w:t>
       </w:r>
     </w:p>
     <w:p>
@@ -1285,7 +1337,7 @@
         <w:t xml:space="preserve">REQUEST FOR ADMISSION NO. 26:  </w:t>
       </w:r>
       <w:r>
-        <w:t>Admit that You do not contend that any provision of Section I – Uninsured Loss or Damage and Excluded Causes of Loss or Damage of The Policy Form bars or reduces recovery for the loss to the windows designated "F1.7" and "B1.2" in The Appraisal Award.</w:t>
+        <w:t xml:space="preserve">Admit that You do not contend that any provision of Section I – Uninsured Loss or Damage and Excluded Causes of Loss or Damage of The Policy Form bars or reduces recovery for the loss to the windows designated "F1.7" and "B1.2" in The Appraisal Award.</w:t>
       </w:r>
     </w:p>
     <w:p>
@@ -1302,7 +1354,7 @@
         <w:t xml:space="preserve">REQUEST FOR ADMISSION NO. 27:  </w:t>
       </w:r>
       <w:r>
-        <w:t>Admit that the application of the windstorm/hail deductible is the only reason You have made no payment on account of the loss to the windows designated "F1.7" and "B1.2" in The Appraisal Award.</w:t>
+        <w:t xml:space="preserve">Admit that the application of the windstorm/hail deductible is the only reason You have made no payment on account of the loss to the windows designated "F1.7" and "B1.2" in The Appraisal Award.</w:t>
       </w:r>
     </w:p>
     <w:p>
@@ -1319,7 +1371,7 @@
         <w:t xml:space="preserve">REQUEST FOR ADMISSION NO. 28:  </w:t>
       </w:r>
       <w:r>
-        <w:t>Admit that the appraisal umpire, Wade Roos, did not provide You with a written report or estimate.</w:t>
+        <w:t xml:space="preserve">Admit that the appraisal umpire, Wade Roos, did not provide You with a written report or estimate.</w:t>
       </w:r>
     </w:p>
     <w:p>
@@ -1336,7 +1388,7 @@
         <w:t xml:space="preserve">REQUEST FOR ADMISSION NO. 29:  </w:t>
       </w:r>
       <w:r>
-        <w:t>Admit that, on The Appraisal Award, the signature line and date line for "Greg Tomes" beneath the statement "We certify the amounts established above for the described loss" are blank.</w:t>
+        <w:t xml:space="preserve">Admit that, on The Appraisal Award, the signature line and date line for "Greg Tomes" beneath the statement "We certify the amounts established above for the described loss" are blank.</w:t>
       </w:r>
     </w:p>
     <w:p>
@@ -1353,7 +1405,7 @@
         <w:t xml:space="preserve">REQUEST FOR ADMISSION NO. 30:  </w:t>
       </w:r>
       <w:r>
-        <w:t>Admit that the only signature of Greg Tomes on The Appraisal Award appears in the section acknowledging that Wade Roos "has been appointed to act as umpire in accord with the policy conditions."</w:t>
+        <w:t xml:space="preserve">Admit that the only signature of Greg Tomes on The Appraisal Award appears in the section acknowledging that Wade Roos "has been appointed to act as umpire in accord with the policy conditions."</w:t>
       </w:r>
     </w:p>
     <w:p>
@@ -1370,7 +1422,7 @@
         <w:t xml:space="preserve">REQUEST FOR ADMISSION NO. 31:  </w:t>
       </w:r>
       <w:r>
-        <w:t>Admit that The Appraisal Award states a Replacement Cost Value of $0 and an Actual Cash Value of $0 for the item "Siding &amp; Paint."</w:t>
+        <w:t xml:space="preserve">Admit that The Appraisal Award states a Replacement Cost Value of $0 and an Actual Cash Value of $0 for the item "Siding &amp; Paint."</w:t>
       </w:r>
     </w:p>
     <w:p>
@@ -1387,7 +1439,7 @@
         <w:t xml:space="preserve">REQUEST FOR ADMISSION NO. 32:  </w:t>
       </w:r>
       <w:r>
-        <w:t>Admit that The Appraisal Award states "Hail" in the Causation column for the item "Siding &amp; Paint."</w:t>
+        <w:t xml:space="preserve">Admit that The Appraisal Award states "Hail" in the Causation column for the item "Siding &amp; Paint."</w:t>
       </w:r>
     </w:p>
     <w:p>
@@ -1403,7 +1455,7 @@
           <w:i/>
           <w:iCs/>
         </w:rPr>
-        <w:t>D.  The September 3, 2024 denial</w:t>
+        <w:t xml:space="preserve">D.  The September 3, 2024 denial</w:t>
       </w:r>
     </w:p>
     <w:p>
@@ -1420,7 +1472,7 @@
         <w:t xml:space="preserve">REQUEST FOR ADMISSION NO. 33:  </w:t>
       </w:r>
       <w:r>
-        <w:t>Admit that Your September 3, 2024 letter to Plaintiffs stated, “There were no other damages observed.”</w:t>
+        <w:t xml:space="preserve">Admit that Your September 3, 2024 letter to Plaintiffs stated, “There were no other damages observed.”</w:t>
       </w:r>
     </w:p>
     <w:p>
@@ -1437,7 +1489,7 @@
         <w:t xml:space="preserve">REQUEST FOR ADMISSION NO. 34:  </w:t>
       </w:r>
       <w:r>
-        <w:t>Admit that on September 6, 2024, Your Senior Claim Adjuster Nicholas Brau observed dents on multiple windows at The Property.</w:t>
+        <w:t xml:space="preserve">Admit that on September 6, 2024, Your Senior Claim Adjuster Nicholas Brau observed dents on multiple windows at The Property.</w:t>
       </w:r>
     </w:p>
     <w:p>
@@ -1454,7 +1506,7 @@
         <w:t xml:space="preserve">REQUEST FOR ADMISSION NO. 35:  </w:t>
       </w:r>
       <w:r>
-        <w:t>Admit that the inspection referred to in Your September 3, 2024 letter as "we had your home inspected" was the August 29, 2024 inspection performed by Hancock Claims Consultants.</w:t>
+        <w:t xml:space="preserve">Admit that the inspection referred to in Your September 3, 2024 letter as "we had your home inspected" was the August 29, 2024 inspection performed by Hancock Claims Consultants.</w:t>
       </w:r>
     </w:p>
     <w:p>
@@ -1471,7 +1523,7 @@
         <w:t xml:space="preserve">REQUEST FOR ADMISSION NO. 36:  </w:t>
       </w:r>
       <w:r>
-        <w:t>Admit that, in connection with The Claim, You did not obtain any engineering analysis, engineering report, or engineering opinion concerning The Property before issuing Your September 3, 2024 letter.</w:t>
+        <w:t xml:space="preserve">Admit that, in connection with The Claim, You did not obtain any engineering analysis, engineering report, or engineering opinion concerning The Property before issuing Your September 3, 2024 letter.</w:t>
       </w:r>
     </w:p>
     <w:p>
@@ -1488,25 +1540,24 @@
         <w:t xml:space="preserve">REQUEST FOR ADMISSION NO. 37:  </w:t>
       </w:r>
       <w:r>
-        <w:t>Admit that, in connection with The Claim, no licensed professional engineer inspected The Property on Your behalf before September 3, 2024.</w:t>
-      </w:r>
-    </w:p>
-    <w:p>
-      <w:pPr>
-        <w:keepLines/>
-        <w:spacing w:after="160"/>
-        <w:ind w:left="720" w:hanging="576"/>
-      </w:pPr>
-      <w:r>
-        <w:rPr>
-          <w:b/>
-          <w:bCs/>
-        </w:rPr>
-        <w:lastRenderedPageBreak/>
+        <w:t xml:space="preserve">Admit that, in connection with The Claim, no licensed professional engineer inspected The Property on Your behalf before September 3, 2024.</w:t>
+      </w:r>
+    </w:p>
+    <w:p>
+      <w:pPr>
+        <w:keepLines/>
+        <w:spacing w:after="160"/>
+        <w:ind w:left="720" w:hanging="576"/>
+      </w:pPr>
+      <w:r>
+        <w:rPr>
+          <w:b/>
+          <w:bCs/>
+        </w:rPr>
         <w:t xml:space="preserve">REQUEST FOR ADMISSION NO. 38:  </w:t>
       </w:r>
       <w:r>
-        <w:t>Admit that Nicholas Brau did not inspect The Property before Your September 3, 2024 letter was issued.</w:t>
+        <w:t xml:space="preserve">Admit that Nicholas Brau did not inspect The Property before Your September 3, 2024 letter was issued.</w:t>
       </w:r>
     </w:p>
     <w:p>
@@ -1522,7 +1573,7 @@
           <w:i/>
           <w:iCs/>
         </w:rPr>
-        <w:t>E.  The November 4, 2024 denial and the provisions it cited</w:t>
+        <w:t xml:space="preserve">E.  The November 4, 2024 denial and the provisions it cited</w:t>
       </w:r>
     </w:p>
     <w:p>
@@ -1537,7 +1588,7 @@
           <w:i/>
           <w:iCs/>
         </w:rPr>
-        <w:t>Each provision below is quoted as it appears in The Coverage Outcome Attachment.</w:t>
+        <w:t xml:space="preserve">Each provision below is quoted as it appears in The Coverage Outcome Attachment.</w:t>
       </w:r>
     </w:p>
     <w:p>
@@ -1554,7 +1605,7 @@
         <w:t xml:space="preserve">REQUEST FOR ADMISSION NO. 39:  </w:t>
       </w:r>
       <w:r>
-        <w:t>Admit that Your November 4, 2024 letter transmitted The Prieve Report to Plaintiffs as a basis for Your denial of The Claim.</w:t>
+        <w:t xml:space="preserve">Admit that Your November 4, 2024 letter transmitted The Prieve Report to Plaintiffs as a basis for Your denial of The Claim.</w:t>
       </w:r>
     </w:p>
     <w:p>
@@ -1571,7 +1622,7 @@
         <w:t xml:space="preserve">REQUEST FOR ADMISSION NO. 40:  </w:t>
       </w:r>
       <w:r>
-        <w:t>Admit that The Coverage Outcome Attachment cites Section I.A.4 and Section I.B.6, “Inherent Vice or Latent Defect.”</w:t>
+        <w:t xml:space="preserve">Admit that The Coverage Outcome Attachment cites Section I.A.4 and Section I.B.6, “Inherent Vice or Latent Defect.”</w:t>
       </w:r>
     </w:p>
     <w:p>
@@ -1588,7 +1639,7 @@
         <w:t xml:space="preserve">REQUEST FOR ADMISSION NO. 41:  </w:t>
       </w:r>
       <w:r>
-        <w:t>Admit that The Coverage Outcome Attachment cites Section I.A.7, “Wear and tear or mechanical breakdown.”</w:t>
+        <w:t xml:space="preserve">Admit that The Coverage Outcome Attachment cites Section I.A.7, “Wear and tear or mechanical breakdown.”</w:t>
       </w:r>
     </w:p>
     <w:p>
@@ -1605,7 +1656,7 @@
         <w:t xml:space="preserve">REQUEST FOR ADMISSION NO. 42:  </w:t>
       </w:r>
       <w:r>
-        <w:t>Admit that The Coverage Outcome Attachment cites Section I.A.8, “Marring.”</w:t>
+        <w:t xml:space="preserve">Admit that The Coverage Outcome Attachment cites Section I.A.8, “Marring.”</w:t>
       </w:r>
     </w:p>
     <w:p>
@@ -1622,7 +1673,7 @@
         <w:t xml:space="preserve">REQUEST FOR ADMISSION NO. 43:  </w:t>
       </w:r>
       <w:r>
-        <w:t>Admit that The Coverage Outcome Attachment cites Section I.A.9 and Section I.B.9, “Corrosion, Deterioration, Decay or Rust.”</w:t>
+        <w:t xml:space="preserve">Admit that The Coverage Outcome Attachment cites Section I.A.9 and Section I.B.9, “Corrosion, Deterioration, Decay or Rust.”</w:t>
       </w:r>
     </w:p>
     <w:p>
@@ -1639,7 +1690,7 @@
         <w:t xml:space="preserve">REQUEST FOR ADMISSION NO. 44:  </w:t>
       </w:r>
       <w:r>
-        <w:t>Admit that The Coverage Outcome Attachment cites Section I.B.4, “Neglect or Lack of Maintenance or Failure to Make Repairs.”</w:t>
+        <w:t xml:space="preserve">Admit that The Coverage Outcome Attachment cites Section I.B.4, “Neglect or Lack of Maintenance or Failure to Make Repairs.”</w:t>
       </w:r>
     </w:p>
     <w:p>
@@ -1656,7 +1707,7 @@
         <w:t xml:space="preserve">REQUEST FOR ADMISSION NO. 45:  </w:t>
       </w:r>
       <w:r>
-        <w:t>Admit that The Coverage Outcome Attachment cites Section I.B.5, “Faulty, Inadequate, Defective or Incomplete Planning, Zoning, Maintenance, Repairs, Renovation, Manufacture or Construction.”</w:t>
+        <w:t xml:space="preserve">Admit that The Coverage Outcome Attachment cites Section I.B.5, “Faulty, Inadequate, Defective or Incomplete Planning, Zoning, Maintenance, Repairs, Renovation, Manufacture or Construction.”</w:t>
       </w:r>
     </w:p>
     <w:p>
@@ -1673,7 +1724,7 @@
         <w:t xml:space="preserve">REQUEST FOR ADMISSION NO. 46:  </w:t>
       </w:r>
       <w:r>
-        <w:t>Admit that The Coverage Outcome Attachment cites Section I.B.8, “Wear and Tear, Deterioration or Mechanical Breakdown.”</w:t>
+        <w:t xml:space="preserve">Admit that The Coverage Outcome Attachment cites Section I.B.8, “Wear and Tear, Deterioration or Mechanical Breakdown.”</w:t>
       </w:r>
     </w:p>
     <w:p>
@@ -1690,7 +1741,7 @@
         <w:t xml:space="preserve">REQUEST FOR ADMISSION NO. 47:  </w:t>
       </w:r>
       <w:r>
-        <w:t>Admit that the definition of “Marring” set out at paragraph 16 of The Coverage Outcome Attachment lists “denting” among its examples of marring.</w:t>
+        <w:t xml:space="preserve">Admit that the definition of “Marring” set out at paragraph 16 of The Coverage Outcome Attachment lists “denting” among its examples of marring.</w:t>
       </w:r>
     </w:p>
     <w:p>
@@ -1706,7 +1757,7 @@
           <w:i/>
           <w:iCs/>
         </w:rPr>
-        <w:t>F.  The Marring provision and its hail exception</w:t>
+        <w:t xml:space="preserve">F.  The Marring provision and its hail exception</w:t>
       </w:r>
     </w:p>
     <w:p>
@@ -1721,7 +1772,7 @@
           <w:i/>
           <w:iCs/>
         </w:rPr>
-        <w:t>Requests 48 and 49 quote The Policy Form. Requests 50 and 51 concern The Coverage Outcome Attachment transmitted with Your November 4, 2024 letter, and are to be read with Request No. 47.</w:t>
+        <w:t xml:space="preserve">Requests 48 and 49 quote The Policy Form. Requests 50 and 51 concern The Coverage Outcome Attachment transmitted with Your November 4, 2024 letter, and are to be read with Request No. 47.</w:t>
       </w:r>
     </w:p>
     <w:p>
@@ -1738,7 +1789,7 @@
         <w:t xml:space="preserve">REQUEST FOR ADMISSION NO. 48:  </w:t>
       </w:r>
       <w:r>
-        <w:t>Admit that item 8 ("Marring") of subsection A of Section I – Uninsured Loss or Damage and Excluded Causes of Loss or Damage of The Policy Form states: "However, we do insure marring which is directly caused by, arises out of or results from the following causes of loss, subject to the terms and limitations set forth in subsection B. Excluded Causes of Loss or Damage and in Extensions of Coverage for any such cause of loss or extensions of coverage:"</w:t>
+        <w:t xml:space="preserve">Admit that item 8 ("Marring") of subsection A of Section I – Uninsured Loss or Damage and Excluded Causes of Loss or Damage of The Policy Form states: "However, we do insure marring which is directly caused by, arises out of or results from the following causes of loss, subject to the terms and limitations set forth in subsection B. Excluded Causes of Loss or Damage and in Extensions of Coverage for any such cause of loss or extensions of coverage:"</w:t>
       </w:r>
     </w:p>
     <w:p>
@@ -1755,25 +1806,24 @@
         <w:t xml:space="preserve">REQUEST FOR ADMISSION NO. 49:  </w:t>
       </w:r>
       <w:r>
-        <w:t>Admit that "windstorm or hail" is among the causes of loss listed immediately after the sentence quoted in the preceding request.</w:t>
-      </w:r>
-    </w:p>
-    <w:p>
-      <w:pPr>
-        <w:keepLines/>
-        <w:spacing w:after="160"/>
-        <w:ind w:left="720" w:hanging="576"/>
-      </w:pPr>
-      <w:r>
-        <w:rPr>
-          <w:b/>
-          <w:bCs/>
-        </w:rPr>
-        <w:lastRenderedPageBreak/>
+        <w:t xml:space="preserve">Admit that "windstorm or hail" is among the causes of loss listed immediately after the sentence quoted in the preceding request.</w:t>
+      </w:r>
+    </w:p>
+    <w:p>
+      <w:pPr>
+        <w:keepLines/>
+        <w:spacing w:after="160"/>
+        <w:ind w:left="720" w:hanging="576"/>
+      </w:pPr>
+      <w:r>
+        <w:rPr>
+          <w:b/>
+          <w:bCs/>
+        </w:rPr>
         <w:t xml:space="preserve">REQUEST FOR ADMISSION NO. 50:  </w:t>
       </w:r>
       <w:r>
-        <w:t>Admit that The Coverage Outcome Attachment does not set out the sentence of item 8 ("Marring") of subsection A that begins "However, we do insure marring."</w:t>
+        <w:t xml:space="preserve">Admit that The Coverage Outcome Attachment does not set out the sentence of item 8 ("Marring") of subsection A that begins "However, we do insure marring."</w:t>
       </w:r>
     </w:p>
     <w:p>
@@ -1790,7 +1840,7 @@
         <w:t xml:space="preserve">REQUEST FOR ADMISSION NO. 51:  </w:t>
       </w:r>
       <w:r>
-        <w:t>Admit that, for item 8 ("Marring") of subsection A, The Coverage Outcome Attachment sets out only the heading "8. Marring." followed by an ellipsis.</w:t>
+        <w:t xml:space="preserve">Admit that, for item 8 ("Marring") of subsection A, The Coverage Outcome Attachment sets out only the heading "8. Marring." followed by an ellipsis.</w:t>
       </w:r>
     </w:p>
     <w:p>
@@ -1806,7 +1856,7 @@
           <w:i/>
           <w:iCs/>
         </w:rPr>
-        <w:t>G.  The Prieve engagement and the November 4, 2024 letter</w:t>
+        <w:t xml:space="preserve">G.  The Prieve engagement and the November 4, 2024 letter</w:t>
       </w:r>
     </w:p>
     <w:p>
@@ -1821,7 +1871,7 @@
           <w:i/>
           <w:iCs/>
         </w:rPr>
-        <w:t>Requests 52 through 57 concern the engagement of Prieve Engineering, LLC and Your November 4, 2024 letter, and are to be read with Requests Nos. 14, 39, and 58 through 65.</w:t>
+        <w:t xml:space="preserve">Requests 52 through 57 concern the engagement of Prieve Engineering, LLC and Your November 4, 2024 letter, and are to be read with Requests Nos. 14, 39, and 58 through 65.</w:t>
       </w:r>
     </w:p>
     <w:p>
@@ -1838,7 +1888,7 @@
         <w:t xml:space="preserve">REQUEST FOR ADMISSION NO. 52:  </w:t>
       </w:r>
       <w:r>
-        <w:t>Admit that You do not contend that The Prieve Report was prepared in anticipation of litigation or for trial within the meaning of Minn. R. Civ. P. 26.02(d).</w:t>
+        <w:t xml:space="preserve">Admit that You do not contend that The Prieve Report was prepared in anticipation of litigation or for trial within the meaning of Minn. R. Civ. P. 26.02(d).</w:t>
       </w:r>
     </w:p>
     <w:p>
@@ -1855,7 +1905,7 @@
         <w:t xml:space="preserve">REQUEST FOR ADMISSION NO. 53:  </w:t>
       </w:r>
       <w:r>
-        <w:t>Admit that neither Prieve Engineering, LLC nor Nathan Prieve was retained or specially employed by You in anticipation of litigation or preparation for trial within the meaning of Minn. R. Civ. P. 26.02(e)(2).</w:t>
+        <w:t xml:space="preserve">Admit that neither Prieve Engineering, LLC nor Nathan Prieve was retained or specially employed by You in anticipation of litigation or preparation for trial within the meaning of Minn. R. Civ. P. 26.02(e)(2).</w:t>
       </w:r>
     </w:p>
     <w:p>
@@ -1872,7 +1922,7 @@
         <w:t xml:space="preserve">REQUEST FOR ADMISSION NO. 54:  </w:t>
       </w:r>
       <w:r>
-        <w:t>Admit that The Prieve Report states that Prieve Engineering, LLC visited The Property "Per the request of Nic Brau of Farmers Insurance."</w:t>
+        <w:t xml:space="preserve">Admit that The Prieve Report states that Prieve Engineering, LLC visited The Property "Per the request of Nic Brau of Farmers Insurance."</w:t>
       </w:r>
     </w:p>
     <w:p>
@@ -1889,7 +1939,7 @@
         <w:t xml:space="preserve">REQUEST FOR ADMISSION NO. 55:  </w:t>
       </w:r>
       <w:r>
-        <w:t>Admit that The Prieve Report bears the report date November 4, 2024.</w:t>
+        <w:t xml:space="preserve">Admit that The Prieve Report bears the report date November 4, 2024.</w:t>
       </w:r>
     </w:p>
     <w:p>
@@ -1906,7 +1956,7 @@
         <w:t xml:space="preserve">REQUEST FOR ADMISSION NO. 56:  </w:t>
       </w:r>
       <w:r>
-        <w:t>Admit that Your November 4, 2024 letter to Plaintiffs was signed by Nicholas Brau, Claims Spec Rep Prop, Fire Insurance Exchange.</w:t>
+        <w:t xml:space="preserve">Admit that Your November 4, 2024 letter to Plaintiffs was signed by Nicholas Brau, Claims Spec Rep Prop, Fire Insurance Exchange.</w:t>
       </w:r>
     </w:p>
     <w:p>
@@ -1923,7 +1973,7 @@
         <w:t xml:space="preserve">REQUEST FOR ADMISSION NO. 57:  </w:t>
       </w:r>
       <w:r>
-        <w:t>Admit that Your November 4, 2024 letter to Plaintiffs stated, "Our investigation found the condition of the window and components to be from wear/tear as referrenced in the attached engineer report."</w:t>
+        <w:t xml:space="preserve">Admit that Your November 4, 2024 letter to Plaintiffs stated, "Our investigation found the condition of the window and components to be from wear/tear as referrenced in the attached engineer report."</w:t>
       </w:r>
     </w:p>
     <w:p>
@@ -1939,7 +1989,7 @@
           <w:i/>
           <w:iCs/>
         </w:rPr>
-        <w:t>H.  The Prieve Report and Photo Appendix A</w:t>
+        <w:t xml:space="preserve">H.  The Prieve Report and Photo Appendix A</w:t>
       </w:r>
     </w:p>
     <w:p>
@@ -1956,7 +2006,7 @@
         <w:t xml:space="preserve">REQUEST FOR ADMISSION NO. 58:  </w:t>
       </w:r>
       <w:r>
-        <w:t>Admit that You retained Prieve Engineering, LLC to “evaluate the condition of windows in the home as relates to hail.”</w:t>
+        <w:t xml:space="preserve">Admit that You retained Prieve Engineering, LLC to “evaluate the condition of windows in the home as relates to hail.”</w:t>
       </w:r>
     </w:p>
     <w:p>
@@ -1973,7 +2023,7 @@
         <w:t xml:space="preserve">REQUEST FOR ADMISSION NO. 59:  </w:t>
       </w:r>
       <w:r>
-        <w:t>Admit that The Prieve Report states: "Similar past estimated hail appears in a summary from the NOAA Storm Events Database with most recent hail in Eden Prairie reported in 2020."</w:t>
+        <w:t xml:space="preserve">Admit that The Prieve Report states: "Similar past estimated hail appears in a summary from the NOAA Storm Events Database with most recent hail in Eden Prairie reported in 2020."</w:t>
       </w:r>
     </w:p>
     <w:p>
@@ -1990,25 +2040,24 @@
         <w:t xml:space="preserve">REQUEST FOR ADMISSION NO. 60:  </w:t>
       </w:r>
       <w:r>
-        <w:t>Admit that the National Weather Service Twin Cities/Chanhassen web page titled "Significant Wind and Hail in Minnesota July 13-14" (https://www.weather.gov/mpx/2024-07-13-SignificantWindandHail) states that a line of storms that developed on the evening of July 13, 2024 "led to numerous reports of hail and wind damage."</w:t>
-      </w:r>
-    </w:p>
-    <w:p>
-      <w:pPr>
-        <w:keepLines/>
-        <w:spacing w:after="160"/>
-        <w:ind w:left="720" w:hanging="576"/>
-      </w:pPr>
-      <w:r>
-        <w:rPr>
-          <w:b/>
-          <w:bCs/>
-        </w:rPr>
-        <w:lastRenderedPageBreak/>
+        <w:t xml:space="preserve">Admit that the National Weather Service Twin Cities/Chanhassen web page titled "Significant Wind and Hail in Minnesota July 13-14" (https://www.weather.gov/mpx/2024-07-13-SignificantWindandHail) states that a line of storms that developed on the evening of July 13, 2024 "led to numerous reports of hail and wind damage."</w:t>
+      </w:r>
+    </w:p>
+    <w:p>
+      <w:pPr>
+        <w:keepLines/>
+        <w:spacing w:after="160"/>
+        <w:ind w:left="720" w:hanging="576"/>
+      </w:pPr>
+      <w:r>
+        <w:rPr>
+          <w:b/>
+          <w:bCs/>
+        </w:rPr>
         <w:t xml:space="preserve">REQUEST FOR ADMISSION NO. 61:  </w:t>
       </w:r>
       <w:r>
-        <w:t>Admit that the National Weather Service Twin Cities/Chanhassen web page titled "Significant Wind and Hail in Minnesota July 13-14" lists a 48 MPH wind gust at "Eden Prairie AP" at 1:00 a.m. on July 14, 2024.</w:t>
+        <w:t xml:space="preserve">Admit that the National Weather Service Twin Cities/Chanhassen web page titled "Significant Wind and Hail in Minnesota July 13-14" lists a 48 MPH wind gust at "Eden Prairie AP" at 1:00 a.m. on July 14, 2024.</w:t>
       </w:r>
     </w:p>
     <w:p>
@@ -2025,7 +2074,7 @@
         <w:t xml:space="preserve">REQUEST FOR ADMISSION NO. 62:  </w:t>
       </w:r>
       <w:r>
-        <w:t>Admit that The Prieve Report contains no quantitative impact-force calculation.</w:t>
+        <w:t xml:space="preserve">Admit that The Prieve Report contains no quantitative impact-force calculation.</w:t>
       </w:r>
     </w:p>
     <w:p>
@@ -2042,7 +2091,7 @@
         <w:t xml:space="preserve">REQUEST FOR ADMISSION NO. 63:  </w:t>
       </w:r>
       <w:r>
-        <w:t>Admit that The Prieve Report contains no terminal-velocity calculation.</w:t>
+        <w:t xml:space="preserve">Admit that The Prieve Report contains no terminal-velocity calculation.</w:t>
       </w:r>
     </w:p>
     <w:p>
@@ -2059,7 +2108,7 @@
         <w:t xml:space="preserve">REQUEST FOR ADMISSION NO. 64:  </w:t>
       </w:r>
       <w:r>
-        <w:t>Admit that The Prieve Report documents dents, marks, or indentations across at least twenty-five distinct windows at The Property.</w:t>
+        <w:t xml:space="preserve">Admit that The Prieve Report documents dents, marks, or indentations across at least twenty-five distinct windows at The Property.</w:t>
       </w:r>
     </w:p>
     <w:p>
@@ -2072,7 +2121,7 @@
           <w:i/>
           <w:iCs/>
         </w:rPr>
-        <w:t>See also Requests for Admission Nos. 82 through 106.</w:t>
+        <w:t xml:space="preserve">See also Requests for Admission Nos. 82 through 106.</w:t>
       </w:r>
     </w:p>
     <w:p>
@@ -2089,7 +2138,7 @@
         <w:t xml:space="preserve">REQUEST FOR ADMISSION NO. 65:  </w:t>
       </w:r>
       <w:r>
-        <w:t>Admit that page 5 of The Prieve Report states: "A dent with a scrape mark present appears in the bottom screen frame of the east facing sliding door."</w:t>
+        <w:t xml:space="preserve">Admit that page 5 of The Prieve Report states: "A dent with a scrape mark present appears in the bottom screen frame of the east facing sliding door."</w:t>
       </w:r>
     </w:p>
     <w:p>
@@ -2106,7 +2155,7 @@
         <w:t xml:space="preserve">REQUEST FOR ADMISSION NO. 66:  </w:t>
       </w:r>
       <w:r>
-        <w:t>Admit that photograph A-42 of Photo Appendix A depicts a dent in a downspout extension at The Property.</w:t>
+        <w:t xml:space="preserve">Admit that photograph A-42 of Photo Appendix A depicts a dent in a downspout extension at The Property.</w:t>
       </w:r>
     </w:p>
     <w:p>
@@ -2123,7 +2172,7 @@
         <w:t xml:space="preserve">REQUEST FOR ADMISSION NO. 67:  </w:t>
       </w:r>
       <w:r>
-        <w:t>Admit that photograph A-92 of Photo Appendix A depicts a dented downspout at The Property.</w:t>
+        <w:t xml:space="preserve">Admit that photograph A-92 of Photo Appendix A depicts a dented downspout at The Property.</w:t>
       </w:r>
     </w:p>
     <w:p>
@@ -2140,7 +2189,7 @@
         <w:t xml:space="preserve">REQUEST FOR ADMISSION NO. 68:  </w:t>
       </w:r>
       <w:r>
-        <w:t>Admit that photograph A-93 of Photo Appendix A depicts a dented downspout at The Property.</w:t>
+        <w:t xml:space="preserve">Admit that photograph A-93 of Photo Appendix A depicts a dented downspout at The Property.</w:t>
       </w:r>
     </w:p>
     <w:p>
@@ -2157,7 +2206,7 @@
         <w:t xml:space="preserve">REQUEST FOR ADMISSION NO. 69:  </w:t>
       </w:r>
       <w:r>
-        <w:t>Admit that photograph A-98 of Photo Appendix A depicts a dented downspout at The Property.</w:t>
+        <w:t xml:space="preserve">Admit that photograph A-98 of Photo Appendix A depicts a dented downspout at The Property.</w:t>
       </w:r>
     </w:p>
     <w:p>
@@ -2174,7 +2223,7 @@
         <w:t xml:space="preserve">REQUEST FOR ADMISSION NO. 70:  </w:t>
       </w:r>
       <w:r>
-        <w:t>Admit that photograph A-99 of Photo Appendix A depicts a dented downspout at The Property.</w:t>
+        <w:t xml:space="preserve">Admit that photograph A-99 of Photo Appendix A depicts a dented downspout at The Property.</w:t>
       </w:r>
     </w:p>
     <w:p>
@@ -2191,7 +2240,7 @@
         <w:t xml:space="preserve">REQUEST FOR ADMISSION NO. 71:  </w:t>
       </w:r>
       <w:r>
-        <w:t>Admit that photograph A-103 of Photo Appendix A depicts dented flashing at The Property.</w:t>
+        <w:t xml:space="preserve">Admit that photograph A-103 of Photo Appendix A depicts dented flashing at The Property.</w:t>
       </w:r>
     </w:p>
     <w:p>
@@ -2208,7 +2257,7 @@
         <w:t xml:space="preserve">REQUEST FOR ADMISSION NO. 72:  </w:t>
       </w:r>
       <w:r>
-        <w:t>Admit that Photo Appendix A is a genuine copy of the photographic appendix prepared by Prieve Engineering, LLC, File Number 241008.</w:t>
+        <w:t xml:space="preserve">Admit that Photo Appendix A is a genuine copy of the photographic appendix prepared by Prieve Engineering, LLC, File Number 241008.</w:t>
       </w:r>
     </w:p>
     <w:p>
@@ -2225,7 +2274,7 @@
         <w:t xml:space="preserve">REQUEST FOR ADMISSION NO. 73:  </w:t>
       </w:r>
       <w:r>
-        <w:t>Admit that "DOWNSPOUT EXTENSION AT FRONT, VIEW OF DENT AT UPPER EDGE" is the caption of photograph A-42 of Photo Appendix A.</w:t>
+        <w:t xml:space="preserve">Admit that "DOWNSPOUT EXTENSION AT FRONT, VIEW OF DENT AT UPPER EDGE" is the caption of photograph A-42 of Photo Appendix A.</w:t>
       </w:r>
     </w:p>
     <w:p>
@@ -2242,7 +2291,7 @@
         <w:t xml:space="preserve">REQUEST FOR ADMISSION NO. 74:  </w:t>
       </w:r>
       <w:r>
-        <w:t>Admit that "VIEW OF DOWNSPOUT, DENT PRESENT" is the caption of photograph A-92 of Photo Appendix A.</w:t>
+        <w:t xml:space="preserve">Admit that "VIEW OF DOWNSPOUT, DENT PRESENT" is the caption of photograph A-92 of Photo Appendix A.</w:t>
       </w:r>
     </w:p>
     <w:p>
@@ -2259,7 +2308,7 @@
         <w:t xml:space="preserve">REQUEST FOR ADMISSION NO. 75:  </w:t>
       </w:r>
       <w:r>
-        <w:t>Admit that "ADJACENT AREA SHOWING DENT IN DOWNSPOUT" is the caption of photograph A-93 of Photo Appendix A.</w:t>
+        <w:t xml:space="preserve">Admit that "ADJACENT AREA SHOWING DENT IN DOWNSPOUT" is the caption of photograph A-93 of Photo Appendix A.</w:t>
       </w:r>
     </w:p>
     <w:p>
@@ -2276,25 +2325,24 @@
         <w:t xml:space="preserve">REQUEST FOR ADMISSION NO. 76:  </w:t>
       </w:r>
       <w:r>
-        <w:t>Admit that "DOWNSPOUT AT EASET [sic] SIDE SHOWING DENT" is the caption of photograph A-98 of Photo Appendix A.</w:t>
-      </w:r>
-    </w:p>
-    <w:p>
-      <w:pPr>
-        <w:keepLines/>
-        <w:spacing w:after="160"/>
-        <w:ind w:left="720" w:hanging="576"/>
-      </w:pPr>
-      <w:r>
-        <w:rPr>
-          <w:b/>
-          <w:bCs/>
-        </w:rPr>
-        <w:lastRenderedPageBreak/>
+        <w:t xml:space="preserve">Admit that "DOWNSPOUT AT EASET [sic] SIDE SHOWING DENT" is the caption of photograph A-98 of Photo Appendix A.</w:t>
+      </w:r>
+    </w:p>
+    <w:p>
+      <w:pPr>
+        <w:keepLines/>
+        <w:spacing w:after="160"/>
+        <w:ind w:left="720" w:hanging="576"/>
+      </w:pPr>
+      <w:r>
+        <w:rPr>
+          <w:b/>
+          <w:bCs/>
+        </w:rPr>
         <w:t xml:space="preserve">REQUEST FOR ADMISSION NO. 77:  </w:t>
       </w:r>
       <w:r>
-        <w:t>Admit that "DENT IN DOWNSPOUT WITH CREASE PRESENT" is the caption of photograph A-99 of Photo Appendix A.</w:t>
+        <w:t xml:space="preserve">Admit that "DENT IN DOWNSPOUT WITH CREASE PRESENT" is the caption of photograph A-99 of Photo Appendix A.</w:t>
       </w:r>
     </w:p>
     <w:p>
@@ -2311,7 +2359,7 @@
         <w:t xml:space="preserve">REQUEST FOR ADMISSION NO. 78:  </w:t>
       </w:r>
       <w:r>
-        <w:t>Admit that "VIEW OF DENTS IN FLASHING AT BASE OF WALL ALONG DECK" is the caption of photograph A-103 of Photo Appendix A.</w:t>
+        <w:t xml:space="preserve">Admit that "VIEW OF DENTS IN FLASHING AT BASE OF WALL ALONG DECK" is the caption of photograph A-103 of Photo Appendix A.</w:t>
       </w:r>
     </w:p>
     <w:p>
@@ -2328,7 +2376,7 @@
         <w:t xml:space="preserve">REQUEST FOR ADMISSION NO. 79:  </w:t>
       </w:r>
       <w:r>
-        <w:t>Admit that "DENT IN SCREEN AT DOOR WINDOW SCRAPE MARK PRESENT" is the caption of photograph A-141 of Photo Appendix A.</w:t>
+        <w:t xml:space="preserve">Admit that "DENT IN SCREEN AT DOOR WINDOW SCRAPE MARK PRESENT" is the caption of photograph A-141 of Photo Appendix A.</w:t>
       </w:r>
     </w:p>
     <w:p>
@@ -2345,7 +2393,7 @@
         <w:t xml:space="preserve">REQUEST FOR ADMISSION NO. 80:  </w:t>
       </w:r>
       <w:r>
-        <w:t>Admit that Photo Appendix A contains no photograph of the two-sash fixed window that is the only other window on the rear (east) elevation of the attached garage at The Property, south of the garage window depicted at photographs A-213 through A-217.</w:t>
+        <w:t xml:space="preserve">Admit that Photo Appendix A contains no photograph of the two-sash fixed window that is the only other window on the rear (east) elevation of the attached garage at The Property, south of the garage window depicted at photographs A-213 through A-217.</w:t>
       </w:r>
     </w:p>
     <w:p>
@@ -2362,7 +2410,7 @@
         <w:t xml:space="preserve">REQUEST FOR ADMISSION NO. 81:  </w:t>
       </w:r>
       <w:r>
-        <w:t>Admit that no person acting for You or retained by You has inspected the window described in the preceding request.</w:t>
+        <w:t xml:space="preserve">Admit that no person acting for You or retained by You has inspected the window described in the preceding request.</w:t>
       </w:r>
     </w:p>
     <w:p>
@@ -2378,7 +2426,7 @@
           <w:i/>
           <w:iCs/>
         </w:rPr>
-        <w:t>I.  Dents recorded in The Prieve Report</w:t>
+        <w:t xml:space="preserve">I.  Dents recorded in The Prieve Report</w:t>
       </w:r>
     </w:p>
     <w:p>
@@ -2393,7 +2441,7 @@
           <w:i/>
           <w:iCs/>
         </w:rPr>
-        <w:t>The first Request in this section concerns the genuineness of The Prieve Report. The next twenty Requests each ask You to admit that a dent or indentation, identified by the sentence of The Prieve Report quoted in the Request, was present at The Property; they do not ask You to admit the cause of any dent or indentation. The remaining Requests in this section concern what The Prieve Report does not state. To be read with Requests Nos. 58 through 65.</w:t>
+        <w:t xml:space="preserve">The first Request in this section concerns the genuineness of The Prieve Report. The next twenty Requests each ask You to admit that a dent or indentation, identified by the sentence of The Prieve Report quoted in the Request, was present at The Property; they do not ask You to admit the cause of any dent or indentation. The remaining Requests in this section concern what The Prieve Report does not state. To be read with Requests Nos. 58 through 65.</w:t>
       </w:r>
     </w:p>
     <w:p>
@@ -2410,7 +2458,7 @@
         <w:t xml:space="preserve">REQUEST FOR ADMISSION NO. 82:  </w:t>
       </w:r>
       <w:r>
-        <w:t>Admit that The Prieve Report is a genuine copy of the report prepared by Prieve Engineering, LLC, File Number 241008.</w:t>
+        <w:t xml:space="preserve">Admit that The Prieve Report is a genuine copy of the report prepared by Prieve Engineering, LLC, File Number 241008.</w:t>
       </w:r>
     </w:p>
     <w:p>
@@ -2427,7 +2475,7 @@
         <w:t xml:space="preserve">REQUEST FOR ADMISSION NO. 83:  </w:t>
       </w:r>
       <w:r>
-        <w:t>Admit that the dents described on page 4 of The Prieve Report in the sentence "Rounded dents were observed at sashes of this window unit" were present at The Property on October 9, 2024.</w:t>
+        <w:t xml:space="preserve">Admit that the dents described on page 4 of The Prieve Report in the sentence "Rounded dents were observed at sashes of this window unit" were present at The Property on October 9, 2024.</w:t>
       </w:r>
     </w:p>
     <w:p>
@@ -2444,7 +2492,7 @@
         <w:t xml:space="preserve">REQUEST FOR ADMISSION NO. 84:  </w:t>
       </w:r>
       <w:r>
-        <w:t>Admit that the dents described on page 4 of The Prieve Report in the sentence "Two dents with sharp marks/indentations appear long the left side of the left sash as shown in photograph A-45" were present at The Property on October 9, 2024.</w:t>
+        <w:t xml:space="preserve">Admit that the dents described on page 4 of The Prieve Report in the sentence "Two dents with sharp marks/indentations appear long the left side of the left sash as shown in photograph A-45" were present at The Property on October 9, 2024.</w:t>
       </w:r>
     </w:p>
     <w:p>
@@ -2461,7 +2509,7 @@
         <w:t xml:space="preserve">REQUEST FOR ADMISSION NO. 85:  </w:t>
       </w:r>
       <w:r>
-        <w:t>Admit that the dent described on page 4 of The Prieve Report in the sentence "A dent appears in a window sash with a scrape mark present inside the dent as shown in photograph A-64" was present at The Property on October 9, 2024.</w:t>
+        <w:t xml:space="preserve">Admit that the dent described on page 4 of The Prieve Report in the sentence "A dent appears in a window sash with a scrape mark present inside the dent as shown in photograph A-64" was present at The Property on October 9, 2024.</w:t>
       </w:r>
     </w:p>
     <w:p>
@@ -2478,25 +2526,24 @@
         <w:t xml:space="preserve">REQUEST FOR ADMISSION NO. 86:  </w:t>
       </w:r>
       <w:r>
-        <w:t>Admit that the dent described on page 5 of The Prieve Report in the sentence "A dent with scrape marks was observed in the frame of the upper southeast facing window as shown in photograph A-107" was present at The Property on October 9, 2024.</w:t>
-      </w:r>
-    </w:p>
-    <w:p>
-      <w:pPr>
-        <w:keepLines/>
-        <w:spacing w:after="160"/>
-        <w:ind w:left="720" w:hanging="576"/>
-      </w:pPr>
-      <w:r>
-        <w:rPr>
-          <w:b/>
-          <w:bCs/>
-        </w:rPr>
-        <w:lastRenderedPageBreak/>
+        <w:t xml:space="preserve">Admit that the dent described on page 5 of The Prieve Report in the sentence "A dent with scrape marks was observed in the frame of the upper southeast facing window as shown in photograph A-107" was present at The Property on October 9, 2024.</w:t>
+      </w:r>
+    </w:p>
+    <w:p>
+      <w:pPr>
+        <w:keepLines/>
+        <w:spacing w:after="160"/>
+        <w:ind w:left="720" w:hanging="576"/>
+      </w:pPr>
+      <w:r>
+        <w:rPr>
+          <w:b/>
+          <w:bCs/>
+        </w:rPr>
         <w:t xml:space="preserve">REQUEST FOR ADMISSION NO. 87:  </w:t>
       </w:r>
       <w:r>
-        <w:t>Admit that the indentation described on page 5 of The Prieve Report in the sentence "An indentation appears on the left side of the center window accessory groove not consistent with hail along with a mark in the frame with loss of finishes as shown in photograph A-113" was present at The Property on October 9, 2024.</w:t>
+        <w:t xml:space="preserve">Admit that the indentation described on page 5 of The Prieve Report in the sentence "An indentation appears on the left side of the center window accessory groove not consistent with hail along with a mark in the frame with loss of finishes as shown in photograph A-113" was present at The Property on October 9, 2024.</w:t>
       </w:r>
     </w:p>
     <w:p>
@@ -2513,7 +2560,7 @@
         <w:t xml:space="preserve">REQUEST FOR ADMISSION NO. 88:  </w:t>
       </w:r>
       <w:r>
-        <w:t>Admit that the dents described on page 5 of The Prieve Report in the sentence "Two dents appear in the face of the sash at the lower left corner of the main window with scrape marks present inside and around areas of dents" were present at The Property on October 9, 2024.</w:t>
+        <w:t xml:space="preserve">Admit that the dents described on page 5 of The Prieve Report in the sentence "Two dents appear in the face of the sash at the lower left corner of the main window with scrape marks present inside and around areas of dents" were present at The Property on October 9, 2024.</w:t>
       </w:r>
     </w:p>
     <w:p>
@@ -2530,7 +2577,7 @@
         <w:t xml:space="preserve">REQUEST FOR ADMISSION NO. 89:  </w:t>
       </w:r>
       <w:r>
-        <w:t>Admit that the dent described on page 5 of The Prieve Report in the sentence "A dent with marks present appears in the face of the drip cap of the upper center window unit" was present at The Property on October 9, 2024.</w:t>
+        <w:t xml:space="preserve">Admit that the dent described on page 5 of The Prieve Report in the sentence "A dent with marks present appears in the face of the drip cap of the upper center window unit" was present at The Property on October 9, 2024.</w:t>
       </w:r>
     </w:p>
     <w:p>
@@ -2547,7 +2594,7 @@
         <w:t xml:space="preserve">REQUEST FOR ADMISSION NO. 90:  </w:t>
       </w:r>
       <w:r>
-        <w:t>Admit that the dent described on page 5 of The Prieve Report in the sentence "A dent appears in the bottom accessory groove of the upper northeast facing window not consistent with hail" was present at The Property on October 9, 2024.</w:t>
+        <w:t xml:space="preserve">Admit that the dent described on page 5 of The Prieve Report in the sentence "A dent appears in the bottom accessory groove of the upper northeast facing window not consistent with hail" was present at The Property on October 9, 2024.</w:t>
       </w:r>
     </w:p>
     <w:p>
@@ -2564,7 +2611,7 @@
         <w:t xml:space="preserve">REQUEST FOR ADMISSION NO. 91:  </w:t>
       </w:r>
       <w:r>
-        <w:t>Admit that the dent described on page 5 of The Prieve Report in the sentence "A dent appears along the left accessory groove of the southeast facing window not consistent with hail" was present at The Property on October 9, 2024.</w:t>
+        <w:t xml:space="preserve">Admit that the dent described on page 5 of The Prieve Report in the sentence "A dent appears along the left accessory groove of the southeast facing window not consistent with hail" was present at The Property on October 9, 2024.</w:t>
       </w:r>
     </w:p>
     <w:p>
@@ -2581,7 +2628,7 @@
         <w:t xml:space="preserve">REQUEST FOR ADMISSION NO. 92:  </w:t>
       </w:r>
       <w:r>
-        <w:t>Admit that the dent described on page 5 of The Prieve Report in the sentence "Various scrape marks and a dent appear along the bottom frame of the center window not consistent with hail" was present at The Property on October 9, 2024.</w:t>
+        <w:t xml:space="preserve">Admit that the dent described on page 5 of The Prieve Report in the sentence "Various scrape marks and a dent appear along the bottom frame of the center window not consistent with hail" was present at The Property on October 9, 2024.</w:t>
       </w:r>
     </w:p>
     <w:p>
@@ -2598,7 +2645,7 @@
         <w:t xml:space="preserve">REQUEST FOR ADMISSION NO. 93:  </w:t>
       </w:r>
       <w:r>
-        <w:t>Admit that the dents described on page 5 of The Prieve Report in the sentence "Dents with scrape marks appear at the lower left corner of the sash of the northeast facing window not consistent with hail" were present at The Property on October 9, 2024.</w:t>
+        <w:t xml:space="preserve">Admit that the dents described on page 5 of The Prieve Report in the sentence "Dents with scrape marks appear at the lower left corner of the sash of the northeast facing window not consistent with hail" were present at The Property on October 9, 2024.</w:t>
       </w:r>
     </w:p>
     <w:p>
@@ -2615,7 +2662,7 @@
         <w:t xml:space="preserve">REQUEST FOR ADMISSION NO. 94:  </w:t>
       </w:r>
       <w:r>
-        <w:t>Admit that the dent described on page 5 of The Prieve Report in the sentence "A dent appears along the bottom accessory groove not consistent with hail" was present at The Property on October 9, 2024.</w:t>
+        <w:t xml:space="preserve">Admit that the dent described on page 5 of The Prieve Report in the sentence "A dent appears along the bottom accessory groove not consistent with hail" was present at The Property on October 9, 2024.</w:t>
       </w:r>
     </w:p>
     <w:p>
@@ -2632,7 +2679,7 @@
         <w:t xml:space="preserve">REQUEST FOR ADMISSION NO. 95:  </w:t>
       </w:r>
       <w:r>
-        <w:t>Admit that the dent described on page 5 of The Prieve Report in the sentence "A similar dent appears along the left side as shown in photograph A-163 not consistent with hail" was present at The Property on October 9, 2024.</w:t>
+        <w:t xml:space="preserve">Admit that the dent described on page 5 of The Prieve Report in the sentence "A similar dent appears along the left side as shown in photograph A-163 not consistent with hail" was present at The Property on October 9, 2024.</w:t>
       </w:r>
     </w:p>
     <w:p>
@@ -2649,25 +2696,24 @@
         <w:t xml:space="preserve">REQUEST FOR ADMISSION NO. 96:  </w:t>
       </w:r>
       <w:r>
-        <w:t>Admit that the dents described on page 5 of The Prieve Report in the sentence "Scrape marks and dents with sharp marks appear at the southeast facing window as shown in photographs A-165 and A-166" were present at The Property on October 9, 2024.</w:t>
-      </w:r>
-    </w:p>
-    <w:p>
-      <w:pPr>
-        <w:keepLines/>
-        <w:spacing w:after="160"/>
-        <w:ind w:left="720" w:hanging="576"/>
-      </w:pPr>
-      <w:r>
-        <w:rPr>
-          <w:b/>
-          <w:bCs/>
-        </w:rPr>
-        <w:lastRenderedPageBreak/>
+        <w:t xml:space="preserve">Admit that the dents described on page 5 of The Prieve Report in the sentence "Scrape marks and dents with sharp marks appear at the southeast facing window as shown in photographs A-165 and A-166" were present at The Property on October 9, 2024.</w:t>
+      </w:r>
+    </w:p>
+    <w:p>
+      <w:pPr>
+        <w:keepLines/>
+        <w:spacing w:after="160"/>
+        <w:ind w:left="720" w:hanging="576"/>
+      </w:pPr>
+      <w:r>
+        <w:rPr>
+          <w:b/>
+          <w:bCs/>
+        </w:rPr>
         <w:t xml:space="preserve">REQUEST FOR ADMISSION NO. 97:  </w:t>
       </w:r>
       <w:r>
-        <w:t>Admit that the dent described on page 5 of The Prieve Report in the sentence "A dent was observed along the bottom accessory groove of the northeast facing window as shown in photograph A-174" was present at The Property on October 9, 2024.</w:t>
+        <w:t xml:space="preserve">Admit that the dent described on page 5 of The Prieve Report in the sentence "A dent was observed along the bottom accessory groove of the northeast facing window as shown in photograph A-174" was present at The Property on October 9, 2024.</w:t>
       </w:r>
     </w:p>
     <w:p>
@@ -2684,7 +2730,7 @@
         <w:t xml:space="preserve">REQUEST FOR ADMISSION NO. 98:  </w:t>
       </w:r>
       <w:r>
-        <w:t>Admit that the dents described on page 5 of The Prieve Report in the sentence "Two dents appear at the lower left corner of the left casement which are generally smooth" were present at The Property on October 9, 2024.</w:t>
+        <w:t xml:space="preserve">Admit that the dents described on page 5 of The Prieve Report in the sentence "Two dents appear at the lower left corner of the left casement which are generally smooth" were present at The Property on October 9, 2024.</w:t>
       </w:r>
     </w:p>
     <w:p>
@@ -2701,7 +2747,7 @@
         <w:t xml:space="preserve">REQUEST FOR ADMISSION NO. 99:  </w:t>
       </w:r>
       <w:r>
-        <w:t>Admit that the dent described on page 5 of The Prieve Report in the sentence "A dent appears in the bottom accessory groove of the window not consistent with hail" was present at The Property on October 9, 2024.</w:t>
+        <w:t xml:space="preserve">Admit that the dent described on page 5 of The Prieve Report in the sentence "A dent appears in the bottom accessory groove of the window not consistent with hail" was present at The Property on October 9, 2024.</w:t>
       </w:r>
     </w:p>
     <w:p>
@@ -2718,7 +2764,7 @@
         <w:t xml:space="preserve">REQUEST FOR ADMISSION NO. 100:  </w:t>
       </w:r>
       <w:r>
-        <w:t>Admit that the dent described on page 5 of The Prieve Report in the sentence "A scrape mark and dent appear at the right side of the east facing window not consistent with hail" was present at The Property on October 9, 2024.</w:t>
+        <w:t xml:space="preserve">Admit that the dent described on page 5 of The Prieve Report in the sentence "A scrape mark and dent appear at the right side of the east facing window not consistent with hail" was present at The Property on October 9, 2024.</w:t>
       </w:r>
     </w:p>
     <w:p>
@@ -2735,7 +2781,7 @@
         <w:t xml:space="preserve">REQUEST FOR ADMISSION NO. 101:  </w:t>
       </w:r>
       <w:r>
-        <w:t>Admit that the dent described on page 6 of The Prieve Report in the sentence "A dent appears in the left accessory groove similar to those observed elsewhere" was present at The Property on October 9, 2024.</w:t>
+        <w:t xml:space="preserve">Admit that the dent described on page 6 of The Prieve Report in the sentence "A dent appears in the left accessory groove similar to those observed elsewhere" was present at The Property on October 9, 2024.</w:t>
       </w:r>
     </w:p>
     <w:p>
@@ -2752,7 +2798,7 @@
         <w:t xml:space="preserve">REQUEST FOR ADMISSION NO. 102:  </w:t>
       </w:r>
       <w:r>
-        <w:t>Admit that the dent described on page 6 of The Prieve Report in the sentence "A dent appears in the left accessory groove at the lower corner of the window" was present at The Property on October 9, 2024.</w:t>
+        <w:t xml:space="preserve">Admit that the dent described on page 6 of The Prieve Report in the sentence "A dent appears in the left accessory groove at the lower corner of the window" was present at The Property on October 9, 2024.</w:t>
       </w:r>
     </w:p>
     <w:p>
@@ -2769,7 +2815,7 @@
         <w:t xml:space="preserve">REQUEST FOR ADMISSION NO. 103:  </w:t>
       </w:r>
       <w:r>
-        <w:t>Admit that The Prieve Report does not identify any object, other than hail, that caused any dent or indentation described in The Prieve Report.</w:t>
+        <w:t xml:space="preserve">Admit that The Prieve Report does not identify any object, other than hail, that caused any dent or indentation described in The Prieve Report.</w:t>
       </w:r>
     </w:p>
     <w:p>
@@ -2786,7 +2832,7 @@
         <w:t xml:space="preserve">REQUEST FOR ADMISSION NO. 104:  </w:t>
       </w:r>
       <w:r>
-        <w:t>Admit that The Prieve Report does not identify when, how, or by whom any dent described in The Prieve Report was caused "during or following installation of windows."</w:t>
+        <w:t xml:space="preserve">Admit that The Prieve Report does not identify when, how, or by whom any dent described in The Prieve Report was caused "during or following installation of windows."</w:t>
       </w:r>
     </w:p>
     <w:p>
@@ -2803,7 +2849,7 @@
         <w:t xml:space="preserve">REQUEST FOR ADMISSION NO. 105:  </w:t>
       </w:r>
       <w:r>
-        <w:t>Admit that The Prieve Report does not state the size of any hailstone that fell at The Property on July 13 or 14, 2024.</w:t>
+        <w:t xml:space="preserve">Admit that The Prieve Report does not state the size of any hailstone that fell at The Property on July 13 or 14, 2024.</w:t>
       </w:r>
     </w:p>
     <w:p>
@@ -2820,7 +2866,7 @@
         <w:t xml:space="preserve">REQUEST FOR ADMISSION NO. 106:  </w:t>
       </w:r>
       <w:r>
-        <w:t>Admit that The Prieve Report does not state the minimum hailstone size required to dent the window frames or sashes at The Property.</w:t>
+        <w:t xml:space="preserve">Admit that The Prieve Report does not state the minimum hailstone size required to dent the window frames or sashes at The Property.</w:t>
       </w:r>
     </w:p>
     <w:p>
@@ -2836,7 +2882,7 @@
           <w:i/>
           <w:iCs/>
         </w:rPr>
-        <w:t>J.  The 2020 Claim file and the dents recorded in The Prieve Report</w:t>
+        <w:t xml:space="preserve">J.  The 2020 Claim file and the dents recorded in The Prieve Report</w:t>
       </w:r>
     </w:p>
     <w:p>
@@ -2851,7 +2897,7 @@
           <w:i/>
           <w:iCs/>
         </w:rPr>
-        <w:t>Each Request in this section concerns Your claim file for The 2020 Claim and a dent or indentation identified by the sentence of The Prieve Report quoted in the Request. To be read with Requests Nos. 83 through 102 and 125 through 131.</w:t>
+        <w:t xml:space="preserve">Each Request in this section concerns Your claim file for The 2020 Claim and a dent or indentation identified by the sentence of The Prieve Report quoted in the Request. To be read with Requests Nos. 83 through 102 and 125 through 131.</w:t>
       </w:r>
     </w:p>
     <w:p>
@@ -2868,25 +2914,24 @@
         <w:t xml:space="preserve">REQUEST FOR ADMISSION NO. 107:  </w:t>
       </w:r>
       <w:r>
-        <w:t>Admit that no document in Your claim file for The 2020 Claim, including the inspection photographs dated October 13, 2020, records the dents described on page 4 of The Prieve Report in the sentence "Two dents with sharp marks/indentations appear long the left side of the left sash as shown in photograph A-45."</w:t>
-      </w:r>
-    </w:p>
-    <w:p>
-      <w:pPr>
-        <w:keepLines/>
-        <w:spacing w:after="160"/>
-        <w:ind w:left="720" w:hanging="576"/>
-      </w:pPr>
-      <w:r>
-        <w:rPr>
-          <w:b/>
-          <w:bCs/>
-        </w:rPr>
-        <w:lastRenderedPageBreak/>
+        <w:t xml:space="preserve">Admit that no document in Your claim file for The 2020 Claim, including the inspection photographs dated October 13, 2020, records the dents described on page 4 of The Prieve Report in the sentence "Two dents with sharp marks/indentations appear long the left side of the left sash as shown in photograph A-45."</w:t>
+      </w:r>
+    </w:p>
+    <w:p>
+      <w:pPr>
+        <w:keepLines/>
+        <w:spacing w:after="160"/>
+        <w:ind w:left="720" w:hanging="576"/>
+      </w:pPr>
+      <w:r>
+        <w:rPr>
+          <w:b/>
+          <w:bCs/>
+        </w:rPr>
         <w:t xml:space="preserve">REQUEST FOR ADMISSION NO. 108:  </w:t>
       </w:r>
       <w:r>
-        <w:t>Admit that no document in Your claim file for The 2020 Claim, including the inspection photographs dated October 13, 2020, records the dent described on page 4 of The Prieve Report in the sentence "A dent appears in a window sash with a scrape mark present inside the dent as shown in photograph A-64."</w:t>
+        <w:t xml:space="preserve">Admit that no document in Your claim file for The 2020 Claim, including the inspection photographs dated October 13, 2020, records the dent described on page 4 of The Prieve Report in the sentence "A dent appears in a window sash with a scrape mark present inside the dent as shown in photograph A-64."</w:t>
       </w:r>
     </w:p>
     <w:p>
@@ -2903,7 +2948,7 @@
         <w:t xml:space="preserve">REQUEST FOR ADMISSION NO. 109:  </w:t>
       </w:r>
       <w:r>
-        <w:t>Admit that no document in Your claim file for The 2020 Claim, including the inspection photographs dated October 13, 2020, records the dent described on page 5 of The Prieve Report in the sentence "A dent with scrape marks was observed in the frame of the upper southeast facing window as shown in photograph A-107."</w:t>
+        <w:t xml:space="preserve">Admit that no document in Your claim file for The 2020 Claim, including the inspection photographs dated October 13, 2020, records the dent described on page 5 of The Prieve Report in the sentence "A dent with scrape marks was observed in the frame of the upper southeast facing window as shown in photograph A-107."</w:t>
       </w:r>
     </w:p>
     <w:p>
@@ -2920,7 +2965,7 @@
         <w:t xml:space="preserve">REQUEST FOR ADMISSION NO. 110:  </w:t>
       </w:r>
       <w:r>
-        <w:t>Admit that no document in Your claim file for The 2020 Claim, including the inspection photographs dated October 13, 2020, records the indentation described on page 5 of The Prieve Report in the sentence "An indentation appears on the left side of the center window accessory groove not consistent with hail along with a mark in the frame with loss of finishes as shown in photograph A-113."</w:t>
+        <w:t xml:space="preserve">Admit that no document in Your claim file for The 2020 Claim, including the inspection photographs dated October 13, 2020, records the indentation described on page 5 of The Prieve Report in the sentence "An indentation appears on the left side of the center window accessory groove not consistent with hail along with a mark in the frame with loss of finishes as shown in photograph A-113."</w:t>
       </w:r>
     </w:p>
     <w:p>
@@ -2937,7 +2982,7 @@
         <w:t xml:space="preserve">REQUEST FOR ADMISSION NO. 111:  </w:t>
       </w:r>
       <w:r>
-        <w:t>Admit that no document in Your claim file for The 2020 Claim, including the inspection photographs dated October 13, 2020, records the dents described on page 5 of The Prieve Report in the sentence "Two dents appear in the face of the sash at the lower left corner of the main window with scrape marks present inside and around areas of dents."</w:t>
+        <w:t xml:space="preserve">Admit that no document in Your claim file for The 2020 Claim, including the inspection photographs dated October 13, 2020, records the dents described on page 5 of The Prieve Report in the sentence "Two dents appear in the face of the sash at the lower left corner of the main window with scrape marks present inside and around areas of dents."</w:t>
       </w:r>
     </w:p>
     <w:p>
@@ -2954,7 +2999,7 @@
         <w:t xml:space="preserve">REQUEST FOR ADMISSION NO. 112:  </w:t>
       </w:r>
       <w:r>
-        <w:t>Admit that no document in Your claim file for The 2020 Claim, including the inspection photographs dated October 13, 2020, records the dent described on page 5 of The Prieve Report in the sentence "A dent with marks present appears in the face of the drip cap of the upper center window unit."</w:t>
+        <w:t xml:space="preserve">Admit that no document in Your claim file for The 2020 Claim, including the inspection photographs dated October 13, 2020, records the dent described on page 5 of The Prieve Report in the sentence "A dent with marks present appears in the face of the drip cap of the upper center window unit."</w:t>
       </w:r>
     </w:p>
     <w:p>
@@ -2971,7 +3016,7 @@
         <w:t xml:space="preserve">REQUEST FOR ADMISSION NO. 113:  </w:t>
       </w:r>
       <w:r>
-        <w:t>Admit that no document in Your claim file for The 2020 Claim, including the inspection photographs dated October 13, 2020, records the dent described on page 5 of The Prieve Report in the sentence "A dent appears in the bottom accessory groove of the upper northeast facing window not consistent with hail."</w:t>
+        <w:t xml:space="preserve">Admit that no document in Your claim file for The 2020 Claim, including the inspection photographs dated October 13, 2020, records the dent described on page 5 of The Prieve Report in the sentence "A dent appears in the bottom accessory groove of the upper northeast facing window not consistent with hail."</w:t>
       </w:r>
     </w:p>
     <w:p>
@@ -2988,7 +3033,7 @@
         <w:t xml:space="preserve">REQUEST FOR ADMISSION NO. 114:  </w:t>
       </w:r>
       <w:r>
-        <w:t>Admit that no document in Your claim file for The 2020 Claim, including the inspection photographs dated October 13, 2020, records the dent described on page 5 of The Prieve Report in the sentence "A dent appears along the left accessory groove of the southeast facing window not consistent with hail."</w:t>
+        <w:t xml:space="preserve">Admit that no document in Your claim file for The 2020 Claim, including the inspection photographs dated October 13, 2020, records the dent described on page 5 of The Prieve Report in the sentence "A dent appears along the left accessory groove of the southeast facing window not consistent with hail."</w:t>
       </w:r>
     </w:p>
     <w:p>
@@ -3005,7 +3050,7 @@
         <w:t xml:space="preserve">REQUEST FOR ADMISSION NO. 115:  </w:t>
       </w:r>
       <w:r>
-        <w:t>Admit that no document in Your claim file for The 2020 Claim, including the inspection photographs dated October 13, 2020, records the dent described on page 5 of The Prieve Report in the sentence "Various scrape marks and a dent appear along the bottom frame of the center window not consistent with hail."</w:t>
+        <w:t xml:space="preserve">Admit that no document in Your claim file for The 2020 Claim, including the inspection photographs dated October 13, 2020, records the dent described on page 5 of The Prieve Report in the sentence "Various scrape marks and a dent appear along the bottom frame of the center window not consistent with hail."</w:t>
       </w:r>
     </w:p>
     <w:p>
@@ -3022,25 +3067,24 @@
         <w:t xml:space="preserve">REQUEST FOR ADMISSION NO. 116:  </w:t>
       </w:r>
       <w:r>
-        <w:t>Admit that no document in Your claim file for The 2020 Claim, including the inspection photographs dated October 13, 2020, records the dents described on page 5 of The Prieve Report in the sentence "Dents with scrape marks appear at the lower left corner of the sash of the northeast facing window not consistent with hail."</w:t>
-      </w:r>
-    </w:p>
-    <w:p>
-      <w:pPr>
-        <w:keepLines/>
-        <w:spacing w:after="160"/>
-        <w:ind w:left="720" w:hanging="576"/>
-      </w:pPr>
-      <w:r>
-        <w:rPr>
-          <w:b/>
-          <w:bCs/>
-        </w:rPr>
-        <w:lastRenderedPageBreak/>
+        <w:t xml:space="preserve">Admit that no document in Your claim file for The 2020 Claim, including the inspection photographs dated October 13, 2020, records the dents described on page 5 of The Prieve Report in the sentence "Dents with scrape marks appear at the lower left corner of the sash of the northeast facing window not consistent with hail."</w:t>
+      </w:r>
+    </w:p>
+    <w:p>
+      <w:pPr>
+        <w:keepLines/>
+        <w:spacing w:after="160"/>
+        <w:ind w:left="720" w:hanging="576"/>
+      </w:pPr>
+      <w:r>
+        <w:rPr>
+          <w:b/>
+          <w:bCs/>
+        </w:rPr>
         <w:t xml:space="preserve">REQUEST FOR ADMISSION NO. 117:  </w:t>
       </w:r>
       <w:r>
-        <w:t>Admit that no document in Your claim file for The 2020 Claim, including the inspection photographs dated October 13, 2020, records the dent described on page 5 of The Prieve Report in the sentence "A dent appears along the bottom accessory groove not consistent with hail."</w:t>
+        <w:t xml:space="preserve">Admit that no document in Your claim file for The 2020 Claim, including the inspection photographs dated October 13, 2020, records the dent described on page 5 of The Prieve Report in the sentence "A dent appears along the bottom accessory groove not consistent with hail."</w:t>
       </w:r>
     </w:p>
     <w:p>
@@ -3057,7 +3101,7 @@
         <w:t xml:space="preserve">REQUEST FOR ADMISSION NO. 118:  </w:t>
       </w:r>
       <w:r>
-        <w:t>Admit that no document in Your claim file for The 2020 Claim, including the inspection photographs dated October 13, 2020, records the dent described on page 5 of The Prieve Report in the sentence "A similar dent appears along the left side as shown in photograph A-163 not consistent with hail."</w:t>
+        <w:t xml:space="preserve">Admit that no document in Your claim file for The 2020 Claim, including the inspection photographs dated October 13, 2020, records the dent described on page 5 of The Prieve Report in the sentence "A similar dent appears along the left side as shown in photograph A-163 not consistent with hail."</w:t>
       </w:r>
     </w:p>
     <w:p>
@@ -3074,7 +3118,7 @@
         <w:t xml:space="preserve">REQUEST FOR ADMISSION NO. 119:  </w:t>
       </w:r>
       <w:r>
-        <w:t>Admit that no document in Your claim file for The 2020 Claim, including the inspection photographs dated October 13, 2020, records the dents described on page 5 of The Prieve Report in the sentence "Scrape marks and dents with sharp marks appear at the southeast facing window as shown in photographs A-165 and A-166."</w:t>
+        <w:t xml:space="preserve">Admit that no document in Your claim file for The 2020 Claim, including the inspection photographs dated October 13, 2020, records the dents described on page 5 of The Prieve Report in the sentence "Scrape marks and dents with sharp marks appear at the southeast facing window as shown in photographs A-165 and A-166."</w:t>
       </w:r>
     </w:p>
     <w:p>
@@ -3091,7 +3135,7 @@
         <w:t xml:space="preserve">REQUEST FOR ADMISSION NO. 120:  </w:t>
       </w:r>
       <w:r>
-        <w:t>Admit that no document in Your claim file for The 2020 Claim, including the inspection photographs dated October 13, 2020, records the dent described on page 5 of The Prieve Report in the sentence "A dent was observed along the bottom accessory groove of the northeast facing window as shown in photograph A-174."</w:t>
+        <w:t xml:space="preserve">Admit that no document in Your claim file for The 2020 Claim, including the inspection photographs dated October 13, 2020, records the dent described on page 5 of The Prieve Report in the sentence "A dent was observed along the bottom accessory groove of the northeast facing window as shown in photograph A-174."</w:t>
       </w:r>
     </w:p>
     <w:p>
@@ -3108,7 +3152,7 @@
         <w:t xml:space="preserve">REQUEST FOR ADMISSION NO. 121:  </w:t>
       </w:r>
       <w:r>
-        <w:t>Admit that no document in Your claim file for The 2020 Claim, including the inspection photographs dated October 13, 2020, records the dent described on page 5 of The Prieve Report in the sentence "A dent appears in the bottom accessory groove of the window not consistent with hail."</w:t>
+        <w:t xml:space="preserve">Admit that no document in Your claim file for The 2020 Claim, including the inspection photographs dated October 13, 2020, records the dent described on page 5 of The Prieve Report in the sentence "A dent appears in the bottom accessory groove of the window not consistent with hail."</w:t>
       </w:r>
     </w:p>
     <w:p>
@@ -3125,7 +3169,7 @@
         <w:t xml:space="preserve">REQUEST FOR ADMISSION NO. 122:  </w:t>
       </w:r>
       <w:r>
-        <w:t>Admit that no document in Your claim file for The 2020 Claim, including the inspection photographs dated October 13, 2020, records the dent described on page 5 of The Prieve Report in the sentence "A scrape mark and dent appear at the right side of the east facing window not consistent with hail."</w:t>
+        <w:t xml:space="preserve">Admit that no document in Your claim file for The 2020 Claim, including the inspection photographs dated October 13, 2020, records the dent described on page 5 of The Prieve Report in the sentence "A scrape mark and dent appear at the right side of the east facing window not consistent with hail."</w:t>
       </w:r>
     </w:p>
     <w:p>
@@ -3142,7 +3186,7 @@
         <w:t xml:space="preserve">REQUEST FOR ADMISSION NO. 123:  </w:t>
       </w:r>
       <w:r>
-        <w:t>Admit that no document in Your claim file for The 2020 Claim, including the inspection photographs dated October 13, 2020, records the dent described on page 6 of The Prieve Report in the sentence "A dent appears in the left accessory groove similar to those observed elsewhere."</w:t>
+        <w:t xml:space="preserve">Admit that no document in Your claim file for The 2020 Claim, including the inspection photographs dated October 13, 2020, records the dent described on page 6 of The Prieve Report in the sentence "A dent appears in the left accessory groove similar to those observed elsewhere."</w:t>
       </w:r>
     </w:p>
     <w:p>
@@ -3159,7 +3203,7 @@
         <w:t xml:space="preserve">REQUEST FOR ADMISSION NO. 124:  </w:t>
       </w:r>
       <w:r>
-        <w:t>Admit that no document in Your claim file for The 2020 Claim, including the inspection photographs dated October 13, 2020, records the dent described on page 6 of The Prieve Report in the sentence "A dent appears in the left accessory groove at the lower corner of the window."</w:t>
+        <w:t xml:space="preserve">Admit that no document in Your claim file for The 2020 Claim, including the inspection photographs dated October 13, 2020, records the dent described on page 6 of The Prieve Report in the sentence "A dent appears in the left accessory groove at the lower corner of the window."</w:t>
       </w:r>
     </w:p>
     <w:p>
@@ -3175,7 +3219,7 @@
           <w:i/>
           <w:iCs/>
         </w:rPr>
-        <w:t>K.  The 2020 Claim</w:t>
+        <w:t xml:space="preserve">K.  The 2020 Claim</w:t>
       </w:r>
     </w:p>
     <w:p>
@@ -3192,25 +3236,24 @@
         <w:t xml:space="preserve">REQUEST FOR ADMISSION NO. 125:  </w:t>
       </w:r>
       <w:r>
-        <w:t>Admit that line item 1 of Your February 18, 2022 estimate for The 2020 Claim (estimate "YIBIAO_LU2") reads "R&amp;R Wood window - casement, 12-23 sf" and states a quantity of 2.00 EA.</w:t>
-      </w:r>
-    </w:p>
-    <w:p>
-      <w:pPr>
-        <w:keepLines/>
-        <w:spacing w:after="160"/>
-        <w:ind w:left="720" w:hanging="576"/>
-      </w:pPr>
-      <w:r>
-        <w:rPr>
-          <w:b/>
-          <w:bCs/>
-        </w:rPr>
-        <w:lastRenderedPageBreak/>
+        <w:t xml:space="preserve">Admit that line item 1 of Your February 18, 2022 estimate for The 2020 Claim (estimate "YIBIAO_LU2") reads "R&amp;R Wood window - casement, 12-23 sf" and states a quantity of 2.00 EA.</w:t>
+      </w:r>
+    </w:p>
+    <w:p>
+      <w:pPr>
+        <w:keepLines/>
+        <w:spacing w:after="160"/>
+        <w:ind w:left="720" w:hanging="576"/>
+      </w:pPr>
+      <w:r>
+        <w:rPr>
+          <w:b/>
+          <w:bCs/>
+        </w:rPr>
         <w:t xml:space="preserve">REQUEST FOR ADMISSION NO. 126:  </w:t>
       </w:r>
       <w:r>
-        <w:t>Admit that the only line items in Your February 18, 2022 estimate for The 2020 Claim (estimate "YIBIAO_LU2") that refer to windows are line items 1 ("R&amp;R Wood window - casement, 12-23 sf"), 2 ("Window blind - horizontal or vertical - Detach &amp; reset"), 3 ("Additional charge for a retrofit window, 24-40 sf"), and 32 ("Window treatment repair").</w:t>
+        <w:t xml:space="preserve">Admit that the only line items in Your February 18, 2022 estimate for The 2020 Claim (estimate "YIBIAO_LU2") that refer to windows are line items 1 ("R&amp;R Wood window - casement, 12-23 sf"), 2 ("Window blind - horizontal or vertical - Detach &amp; reset"), 3 ("Additional charge for a retrofit window, 24-40 sf"), and 32 ("Window treatment repair").</w:t>
       </w:r>
     </w:p>
     <w:p>
@@ -3227,7 +3270,7 @@
         <w:t xml:space="preserve">REQUEST FOR ADMISSION NO. 127:  </w:t>
       </w:r>
       <w:r>
-        <w:t>Admit that Your February 18, 2022 estimate for The 2020 Claim (estimate "YIBIAO_LU2") states "Type of Loss: Hail."</w:t>
+        <w:t xml:space="preserve">Admit that Your February 18, 2022 estimate for The 2020 Claim (estimate "YIBIAO_LU2") states "Type of Loss: Hail."</w:t>
       </w:r>
     </w:p>
     <w:p>
@@ -3244,7 +3287,7 @@
         <w:t xml:space="preserve">REQUEST FOR ADMISSION NO. 128:  </w:t>
       </w:r>
       <w:r>
-        <w:t>Admit that You made payment to Plaintiff Yibiao Lu on The 2020 Claim.</w:t>
+        <w:t xml:space="preserve">Admit that You made payment to Plaintiff Yibiao Lu on The 2020 Claim.</w:t>
       </w:r>
     </w:p>
     <w:p>
@@ -3261,7 +3304,7 @@
         <w:t xml:space="preserve">REQUEST FOR ADMISSION NO. 129:  </w:t>
       </w:r>
       <w:r>
-        <w:t>Admit that Your February 18, 2022 estimate for The 2020 Claim (estimate "YIBIAO_LU2") does not identify the location at The Property of the item or items addressed by line item 1.</w:t>
+        <w:t xml:space="preserve">Admit that Your February 18, 2022 estimate for The 2020 Claim (estimate "YIBIAO_LU2") does not identify the location at The Property of the item or items addressed by line item 1.</w:t>
       </w:r>
     </w:p>
     <w:p>
@@ -3278,7 +3321,7 @@
         <w:t xml:space="preserve">REQUEST FOR ADMISSION NO. 130:  </w:t>
       </w:r>
       <w:r>
-        <w:t>Admit that Your claim file for The 2020 Claim, including any inspection photographs dated October 13, 2020, identifies no dented window or sash at The Property other than the items addressed by line item 1 ("R&amp;R Wood window - casement, 12-23 sf") of Your February 18, 2022 estimate for The 2020 Claim (estimate "YIBIAO_LU2").</w:t>
+        <w:t xml:space="preserve">Admit that Your claim file for The 2020 Claim, including any inspection photographs dated October 13, 2020, identifies no dented window or sash at The Property other than the items addressed by line item 1 ("R&amp;R Wood window - casement, 12-23 sf") of Your February 18, 2022 estimate for The 2020 Claim (estimate "YIBIAO_LU2").</w:t>
       </w:r>
     </w:p>
     <w:p>
@@ -3295,7 +3338,7 @@
         <w:t xml:space="preserve">REQUEST FOR ADMISSION NO. 131:  </w:t>
       </w:r>
       <w:r>
-        <w:t>Admit that Your claim records for The Property identify no hail loss with a date of loss after September 5, 2020, other than The Claim.</w:t>
+        <w:t xml:space="preserve">Admit that Your claim records for The Property identify no hail loss with a date of loss after September 5, 2020, other than The Claim.</w:t>
       </w:r>
     </w:p>
     <w:p>
@@ -3311,7 +3354,7 @@
           <w:i/>
           <w:iCs/>
         </w:rPr>
-        <w:t>L.  The engineer-report requirement and Plaintiffs' submissions</w:t>
+        <w:t xml:space="preserve">L.  The engineer-report requirement and Plaintiffs' submissions</w:t>
       </w:r>
     </w:p>
     <w:p>
@@ -3328,7 +3371,7 @@
         <w:t xml:space="preserve">REQUEST FOR ADMISSION NO. 132:  </w:t>
       </w:r>
       <w:r>
-        <w:t>Admit that on February 3, 2025, Your field claim supervisor Bradlee Monson told Plaintiff Yibiao Lu that You would not review evidence unless it was provided by an engineer.</w:t>
+        <w:t xml:space="preserve">Admit that on February 3, 2025, Your field claim supervisor Bradlee Monson told Plaintiff Yibiao Lu that You would not review evidence unless it was provided by an engineer.</w:t>
       </w:r>
     </w:p>
     <w:p>
@@ -3345,7 +3388,7 @@
         <w:t xml:space="preserve">REQUEST FOR ADMISSION NO. 133:  </w:t>
       </w:r>
       <w:r>
-        <w:t>Admit that You received Plaintiffs' January 31, 2025 submission concerning post-2020 storm activity and gutter replacement.</w:t>
+        <w:t xml:space="preserve">Admit that You received Plaintiffs' January 31, 2025 submission concerning post-2020 storm activity and gutter replacement.</w:t>
       </w:r>
     </w:p>
     <w:p>
@@ -3362,7 +3405,7 @@
         <w:t xml:space="preserve">REQUEST FOR ADMISSION NO. 134:  </w:t>
       </w:r>
       <w:r>
-        <w:t>Admit that You received Plaintiffs' February 10, 2025 submission containing City of Eden Prairie permit records and a neighbor canvass.</w:t>
+        <w:t xml:space="preserve">Admit that You received Plaintiffs' February 10, 2025 submission containing City of Eden Prairie permit records and a neighbor canvass.</w:t>
       </w:r>
     </w:p>
     <w:p>
@@ -3379,7 +3422,7 @@
         <w:t xml:space="preserve">REQUEST FOR ADMISSION NO. 135:  </w:t>
       </w:r>
       <w:r>
-        <w:t>Admit that You received, directly or through Your agent Peter Pietila, Plaintiffs' May 28, 2025 submission containing National Weather Service and Interactive Hail Maps material.</w:t>
+        <w:t xml:space="preserve">Admit that You received, directly or through Your agent Peter Pietila, Plaintiffs' May 28, 2025 submission containing National Weather Service and Interactive Hail Maps material.</w:t>
       </w:r>
     </w:p>
     <w:p>
@@ -3396,7 +3439,7 @@
         <w:t xml:space="preserve">REQUEST FOR ADMISSION NO. 136:  </w:t>
       </w:r>
       <w:r>
-        <w:t>Admit that You did not reopen The Claim after receiving the submissions identified in the three preceding requests.</w:t>
+        <w:t xml:space="preserve">Admit that You did not reopen The Claim after receiving the submissions identified in the three preceding requests.</w:t>
       </w:r>
     </w:p>
     <w:p>
@@ -3412,7 +3455,7 @@
           <w:i/>
           <w:iCs/>
         </w:rPr>
-        <w:t>M.  Missing records and non-payment</w:t>
+        <w:t xml:space="preserve">M.  Missing records and non-payment</w:t>
       </w:r>
     </w:p>
     <w:p>
@@ -3429,7 +3472,7 @@
         <w:t xml:space="preserve">REQUEST FOR ADMISSION NO. 137:  </w:t>
       </w:r>
       <w:r>
-        <w:t>Admit that Your October 10, 2025 letter to Plaintiffs stated, "The file does not contain a report on the requested date."</w:t>
+        <w:t xml:space="preserve">Admit that Your October 10, 2025 letter to Plaintiffs stated, "The file does not contain a report on the requested date."</w:t>
       </w:r>
     </w:p>
     <w:p>
@@ -3446,25 +3489,24 @@
         <w:t xml:space="preserve">REQUEST FOR ADMISSION NO. 138:  </w:t>
       </w:r>
       <w:r>
-        <w:t>Admit that the "requested date" referred to in the statement quoted in the preceding request was September 6, 2024.</w:t>
-      </w:r>
-    </w:p>
-    <w:p>
-      <w:pPr>
-        <w:keepLines/>
-        <w:spacing w:after="160"/>
-        <w:ind w:left="720" w:hanging="576"/>
-      </w:pPr>
-      <w:r>
-        <w:rPr>
-          <w:b/>
-          <w:bCs/>
-        </w:rPr>
-        <w:lastRenderedPageBreak/>
+        <w:t xml:space="preserve">Admit that the "requested date" referred to in the statement quoted in the preceding request was September 6, 2024.</w:t>
+      </w:r>
+    </w:p>
+    <w:p>
+      <w:pPr>
+        <w:keepLines/>
+        <w:spacing w:after="160"/>
+        <w:ind w:left="720" w:hanging="576"/>
+      </w:pPr>
+      <w:r>
+        <w:rPr>
+          <w:b/>
+          <w:bCs/>
+        </w:rPr>
         <w:t xml:space="preserve">REQUEST FOR ADMISSION NO. 139:  </w:t>
       </w:r>
       <w:r>
-        <w:t>Admit that You have not produced to Plaintiffs any written report of Nicholas Brau's September 6, 2024 inspection.</w:t>
+        <w:t xml:space="preserve">Admit that You have not produced to Plaintiffs any written report of Nicholas Brau's September 6, 2024 inspection.</w:t>
       </w:r>
     </w:p>
     <w:p>
@@ -3481,7 +3523,7 @@
         <w:t xml:space="preserve">REQUEST FOR ADMISSION NO. 140:  </w:t>
       </w:r>
       <w:r>
-        <w:t>Admit that You have paid Plaintiffs nothing on The Claim.</w:t>
+        <w:t xml:space="preserve">Admit that You have paid Plaintiffs nothing on The Claim.</w:t>
       </w:r>
     </w:p>
     <w:p>
@@ -3494,7 +3536,7 @@
           <w:i/>
           <w:iCs/>
         </w:rPr>
-        <w:t>See also Request for Admission No. 27.</w:t>
+        <w:t xml:space="preserve">See also Request for Admission No. 27.</w:t>
       </w:r>
     </w:p>
     <w:p>
@@ -3511,7 +3553,7 @@
         <w:t xml:space="preserve">REQUEST FOR ADMISSION NO. 141:  </w:t>
       </w:r>
       <w:r>
-        <w:t>Admit that You have made no payment of any kind to any contractor, repair firm, or other third party for the repair or replacement of any part of The Property on account of the July 13, 2024 loss, including any payment for emergency or temporary repairs.</w:t>
+        <w:t xml:space="preserve">Admit that You have made no payment of any kind to any contractor, repair firm, or other third party for the repair or replacement of any part of The Property on account of the July 13, 2024 loss, including any payment for emergency or temporary repairs.</w:t>
       </w:r>
     </w:p>
     <w:p>
@@ -3527,7 +3569,7 @@
           <w:i/>
           <w:iCs/>
         </w:rPr>
-        <w:t>N.  Claim handlers and the September 6, 2024 inspection records</w:t>
+        <w:t xml:space="preserve">N.  Claim handlers and the September 6, 2024 inspection records</w:t>
       </w:r>
     </w:p>
     <w:p>
@@ -3542,7 +3584,7 @@
           <w:i/>
           <w:iCs/>
         </w:rPr>
-        <w:t>Requests 142 through 151 concern the persons who handled The Claim and the records of the September 6, 2024 inspection, and are to be read with Requests Nos. 8 through 12, 34, and 137 through 139.</w:t>
+        <w:t xml:space="preserve">Requests 142 through 151 concern the persons who handled The Claim and the records of the September 6, 2024 inspection, and are to be read with Requests Nos. 8 through 12, 34, and 137 through 139.</w:t>
       </w:r>
     </w:p>
     <w:p>
@@ -3559,7 +3601,7 @@
         <w:t xml:space="preserve">REQUEST FOR ADMISSION NO. 142:  </w:t>
       </w:r>
       <w:r>
-        <w:t>Admit that Christian Dudley acted on behalf of Fire Insurance Exchange in handling The Claim.</w:t>
+        <w:t xml:space="preserve">Admit that Christian Dudley acted on behalf of Fire Insurance Exchange in handling The Claim.</w:t>
       </w:r>
     </w:p>
     <w:p>
@@ -3576,7 +3618,7 @@
         <w:t xml:space="preserve">REQUEST FOR ADMISSION NO. 143:  </w:t>
       </w:r>
       <w:r>
-        <w:t>Admit that Nicholas Brau acted on behalf of Fire Insurance Exchange in handling The Claim.</w:t>
+        <w:t xml:space="preserve">Admit that Nicholas Brau acted on behalf of Fire Insurance Exchange in handling The Claim.</w:t>
       </w:r>
     </w:p>
     <w:p>
@@ -3593,7 +3635,7 @@
         <w:t xml:space="preserve">REQUEST FOR ADMISSION NO. 144:  </w:t>
       </w:r>
       <w:r>
-        <w:t>Admit that Bradlee Monson acted on behalf of Fire Insurance Exchange in handling The Claim.</w:t>
+        <w:t xml:space="preserve">Admit that Bradlee Monson acted on behalf of Fire Insurance Exchange in handling The Claim.</w:t>
       </w:r>
     </w:p>
     <w:p>
@@ -3610,7 +3652,7 @@
         <w:t xml:space="preserve">REQUEST FOR ADMISSION NO. 145:  </w:t>
       </w:r>
       <w:r>
-        <w:t>Admit that Zorphlon Miller acted on behalf of Fire Insurance Exchange in handling The Claim.</w:t>
+        <w:t xml:space="preserve">Admit that Zorphlon Miller acted on behalf of Fire Insurance Exchange in handling The Claim.</w:t>
       </w:r>
     </w:p>
     <w:p>
@@ -3627,7 +3669,7 @@
         <w:t xml:space="preserve">REQUEST FOR ADMISSION NO. 146:  </w:t>
       </w:r>
       <w:r>
-        <w:t>Admit that Jillian Bell acted on behalf of Fire Insurance Exchange in handling The Claim.</w:t>
+        <w:t xml:space="preserve">Admit that Jillian Bell acted on behalf of Fire Insurance Exchange in handling The Claim.</w:t>
       </w:r>
     </w:p>
     <w:p>
@@ -3644,7 +3686,7 @@
         <w:t xml:space="preserve">REQUEST FOR ADMISSION NO. 147:  </w:t>
       </w:r>
       <w:r>
-        <w:t>Admit that during the September 6, 2024 inspection of The Property, Nicholas Brau made handwritten notes, measurements, or sketches concerning the windows at The Property.</w:t>
+        <w:t xml:space="preserve">Admit that during the September 6, 2024 inspection of The Property, Nicholas Brau made handwritten notes, measurements, or sketches concerning the windows at The Property.</w:t>
       </w:r>
     </w:p>
     <w:p>
@@ -3661,7 +3703,7 @@
         <w:t xml:space="preserve">REQUEST FOR ADMISSION NO. 148:  </w:t>
       </w:r>
       <w:r>
-        <w:t>Admit that on October 29, 2025, notes, measurements, or sketches made by Nicholas Brau in connection with the September 6, 2024 inspection of The Property were in Your possession, custody, or control.</w:t>
+        <w:t xml:space="preserve">Admit that on October 29, 2025, notes, measurements, or sketches made by Nicholas Brau in connection with the September 6, 2024 inspection of The Property were in Your possession, custody, or control.</w:t>
       </w:r>
     </w:p>
     <w:p>
@@ -3678,7 +3720,7 @@
         <w:t xml:space="preserve">REQUEST FOR ADMISSION NO. 149:  </w:t>
       </w:r>
       <w:r>
-        <w:t>Admit that no document You have produced or released to Plaintiffs records Nicholas Brau's observations from the September 6, 2024 inspection of The Property.</w:t>
+        <w:t xml:space="preserve">Admit that no document You have produced or released to Plaintiffs records Nicholas Brau's observations from the September 6, 2024 inspection of The Property.</w:t>
       </w:r>
     </w:p>
     <w:p>
@@ -3695,25 +3737,24 @@
         <w:t xml:space="preserve">REQUEST FOR ADMISSION NO. 150:  </w:t>
       </w:r>
       <w:r>
-        <w:t>Admit that, as of September 6, 2024, You had not issued any litigation hold, preservation notice, or document-preservation instruction directing the preservation of documents concerning The Claim.</w:t>
-      </w:r>
-    </w:p>
-    <w:p>
-      <w:pPr>
-        <w:keepLines/>
-        <w:spacing w:after="160"/>
-        <w:ind w:left="720" w:hanging="576"/>
-      </w:pPr>
-      <w:r>
-        <w:rPr>
-          <w:b/>
-          <w:bCs/>
-        </w:rPr>
-        <w:lastRenderedPageBreak/>
+        <w:t xml:space="preserve">Admit that, as of September 6, 2024, You had not issued any litigation hold, preservation notice, or document-preservation instruction directing the preservation of documents concerning The Claim.</w:t>
+      </w:r>
+    </w:p>
+    <w:p>
+      <w:pPr>
+        <w:keepLines/>
+        <w:spacing w:after="160"/>
+        <w:ind w:left="720" w:hanging="576"/>
+      </w:pPr>
+      <w:r>
+        <w:rPr>
+          <w:b/>
+          <w:bCs/>
+        </w:rPr>
         <w:t xml:space="preserve">REQUEST FOR ADMISSION NO. 151:  </w:t>
       </w:r>
       <w:r>
-        <w:t>Admit that, as of November 4, 2024, You had not issued any litigation hold, preservation notice, or document-preservation instruction directing the preservation of documents concerning The Claim.</w:t>
+        <w:t xml:space="preserve">Admit that, as of November 4, 2024, You had not issued any litigation hold, preservation notice, or document-preservation instruction directing the preservation of documents concerning The Claim.</w:t>
       </w:r>
     </w:p>
     <w:p>
@@ -3729,7 +3770,7 @@
           <w:i/>
           <w:iCs/>
         </w:rPr>
-        <w:t>O.  The September 3, 2024 Denial Package and its photograph logs</w:t>
+        <w:t xml:space="preserve">O.  The September 3, 2024 Denial Package and its photograph logs</w:t>
       </w:r>
     </w:p>
     <w:p>
@@ -3746,7 +3787,7 @@
         <w:t xml:space="preserve">REQUEST FOR ADMISSION NO. 152:  </w:t>
       </w:r>
       <w:r>
-        <w:t>Admit that You sent The September 3, 2024 Denial Package to Plaintiffs on or about September 3, 2024.</w:t>
+        <w:t xml:space="preserve">Admit that You sent The September 3, 2024 Denial Package to Plaintiffs on or about September 3, 2024.</w:t>
       </w:r>
     </w:p>
     <w:p>
@@ -3763,7 +3804,7 @@
         <w:t xml:space="preserve">REQUEST FOR ADMISSION NO. 153:  </w:t>
       </w:r>
       <w:r>
-        <w:t>Admit that The First Photo Set and The Second Photo Set together contain 138 numbered photographs of The Property.</w:t>
+        <w:t xml:space="preserve">Admit that The First Photo Set and The Second Photo Set together contain 138 numbered photographs of The Property.</w:t>
       </w:r>
     </w:p>
     <w:p>
@@ -3780,7 +3821,7 @@
         <w:t xml:space="preserve">REQUEST FOR ADMISSION NO. 154:  </w:t>
       </w:r>
       <w:r>
-        <w:t>Admit that each of the 38 photographs in The First Photo Set bears a No-Damage Caption.</w:t>
+        <w:t xml:space="preserve">Admit that each of the 38 photographs in The First Photo Set bears a No-Damage Caption.</w:t>
       </w:r>
     </w:p>
     <w:p>
@@ -3797,7 +3838,7 @@
         <w:t xml:space="preserve">REQUEST FOR ADMISSION NO. 155:  </w:t>
       </w:r>
       <w:r>
-        <w:t>Admit that 94 of the 100 photographs in The Second Photo Set bear a No-Damage Caption.</w:t>
+        <w:t xml:space="preserve">Admit that 94 of the 100 photographs in The Second Photo Set bear a No-Damage Caption.</w:t>
       </w:r>
     </w:p>
     <w:p>
@@ -3814,7 +3855,7 @@
         <w:t xml:space="preserve">REQUEST FOR ADMISSION NO. 156:  </w:t>
       </w:r>
       <w:r>
-        <w:t>Admit that The Second Photo Set contains 34 photographs whose captions begin with the word "Siding."</w:t>
+        <w:t xml:space="preserve">Admit that The Second Photo Set contains 34 photographs whose captions begin with the word "Siding."</w:t>
       </w:r>
     </w:p>
     <w:p>
@@ -3831,7 +3872,7 @@
         <w:t xml:space="preserve">REQUEST FOR ADMISSION NO. 157:  </w:t>
       </w:r>
       <w:r>
-        <w:t>Admit that each photograph in The Second Photo Set whose caption begins with the word "Siding" bears a No-Damage Caption.</w:t>
+        <w:t xml:space="preserve">Admit that each photograph in The Second Photo Set whose caption begins with the word "Siding" bears a No-Damage Caption.</w:t>
       </w:r>
     </w:p>
     <w:p>
@@ -3848,7 +3889,7 @@
         <w:t xml:space="preserve">REQUEST FOR ADMISSION NO. 158:  </w:t>
       </w:r>
       <w:r>
-        <w:t>Admit that photographs numbered 98, 99, and 100 of The Second Photo Set are photographs of downspouts at The Property.</w:t>
+        <w:t xml:space="preserve">Admit that photographs numbered 98, 99, and 100 of The Second Photo Set are photographs of downspouts at The Property.</w:t>
       </w:r>
     </w:p>
     <w:p>
@@ -3865,7 +3906,7 @@
         <w:t xml:space="preserve">REQUEST FOR ADMISSION NO. 159:  </w:t>
       </w:r>
       <w:r>
-        <w:t>Admit that each of photographs numbered 98, 99, and 100 of The Second Photo Set bears a No-Damage Caption.</w:t>
+        <w:t xml:space="preserve">Admit that each of photographs numbered 98, 99, and 100 of The Second Photo Set bears a No-Damage Caption.</w:t>
       </w:r>
     </w:p>
     <w:p>
@@ -3882,7 +3923,7 @@
         <w:t xml:space="preserve">REQUEST FOR ADMISSION NO. 160:  </w:t>
       </w:r>
       <w:r>
-        <w:t>Admit that all of the photographs in The First Photo Set and The Second Photo Set were taken at the August 29, 2024 inspection of The Property performed by Hancock Claims Consultants.</w:t>
+        <w:t xml:space="preserve">Admit that all of the photographs in The First Photo Set and The Second Photo Set were taken at the August 29, 2024 inspection of The Property performed by Hancock Claims Consultants.</w:t>
       </w:r>
     </w:p>
     <w:p>
@@ -3899,7 +3940,7 @@
         <w:t xml:space="preserve">REQUEST FOR ADMISSION NO. 161:  </w:t>
       </w:r>
       <w:r>
-        <w:t>Admit that The First Photo Set and The Second Photo Set each contain photographs taken inside The Property.</w:t>
+        <w:t xml:space="preserve">Admit that The First Photo Set and The Second Photo Set each contain photographs taken inside The Property.</w:t>
       </w:r>
     </w:p>
     <w:p>
@@ -3916,7 +3957,7 @@
         <w:t xml:space="preserve">REQUEST FOR ADMISSION NO. 162:  </w:t>
       </w:r>
       <w:r>
-        <w:t>Admit that, in a No-Damage Caption, the underscore and numeral following the word "No" distinguish multiple photographs bearing the same underlying caption and do not denote a different condition, assessment, or finding.</w:t>
+        <w:t xml:space="preserve">Admit that, in a No-Damage Caption, the underscore and numeral following the word "No" distinguish multiple photographs bearing the same underlying caption and do not denote a different condition, assessment, or finding.</w:t>
       </w:r>
     </w:p>
     <w:p>
@@ -3933,7 +3974,7 @@
         <w:t xml:space="preserve">REQUEST FOR ADMISSION NO. 163:  </w:t>
       </w:r>
       <w:r>
-        <w:t>Admit that Your October 10, 2025 letter to Plaintiffs was signed by Zorphlon Miller, Senior General Claims Adjuster.</w:t>
+        <w:t xml:space="preserve">Admit that Your October 10, 2025 letter to Plaintiffs was signed by Zorphlon Miller, Senior General Claims Adjuster.</w:t>
       </w:r>
     </w:p>
     <w:p>
@@ -3950,7 +3991,7 @@
         <w:t xml:space="preserve">REQUEST FOR ADMISSION NO. 164:  </w:t>
       </w:r>
       <w:r>
-        <w:t>Admit that Your October 10, 2025 letter to Plaintiffs stated, "I have attached the coverage position and photos sent by Mr. Dudley."</w:t>
+        <w:t xml:space="preserve">Admit that Your October 10, 2025 letter to Plaintiffs stated, "I have attached the coverage position and photos sent by Mr. Dudley."</w:t>
       </w:r>
     </w:p>
     <w:p>
@@ -3966,7 +4007,7 @@
           <w:i/>
           <w:iCs/>
         </w:rPr>
-        <w:t>P.  The October 29, 2025 email</w:t>
+        <w:t xml:space="preserve">P.  The October 29, 2025 email</w:t>
       </w:r>
     </w:p>
     <w:p>
@@ -3983,25 +4024,24 @@
         <w:t xml:space="preserve">REQUEST FOR ADMISSION NO. 165:  </w:t>
       </w:r>
       <w:r>
-        <w:t>Admit that on October 29, 2025, Nicholas Brau sent Plaintiffs an electronic mail message stating, "All the information we can release has already been sent to you."</w:t>
-      </w:r>
-    </w:p>
-    <w:p>
-      <w:pPr>
-        <w:keepLines/>
-        <w:spacing w:after="160"/>
-        <w:ind w:left="720" w:hanging="576"/>
-      </w:pPr>
-      <w:r>
-        <w:rPr>
-          <w:b/>
-          <w:bCs/>
-        </w:rPr>
-        <w:lastRenderedPageBreak/>
+        <w:t xml:space="preserve">Admit that on October 29, 2025, Nicholas Brau sent Plaintiffs an electronic mail message stating, "All the information we can release has already been sent to you."</w:t>
+      </w:r>
+    </w:p>
+    <w:p>
+      <w:pPr>
+        <w:keepLines/>
+        <w:spacing w:after="160"/>
+        <w:ind w:left="720" w:hanging="576"/>
+      </w:pPr>
+      <w:r>
+        <w:rPr>
+          <w:b/>
+          <w:bCs/>
+        </w:rPr>
         <w:t xml:space="preserve">REQUEST FOR ADMISSION NO. 166:  </w:t>
       </w:r>
       <w:r>
-        <w:t>Admit that the message identified in the preceding request was sent from the address myadjuster@farmersinsurance.com and bore the subject line "Claim # 7007986837-1-1, Loss Date 07/13/2024, Important Claim Information [3CAB117Z3]."</w:t>
+        <w:t xml:space="preserve">Admit that the message identified in the preceding request was sent from the address myadjuster@farmersinsurance.com and bore the subject line "Claim # 7007986837-1-1, Loss Date 07/13/2024, Important Claim Information [3CAB117Z3]."</w:t>
       </w:r>
     </w:p>
     <w:p>
@@ -4018,13 +4058,7 @@
         <w:t xml:space="preserve">REQUEST FOR ADMISSION NO. 167:  </w:t>
       </w:r>
       <w:r>
-        <w:t>Admit that the message identified in Request No. 16</w:t>
-      </w:r>
-      <w:r>
-        <w:t>5</w:t>
-      </w:r>
-      <w:r>
-        <w:t xml:space="preserve"> was signed by Nicholas Brau, Claims Spec Rep Prop, Fire Insurance Exchange.</w:t>
+        <w:t xml:space="preserve">Admit that the message identified in Request No. 165 was signed by Nicholas Brau, Claims Spec Rep Prop, Fire Insurance Exchange.</w:t>
       </w:r>
     </w:p>
     <w:p>
@@ -4041,7 +4075,7 @@
         <w:t xml:space="preserve">REQUEST FOR ADMISSION NO. 168:  </w:t>
       </w:r>
       <w:r>
-        <w:t>Admit that, as of October 29, 2025, information relating to The Claim existed that You had not released to Plaintiffs.</w:t>
+        <w:t xml:space="preserve">Admit that, as of October 29, 2025, information relating to The Claim existed that You had not released to Plaintiffs.</w:t>
       </w:r>
     </w:p>
     <w:p>
@@ -4057,7 +4091,7 @@
           <w:i/>
           <w:iCs/>
         </w:rPr>
-        <w:t>Q.  The October 21, 2025 reply and the handling of post-appraisal correspondence</w:t>
+        <w:t xml:space="preserve">Q.  The October 21, 2025 reply and the handling of post-appraisal correspondence</w:t>
       </w:r>
     </w:p>
     <w:p>
@@ -4074,7 +4108,7 @@
         <w:t xml:space="preserve">REQUEST FOR ADMISSION NO. 169:  </w:t>
       </w:r>
       <w:r>
-        <w:t>Admit that Your October 21, 2025 electronic mail message to Plaintiffs was signed by Jillian Bell, Senior General Claims Adjuster, Fire Insurance Exchange.</w:t>
+        <w:t xml:space="preserve">Admit that Your October 21, 2025 electronic mail message to Plaintiffs was signed by Jillian Bell, Senior General Claims Adjuster, Fire Insurance Exchange.</w:t>
       </w:r>
     </w:p>
     <w:p>
@@ -4091,7 +4125,7 @@
         <w:t xml:space="preserve">REQUEST FOR ADMISSION NO. 170:  </w:t>
       </w:r>
       <w:r>
-        <w:t>Admit that Jillian Bell was employed or engaged by Fire Insurance Exchange on October 21, 2025.</w:t>
+        <w:t xml:space="preserve">Admit that Jillian Bell was employed or engaged by Fire Insurance Exchange on October 21, 2025.</w:t>
       </w:r>
     </w:p>
     <w:p>
@@ -4108,7 +4142,7 @@
         <w:t xml:space="preserve">REQUEST FOR ADMISSION NO. 171:  </w:t>
       </w:r>
       <w:r>
-        <w:t>Admit that the electronic mail address myadjuster@farmersinsurance.com is used by more than one of Your employees or representatives to communicate with policyholders.</w:t>
+        <w:t xml:space="preserve">Admit that the electronic mail address myadjuster@farmersinsurance.com is used by more than one of Your employees or representatives to communicate with policyholders.</w:t>
       </w:r>
     </w:p>
     <w:p>
@@ -4124,7 +4158,7 @@
           <w:i/>
           <w:iCs/>
         </w:rPr>
-        <w:t>R.  Party identity, agency, and the Hancock inspector</w:t>
+        <w:t xml:space="preserve">R.  Party identity, agency, and the Hancock inspector</w:t>
       </w:r>
     </w:p>
     <w:p>
@@ -4141,7 +4175,7 @@
         <w:t xml:space="preserve">REQUEST FOR ADMISSION NO. 172:  </w:t>
       </w:r>
       <w:r>
-        <w:t>Admit that Fire Insurance Exchange is the proper party defendant to this action.</w:t>
+        <w:t xml:space="preserve">Admit that You do not contend that any person should be the defendant in this action in place of Fire Insurance Exchange.</w:t>
       </w:r>
     </w:p>
     <w:p>
@@ -4158,7 +4192,7 @@
         <w:t xml:space="preserve">REQUEST FOR ADMISSION NO. 173:  </w:t>
       </w:r>
       <w:r>
-        <w:t>Admit that, in its dealings with Plaintiffs concerning The Policy and The Claim, Fire Insurance Exchange did business under the name "Farmers Insurance."</w:t>
+        <w:t xml:space="preserve">Admit that You do not contend that any person must be added as a defendant in this action.</w:t>
       </w:r>
     </w:p>
     <w:p>
@@ -4175,7 +4209,7 @@
         <w:t xml:space="preserve">REQUEST FOR ADMISSION NO. 174:  </w:t>
       </w:r>
       <w:r>
-        <w:t>Admit that Zorphlon Miller was employed or engaged by Fire Insurance Exchange on October 10, 2025.</w:t>
+        <w:t xml:space="preserve">Admit that You do not contend that Fire Insurance Exchange is misnamed or misdescribed in the caption of this action.</w:t>
       </w:r>
     </w:p>
     <w:p>
@@ -4192,7 +4226,7 @@
         <w:t xml:space="preserve">REQUEST FOR ADMISSION NO. 175:  </w:t>
       </w:r>
       <w:r>
-        <w:t>Admit that Peter Pietila acted as Your agent in connection with The Policy.</w:t>
+        <w:t xml:space="preserve">Admit that, in its dealings with Plaintiffs concerning The Policy and The Claim, Fire Insurance Exchange did business under the name "Farmers Insurance."</w:t>
       </w:r>
     </w:p>
     <w:p>
@@ -4209,7 +4243,7 @@
         <w:t xml:space="preserve">REQUEST FOR ADMISSION NO. 176:  </w:t>
       </w:r>
       <w:r>
-        <w:t>Admit that Jayden Grimm performed the August 29, 2024 inspection of The Property on behalf of Hancock Claims Consultants.</w:t>
+        <w:t xml:space="preserve">Admit that Zorphlon Miller was employed or engaged by Fire Insurance Exchange on October 10, 2025.</w:t>
       </w:r>
     </w:p>
     <w:p>
@@ -4226,7 +4260,41 @@
         <w:t xml:space="preserve">REQUEST FOR ADMISSION NO. 177:  </w:t>
       </w:r>
       <w:r>
-        <w:t>Admit that Jayden Grimm was the only person who inspected The Property on behalf of Hancock Claims Consultants on August 29, 2024.</w:t>
+        <w:t xml:space="preserve">Admit that Peter Pietila acted as Your agent in connection with The Policy.</w:t>
+      </w:r>
+    </w:p>
+    <w:p>
+      <w:pPr>
+        <w:keepLines/>
+        <w:spacing w:after="160"/>
+        <w:ind w:left="720" w:hanging="576"/>
+      </w:pPr>
+      <w:r>
+        <w:rPr>
+          <w:b/>
+          <w:bCs/>
+        </w:rPr>
+        <w:t xml:space="preserve">REQUEST FOR ADMISSION NO. 178:  </w:t>
+      </w:r>
+      <w:r>
+        <w:t xml:space="preserve">Admit that Jayden Grimm performed the August 29, 2024 inspection of The Property on behalf of Hancock Claims Consultants.</w:t>
+      </w:r>
+    </w:p>
+    <w:p>
+      <w:pPr>
+        <w:keepLines/>
+        <w:spacing w:after="160"/>
+        <w:ind w:left="720" w:hanging="576"/>
+      </w:pPr>
+      <w:r>
+        <w:rPr>
+          <w:b/>
+          <w:bCs/>
+        </w:rPr>
+        <w:t xml:space="preserve">REQUEST FOR ADMISSION NO. 179:  </w:t>
+      </w:r>
+      <w:r>
+        <w:t xml:space="preserve">Admit that Jayden Grimm was the only individual who inspected The Property on behalf of Hancock Claims Consultants on August 29, 2024.</w:t>
       </w:r>
     </w:p>
     <w:p>
@@ -4242,8 +4310,7 @@
           <w:i/>
           <w:iCs/>
         </w:rPr>
-        <w:lastRenderedPageBreak/>
-        <w:t>S.  The Policy's own provisions bearing on capacity, suit, and forum</w:t>
+        <w:t xml:space="preserve">S.  The Policy's own provisions bearing on capacity, suit, and forum</w:t>
       </w:r>
     </w:p>
     <w:p>
@@ -4258,41 +4325,7 @@
           <w:i/>
           <w:iCs/>
         </w:rPr>
-        <w:t>Relevant to Defendant's First Affirmative Defense, which alleges "there exists a lack of jurisdiction over Defendant FIE."</w:t>
-      </w:r>
-    </w:p>
-    <w:p>
-      <w:pPr>
-        <w:keepLines/>
-        <w:spacing w:after="160"/>
-        <w:ind w:left="720" w:hanging="576"/>
-      </w:pPr>
-      <w:r>
-        <w:rPr>
-          <w:b/>
-          <w:bCs/>
-        </w:rPr>
-        <w:t xml:space="preserve">REQUEST FOR ADMISSION NO. 178:  </w:t>
-      </w:r>
-      <w:r>
-        <w:t>Admit that The Policy Form, at "General Conditions Applying to The Entire Policy," provision 15 ("Reciprocal provisions"), states: "We may sue or be sued in our own name, as though we were an individual, if necessary to enforce any claims which arise under this policy."</w:t>
-      </w:r>
-    </w:p>
-    <w:p>
-      <w:pPr>
-        <w:keepLines/>
-        <w:spacing w:after="160"/>
-        <w:ind w:left="720" w:hanging="576"/>
-      </w:pPr>
-      <w:r>
-        <w:rPr>
-          <w:b/>
-          <w:bCs/>
-        </w:rPr>
-        <w:t xml:space="preserve">REQUEST FOR ADMISSION NO. 179:  </w:t>
-      </w:r>
-      <w:r>
-        <w:t>Admit that The Policy Form, at "General Conditions Applying to The Entire Policy," provision 15 ("Reciprocal provisions"), states: "In any suit against us, service of process shall be upon the Attorney-in-Fact as shown in your Subscription Agreement."</w:t>
+        <w:t xml:space="preserve">Relevant to Defendant's First Affirmative Defense, which alleges "there exists a lack of jurisdiction over Defendant FIE."</w:t>
       </w:r>
     </w:p>
     <w:p>
@@ -4309,7 +4342,7 @@
         <w:t xml:space="preserve">REQUEST FOR ADMISSION NO. 180:  </w:t>
       </w:r>
       <w:r>
-        <w:t>Admit that The Policy Form, at "General Conditions Applying to The Entire Policy," provision 11 ("What law will apply"), states: "The laws of the state where the residence premises is located shall govern any and all claims or disputes in any way related to this policy."</w:t>
+        <w:t xml:space="preserve">Admit that The Policy Form, at "General Conditions Applying to The Entire Policy," provision 15 ("Reciprocal provisions"), states: "We may sue or be sued in our own name, as though we were an individual, if necessary to enforce any claims which arise under this policy."</w:t>
       </w:r>
     </w:p>
     <w:p>
@@ -4326,7 +4359,7 @@
         <w:t xml:space="preserve">REQUEST FOR ADMISSION NO. 181:  </w:t>
       </w:r>
       <w:r>
-        <w:t>Admit that the text of The Policy Form in force on July 13, 2024 is identical to the text of Form 56-5543 2nd Edition (7-08) included in the "Home Insurance New Policy" documents for The Policy that You sent to Plaintiff Yibiao Lu under a cover letter dated December 8, 2014.</w:t>
+        <w:t xml:space="preserve">Admit that The Policy Form, at "General Conditions Applying to The Entire Policy," provision 15 ("Reciprocal provisions"), states: "In any suit against us, service of process shall be upon the Attorney-in-Fact as shown in your Subscription Agreement."</w:t>
       </w:r>
     </w:p>
     <w:p>
@@ -4343,7 +4376,7 @@
         <w:t xml:space="preserve">REQUEST FOR ADMISSION NO. 182:  </w:t>
       </w:r>
       <w:r>
-        <w:t>Admit that Fire Insurance Exchange was licensed by the Minnesota Department of Commerce to transact insurance business in Minnesota on July 13, 2024.</w:t>
+        <w:t xml:space="preserve">Admit that The Policy Form, at "General Conditions Applying to The Entire Policy," provision 11 ("What law will apply"), states: "The laws of the state where the residence premises is located shall govern any and all claims or disputes in any way related to this policy."</w:t>
       </w:r>
     </w:p>
     <w:p>
@@ -4360,7 +4393,7 @@
         <w:t xml:space="preserve">REQUEST FOR ADMISSION NO. 183:  </w:t>
       </w:r>
       <w:r>
-        <w:t>Admit that the Application for Insurance and Subscription Agreement executed by Plaintiff Yibiao Lu on October 21, 2014 in connection with The Policy designates Farmers Underwriters Association as attorney-in-fact.</w:t>
+        <w:t xml:space="preserve">Admit that the text of The Policy Form in force on July 13, 2024 is identical to the text of Form 56-5543 2nd Edition (7-08) included in the "Home Insurance New Policy" documents for The Policy that You sent to Plaintiff Yibiao Lu under a cover letter dated December 8, 2014.</w:t>
       </w:r>
     </w:p>
     <w:p>
@@ -4377,7 +4410,41 @@
         <w:t xml:space="preserve">REQUEST FOR ADMISSION NO. 184:  </w:t>
       </w:r>
       <w:r>
-        <w:t>Admit that the "Subscription Agreement Notice" included in Your renewal documents for The Policy for the policy period October 22, 2023 to October 22, 2024 designates Fire Underwriters Association as attorney-in-fact.</w:t>
+        <w:t xml:space="preserve">Admit that Fire Insurance Exchange was licensed by the Minnesota Department of Commerce to transact insurance business in Minnesota on July 13, 2024.</w:t>
+      </w:r>
+    </w:p>
+    <w:p>
+      <w:pPr>
+        <w:keepLines/>
+        <w:spacing w:after="160"/>
+        <w:ind w:left="720" w:hanging="576"/>
+      </w:pPr>
+      <w:r>
+        <w:rPr>
+          <w:b/>
+          <w:bCs/>
+        </w:rPr>
+        <w:t xml:space="preserve">REQUEST FOR ADMISSION NO. 185:  </w:t>
+      </w:r>
+      <w:r>
+        <w:t xml:space="preserve">Admit that the Application for Insurance and Subscription Agreement executed by Plaintiff Yibiao Lu on October 21, 2014 in connection with The Policy designates Farmers Underwriters Association as attorney-in-fact.</w:t>
+      </w:r>
+    </w:p>
+    <w:p>
+      <w:pPr>
+        <w:keepLines/>
+        <w:spacing w:after="160"/>
+        <w:ind w:left="720" w:hanging="576"/>
+      </w:pPr>
+      <w:r>
+        <w:rPr>
+          <w:b/>
+          <w:bCs/>
+        </w:rPr>
+        <w:t xml:space="preserve">REQUEST FOR ADMISSION NO. 186:  </w:t>
+      </w:r>
+      <w:r>
+        <w:t xml:space="preserve">Admit that the "Subscription Agreement Notice" included in Your renewal documents for The Policy for the policy period October 22, 2023 to October 22, 2024 designates Fire Underwriters Association as attorney-in-fact.</w:t>
       </w:r>
     </w:p>
     <w:p>
@@ -4393,7 +4460,7 @@
           <w:i/>
           <w:iCs/>
         </w:rPr>
-        <w:t>T.  Service of process and jurisdiction</w:t>
+        <w:t xml:space="preserve">T.  Service of process and jurisdiction</w:t>
       </w:r>
     </w:p>
     <w:p>
@@ -4408,59 +4475,58 @@
           <w:i/>
           <w:iCs/>
         </w:rPr>
-        <w:t>Relevant to Defendant's First Affirmative Defense, which alleges "there exists a lack of jurisdiction over Defendant FIE."</w:t>
-      </w:r>
-    </w:p>
-    <w:p>
-      <w:pPr>
-        <w:keepLines/>
-        <w:spacing w:after="160"/>
-        <w:ind w:left="720" w:hanging="576"/>
-      </w:pPr>
-      <w:r>
-        <w:rPr>
-          <w:b/>
-          <w:bCs/>
-        </w:rPr>
-        <w:t xml:space="preserve">REQUEST FOR ADMISSION NO. 185:  </w:t>
-      </w:r>
-      <w:r>
-        <w:t>Admit that service of the Summons and Complaint in this action upon Fire Insurance Exchange under Minn. Stat. § 45.028 was effective no later than July 8, 2026.</w:t>
-      </w:r>
-    </w:p>
-    <w:p>
-      <w:pPr>
-        <w:keepLines/>
-        <w:spacing w:after="160"/>
-        <w:ind w:left="720" w:hanging="576"/>
-      </w:pPr>
-      <w:r>
-        <w:rPr>
-          <w:b/>
-          <w:bCs/>
-        </w:rPr>
-        <w:t xml:space="preserve">REQUEST FOR ADMISSION NO. 186:  </w:t>
-      </w:r>
-      <w:r>
-        <w:t>Admit that You do not contend that service of the Summons and Complaint upon Fire Insurance Exchange was insufficient.</w:t>
-      </w:r>
-    </w:p>
-    <w:p>
-      <w:pPr>
-        <w:keepLines/>
-        <w:spacing w:after="160"/>
-        <w:ind w:left="720" w:hanging="576"/>
-      </w:pPr>
-      <w:r>
-        <w:rPr>
-          <w:b/>
-          <w:bCs/>
-        </w:rPr>
-        <w:lastRenderedPageBreak/>
+        <w:t xml:space="preserve">Relevant to Defendant's First Affirmative Defense, which alleges "there exists a lack of jurisdiction over Defendant FIE."</w:t>
+      </w:r>
+    </w:p>
+    <w:p>
+      <w:pPr>
+        <w:keepLines/>
+        <w:spacing w:after="160"/>
+        <w:ind w:left="720" w:hanging="576"/>
+      </w:pPr>
+      <w:r>
+        <w:rPr>
+          <w:b/>
+          <w:bCs/>
+        </w:rPr>
         <w:t xml:space="preserve">REQUEST FOR ADMISSION NO. 187:  </w:t>
       </w:r>
       <w:r>
-        <w:t>Admit that You do not contend that this Court lacks personal jurisdiction over Fire Insurance Exchange.</w:t>
+        <w:t xml:space="preserve">Admit that service of the Summons and Complaint in this action upon Fire Insurance Exchange under Minn. Stat. § 45.028 was effective no later than July 8, 2026.</w:t>
+      </w:r>
+    </w:p>
+    <w:p>
+      <w:pPr>
+        <w:keepLines/>
+        <w:spacing w:after="160"/>
+        <w:ind w:left="720" w:hanging="576"/>
+      </w:pPr>
+      <w:r>
+        <w:rPr>
+          <w:b/>
+          <w:bCs/>
+        </w:rPr>
+        <w:t xml:space="preserve">REQUEST FOR ADMISSION NO. 188:  </w:t>
+      </w:r>
+      <w:r>
+        <w:t xml:space="preserve">Admit that You do not contend that service of the Summons and Complaint upon Fire Insurance Exchange was insufficient.</w:t>
+      </w:r>
+    </w:p>
+    <w:p>
+      <w:pPr>
+        <w:keepLines/>
+        <w:spacing w:after="160"/>
+        <w:ind w:left="720" w:hanging="576"/>
+      </w:pPr>
+      <w:r>
+        <w:rPr>
+          <w:b/>
+          <w:bCs/>
+        </w:rPr>
+        <w:t xml:space="preserve">REQUEST FOR ADMISSION NO. 189:  </w:t>
+      </w:r>
+      <w:r>
+        <w:t xml:space="preserve">Admit that You do not contend that this Court lacks personal jurisdiction over Fire Insurance Exchange.</w:t>
       </w:r>
     </w:p>
     <w:p>
@@ -4476,7 +4542,7 @@
           <w:i/>
           <w:iCs/>
         </w:rPr>
-        <w:t>U.  Plaintiff Jie Hu's status under The Policy</w:t>
+        <w:t xml:space="preserve">U.  Plaintiff Jie Hu's status under The Policy</w:t>
       </w:r>
     </w:p>
     <w:p>
@@ -4491,41 +4557,7 @@
           <w:i/>
           <w:iCs/>
         </w:rPr>
-        <w:t>Relevant to Complaint ¶4, which Defendant's Answer did not admit as to Plaintiff Jie Hu, and to Defendant's First Affirmative Defense.</w:t>
-      </w:r>
-    </w:p>
-    <w:p>
-      <w:pPr>
-        <w:keepLines/>
-        <w:spacing w:after="160"/>
-        <w:ind w:left="720" w:hanging="576"/>
-      </w:pPr>
-      <w:r>
-        <w:rPr>
-          <w:b/>
-          <w:bCs/>
-        </w:rPr>
-        <w:t xml:space="preserve">REQUEST FOR ADMISSION NO. 188:  </w:t>
-      </w:r>
-      <w:r>
-        <w:t>Admit that The Policy Form, under "Definitions," states: "Throughout this policy, 'you' and 'your' mean the 'named insured' shown in the Declarations or renewal notice and your spouse or registered domestic partner under applicable state law if a resident of the same household with you."</w:t>
-      </w:r>
-    </w:p>
-    <w:p>
-      <w:pPr>
-        <w:keepLines/>
-        <w:spacing w:after="160"/>
-        <w:ind w:left="720" w:hanging="576"/>
-      </w:pPr>
-      <w:r>
-        <w:rPr>
-          <w:b/>
-          <w:bCs/>
-        </w:rPr>
-        <w:t xml:space="preserve">REQUEST FOR ADMISSION NO. 189:  </w:t>
-      </w:r>
-      <w:r>
-        <w:t>Admit that on July 13, 2024, Jie Hu was the spouse of Yibiao Lu.</w:t>
+        <w:t xml:space="preserve">Relevant to Complaint ¶4, which Defendant's Answer did not admit as to Plaintiff Jie Hu, and to Defendant's First Affirmative Defense.</w:t>
       </w:r>
     </w:p>
     <w:p>
@@ -4542,7 +4574,7 @@
         <w:t xml:space="preserve">REQUEST FOR ADMISSION NO. 190:  </w:t>
       </w:r>
       <w:r>
-        <w:t>Admit that on July 13, 2024, Jie Hu resided at The Property in the same household as Yibiao Lu.</w:t>
+        <w:t xml:space="preserve">Admit that The Policy Form, under "Definitions," states: "Throughout this policy, 'you' and 'your' mean the 'named insured' shown in the Declarations or renewal notice and your spouse or registered domestic partner under applicable state law if a resident of the same household with you."</w:t>
       </w:r>
     </w:p>
     <w:p>
@@ -4559,7 +4591,7 @@
         <w:t xml:space="preserve">REQUEST FOR ADMISSION NO. 191:  </w:t>
       </w:r>
       <w:r>
-        <w:t>Admit that Jie Hu is an insured under The Policy with respect to The Claim.</w:t>
+        <w:t xml:space="preserve">Admit that on July 13, 2024, Jie Hu was the spouse of Yibiao Lu.</w:t>
       </w:r>
     </w:p>
     <w:p>
@@ -4576,7 +4608,7 @@
         <w:t xml:space="preserve">REQUEST FOR ADMISSION NO. 192:  </w:t>
       </w:r>
       <w:r>
-        <w:t>Admit that You do not contend that Jie Hu lacks standing to assert a claim under The Policy arising from The Claim.</w:t>
+        <w:t xml:space="preserve">Admit that on July 13, 2024, Jie Hu resided at The Property in the same household as Yibiao Lu.</w:t>
       </w:r>
     </w:p>
     <w:p>
@@ -4593,7 +4625,41 @@
         <w:t xml:space="preserve">REQUEST FOR ADMISSION NO. 193:  </w:t>
       </w:r>
       <w:r>
-        <w:t>Admit that You do not contend that Jie Hu is not a proper party plaintiff in this action.</w:t>
+        <w:t xml:space="preserve">Admit that Jie Hu is an insured under The Policy with respect to The Claim.</w:t>
+      </w:r>
+    </w:p>
+    <w:p>
+      <w:pPr>
+        <w:keepLines/>
+        <w:spacing w:after="160"/>
+        <w:ind w:left="720" w:hanging="576"/>
+      </w:pPr>
+      <w:r>
+        <w:rPr>
+          <w:b/>
+          <w:bCs/>
+        </w:rPr>
+        <w:t xml:space="preserve">REQUEST FOR ADMISSION NO. 194:  </w:t>
+      </w:r>
+      <w:r>
+        <w:t xml:space="preserve">Admit that You do not contend that Jie Hu lacks standing to assert a claim under The Policy arising from The Claim.</w:t>
+      </w:r>
+    </w:p>
+    <w:p>
+      <w:pPr>
+        <w:keepLines/>
+        <w:spacing w:after="160"/>
+        <w:ind w:left="720" w:hanging="576"/>
+      </w:pPr>
+      <w:r>
+        <w:rPr>
+          <w:b/>
+          <w:bCs/>
+        </w:rPr>
+        <w:t xml:space="preserve">REQUEST FOR ADMISSION NO. 195:  </w:t>
+      </w:r>
+      <w:r>
+        <w:t xml:space="preserve">Admit that You do not contend that Jie Hu is not a proper party plaintiff in this action.</w:t>
       </w:r>
     </w:p>
     <w:p>
@@ -4602,8 +4668,7 @@
         <w:spacing w:after="160" w:line="276" w:lineRule="auto"/>
       </w:pPr>
       <w:r>
-        <w:lastRenderedPageBreak/>
-        <w:t>Plaintiffs reserve the right to serve additional requests for admission. Minn. R. Civ. P. 36 imposes no numerical limit on requests for admission.</w:t>
+        <w:t xml:space="preserve">Plaintiffs reserve the right to serve additional requests for admission. Minn. R. Civ. P. 36 imposes no numerical limit on requests for admission.</w:t>
       </w:r>
     </w:p>
     <w:p>
@@ -4612,7 +4677,7 @@
         <w:spacing w:before="240" w:after="160"/>
       </w:pPr>
       <w:r>
-        <w:t>Dated: ______________, 2026.</w:t>
+        <w:t xml:space="preserve">Dated: ______________, 2026.</w:t>
       </w:r>
     </w:p>
     <w:p>
@@ -4621,7 +4686,7 @@
         <w:spacing w:before="480"/>
       </w:pPr>
       <w:r>
-        <w:t>____________________________________</w:t>
+        <w:t xml:space="preserve">____________________________________</w:t>
       </w:r>
     </w:p>
     <w:p>
@@ -4636,7 +4701,7 @@
           <w:i/>
           <w:iCs/>
         </w:rPr>
-        <w:t>pro se</w:t>
+        <w:t xml:space="preserve">pro se</w:t>
       </w:r>
     </w:p>
     <w:p>
@@ -4645,7 +4710,7 @@
         <w:spacing w:before="120"/>
       </w:pPr>
       <w:r>
-        <w:t>17756 George Moran Dr.</w:t>
+        <w:t xml:space="preserve">17756 George Moran Dr.</w:t>
       </w:r>
     </w:p>
     <w:p>
@@ -4654,7 +4719,7 @@
         <w:spacing w:before="120"/>
       </w:pPr>
       <w:r>
-        <w:t>Eden Prairie, MN 55347</w:t>
+        <w:t xml:space="preserve">Eden Prairie, MN 55347</w:t>
       </w:r>
     </w:p>
     <w:p>
@@ -4663,7 +4728,7 @@
         <w:spacing w:before="120"/>
       </w:pPr>
       <w:r>
-        <w:t>Telephone: 763-843-2859</w:t>
+        <w:t xml:space="preserve">Telephone: 763-843-2859</w:t>
       </w:r>
     </w:p>
     <w:p>
@@ -4672,7 +4737,7 @@
         <w:spacing w:before="120"/>
       </w:pPr>
       <w:r>
-        <w:t>Email: bill_y_lu@yahoo.com</w:t>
+        <w:t xml:space="preserve">Email: bill_y_lu@yahoo.com</w:t>
       </w:r>
     </w:p>
     <w:p>
@@ -4681,7 +4746,7 @@
         <w:spacing w:before="480"/>
       </w:pPr>
       <w:r>
-        <w:t>____________________________________</w:t>
+        <w:t xml:space="preserve">____________________________________</w:t>
       </w:r>
     </w:p>
     <w:p>
@@ -4696,7 +4761,7 @@
           <w:i/>
           <w:iCs/>
         </w:rPr>
-        <w:t>pro se</w:t>
+        <w:t xml:space="preserve">pro se</w:t>
       </w:r>
     </w:p>
     <w:p>
@@ -4705,7 +4770,7 @@
         <w:spacing w:before="120"/>
       </w:pPr>
       <w:r>
-        <w:t>17756 George Moran Dr.</w:t>
+        <w:t xml:space="preserve">17756 George Moran Dr.</w:t>
       </w:r>
     </w:p>
     <w:p>
@@ -4714,7 +4779,7 @@
         <w:spacing w:before="120"/>
       </w:pPr>
       <w:r>
-        <w:t>Eden Prairie, MN 55347</w:t>
+        <w:t xml:space="preserve">Eden Prairie, MN 55347</w:t>
       </w:r>
     </w:p>
     <w:p>
@@ -4723,7 +4788,7 @@
         <w:spacing w:before="120"/>
       </w:pPr>
       <w:r>
-        <w:t>Telephone: 763-843-2860</w:t>
+        <w:t xml:space="preserve">Telephone: 763-843-2860</w:t>
       </w:r>
     </w:p>
     <w:p>
@@ -4731,7 +4796,7 @@
         <w:spacing w:before="120"/>
       </w:pPr>
       <w:r>
-        <w:t>Email: jie_h_hu@yahoo.com</w:t>
+        <w:t xml:space="preserve">Email: jie_h_hu@yahoo.com</w:t>
       </w:r>
     </w:p>
     <w:p>
@@ -4749,7 +4814,6 @@
           <w:b/>
           <w:bCs/>
         </w:rPr>
-        <w:lastRenderedPageBreak/>
         <w:t>CERTIFICATE OF SERVICE</w:t>
       </w:r>
     </w:p>
@@ -4799,7 +4863,7 @@
           <w:i/>
           <w:iCs/>
         </w:rPr>
-        <w:t>Plaintiffs’ First Set of Requests for Admission to Defendant Fire Insurance Exchange</w:t>
+        <w:t xml:space="preserve">Plaintiffs’ First Set of Requests for Admission to Defendant Fire Insurance Exchange</w:t>
       </w:r>
       <w:r>
         <w:t xml:space="preserve"> upon Defendant's counsel of record by transmitting it as a PDF attachment to an electronic mail message addressed as follows:</w:t>
@@ -4901,7 +4965,7 @@
         <w:spacing w:after="160" w:line="276" w:lineRule="auto"/>
       </w:pPr>
       <w:r>
-        <w:t>Dated: ______________, 2026, at Eden Prairie, Hennepin County, Minnesota.</w:t>
+        <w:t xml:space="preserve">Dated: ______________, 2026, at Eden Prairie, Hennepin County, Minnesota.</w:t>
       </w:r>
     </w:p>
     <w:p>

</xml_diff>

<commit_message>
Minor changes to RFAs
</commit_message>
<xml_diff>
--- a/Filings/RequestForAdmission/FirstSet/Plaintiffs_First_Set_of_Requests_for_Admission_to_FIE.docx
+++ b/Filings/RequestForAdmission/FirstSet/Plaintiffs_First_Set_of_Requests_for_Admission_to_FIE.docx
@@ -307,6 +307,22 @@
           <w:b/>
           <w:bCs/>
         </w:rPr>
+        <w:t xml:space="preserve">"The February 18, 2022 Settlement Package" </w:t>
+      </w:r>
+      <w:r>
+        <w:t>means the 11-page document dated February 18, 2022 that You provided to Plaintiff Yibiao Lu concerning The 2020 Claim, consisting of Your two-page letter captioned "Settlement Notice," the one-page "BUILDING LOSS WORKSHEET" headed "This is a complete recap of your claim," and the eight-page estimate that follows, identified on its face as Estimate "YIBIAO_LU2," bearing "Claim Number: 3013539499-1-1" and setting out numbered line items 1 through 32.</w:t>
+      </w:r>
+    </w:p>
+    <w:p>
+      <w:pPr>
+        <w:spacing w:after="160" w:line="276" w:lineRule="auto"/>
+        <w:ind w:left="720" w:hanging="576"/>
+      </w:pPr>
+      <w:r>
+        <w:rPr>
+          <w:b/>
+          <w:bCs/>
+        </w:rPr>
         <w:t xml:space="preserve">"The Policy" </w:t>
       </w:r>
       <w:r>
@@ -1235,7 +1251,7 @@
         <w:t xml:space="preserve">REQUEST FOR ADMISSION NO. 20:  </w:t>
       </w:r>
       <w:r>
-        <w:t xml:space="preserve">Admit that The Appraisal Award identifies the two awarded windows only by the designations “F1.7” and “B1.2.”</w:t>
+        <w:t>Admit that The Appraisal Award identifies the two awarded windows only by the designations "F1.7" and "B1.2."</w:t>
       </w:r>
     </w:p>
     <w:p>
@@ -1303,7 +1319,7 @@
         <w:t xml:space="preserve">REQUEST FOR ADMISSION NO. 24:  </w:t>
       </w:r>
       <w:r>
-        <w:t xml:space="preserve">Admit that The Appraisal Award does not state an actual value or a loss for any window at The Property other than the two windows designated “F1.7” and “B1.2.”</w:t>
+        <w:t>Admit that The Appraisal Award does not state an actual value or a loss for any window at The Property other than the two windows designated "F1.7" and "B1.2."</w:t>
       </w:r>
     </w:p>
     <w:p>
@@ -1472,7 +1488,7 @@
         <w:t xml:space="preserve">REQUEST FOR ADMISSION NO. 33:  </w:t>
       </w:r>
       <w:r>
-        <w:t xml:space="preserve">Admit that Your September 3, 2024 letter to Plaintiffs stated, “There were no other damages observed.”</w:t>
+        <w:t>Admit that Your September 3, 2024 letter to Plaintiffs stated, "There were no other damages observed."</w:t>
       </w:r>
     </w:p>
     <w:p>
@@ -1622,7 +1638,7 @@
         <w:t xml:space="preserve">REQUEST FOR ADMISSION NO. 40:  </w:t>
       </w:r>
       <w:r>
-        <w:t xml:space="preserve">Admit that The Coverage Outcome Attachment cites Section I.A.4 and Section I.B.6, “Inherent Vice or Latent Defect.”</w:t>
+        <w:t>Admit that The Coverage Outcome Attachment cites Section I.A.4 and Section I.B.6, "Inherent Vice or Latent Defect."</w:t>
       </w:r>
     </w:p>
     <w:p>
@@ -1639,7 +1655,7 @@
         <w:t xml:space="preserve">REQUEST FOR ADMISSION NO. 41:  </w:t>
       </w:r>
       <w:r>
-        <w:t xml:space="preserve">Admit that The Coverage Outcome Attachment cites Section I.A.7, “Wear and tear or mechanical breakdown.”</w:t>
+        <w:t>Admit that The Coverage Outcome Attachment cites Section I.A.7, "Wear and tear or mechanical breakdown."</w:t>
       </w:r>
     </w:p>
     <w:p>
@@ -1656,7 +1672,7 @@
         <w:t xml:space="preserve">REQUEST FOR ADMISSION NO. 42:  </w:t>
       </w:r>
       <w:r>
-        <w:t xml:space="preserve">Admit that The Coverage Outcome Attachment cites Section I.A.8, “Marring.”</w:t>
+        <w:t>Admit that The Coverage Outcome Attachment cites Section I.A.8, "Marring."</w:t>
       </w:r>
     </w:p>
     <w:p>
@@ -1673,7 +1689,7 @@
         <w:t xml:space="preserve">REQUEST FOR ADMISSION NO. 43:  </w:t>
       </w:r>
       <w:r>
-        <w:t xml:space="preserve">Admit that The Coverage Outcome Attachment cites Section I.A.9 and Section I.B.9, “Corrosion, Deterioration, Decay or Rust.”</w:t>
+        <w:t>Admit that The Coverage Outcome Attachment cites Section I.A.9 and Section I.B.9, "Corrosion, Deterioration, Decay or Rust."</w:t>
       </w:r>
     </w:p>
     <w:p>
@@ -1690,7 +1706,7 @@
         <w:t xml:space="preserve">REQUEST FOR ADMISSION NO. 44:  </w:t>
       </w:r>
       <w:r>
-        <w:t xml:space="preserve">Admit that The Coverage Outcome Attachment cites Section I.B.4, “Neglect or Lack of Maintenance or Failure to Make Repairs.”</w:t>
+        <w:t>Admit that The Coverage Outcome Attachment cites Section I.B.4, "Neglect or Lack of Maintenance or Failure to Make Repairs."</w:t>
       </w:r>
     </w:p>
     <w:p>
@@ -1707,7 +1723,7 @@
         <w:t xml:space="preserve">REQUEST FOR ADMISSION NO. 45:  </w:t>
       </w:r>
       <w:r>
-        <w:t xml:space="preserve">Admit that The Coverage Outcome Attachment cites Section I.B.5, “Faulty, Inadequate, Defective or Incomplete Planning, Zoning, Maintenance, Repairs, Renovation, Manufacture or Construction.”</w:t>
+        <w:t>Admit that The Coverage Outcome Attachment cites Section I.B.5, "Faulty, Inadequate, Defective or Incomplete Planning, Zoning, Maintenance, Repairs, Renovation, Manufacture or Construction."</w:t>
       </w:r>
     </w:p>
     <w:p>
@@ -1724,7 +1740,7 @@
         <w:t xml:space="preserve">REQUEST FOR ADMISSION NO. 46:  </w:t>
       </w:r>
       <w:r>
-        <w:t xml:space="preserve">Admit that The Coverage Outcome Attachment cites Section I.B.8, “Wear and Tear, Deterioration or Mechanical Breakdown.”</w:t>
+        <w:t>Admit that The Coverage Outcome Attachment cites Section I.B.8, "Wear and Tear, Deterioration or Mechanical Breakdown."</w:t>
       </w:r>
     </w:p>
     <w:p>
@@ -1741,7 +1757,7 @@
         <w:t xml:space="preserve">REQUEST FOR ADMISSION NO. 47:  </w:t>
       </w:r>
       <w:r>
-        <w:t xml:space="preserve">Admit that the definition of “Marring” set out at paragraph 16 of The Coverage Outcome Attachment lists “denting” among its examples of marring.</w:t>
+        <w:t>Admit that the definition of "Marring" set out at paragraph 16 of The Coverage Outcome Attachment lists "denting" among its examples of marring.</w:t>
       </w:r>
     </w:p>
     <w:p>
@@ -1973,7 +1989,7 @@
         <w:t xml:space="preserve">REQUEST FOR ADMISSION NO. 57:  </w:t>
       </w:r>
       <w:r>
-        <w:t xml:space="preserve">Admit that Your November 4, 2024 letter to Plaintiffs stated, "Our investigation found the condition of the window and components to be from wear/tear as referrenced in the attached engineer report."</w:t>
+        <w:t>Admit that Your November 4, 2024 letter to Plaintiffs stated, "Our investigation found the condition of the window and components to be from wear/tear as referrenced [sic] in the attached engineer report."</w:t>
       </w:r>
     </w:p>
     <w:p>
@@ -2006,7 +2022,7 @@
         <w:t xml:space="preserve">REQUEST FOR ADMISSION NO. 58:  </w:t>
       </w:r>
       <w:r>
-        <w:t xml:space="preserve">Admit that You retained Prieve Engineering, LLC to “evaluate the condition of windows in the home as relates to hail.”</w:t>
+        <w:t>Admit that You retained Prieve Engineering, LLC to "evaluate the condition of windows in the home as relates to hail."</w:t>
       </w:r>
     </w:p>
     <w:p>
@@ -2492,7 +2508,7 @@
         <w:t xml:space="preserve">REQUEST FOR ADMISSION NO. 84:  </w:t>
       </w:r>
       <w:r>
-        <w:t xml:space="preserve">Admit that the dents described on page 4 of The Prieve Report in the sentence "Two dents with sharp marks/indentations appear long the left side of the left sash as shown in photograph A-45" were present at The Property on October 9, 2024.</w:t>
+        <w:t>Admit that the dents described on page 4 of The Prieve Report in the sentence "Two dents with sharp marks/indentations appear long [sic] the left side of the left sash as shown in photograph A-45" were present at The Property on October 9, 2024.</w:t>
       </w:r>
     </w:p>
     <w:p>
@@ -2914,7 +2930,7 @@
         <w:t xml:space="preserve">REQUEST FOR ADMISSION NO. 107:  </w:t>
       </w:r>
       <w:r>
-        <w:t xml:space="preserve">Admit that no document in Your claim file for The 2020 Claim, including the inspection photographs dated October 13, 2020, records the dents described on page 4 of The Prieve Report in the sentence "Two dents with sharp marks/indentations appear long the left side of the left sash as shown in photograph A-45."</w:t>
+        <w:t>Admit that no document in Your claim file for The 2020 Claim, including the inspection photographs dated October 13, 2020, records the dents described on page 4 of The Prieve Report in the sentence "Two dents with sharp marks/indentations appear long [sic] the left side of the left sash as shown in photograph A-45."</w:t>
       </w:r>
     </w:p>
     <w:p>
@@ -3236,7 +3252,7 @@
         <w:t xml:space="preserve">REQUEST FOR ADMISSION NO. 125:  </w:t>
       </w:r>
       <w:r>
-        <w:t xml:space="preserve">Admit that line item 1 of Your February 18, 2022 estimate for The 2020 Claim (estimate "YIBIAO_LU2") reads "R&amp;R Wood window - casement, 12-23 sf" and states a quantity of 2.00 EA.</w:t>
+        <w:t>Admit that line item 1 of the estimate within The February 18, 2022 Settlement Package reads "R&amp;R Wood window - casement, 12-23 sf" and states a quantity of 2.00 EA.</w:t>
       </w:r>
     </w:p>
     <w:p>
@@ -3253,7 +3269,7 @@
         <w:t xml:space="preserve">REQUEST FOR ADMISSION NO. 126:  </w:t>
       </w:r>
       <w:r>
-        <w:t xml:space="preserve">Admit that the only line items in Your February 18, 2022 estimate for The 2020 Claim (estimate "YIBIAO_LU2") that refer to windows are line items 1 ("R&amp;R Wood window - casement, 12-23 sf"), 2 ("Window blind - horizontal or vertical - Detach &amp; reset"), 3 ("Additional charge for a retrofit window, 24-40 sf"), and 32 ("Window treatment repair").</w:t>
+        <w:t>Admit that the only line items of the estimate within The February 18, 2022 Settlement Package that refer to windows are line items 1 ("R&amp;R Wood window - casement, 12-23 sf"), 2 ("Window blind - horizontal or vertical - Detach &amp; reset"), 3 ("Additional charge for a retrofit window, 24-40 sf"), and 32 ("Window treatment repair").</w:t>
       </w:r>
     </w:p>
     <w:p>
@@ -3270,7 +3286,7 @@
         <w:t xml:space="preserve">REQUEST FOR ADMISSION NO. 127:  </w:t>
       </w:r>
       <w:r>
-        <w:t xml:space="preserve">Admit that Your February 18, 2022 estimate for The 2020 Claim (estimate "YIBIAO_LU2") states "Type of Loss: Hail."</w:t>
+        <w:t>Admit that the estimate within The February 18, 2022 Settlement Package states "Type of Loss: Hail."</w:t>
       </w:r>
     </w:p>
     <w:p>
@@ -3304,7 +3320,7 @@
         <w:t xml:space="preserve">REQUEST FOR ADMISSION NO. 129:  </w:t>
       </w:r>
       <w:r>
-        <w:t xml:space="preserve">Admit that Your February 18, 2022 estimate for The 2020 Claim (estimate "YIBIAO_LU2") does not identify the location at The Property of the item or items addressed by line item 1.</w:t>
+        <w:t>Admit that the estimate within The February 18, 2022 Settlement Package does not identify the location at The Property of the item or items addressed by line item 1.</w:t>
       </w:r>
     </w:p>
     <w:p>
@@ -3321,7 +3337,7 @@
         <w:t xml:space="preserve">REQUEST FOR ADMISSION NO. 130:  </w:t>
       </w:r>
       <w:r>
-        <w:t xml:space="preserve">Admit that Your claim file for The 2020 Claim, including any inspection photographs dated October 13, 2020, identifies no dented window or sash at The Property other than the items addressed by line item 1 ("R&amp;R Wood window - casement, 12-23 sf") of Your February 18, 2022 estimate for The 2020 Claim (estimate "YIBIAO_LU2").</w:t>
+        <w:t>Admit that Your claim file for The 2020 Claim, including any inspection photographs dated October 13, 2020, identifies no dented window or sash at The Property other than the items addressed by line item 1 ("R&amp;R Wood window - casement, 12-23 sf") of the estimate within The February 18, 2022 Settlement Package.</w:t>
       </w:r>
     </w:p>
     <w:p>
@@ -4660,6 +4676,255 @@
       </w:r>
       <w:r>
         <w:t xml:space="preserve">Admit that You do not contend that Jie Hu is not a proper party plaintiff in this action.</w:t>
+      </w:r>
+    </w:p>
+    <w:p>
+      <w:pPr>
+        <w:keepNext/>
+        <w:keepLines/>
+        <w:spacing w:before="200" w:after="120"/>
+      </w:pPr>
+      <w:r>
+        <w:rPr>
+          <w:b/>
+          <w:bCs/>
+          <w:i/>
+          <w:iCs/>
+        </w:rPr>
+        <w:t>V.  Coverage provisions and limitations</w:t>
+      </w:r>
+    </w:p>
+    <w:p>
+      <w:pPr>
+        <w:keepLines/>
+        <w:spacing w:after="160"/>
+        <w:ind w:left="720" w:hanging="576"/>
+      </w:pPr>
+      <w:r>
+        <w:rPr>
+          <w:b/>
+          <w:bCs/>
+        </w:rPr>
+        <w:t xml:space="preserve">REQUEST FOR ADMISSION NO. 196:  </w:t>
+      </w:r>
+      <w:r>
+        <w:t>Admit that You do not contend that any provision of The Policy, other than the windstorm/hail deductible, bars, limits, or reduces recovery for damage caused by hail to the windows or other exterior components of The Property.</w:t>
+      </w:r>
+    </w:p>
+    <w:p>
+      <w:pPr>
+        <w:keepLines/>
+        <w:spacing w:after="160"/>
+        <w:ind w:left="720" w:hanging="576"/>
+      </w:pPr>
+      <w:r>
+        <w:rPr>
+          <w:b/>
+          <w:bCs/>
+        </w:rPr>
+        <w:t xml:space="preserve">REQUEST FOR ADMISSION NO. 197:  </w:t>
+      </w:r>
+      <w:r>
+        <w:t>Admit that You have not at any time obtained any engineering analysis, engineering report, or engineering opinion concerning the cause of the conditions depicted at photographs A-42, A-92, A-93, A-98, A-99, A-103, and A-141 of Photo Appendix A.</w:t>
+      </w:r>
+    </w:p>
+    <w:p>
+      <w:pPr>
+        <w:keepNext/>
+        <w:keepLines/>
+        <w:spacing w:before="200" w:after="120"/>
+      </w:pPr>
+      <w:r>
+        <w:rPr>
+          <w:b/>
+          <w:bCs/>
+          <w:i/>
+          <w:iCs/>
+        </w:rPr>
+        <w:t>W.  The items listed on The Appraisal Award</w:t>
+      </w:r>
+    </w:p>
+    <w:p>
+      <w:pPr>
+        <w:keepLines/>
+        <w:spacing w:after="160"/>
+        <w:ind w:left="720" w:hanging="576"/>
+      </w:pPr>
+      <w:r>
+        <w:rPr>
+          <w:b/>
+          <w:bCs/>
+        </w:rPr>
+        <w:t xml:space="preserve">REQUEST FOR ADMISSION NO. 198:  </w:t>
+      </w:r>
+      <w:r>
+        <w:t>Admit that the only items listed in the item column of The Appraisal Award are "Siding &amp; Paint," "Windows F1.7 B1.2," and "Debris."</w:t>
+      </w:r>
+    </w:p>
+    <w:p>
+      <w:pPr>
+        <w:keepLines/>
+        <w:spacing w:after="160"/>
+        <w:ind w:left="720" w:hanging="576"/>
+      </w:pPr>
+      <w:r>
+        <w:rPr>
+          <w:b/>
+          <w:bCs/>
+        </w:rPr>
+        <w:t xml:space="preserve">REQUEST FOR ADMISSION NO. 199:  </w:t>
+      </w:r>
+      <w:r>
+        <w:t>Admit that The Appraisal Award states a Replacement Cost Value of $0 and an Actual Cash Value of $0 for the item "Debris."</w:t>
+      </w:r>
+    </w:p>
+    <w:p>
+      <w:pPr>
+        <w:keepLines/>
+        <w:spacing w:after="160"/>
+        <w:ind w:left="720" w:hanging="576"/>
+      </w:pPr>
+      <w:r>
+        <w:rPr>
+          <w:b/>
+          <w:bCs/>
+        </w:rPr>
+        <w:t xml:space="preserve">REQUEST FOR ADMISSION NO. 200:  </w:t>
+      </w:r>
+      <w:r>
+        <w:t>Admit that The Appraisal Award states "Hail" in the Causation column for the item "Debris."</w:t>
+      </w:r>
+    </w:p>
+    <w:p>
+      <w:pPr>
+        <w:keepNext/>
+        <w:keepLines/>
+        <w:spacing w:before="200" w:after="120"/>
+      </w:pPr>
+      <w:r>
+        <w:rPr>
+          <w:b/>
+          <w:bCs/>
+          <w:i/>
+          <w:iCs/>
+        </w:rPr>
+        <w:t>X.  The scope of the Prieve engagement</w:t>
+      </w:r>
+    </w:p>
+    <w:p>
+      <w:pPr>
+        <w:keepLines/>
+        <w:spacing w:after="160"/>
+        <w:ind w:left="720" w:hanging="576"/>
+      </w:pPr>
+      <w:r>
+        <w:rPr>
+          <w:b/>
+          <w:bCs/>
+        </w:rPr>
+        <w:t xml:space="preserve">REQUEST FOR ADMISSION NO. 201:  </w:t>
+      </w:r>
+      <w:r>
+        <w:t>Admit that You did not retain Prieve Engineering, LLC to evaluate the condition of the siding at The Property.</w:t>
+      </w:r>
+    </w:p>
+    <w:p>
+      <w:pPr>
+        <w:keepNext/>
+        <w:keepLines/>
+        <w:spacing w:before="200" w:after="120"/>
+      </w:pPr>
+      <w:r>
+        <w:rPr>
+          <w:b/>
+          <w:bCs/>
+          <w:i/>
+          <w:iCs/>
+        </w:rPr>
+        <w:t>Y.  The "peer review" referred to in Your Answer</w:t>
+      </w:r>
+    </w:p>
+    <w:p>
+      <w:pPr>
+        <w:keepLines/>
+        <w:spacing w:after="160"/>
+        <w:ind w:left="720" w:hanging="576"/>
+      </w:pPr>
+      <w:r>
+        <w:rPr>
+          <w:b/>
+          <w:bCs/>
+        </w:rPr>
+        <w:t xml:space="preserve">REQUEST FOR ADMISSION NO. 202:  </w:t>
+      </w:r>
+      <w:r>
+        <w:t>Admit that You have no written policy, procedure, or guideline describing the peer review referred to in Your answer to paragraph 24 of the Complaint.</w:t>
+      </w:r>
+    </w:p>
+    <w:p>
+      <w:pPr>
+        <w:keepNext/>
+        <w:keepLines/>
+        <w:spacing w:before="200" w:after="120"/>
+      </w:pPr>
+      <w:r>
+        <w:rPr>
+          <w:b/>
+          <w:bCs/>
+          <w:i/>
+          <w:iCs/>
+        </w:rPr>
+        <w:t>Z.  The October 29, 2025 message — additional text</w:t>
+      </w:r>
+    </w:p>
+    <w:p>
+      <w:pPr>
+        <w:keepLines/>
+        <w:spacing w:after="160"/>
+        <w:ind w:left="720" w:hanging="576"/>
+      </w:pPr>
+      <w:r>
+        <w:rPr>
+          <w:b/>
+          <w:bCs/>
+        </w:rPr>
+        <w:t xml:space="preserve">REQUEST FOR ADMISSION NO. 203:  </w:t>
+      </w:r>
+      <w:r>
+        <w:t>Admit that the message identified in Request No. 165 also stated, "If you need information as to why additional windows were not included in the award then you will need to contact your appraiser to obtain that information."</w:t>
+      </w:r>
+    </w:p>
+    <w:p>
+      <w:pPr>
+        <w:keepNext/>
+        <w:keepLines/>
+        <w:spacing w:before="200" w:after="120"/>
+      </w:pPr>
+      <w:r>
+        <w:rPr>
+          <w:b/>
+          <w:bCs/>
+          <w:i/>
+          <w:iCs/>
+        </w:rPr>
+        <w:t>AA.  Work product and the pre-suit claim file</w:t>
+      </w:r>
+    </w:p>
+    <w:p>
+      <w:pPr>
+        <w:keepLines/>
+        <w:spacing w:after="160"/>
+        <w:ind w:left="720" w:hanging="576"/>
+      </w:pPr>
+      <w:r>
+        <w:rPr>
+          <w:b/>
+          <w:bCs/>
+        </w:rPr>
+        <w:t xml:space="preserve">REQUEST FOR ADMISSION NO. 204:  </w:t>
+      </w:r>
+      <w:r>
+        <w:t>Admit that no document in Your claim file for The Claim created before July 8, 2026 was prepared in anticipation of litigation or for trial within the meaning of Minn. R. Civ. P. 26.02(d).</w:t>
       </w:r>
     </w:p>
     <w:p>

</xml_diff>

<commit_message>
rewrite interrogatory 2; change the signature clock
</commit_message>
<xml_diff>
--- a/Filings/RequestForAdmission/FirstSet/Plaintiffs_First_Set_of_Requests_for_Admission_to_FIE.docx
+++ b/Filings/RequestForAdmission/FirstSet/Plaintiffs_First_Set_of_Requests_for_Admission_to_FIE.docx
@@ -5480,11 +5480,10 @@
       </w:pPr>
       <w:r>
         <w:t>2.</w:t>
-      </w:r>
-      <w:r>
         <w:tab/>
-        <w:t xml:space="preserve">On ______________, 2026, at ______ __.m. local Minnesota time, I served a true and correct copy of </w:t>
-      </w:r>
+        <w:t xml:space="preserve">On ______________, 2026, I served a true and correct copy of </w:t>
+      </w:r>
+      <w:r/>
       <w:r>
         <w:rPr>
           <w:i/>
@@ -5563,7 +5562,7 @@
       </w:r>
       <w:r>
         <w:tab/>
-        <w:t>The transmission was sent from bill_y_lu@yahoo.com. I did not receive any indication that the transmission failed or was undeliverable. I have retained a copy of the transmission.</w:t>
+        <w:t>The transmission was sent from bill_y_lu@yahoo.com.</w:t>
       </w:r>
     </w:p>
     <w:p>

</xml_diff>

<commit_message>
Added few new RFAs based on the review of int. 3
</commit_message>
<xml_diff>
--- a/Filings/RequestForAdmission/FirstSet/Plaintiffs_First_Set_of_Requests_for_Admission_to_FIE.docx
+++ b/Filings/RequestForAdmission/FirstSet/Plaintiffs_First_Set_of_Requests_for_Admission_to_FIE.docx
@@ -5286,6 +5286,186 @@
           <w:bCs/>
         </w:rPr>
         <w:t>Admit that You do not contend that Jie Hu is not a proper party plaintiff in this action.</w:t>
+      </w:r>
+    </w:p>
+    <w:p>
+      <w:pPr>
+        <w:keepNext/>
+        <w:keepLines/>
+        <w:spacing w:before="200" w:after="120"/>
+      </w:pPr>
+      <w:r>
+        <w:rPr>
+          <w:b/>
+          <w:bCs/>
+          <w:i/>
+          <w:iCs/>
+        </w:rPr>
+        <w:t>U.  The September 24, 2025 message and its signer</w:t>
+      </w:r>
+    </w:p>
+    <w:p>
+      <w:pPr>
+        <w:keepNext/>
+        <w:keepLines/>
+        <w:spacing w:after="160" w:line="276" w:lineRule="auto"/>
+        <w:ind w:left="720"/>
+      </w:pPr>
+      <w:r>
+        <w:rPr>
+          <w:iCs/>
+        </w:rPr>
+        <w:t>Requests 201 through 204 concern Your September 24, 2025 electronic mail message to Plaintiff Yibiao Lu, and are to be read with Requests Nos. 31 and 177.</w:t>
+      </w:r>
+    </w:p>
+    <w:p>
+      <w:pPr>
+        <w:keepLines/>
+        <w:spacing w:after="160"/>
+        <w:ind w:left="720" w:hanging="576"/>
+      </w:pPr>
+      <w:r>
+        <w:rPr>
+          <w:b/>
+          <w:bCs/>
+        </w:rPr>
+        <w:t xml:space="preserve">REQUEST FOR ADMISSION NO. 201:  </w:t>
+      </w:r>
+      <w:r>
+        <w:rPr>
+          <w:bCs/>
+        </w:rPr>
+        <w:t>Admit that Your September 24, 2025 electronic mail message to Plaintiff Yibiao Lu was signed by Twonda Miller, Senior General Claims Adjuster, Fire Insurance Exchange.</w:t>
+      </w:r>
+    </w:p>
+    <w:p>
+      <w:pPr>
+        <w:keepLines/>
+        <w:spacing w:after="160"/>
+        <w:ind w:left="720" w:hanging="576"/>
+      </w:pPr>
+      <w:r>
+        <w:rPr>
+          <w:b/>
+          <w:bCs/>
+        </w:rPr>
+        <w:t xml:space="preserve">REQUEST FOR ADMISSION NO. 202:  </w:t>
+      </w:r>
+      <w:r>
+        <w:rPr>
+          <w:bCs/>
+        </w:rPr>
+        <w:t>Admit that Twonda Miller acted on behalf of Fire Insurance Exchange in handling The Claim.</w:t>
+      </w:r>
+    </w:p>
+    <w:p>
+      <w:pPr>
+        <w:keepLines/>
+        <w:spacing w:after="160"/>
+        <w:ind w:left="720" w:hanging="576"/>
+      </w:pPr>
+      <w:r>
+        <w:rPr>
+          <w:b/>
+          <w:bCs/>
+        </w:rPr>
+        <w:t xml:space="preserve">REQUEST FOR ADMISSION NO. 203:  </w:t>
+      </w:r>
+      <w:r>
+        <w:rPr>
+          <w:bCs/>
+        </w:rPr>
+        <w:t>Admit that Your September 24, 2025 electronic mail message to Plaintiff Yibiao Lu stated, "Unfortunately, the umpire did not provide a report or estimate."</w:t>
+      </w:r>
+    </w:p>
+    <w:p>
+      <w:pPr>
+        <w:keepLines/>
+        <w:spacing w:after="160"/>
+        <w:ind w:left="720" w:hanging="576"/>
+      </w:pPr>
+      <w:r>
+        <w:rPr>
+          <w:b/>
+          <w:bCs/>
+        </w:rPr>
+        <w:t xml:space="preserve">REQUEST FOR ADMISSION NO. 204:  </w:t>
+      </w:r>
+      <w:r>
+        <w:rPr>
+          <w:bCs/>
+        </w:rPr>
+        <w:t>Admit that Your September 24, 2025 electronic mail message to Plaintiff Yibiao Lu stated, "Our only recommendation is to refer you to your appraiser for any additional details he may have in his file."</w:t>
+      </w:r>
+    </w:p>
+    <w:p>
+      <w:pPr>
+        <w:keepNext/>
+        <w:keepLines/>
+        <w:spacing w:before="200" w:after="120"/>
+      </w:pPr>
+      <w:r>
+        <w:rPr>
+          <w:b/>
+          <w:bCs/>
+          <w:i/>
+          <w:iCs/>
+        </w:rPr>
+        <w:t>V.  The October 7, 2025 request for Nicholas Brau’s inspection report or notes</w:t>
+      </w:r>
+    </w:p>
+    <w:p>
+      <w:pPr>
+        <w:keepNext/>
+        <w:keepLines/>
+        <w:spacing w:after="160" w:line="276" w:lineRule="auto"/>
+        <w:ind w:left="720"/>
+      </w:pPr>
+      <w:r>
+        <w:rPr>
+          <w:iCs/>
+        </w:rPr>
+        <w:t>Requests 205 and 206 concern Plaintiff Yibiao Lu’s October 7, 2025 electronic mail message, and are to be read with Requests Nos. 42 and 143 through 145.</w:t>
+      </w:r>
+    </w:p>
+    <w:p>
+      <w:pPr>
+        <w:keepLines/>
+        <w:spacing w:after="160"/>
+        <w:ind w:left="720" w:hanging="576"/>
+      </w:pPr>
+      <w:r>
+        <w:rPr>
+          <w:b/>
+          <w:bCs/>
+        </w:rPr>
+        <w:t xml:space="preserve">REQUEST FOR ADMISSION NO. 205:  </w:t>
+      </w:r>
+      <w:r>
+        <w:rPr>
+          <w:bCs/>
+        </w:rPr>
+        <w:t>Admit that on October 7, 2025, Plaintiff Yibiao Lu sent an electronic mail message to myadjuster@farmersinsurance.com stating, "We request to have a copy of the inspection report/notes from Nic Brau. He came to the property on 9/6/2024 to perform the inspection."</w:t>
+      </w:r>
+    </w:p>
+    <w:p>
+      <w:pPr>
+        <w:keepLines/>
+        <w:spacing w:after="160"/>
+        <w:ind w:left="720" w:hanging="576"/>
+      </w:pPr>
+      <w:r>
+        <w:rPr>
+          <w:b/>
+          <w:bCs/>
+        </w:rPr>
+        <w:t xml:space="preserve">REQUEST FOR ADMISSION NO. 206:  </w:t>
+      </w:r>
+      <w:r>
+        <w:rPr>
+          <w:bCs/>
+        </w:rPr>
+        <w:t>Admit that Your October 10, 2025 letter to Plaintiffs was sent in response to the message identified in the preceding request.</w:t>
       </w:r>
     </w:p>
     <w:p>

</xml_diff>

<commit_message>
Jeffrey updates 9/19 - remove 21 RFA
</commit_message>
<xml_diff>
--- a/Filings/RequestForAdmission/FirstSet/Plaintiffs_First_Set_of_Requests_for_Admission_to_FIE.docx
+++ b/Filings/RequestForAdmission/FirstSet/Plaintiffs_First_Set_of_Requests_for_Admission_to_FIE.docx
@@ -46,13 +46,8 @@
           </w:p>
           <w:p/>
           <w:p>
-            <w:proofErr w:type="spellStart"/>
             <w:r>
-              <w:t>Yibiao</w:t>
-            </w:r>
-            <w:proofErr w:type="spellEnd"/>
-            <w:r>
-              <w:t xml:space="preserve"> Lu and Jie Hu,</w:t>
+              <w:t xml:space="preserve">Yibiao Lu and Jie Hu,</w:t>
             </w:r>
           </w:p>
           <w:p/>
@@ -758,7 +753,7 @@
         <w:rPr>
           <w:bCs/>
         </w:rPr>
-        <w:t xml:space="preserve"> No document is attached to or served with this set. Each request refers to a term defined above, to a document or record in Defendant's own possession, custody, or control, or to the publicly available National Weather Service web page identified by its address in Request No. 70. Plaintiffs will provide a copy of any document referred to in these requests promptly upon Defendant's request.</w:t>
+        <w:t xml:space="preserve"> No document is attached to or served with this set. Each request refers to a term defined above or to a document or record in Defendant's own possession, custody, or control. Plaintiffs will provide a copy of any document referred to in these requests promptly upon Defendant's request.</w:t>
       </w:r>
     </w:p>
     <w:p>
@@ -851,7 +846,7 @@
         <w:rPr>
           <w:bCs/>
         </w:rPr>
-        <w:t>Admit that The Policy was a valid and enforceable contract in force on July 13, 2024.</w:t>
+        <w:t>Admit that Your September 3, 2024 letter to Plaintiffs stated, "our investigation found your policy provides coverage for direct physical loss to insured property, less uninsured or excluded."</w:t>
       </w:r>
     </w:p>
     <w:p>
@@ -871,7 +866,7 @@
         <w:rPr>
           <w:bCs/>
         </w:rPr>
-        <w:t>Admit that the windstorm/hail deductible applicable to The Claim is $17,720.</w:t>
+        <w:t>Admit that The Policy Form, at "Section I - Loss or Damage Insured," states: "We insure accidental direct physical loss or damage to that property described in Section I - Types of Property Insured."</w:t>
       </w:r>
     </w:p>
     <w:p>
@@ -891,67 +886,7 @@
         <w:rPr>
           <w:bCs/>
         </w:rPr>
-        <w:t>Admit that Your September 3, 2024 letter to Plaintiffs stated, "our investigation found your policy provides coverage for direct physical loss to insured property, less uninsured or excluded."</w:t>
-      </w:r>
-    </w:p>
-    <w:p>
-      <w:pPr>
-        <w:keepLines/>
-        <w:spacing w:after="160"/>
-        <w:ind w:left="720" w:hanging="576"/>
-      </w:pPr>
-      <w:r>
-        <w:rPr>
-          <w:b/>
-          <w:bCs/>
-        </w:rPr>
-        <w:t xml:space="preserve">REQUEST FOR ADMISSION NO. 4:  </w:t>
-      </w:r>
-      <w:r>
-        <w:rPr>
-          <w:bCs/>
-        </w:rPr>
-        <w:t>Admit that The Policy Form, at "Section I - Loss or Damage Insured," states: "We insure accidental direct physical loss or damage to that property described in Section I - Types of Property Insured."</w:t>
-      </w:r>
-    </w:p>
-    <w:p>
-      <w:pPr>
-        <w:keepLines/>
-        <w:spacing w:after="160"/>
-        <w:ind w:left="720" w:hanging="576"/>
-      </w:pPr>
-      <w:r>
-        <w:rPr>
-          <w:b/>
-          <w:bCs/>
-        </w:rPr>
-        <w:t xml:space="preserve">REQUEST FOR ADMISSION NO. 5:  </w:t>
-      </w:r>
-      <w:r>
-        <w:rPr>
-          <w:bCs/>
-        </w:rPr>
         <w:t>Admit that item 26 ("Windstorm or hail") of subsection B of Section I – Uninsured Loss or Damage and Excluded Causes of Loss or Damage of The Policy Form does not apply to loss or damage to the windows of the dwelling at The Property.</w:t>
-      </w:r>
-    </w:p>
-    <w:p>
-      <w:pPr>
-        <w:keepLines/>
-        <w:spacing w:after="160"/>
-        <w:ind w:left="720" w:hanging="576"/>
-      </w:pPr>
-      <w:r>
-        <w:rPr>
-          <w:b/>
-          <w:bCs/>
-        </w:rPr>
-        <w:t xml:space="preserve">REQUEST FOR ADMISSION NO. 6:  </w:t>
-      </w:r>
-      <w:r>
-        <w:rPr>
-          <w:bCs/>
-        </w:rPr>
-        <w:t>Admit that The Policy contains no provision requiring that evidence supporting a claim be provided by an engineer.</w:t>
       </w:r>
     </w:p>
     <w:p>
@@ -995,13 +930,73 @@
           <w:b/>
           <w:bCs/>
         </w:rPr>
+        <w:t xml:space="preserve">REQUEST FOR ADMISSION NO. 4:  </w:t>
+      </w:r>
+      <w:r>
+        <w:rPr>
+          <w:bCs/>
+        </w:rPr>
+        <w:t>Admit that Christian Dudley was employed or engaged by Fire Insurance Exchange at the time of his involvement in The Claim.</w:t>
+      </w:r>
+    </w:p>
+    <w:p>
+      <w:pPr>
+        <w:keepLines/>
+        <w:spacing w:after="160"/>
+        <w:ind w:left="720" w:hanging="576"/>
+      </w:pPr>
+      <w:r>
+        <w:rPr>
+          <w:b/>
+          <w:bCs/>
+        </w:rPr>
+        <w:t xml:space="preserve">REQUEST FOR ADMISSION NO. 5:  </w:t>
+      </w:r>
+      <w:r>
+        <w:rPr>
+          <w:bCs/>
+        </w:rPr>
+        <w:t>Admit that Nicholas Brau was employed or engaged by Fire Insurance Exchange at the time of his September 6, 2024 inspection of The Property.</w:t>
+      </w:r>
+    </w:p>
+    <w:p>
+      <w:pPr>
+        <w:keepLines/>
+        <w:spacing w:after="160"/>
+        <w:ind w:left="720" w:hanging="576"/>
+      </w:pPr>
+      <w:r>
+        <w:rPr>
+          <w:b/>
+          <w:bCs/>
+        </w:rPr>
+        <w:t xml:space="preserve">REQUEST FOR ADMISSION NO. 6:  </w:t>
+      </w:r>
+      <w:r>
+        <w:rPr>
+          <w:bCs/>
+        </w:rPr>
+        <w:t>Admit that Bradlee Monson was employed or engaged by Fire Insurance Exchange at the time of his involvement in The Claim.</w:t>
+      </w:r>
+    </w:p>
+    <w:p>
+      <w:pPr>
+        <w:keepLines/>
+        <w:spacing w:after="160"/>
+        <w:ind w:left="720" w:hanging="576"/>
+      </w:pPr>
+      <w:r>
+        <w:rPr>
+          <w:b/>
+          <w:bCs/>
+        </w:rPr>
         <w:t xml:space="preserve">REQUEST FOR ADMISSION NO. 7:  </w:t>
       </w:r>
       <w:r>
         <w:rPr>
           <w:bCs/>
         </w:rPr>
-        <w:t>Admit that Fire Insurance Exchange issued and underwrote The Policy.</w:t>
+        <w:t>Admit that Fire Insurance Exchange made the coverage decision communicated in Your September 3, 2024 letter to Plaintiffs.</w:t>
       </w:r>
     </w:p>
     <w:p>
@@ -1021,7 +1016,7 @@
         <w:rPr>
           <w:bCs/>
         </w:rPr>
-        <w:t>Admit that Christian Dudley was employed or engaged by Fire Insurance Exchange at the time of his involvement in The Claim.</w:t>
+        <w:t>Admit that Fire Insurance Exchange made the coverage decision communicated in Your November 4, 2024 letter to Plaintiffs.</w:t>
       </w:r>
     </w:p>
     <w:p>
@@ -1041,7 +1036,7 @@
         <w:rPr>
           <w:bCs/>
         </w:rPr>
-        <w:t>Admit that Nicholas Brau was employed or engaged by Fire Insurance Exchange at the time of his September 6, 2024 inspection of The Property.</w:t>
+        <w:t>Admit that Fire Insurance Exchange retained Hancock Claims Consultants to inspect The Property.</w:t>
       </w:r>
     </w:p>
     <w:p>
@@ -1061,7 +1056,7 @@
         <w:rPr>
           <w:bCs/>
         </w:rPr>
-        <w:t>Admit that Bradlee Monson was employed or engaged by Fire Insurance Exchange at the time of his involvement in The Claim.</w:t>
+        <w:t>Admit that Fire Insurance Exchange maintains the claim file for The Claim.</w:t>
       </w:r>
     </w:p>
     <w:p>
@@ -1081,7 +1076,7 @@
         <w:rPr>
           <w:bCs/>
         </w:rPr>
-        <w:t>Admit that Fire Insurance Exchange made the coverage decision communicated in Your September 3, 2024 letter to Plaintiffs.</w:t>
+        <w:t>Admit that Fire Insurance Exchange maintains the claim file for The 2020 Claim.</w:t>
       </w:r>
     </w:p>
     <w:p>
@@ -1096,126 +1091,6 @@
           <w:bCs/>
         </w:rPr>
         <w:t xml:space="preserve">REQUEST FOR ADMISSION NO. 12:  </w:t>
-      </w:r>
-      <w:r>
-        <w:rPr>
-          <w:bCs/>
-        </w:rPr>
-        <w:t>Admit that Fire Insurance Exchange made the coverage decision communicated in Your November 4, 2024 letter to Plaintiffs.</w:t>
-      </w:r>
-    </w:p>
-    <w:p>
-      <w:pPr>
-        <w:keepLines/>
-        <w:spacing w:after="160"/>
-        <w:ind w:left="720" w:hanging="576"/>
-      </w:pPr>
-      <w:r>
-        <w:rPr>
-          <w:b/>
-          <w:bCs/>
-        </w:rPr>
-        <w:t xml:space="preserve">REQUEST FOR ADMISSION NO. 13:  </w:t>
-      </w:r>
-      <w:r>
-        <w:rPr>
-          <w:bCs/>
-        </w:rPr>
-        <w:t>Admit that Fire Insurance Exchange retained Hancock Claims Consultants to inspect The Property.</w:t>
-      </w:r>
-    </w:p>
-    <w:p>
-      <w:pPr>
-        <w:keepLines/>
-        <w:spacing w:after="160"/>
-        <w:ind w:left="720" w:hanging="576"/>
-      </w:pPr>
-      <w:r>
-        <w:rPr>
-          <w:b/>
-          <w:bCs/>
-        </w:rPr>
-        <w:t xml:space="preserve">REQUEST FOR ADMISSION NO. 14:  </w:t>
-      </w:r>
-      <w:r>
-        <w:rPr>
-          <w:bCs/>
-        </w:rPr>
-        <w:t>Admit that Fire Insurance Exchange retained Prieve Engineering, LLC to inspect The Property.</w:t>
-      </w:r>
-    </w:p>
-    <w:p>
-      <w:pPr>
-        <w:keepLines/>
-        <w:spacing w:after="160"/>
-        <w:ind w:left="720" w:hanging="576"/>
-      </w:pPr>
-      <w:r>
-        <w:rPr>
-          <w:b/>
-          <w:bCs/>
-        </w:rPr>
-        <w:t xml:space="preserve">REQUEST FOR ADMISSION NO. 15:  </w:t>
-      </w:r>
-      <w:r>
-        <w:rPr>
-          <w:bCs/>
-        </w:rPr>
-        <w:t>Admit that Fire Insurance Exchange maintains the claim file for The Claim.</w:t>
-      </w:r>
-    </w:p>
-    <w:p>
-      <w:pPr>
-        <w:keepLines/>
-        <w:spacing w:after="160"/>
-        <w:ind w:left="720" w:hanging="576"/>
-      </w:pPr>
-      <w:r>
-        <w:rPr>
-          <w:b/>
-          <w:bCs/>
-        </w:rPr>
-        <w:t xml:space="preserve">REQUEST FOR ADMISSION NO. 16:  </w:t>
-      </w:r>
-      <w:r>
-        <w:rPr>
-          <w:bCs/>
-        </w:rPr>
-        <w:t>Admit that Fire Insurance Exchange maintains the claim file for The 2020 Claim.</w:t>
-      </w:r>
-    </w:p>
-    <w:p>
-      <w:pPr>
-        <w:keepLines/>
-        <w:spacing w:after="160"/>
-        <w:ind w:left="720" w:hanging="576"/>
-      </w:pPr>
-      <w:r>
-        <w:rPr>
-          <w:b/>
-          <w:bCs/>
-        </w:rPr>
-        <w:t xml:space="preserve">REQUEST FOR ADMISSION NO. 17:  </w:t>
-      </w:r>
-      <w:r>
-        <w:rPr>
-          <w:bCs/>
-        </w:rPr>
-        <w:t>Admit that Fire Insurance Exchange appointed Greg Tomes as its appraiser in the appraisal that resulted in The Appraisal Award.</w:t>
-      </w:r>
-    </w:p>
-    <w:p>
-      <w:pPr>
-        <w:keepLines/>
-        <w:spacing w:after="160"/>
-        <w:ind w:left="720" w:hanging="576"/>
-      </w:pPr>
-      <w:r>
-        <w:rPr>
-          <w:b/>
-          <w:bCs/>
-        </w:rPr>
-        <w:t xml:space="preserve">REQUEST FOR ADMISSION NO. 18:  </w:t>
       </w:r>
       <w:r>
         <w:rPr>
@@ -1251,13 +1126,133 @@
           <w:b/>
           <w:bCs/>
         </w:rPr>
+        <w:t xml:space="preserve">REQUEST FOR ADMISSION NO. 13:  </w:t>
+      </w:r>
+      <w:r>
+        <w:rPr>
+          <w:bCs/>
+        </w:rPr>
+        <w:t>Admit that Plaintiffs' August 3, 2025 Demand for Appraisal did not list downspouts, gutters, exterior doors, or window screens among the items to be considered by the appraisal panel.</w:t>
+      </w:r>
+    </w:p>
+    <w:p>
+      <w:pPr>
+        <w:keepLines/>
+        <w:spacing w:after="160"/>
+        <w:ind w:left="720" w:hanging="576"/>
+      </w:pPr>
+      <w:r>
+        <w:rPr>
+          <w:b/>
+          <w:bCs/>
+        </w:rPr>
+        <w:t xml:space="preserve">REQUEST FOR ADMISSION NO. 14:  </w:t>
+      </w:r>
+      <w:r>
+        <w:rPr>
+          <w:bCs/>
+        </w:rPr>
+        <w:t>Admit that The Appraisal Award identifies the two awarded windows only by the designations "F1.7" and "B1.2."</w:t>
+      </w:r>
+    </w:p>
+    <w:p>
+      <w:pPr>
+        <w:keepLines/>
+        <w:spacing w:after="160"/>
+        <w:ind w:left="720" w:hanging="576"/>
+      </w:pPr>
+      <w:r>
+        <w:rPr>
+          <w:b/>
+          <w:bCs/>
+        </w:rPr>
+        <w:t xml:space="preserve">REQUEST FOR ADMISSION NO. 15:  </w:t>
+      </w:r>
+      <w:r>
+        <w:rPr>
+          <w:bCs/>
+        </w:rPr>
+        <w:t>Admit that The Appraisal Award states a Replacement Cost Value of $12,800 and an Actual Cash Value of $6,400 on a single line, the item description of which reads "Windows F1.7 B1.2."</w:t>
+      </w:r>
+    </w:p>
+    <w:p>
+      <w:pPr>
+        <w:keepLines/>
+        <w:spacing w:after="160"/>
+        <w:ind w:left="720" w:hanging="576"/>
+      </w:pPr>
+      <w:r>
+        <w:rPr>
+          <w:b/>
+          <w:bCs/>
+        </w:rPr>
+        <w:t xml:space="preserve">REQUEST FOR ADMISSION NO. 16:  </w:t>
+      </w:r>
+      <w:r>
+        <w:rPr>
+          <w:bCs/>
+        </w:rPr>
+        <w:t>Admit that The Appraisal Award does not state separately an actual value or a loss for the window designated "F1.7."</w:t>
+      </w:r>
+    </w:p>
+    <w:p>
+      <w:pPr>
+        <w:keepLines/>
+        <w:spacing w:after="160"/>
+        <w:ind w:left="720" w:hanging="576"/>
+      </w:pPr>
+      <w:r>
+        <w:rPr>
+          <w:b/>
+          <w:bCs/>
+        </w:rPr>
+        <w:t xml:space="preserve">REQUEST FOR ADMISSION NO. 17:  </w:t>
+      </w:r>
+      <w:r>
+        <w:rPr>
+          <w:bCs/>
+        </w:rPr>
+        <w:t>Admit that The Appraisal Award does not state separately an actual value or a loss for the window designated "B1.2."</w:t>
+      </w:r>
+    </w:p>
+    <w:p>
+      <w:pPr>
+        <w:keepLines/>
+        <w:spacing w:after="160"/>
+        <w:ind w:left="720" w:hanging="576"/>
+      </w:pPr>
+      <w:r>
+        <w:rPr>
+          <w:b/>
+          <w:bCs/>
+        </w:rPr>
+        <w:t xml:space="preserve">REQUEST FOR ADMISSION NO. 18:  </w:t>
+      </w:r>
+      <w:r>
+        <w:rPr>
+          <w:bCs/>
+        </w:rPr>
+        <w:t>Admit that The Appraisal Award does not state an actual value or a loss for any window at The Property other than the two windows designated "F1.7" and "B1.2."</w:t>
+      </w:r>
+    </w:p>
+    <w:p>
+      <w:pPr>
+        <w:keepLines/>
+        <w:spacing w:after="160"/>
+        <w:ind w:left="720" w:hanging="576"/>
+      </w:pPr>
+      <w:r>
+        <w:rPr>
+          <w:b/>
+          <w:bCs/>
+        </w:rPr>
         <w:t xml:space="preserve">REQUEST FOR ADMISSION NO. 19:  </w:t>
       </w:r>
       <w:r>
         <w:rPr>
           <w:bCs/>
         </w:rPr>
-        <w:t>Admit that Plaintiffs' August 3, 2025 Demand for Appraisal listed three items to be considered by the appraisal panel: "Windows," "Siding (repaint)," and "Siding (R&amp;R)."</w:t>
+        <w:t>Admit that The Appraisal Award does not state, as to any window at The Property other than the windows designated "F1.7" and "B1.2," whether hail caused damage to that window.</w:t>
       </w:r>
     </w:p>
     <w:p>
@@ -1277,7 +1272,7 @@
         <w:rPr>
           <w:bCs/>
         </w:rPr>
-        <w:t>Admit that Plaintiffs' August 3, 2025 Demand for Appraisal did not list downspouts, gutters, exterior doors, or window screens among the items to be considered by the appraisal panel.</w:t>
+        <w:t>Admit that You are bound by The Appraisal Award's determination that hail was the cause of loss to the windows designated "F1.7" and "B1.2."</w:t>
       </w:r>
     </w:p>
     <w:p>
@@ -1297,7 +1292,7 @@
         <w:rPr>
           <w:bCs/>
         </w:rPr>
-        <w:t>Admit that The Appraisal Award identified hail as the cause of loss for the two windows it awarded.</w:t>
+        <w:t>Admit that You do not contend that any provision of Section I – Uninsured Loss or Damage and Excluded Causes of Loss or Damage of The Policy Form bars or reduces recovery for the loss to the windows designated "F1.7" and "B1.2" in The Appraisal Award.</w:t>
       </w:r>
     </w:p>
     <w:p>
@@ -1317,7 +1312,7 @@
         <w:rPr>
           <w:bCs/>
         </w:rPr>
-        <w:t>Admit that The Appraisal Award identifies the two awarded windows only by the designations "F1.7" and "B1.2."</w:t>
+        <w:t>Admit that the application of the windstorm/hail deductible is the only reason You have made no payment on account of the loss to the windows designated "F1.7" and "B1.2" in The Appraisal Award.</w:t>
       </w:r>
     </w:p>
     <w:p>
@@ -1337,7 +1332,7 @@
         <w:rPr>
           <w:bCs/>
         </w:rPr>
-        <w:t>Admit that The Appraisal Award states a Replacement Cost Value of $12,800 and an Actual Cash Value of $6,400 on a single line, the item description of which reads "Windows F1.7 B1.2."</w:t>
+        <w:t>Admit that, on The Appraisal Award, the signature line and date line for "Greg Tomes" beneath the statement "We certify the amounts established above for the described loss" are blank.</w:t>
       </w:r>
     </w:p>
     <w:p>
@@ -1357,7 +1352,7 @@
         <w:rPr>
           <w:bCs/>
         </w:rPr>
-        <w:t>Admit that The Appraisal Award does not state separately an actual value or a loss for the window designated "F1.7."</w:t>
+        <w:t>Admit that the only signature of Greg Tomes on The Appraisal Award appears in the section acknowledging that Wade Roos "has been appointed to act as umpire in accord with the policy conditions."</w:t>
       </w:r>
     </w:p>
     <w:p>
@@ -1377,7 +1372,7 @@
         <w:rPr>
           <w:bCs/>
         </w:rPr>
-        <w:t>Admit that The Appraisal Award does not state separately an actual value or a loss for the window designated "B1.2."</w:t>
+        <w:t>Admit that the only items listed in the item column of The Appraisal Award are "Siding &amp; Paint," "Windows F1.7 B1.2," and "Debris."</w:t>
       </w:r>
     </w:p>
     <w:p>
@@ -1397,7 +1392,7 @@
         <w:rPr>
           <w:bCs/>
         </w:rPr>
-        <w:t>Admit that The Appraisal Award does not state an actual value or a loss for any window at The Property other than the two windows designated "F1.7" and "B1.2."</w:t>
+        <w:t>Admit that The Appraisal Award states a Replacement Cost Value of $0 and an Actual Cash Value of $0 for the item "Siding &amp; Paint."</w:t>
       </w:r>
     </w:p>
     <w:p>
@@ -1417,227 +1412,7 @@
         <w:rPr>
           <w:bCs/>
         </w:rPr>
-        <w:t>Admit that The Appraisal Award does not state, as to any window at The Property other than the windows designated "F1.7" and "B1.2," whether hail caused damage to that window.</w:t>
-      </w:r>
-    </w:p>
-    <w:p>
-      <w:pPr>
-        <w:keepLines/>
-        <w:spacing w:after="160"/>
-        <w:ind w:left="720" w:hanging="576"/>
-      </w:pPr>
-      <w:r>
-        <w:rPr>
-          <w:b/>
-          <w:bCs/>
-        </w:rPr>
-        <w:t xml:space="preserve">REQUEST FOR ADMISSION NO. 28:  </w:t>
-      </w:r>
-      <w:r>
-        <w:rPr>
-          <w:bCs/>
-        </w:rPr>
-        <w:t>Admit that You are bound by The Appraisal Award's determination that hail was the cause of loss to the windows designated "F1.7" and "B1.2."</w:t>
-      </w:r>
-    </w:p>
-    <w:p>
-      <w:pPr>
-        <w:keepLines/>
-        <w:spacing w:after="160"/>
-        <w:ind w:left="720" w:hanging="576"/>
-      </w:pPr>
-      <w:r>
-        <w:rPr>
-          <w:b/>
-          <w:bCs/>
-        </w:rPr>
-        <w:t xml:space="preserve">REQUEST FOR ADMISSION NO. 29:  </w:t>
-      </w:r>
-      <w:r>
-        <w:rPr>
-          <w:bCs/>
-        </w:rPr>
-        <w:t>Admit that You do not contend that any provision of Section I – Uninsured Loss or Damage and Excluded Causes of Loss or Damage of The Policy Form bars or reduces recovery for the loss to the windows designated "F1.7" and "B1.2" in The Appraisal Award.</w:t>
-      </w:r>
-    </w:p>
-    <w:p>
-      <w:pPr>
-        <w:keepLines/>
-        <w:spacing w:after="160"/>
-        <w:ind w:left="720" w:hanging="576"/>
-      </w:pPr>
-      <w:r>
-        <w:rPr>
-          <w:b/>
-          <w:bCs/>
-        </w:rPr>
-        <w:t xml:space="preserve">REQUEST FOR ADMISSION NO. 30:  </w:t>
-      </w:r>
-      <w:r>
-        <w:rPr>
-          <w:bCs/>
-        </w:rPr>
-        <w:t>Admit that the application of the windstorm/hail deductible is the only reason You have made no payment on account of the loss to the windows designated "F1.7" and "B1.2" in The Appraisal Award.</w:t>
-      </w:r>
-    </w:p>
-    <w:p>
-      <w:pPr>
-        <w:keepLines/>
-        <w:spacing w:after="160"/>
-        <w:ind w:left="720" w:hanging="576"/>
-      </w:pPr>
-      <w:r>
-        <w:rPr>
-          <w:b/>
-          <w:bCs/>
-        </w:rPr>
-        <w:t xml:space="preserve">REQUEST FOR ADMISSION NO. 31:  </w:t>
-      </w:r>
-      <w:r>
-        <w:rPr>
-          <w:bCs/>
-        </w:rPr>
-        <w:t>Admit that the appraisal umpire, Wade Roos, did not provide You with a written report or estimate.</w:t>
-      </w:r>
-    </w:p>
-    <w:p>
-      <w:pPr>
-        <w:keepLines/>
-        <w:spacing w:after="160"/>
-        <w:ind w:left="720" w:hanging="576"/>
-      </w:pPr>
-      <w:r>
-        <w:rPr>
-          <w:b/>
-          <w:bCs/>
-        </w:rPr>
-        <w:t xml:space="preserve">REQUEST FOR ADMISSION NO. 32:  </w:t>
-      </w:r>
-      <w:r>
-        <w:rPr>
-          <w:bCs/>
-        </w:rPr>
-        <w:t>Admit that, on The Appraisal Award, the signature line and date line for "Greg Tomes" beneath the statement "We certify the amounts established above for the described loss" are blank.</w:t>
-      </w:r>
-    </w:p>
-    <w:p>
-      <w:pPr>
-        <w:keepLines/>
-        <w:spacing w:after="160"/>
-        <w:ind w:left="720" w:hanging="576"/>
-      </w:pPr>
-      <w:r>
-        <w:rPr>
-          <w:b/>
-          <w:bCs/>
-        </w:rPr>
-        <w:t xml:space="preserve">REQUEST FOR ADMISSION NO. 33:  </w:t>
-      </w:r>
-      <w:r>
-        <w:rPr>
-          <w:bCs/>
-        </w:rPr>
-        <w:t>Admit that the only signature of Greg Tomes on The Appraisal Award appears in the section acknowledging that Wade Roos "has been appointed to act as umpire in accord with the policy conditions."</w:t>
-      </w:r>
-    </w:p>
-    <w:p>
-      <w:pPr>
-        <w:keepLines/>
-        <w:spacing w:after="160"/>
-        <w:ind w:left="720" w:hanging="576"/>
-      </w:pPr>
-      <w:r>
-        <w:rPr>
-          <w:b/>
-          <w:bCs/>
-        </w:rPr>
-        <w:t xml:space="preserve">REQUEST FOR ADMISSION NO. 34:  </w:t>
-      </w:r>
-      <w:r>
-        <w:rPr>
-          <w:bCs/>
-        </w:rPr>
-        <w:t>Admit that the only items listed in the item column of The Appraisal Award are "Siding &amp; Paint," "Windows F1.7 B1.2," and "Debris."</w:t>
-      </w:r>
-    </w:p>
-    <w:p>
-      <w:pPr>
-        <w:keepLines/>
-        <w:spacing w:after="160"/>
-        <w:ind w:left="720" w:hanging="576"/>
-      </w:pPr>
-      <w:r>
-        <w:rPr>
-          <w:b/>
-          <w:bCs/>
-        </w:rPr>
-        <w:t xml:space="preserve">REQUEST FOR ADMISSION NO. 35:  </w:t>
-      </w:r>
-      <w:r>
-        <w:rPr>
-          <w:bCs/>
-        </w:rPr>
-        <w:t>Admit that The Appraisal Award states a Replacement Cost Value of $0 and an Actual Cash Value of $0 for the item "Siding &amp; Paint."</w:t>
-      </w:r>
-    </w:p>
-    <w:p>
-      <w:pPr>
-        <w:keepLines/>
-        <w:spacing w:after="160"/>
-        <w:ind w:left="720" w:hanging="576"/>
-      </w:pPr>
-      <w:r>
-        <w:rPr>
-          <w:b/>
-          <w:bCs/>
-        </w:rPr>
-        <w:t xml:space="preserve">REQUEST FOR ADMISSION NO. 36:  </w:t>
-      </w:r>
-      <w:r>
-        <w:rPr>
-          <w:bCs/>
-        </w:rPr>
         <w:t>Admit that The Appraisal Award states "Hail" in the Causation column for the item "Siding &amp; Paint."</w:t>
-      </w:r>
-    </w:p>
-    <w:p>
-      <w:pPr>
-        <w:keepLines/>
-        <w:spacing w:after="160"/>
-        <w:ind w:left="720" w:hanging="576"/>
-      </w:pPr>
-      <w:r>
-        <w:rPr>
-          <w:b/>
-          <w:bCs/>
-        </w:rPr>
-        <w:t xml:space="preserve">REQUEST FOR ADMISSION NO. 37:  </w:t>
-      </w:r>
-      <w:r>
-        <w:rPr>
-          <w:bCs/>
-        </w:rPr>
-        <w:t>Admit that The Appraisal Award states a Replacement Cost Value of $0 and an Actual Cash Value of $0 for the item "Debris."</w:t>
-      </w:r>
-    </w:p>
-    <w:p>
-      <w:pPr>
-        <w:keepLines/>
-        <w:spacing w:after="160"/>
-        <w:ind w:left="720" w:hanging="576"/>
-      </w:pPr>
-      <w:r>
-        <w:rPr>
-          <w:b/>
-          <w:bCs/>
-        </w:rPr>
-        <w:t xml:space="preserve">REQUEST FOR ADMISSION NO. 38:  </w:t>
-      </w:r>
-      <w:r>
-        <w:rPr>
-          <w:bCs/>
-        </w:rPr>
-        <w:t>Admit that The Appraisal Award states "Hail" in the Causation column for the item "Debris."</w:t>
       </w:r>
     </w:p>
     <w:p>
@@ -1667,7 +1442,7 @@
           <w:b/>
           <w:bCs/>
         </w:rPr>
-        <w:t xml:space="preserve">REQUEST FOR ADMISSION NO. 39:  </w:t>
+        <w:t xml:space="preserve">REQUEST FOR ADMISSION NO. 28:  </w:t>
       </w:r>
       <w:r>
         <w:rPr>
@@ -1687,7 +1462,7 @@
           <w:b/>
           <w:bCs/>
         </w:rPr>
-        <w:t xml:space="preserve">REQUEST FOR ADMISSION NO. 40:  </w:t>
+        <w:t xml:space="preserve">REQUEST FOR ADMISSION NO. 29:  </w:t>
       </w:r>
       <w:r>
         <w:rPr>
@@ -1707,7 +1482,7 @@
           <w:b/>
           <w:bCs/>
         </w:rPr>
-        <w:t xml:space="preserve">REQUEST FOR ADMISSION NO. 41:  </w:t>
+        <w:t xml:space="preserve">REQUEST FOR ADMISSION NO. 30:  </w:t>
       </w:r>
       <w:r>
         <w:rPr>
@@ -1727,7 +1502,7 @@
           <w:b/>
           <w:bCs/>
         </w:rPr>
-        <w:t xml:space="preserve">REQUEST FOR ADMISSION NO. 42:  </w:t>
+        <w:t xml:space="preserve">REQUEST FOR ADMISSION NO. 31:  </w:t>
       </w:r>
       <w:r>
         <w:rPr>
@@ -1747,7 +1522,7 @@
           <w:b/>
           <w:bCs/>
         </w:rPr>
-        <w:t xml:space="preserve">REQUEST FOR ADMISSION NO. 43:  </w:t>
+        <w:t xml:space="preserve">REQUEST FOR ADMISSION NO. 32:  </w:t>
       </w:r>
       <w:r>
         <w:rPr>
@@ -1767,7 +1542,7 @@
           <w:b/>
           <w:bCs/>
         </w:rPr>
-        <w:t xml:space="preserve">REQUEST FOR ADMISSION NO. 44:  </w:t>
+        <w:t xml:space="preserve">REQUEST FOR ADMISSION NO. 33:  </w:t>
       </w:r>
       <w:r>
         <w:rPr>
@@ -1787,7 +1562,7 @@
           <w:b/>
           <w:bCs/>
         </w:rPr>
-        <w:t xml:space="preserve">REQUEST FOR ADMISSION NO. 45:  </w:t>
+        <w:t xml:space="preserve">REQUEST FOR ADMISSION NO. 34:  </w:t>
       </w:r>
       <w:r>
         <w:rPr>
@@ -1807,7 +1582,7 @@
           <w:b/>
           <w:bCs/>
         </w:rPr>
-        <w:t xml:space="preserve">REQUEST FOR ADMISSION NO. 46:  </w:t>
+        <w:t xml:space="preserve">REQUEST FOR ADMISSION NO. 35:  </w:t>
       </w:r>
       <w:r>
         <w:rPr>
@@ -1857,27 +1632,7 @@
           <w:b/>
           <w:bCs/>
         </w:rPr>
-        <w:t xml:space="preserve">REQUEST FOR ADMISSION NO. 47:  </w:t>
-      </w:r>
-      <w:r>
-        <w:rPr>
-          <w:bCs/>
-        </w:rPr>
-        <w:t>Admit that Your November 4, 2024 letter transmitted The Prieve Report to Plaintiffs as a basis for Your denial of The Claim.</w:t>
-      </w:r>
-    </w:p>
-    <w:p>
-      <w:pPr>
-        <w:keepLines/>
-        <w:spacing w:after="160"/>
-        <w:ind w:left="720" w:hanging="576"/>
-      </w:pPr>
-      <w:r>
-        <w:rPr>
-          <w:b/>
-          <w:bCs/>
-        </w:rPr>
-        <w:t xml:space="preserve">REQUEST FOR ADMISSION NO. 48:  </w:t>
+        <w:t xml:space="preserve">REQUEST FOR ADMISSION NO. 36:  </w:t>
       </w:r>
       <w:r>
         <w:rPr>
@@ -1897,7 +1652,7 @@
           <w:b/>
           <w:bCs/>
         </w:rPr>
-        <w:t xml:space="preserve">REQUEST FOR ADMISSION NO. 49:  </w:t>
+        <w:t xml:space="preserve">REQUEST FOR ADMISSION NO. 37:  </w:t>
       </w:r>
       <w:r>
         <w:rPr>
@@ -1917,7 +1672,7 @@
           <w:b/>
           <w:bCs/>
         </w:rPr>
-        <w:t xml:space="preserve">REQUEST FOR ADMISSION NO. 50:  </w:t>
+        <w:t xml:space="preserve">REQUEST FOR ADMISSION NO. 38:  </w:t>
       </w:r>
       <w:r>
         <w:rPr>
@@ -1937,7 +1692,7 @@
           <w:b/>
           <w:bCs/>
         </w:rPr>
-        <w:t xml:space="preserve">REQUEST FOR ADMISSION NO. 51:  </w:t>
+        <w:t xml:space="preserve">REQUEST FOR ADMISSION NO. 39:  </w:t>
       </w:r>
       <w:r>
         <w:rPr>
@@ -1957,7 +1712,7 @@
           <w:b/>
           <w:bCs/>
         </w:rPr>
-        <w:t xml:space="preserve">REQUEST FOR ADMISSION NO. 52:  </w:t>
+        <w:t xml:space="preserve">REQUEST FOR ADMISSION NO. 40:  </w:t>
       </w:r>
       <w:r>
         <w:rPr>
@@ -1977,7 +1732,7 @@
           <w:b/>
           <w:bCs/>
         </w:rPr>
-        <w:t xml:space="preserve">REQUEST FOR ADMISSION NO. 53:  </w:t>
+        <w:t xml:space="preserve">REQUEST FOR ADMISSION NO. 41:  </w:t>
       </w:r>
       <w:r>
         <w:rPr>
@@ -1997,7 +1752,7 @@
           <w:b/>
           <w:bCs/>
         </w:rPr>
-        <w:t xml:space="preserve">REQUEST FOR ADMISSION NO. 54:  </w:t>
+        <w:t xml:space="preserve">REQUEST FOR ADMISSION NO. 42:  </w:t>
       </w:r>
       <w:r>
         <w:rPr>
@@ -2017,7 +1772,7 @@
           <w:b/>
           <w:bCs/>
         </w:rPr>
-        <w:t xml:space="preserve">REQUEST FOR ADMISSION NO. 55:  </w:t>
+        <w:t xml:space="preserve">REQUEST FOR ADMISSION NO. 43:  </w:t>
       </w:r>
       <w:r>
         <w:rPr>
@@ -2053,21 +1808,21 @@
         <w:rPr>
           <w:iCs/>
         </w:rPr>
-        <w:t>Requests 56 and 57 quote The Policy Form. Requests 58 and 59 concern The Coverage Outcome Attachment transmitted with Your November 4, 2024 letter, and are to be read with Request No. 55.</w:t>
-      </w:r>
-    </w:p>
-    <w:p>
-      <w:pPr>
-        <w:keepLines/>
-        <w:spacing w:after="160"/>
-        <w:ind w:left="720" w:hanging="576"/>
-      </w:pPr>
-      <w:r>
-        <w:rPr>
-          <w:b/>
-          <w:bCs/>
-        </w:rPr>
-        <w:t xml:space="preserve">REQUEST FOR ADMISSION NO. 56:  </w:t>
+        <w:t>Requests 44 and 45 quote The Policy Form. Requests 46 and 47 concern The Coverage Outcome Attachment transmitted with Your November 4, 2024 letter, and are to be read with Request No. 43.</w:t>
+      </w:r>
+    </w:p>
+    <w:p>
+      <w:pPr>
+        <w:keepLines/>
+        <w:spacing w:after="160"/>
+        <w:ind w:left="720" w:hanging="576"/>
+      </w:pPr>
+      <w:r>
+        <w:rPr>
+          <w:b/>
+          <w:bCs/>
+        </w:rPr>
+        <w:t xml:space="preserve">REQUEST FOR ADMISSION NO. 44:  </w:t>
       </w:r>
       <w:r>
         <w:rPr>
@@ -2087,7 +1842,7 @@
           <w:b/>
           <w:bCs/>
         </w:rPr>
-        <w:t xml:space="preserve">REQUEST FOR ADMISSION NO. 57:  </w:t>
+        <w:t xml:space="preserve">REQUEST FOR ADMISSION NO. 45:  </w:t>
       </w:r>
       <w:r>
         <w:rPr>
@@ -2107,7 +1862,7 @@
           <w:b/>
           <w:bCs/>
         </w:rPr>
-        <w:t xml:space="preserve">REQUEST FOR ADMISSION NO. 58:  </w:t>
+        <w:t xml:space="preserve">REQUEST FOR ADMISSION NO. 46:  </w:t>
       </w:r>
       <w:r>
         <w:rPr>
@@ -2127,7 +1882,7 @@
           <w:b/>
           <w:bCs/>
         </w:rPr>
-        <w:t xml:space="preserve">REQUEST FOR ADMISSION NO. 59:  </w:t>
+        <w:t xml:space="preserve">REQUEST FOR ADMISSION NO. 47:  </w:t>
       </w:r>
       <w:r>
         <w:rPr>
@@ -2163,21 +1918,21 @@
         <w:rPr>
           <w:iCs/>
         </w:rPr>
-        <w:t>Requests 60 through 66 concern the engagement of Prieve Engineering, LLC, Your November 4, 2024 letter, and the work-product status of Your claim file, and are to be read with Requests Nos. 14, 47, and 67 through 75.</w:t>
-      </w:r>
-    </w:p>
-    <w:p>
-      <w:pPr>
-        <w:keepLines/>
-        <w:spacing w:after="160"/>
-        <w:ind w:left="720" w:hanging="576"/>
-      </w:pPr>
-      <w:r>
-        <w:rPr>
-          <w:b/>
-          <w:bCs/>
-        </w:rPr>
-        <w:t xml:space="preserve">REQUEST FOR ADMISSION NO. 60:  </w:t>
+        <w:t>Requests 48 through 54 concern the engagement of Prieve Engineering, LLC, Your November 4, 2024 letter, and the work-product status of Your claim file, and are to be read with Requests Nos. 55 through 61.</w:t>
+      </w:r>
+    </w:p>
+    <w:p>
+      <w:pPr>
+        <w:keepLines/>
+        <w:spacing w:after="160"/>
+        <w:ind w:left="720" w:hanging="576"/>
+      </w:pPr>
+      <w:r>
+        <w:rPr>
+          <w:b/>
+          <w:bCs/>
+        </w:rPr>
+        <w:t xml:space="preserve">REQUEST FOR ADMISSION NO. 48:  </w:t>
       </w:r>
       <w:r>
         <w:rPr>
@@ -2197,7 +1952,7 @@
           <w:b/>
           <w:bCs/>
         </w:rPr>
-        <w:t xml:space="preserve">REQUEST FOR ADMISSION NO. 61:  </w:t>
+        <w:t xml:space="preserve">REQUEST FOR ADMISSION NO. 49:  </w:t>
       </w:r>
       <w:r>
         <w:rPr>
@@ -2217,7 +1972,7 @@
           <w:b/>
           <w:bCs/>
         </w:rPr>
-        <w:t xml:space="preserve">REQUEST FOR ADMISSION NO. 62:  </w:t>
+        <w:t xml:space="preserve">REQUEST FOR ADMISSION NO. 50:  </w:t>
       </w:r>
       <w:r>
         <w:rPr>
@@ -2237,7 +1992,7 @@
           <w:b/>
           <w:bCs/>
         </w:rPr>
-        <w:t xml:space="preserve">REQUEST FOR ADMISSION NO. 63:  </w:t>
+        <w:t xml:space="preserve">REQUEST FOR ADMISSION NO. 51:  </w:t>
       </w:r>
       <w:r>
         <w:rPr>
@@ -2257,7 +2012,7 @@
           <w:b/>
           <w:bCs/>
         </w:rPr>
-        <w:t xml:space="preserve">REQUEST FOR ADMISSION NO. 64:  </w:t>
+        <w:t xml:space="preserve">REQUEST FOR ADMISSION NO. 52:  </w:t>
       </w:r>
       <w:r>
         <w:rPr>
@@ -2277,7 +2032,7 @@
           <w:b/>
           <w:bCs/>
         </w:rPr>
-        <w:t xml:space="preserve">REQUEST FOR ADMISSION NO. 65:  </w:t>
+        <w:t xml:space="preserve">REQUEST FOR ADMISSION NO. 53:  </w:t>
       </w:r>
       <w:r>
         <w:rPr>
@@ -2297,7 +2052,7 @@
           <w:b/>
           <w:bCs/>
         </w:rPr>
-        <w:t xml:space="preserve">REQUEST FOR ADMISSION NO. 66:  </w:t>
+        <w:t xml:space="preserve">REQUEST FOR ADMISSION NO. 54:  </w:t>
       </w:r>
       <w:r>
         <w:rPr>
@@ -2333,7 +2088,7 @@
           <w:b/>
           <w:bCs/>
         </w:rPr>
-        <w:t xml:space="preserve">REQUEST FOR ADMISSION NO. 67:  </w:t>
+        <w:t xml:space="preserve">REQUEST FOR ADMISSION NO. 55:  </w:t>
       </w:r>
       <w:r>
         <w:rPr>
@@ -2353,7 +2108,7 @@
           <w:b/>
           <w:bCs/>
         </w:rPr>
-        <w:t xml:space="preserve">REQUEST FOR ADMISSION NO. 68:  </w:t>
+        <w:t xml:space="preserve">REQUEST FOR ADMISSION NO. 56:  </w:t>
       </w:r>
       <w:r>
         <w:rPr>
@@ -2373,7 +2128,7 @@
           <w:b/>
           <w:bCs/>
         </w:rPr>
-        <w:t xml:space="preserve">REQUEST FOR ADMISSION NO. 69:  </w:t>
+        <w:t xml:space="preserve">REQUEST FOR ADMISSION NO. 57:  </w:t>
       </w:r>
       <w:r>
         <w:rPr>
@@ -2393,47 +2148,7 @@
           <w:b/>
           <w:bCs/>
         </w:rPr>
-        <w:t xml:space="preserve">REQUEST FOR ADMISSION NO. 70:  </w:t>
-      </w:r>
-      <w:r>
-        <w:rPr>
-          <w:bCs/>
-        </w:rPr>
-        <w:t>Admit that the National Weather Service Twin Cities/Chanhassen web page titled "Significant Wind and Hail in Minnesota July 13-14" (https://www.weather.gov/mpx/2024-07-13-SignificantWindandHail) states that a line of storms that developed on the evening of July 13, 2024 "led to numerous reports of hail and wind damage."</w:t>
-      </w:r>
-    </w:p>
-    <w:p>
-      <w:pPr>
-        <w:keepLines/>
-        <w:spacing w:after="160"/>
-        <w:ind w:left="720" w:hanging="576"/>
-      </w:pPr>
-      <w:r>
-        <w:rPr>
-          <w:b/>
-          <w:bCs/>
-        </w:rPr>
-        <w:t xml:space="preserve">REQUEST FOR ADMISSION NO. 71:  </w:t>
-      </w:r>
-      <w:r>
-        <w:rPr>
-          <w:bCs/>
-        </w:rPr>
-        <w:t>Admit that the National Weather Service Twin Cities/Chanhassen web page titled "Significant Wind and Hail in Minnesota July 13-14" lists a 48 MPH wind gust at "Eden Prairie AP" at 1:00 a.m. on July 14, 2024.</w:t>
-      </w:r>
-    </w:p>
-    <w:p>
-      <w:pPr>
-        <w:keepLines/>
-        <w:spacing w:after="160"/>
-        <w:ind w:left="720" w:hanging="576"/>
-      </w:pPr>
-      <w:r>
-        <w:rPr>
-          <w:b/>
-          <w:bCs/>
-        </w:rPr>
-        <w:t xml:space="preserve">REQUEST FOR ADMISSION NO. 72:  </w:t>
+        <w:t xml:space="preserve">REQUEST FOR ADMISSION NO. 58:  </w:t>
       </w:r>
       <w:r>
         <w:rPr>
@@ -2453,7 +2168,7 @@
           <w:b/>
           <w:bCs/>
         </w:rPr>
-        <w:t xml:space="preserve">REQUEST FOR ADMISSION NO. 73:  </w:t>
+        <w:t xml:space="preserve">REQUEST FOR ADMISSION NO. 59:  </w:t>
       </w:r>
       <w:r>
         <w:rPr>
@@ -2473,7 +2188,7 @@
           <w:b/>
           <w:bCs/>
         </w:rPr>
-        <w:t xml:space="preserve">REQUEST FOR ADMISSION NO. 74:  </w:t>
+        <w:t xml:space="preserve">REQUEST FOR ADMISSION NO. 60:  </w:t>
       </w:r>
       <w:r>
         <w:rPr>
@@ -2491,7 +2206,287 @@
         <w:rPr>
           <w:i/>
         </w:rPr>
-        <w:t>See also Requests for Admission Nos. 93 through 117.</w:t>
+        <w:t>See also Requests for Admission Nos. 79 through 103.</w:t>
+      </w:r>
+    </w:p>
+    <w:p>
+      <w:pPr>
+        <w:keepLines/>
+        <w:spacing w:after="160"/>
+        <w:ind w:left="720" w:hanging="576"/>
+      </w:pPr>
+      <w:r>
+        <w:rPr>
+          <w:b/>
+          <w:bCs/>
+        </w:rPr>
+        <w:t xml:space="preserve">REQUEST FOR ADMISSION NO. 61:  </w:t>
+      </w:r>
+      <w:r>
+        <w:rPr>
+          <w:bCs/>
+        </w:rPr>
+        <w:t>Admit that page 5 of The Prieve Report states: "A dent with a scrape mark present appears in the bottom screen frame of the east facing sliding door."</w:t>
+      </w:r>
+    </w:p>
+    <w:p>
+      <w:pPr>
+        <w:keepLines/>
+        <w:spacing w:after="160"/>
+        <w:ind w:left="720" w:hanging="576"/>
+      </w:pPr>
+      <w:r>
+        <w:rPr>
+          <w:b/>
+          <w:bCs/>
+        </w:rPr>
+        <w:t xml:space="preserve">REQUEST FOR ADMISSION NO. 62:  </w:t>
+      </w:r>
+      <w:r>
+        <w:rPr>
+          <w:bCs/>
+        </w:rPr>
+        <w:t>Admit that photograph A-42 of Photo Appendix A depicts a dent in a downspout extension at The Property.</w:t>
+      </w:r>
+    </w:p>
+    <w:p>
+      <w:pPr>
+        <w:keepLines/>
+        <w:spacing w:after="160"/>
+        <w:ind w:left="720" w:hanging="576"/>
+      </w:pPr>
+      <w:r>
+        <w:rPr>
+          <w:b/>
+          <w:bCs/>
+        </w:rPr>
+        <w:t xml:space="preserve">REQUEST FOR ADMISSION NO. 63:  </w:t>
+      </w:r>
+      <w:r>
+        <w:rPr>
+          <w:bCs/>
+        </w:rPr>
+        <w:t>Admit that photograph A-92 of Photo Appendix A depicts a dented downspout at The Property.</w:t>
+      </w:r>
+    </w:p>
+    <w:p>
+      <w:pPr>
+        <w:keepLines/>
+        <w:spacing w:after="160"/>
+        <w:ind w:left="720" w:hanging="576"/>
+      </w:pPr>
+      <w:r>
+        <w:rPr>
+          <w:b/>
+          <w:bCs/>
+        </w:rPr>
+        <w:t xml:space="preserve">REQUEST FOR ADMISSION NO. 64:  </w:t>
+      </w:r>
+      <w:r>
+        <w:rPr>
+          <w:bCs/>
+        </w:rPr>
+        <w:t>Admit that photograph A-93 of Photo Appendix A depicts a dented downspout at The Property.</w:t>
+      </w:r>
+    </w:p>
+    <w:p>
+      <w:pPr>
+        <w:keepLines/>
+        <w:spacing w:after="160"/>
+        <w:ind w:left="720" w:hanging="576"/>
+      </w:pPr>
+      <w:r>
+        <w:rPr>
+          <w:b/>
+          <w:bCs/>
+        </w:rPr>
+        <w:t xml:space="preserve">REQUEST FOR ADMISSION NO. 65:  </w:t>
+      </w:r>
+      <w:r>
+        <w:rPr>
+          <w:bCs/>
+        </w:rPr>
+        <w:t>Admit that photograph A-98 of Photo Appendix A depicts a dented downspout at The Property.</w:t>
+      </w:r>
+    </w:p>
+    <w:p>
+      <w:pPr>
+        <w:keepLines/>
+        <w:spacing w:after="160"/>
+        <w:ind w:left="720" w:hanging="576"/>
+      </w:pPr>
+      <w:r>
+        <w:rPr>
+          <w:b/>
+          <w:bCs/>
+        </w:rPr>
+        <w:t xml:space="preserve">REQUEST FOR ADMISSION NO. 66:  </w:t>
+      </w:r>
+      <w:r>
+        <w:rPr>
+          <w:bCs/>
+        </w:rPr>
+        <w:t>Admit that photograph A-99 of Photo Appendix A depicts a dented downspout at The Property.</w:t>
+      </w:r>
+    </w:p>
+    <w:p>
+      <w:pPr>
+        <w:keepLines/>
+        <w:spacing w:after="160"/>
+        <w:ind w:left="720" w:hanging="576"/>
+      </w:pPr>
+      <w:r>
+        <w:rPr>
+          <w:b/>
+          <w:bCs/>
+        </w:rPr>
+        <w:t xml:space="preserve">REQUEST FOR ADMISSION NO. 67:  </w:t>
+      </w:r>
+      <w:r>
+        <w:rPr>
+          <w:bCs/>
+        </w:rPr>
+        <w:t>Admit that photograph A-103 of Photo Appendix A depicts dented flashing at The Property.</w:t>
+      </w:r>
+    </w:p>
+    <w:p>
+      <w:pPr>
+        <w:keepLines/>
+        <w:spacing w:after="160"/>
+        <w:ind w:left="720" w:hanging="576"/>
+      </w:pPr>
+      <w:r>
+        <w:rPr>
+          <w:b/>
+          <w:bCs/>
+        </w:rPr>
+        <w:t xml:space="preserve">REQUEST FOR ADMISSION NO. 68:  </w:t>
+      </w:r>
+      <w:r>
+        <w:rPr>
+          <w:bCs/>
+        </w:rPr>
+        <w:t>Admit that Photo Appendix A is a genuine copy of the photographic appendix prepared by Prieve Engineering, LLC, File Number 241008.</w:t>
+      </w:r>
+    </w:p>
+    <w:p>
+      <w:pPr>
+        <w:keepLines/>
+        <w:spacing w:after="160"/>
+        <w:ind w:left="720" w:hanging="576"/>
+      </w:pPr>
+      <w:r>
+        <w:rPr>
+          <w:b/>
+          <w:bCs/>
+        </w:rPr>
+        <w:t xml:space="preserve">REQUEST FOR ADMISSION NO. 69:  </w:t>
+      </w:r>
+      <w:r>
+        <w:rPr>
+          <w:bCs/>
+        </w:rPr>
+        <w:t>Admit that "DOWNSPOUT EXTENSION AT FRONT, VIEW OF DENT AT UPPER EDGE" is the caption of photograph A-42 of Photo Appendix A.</w:t>
+      </w:r>
+    </w:p>
+    <w:p>
+      <w:pPr>
+        <w:keepLines/>
+        <w:spacing w:after="160"/>
+        <w:ind w:left="720" w:hanging="576"/>
+      </w:pPr>
+      <w:r>
+        <w:rPr>
+          <w:b/>
+          <w:bCs/>
+        </w:rPr>
+        <w:t xml:space="preserve">REQUEST FOR ADMISSION NO. 70:  </w:t>
+      </w:r>
+      <w:r>
+        <w:rPr>
+          <w:bCs/>
+        </w:rPr>
+        <w:t>Admit that "VIEW OF DOWNSPOUT, DENT PRESENT" is the caption of photograph A-92 of Photo Appendix A.</w:t>
+      </w:r>
+    </w:p>
+    <w:p>
+      <w:pPr>
+        <w:keepLines/>
+        <w:spacing w:after="160"/>
+        <w:ind w:left="720" w:hanging="576"/>
+      </w:pPr>
+      <w:r>
+        <w:rPr>
+          <w:b/>
+          <w:bCs/>
+        </w:rPr>
+        <w:t xml:space="preserve">REQUEST FOR ADMISSION NO. 71:  </w:t>
+      </w:r>
+      <w:r>
+        <w:rPr>
+          <w:bCs/>
+        </w:rPr>
+        <w:t>Admit that "ADJACENT AREA SHOWING DENT IN DOWNSPOUT" is the caption of photograph A-93 of Photo Appendix A.</w:t>
+      </w:r>
+    </w:p>
+    <w:p>
+      <w:pPr>
+        <w:keepLines/>
+        <w:spacing w:after="160"/>
+        <w:ind w:left="720" w:hanging="576"/>
+      </w:pPr>
+      <w:r>
+        <w:rPr>
+          <w:b/>
+          <w:bCs/>
+        </w:rPr>
+        <w:t xml:space="preserve">REQUEST FOR ADMISSION NO. 72:  </w:t>
+      </w:r>
+      <w:r>
+        <w:rPr>
+          <w:bCs/>
+        </w:rPr>
+        <w:t>Admit that "DOWNSPOUT AT EASET [sic] SIDE SHOWING DENT" is the caption of photograph A-98 of Photo Appendix A.</w:t>
+      </w:r>
+    </w:p>
+    <w:p>
+      <w:pPr>
+        <w:keepLines/>
+        <w:spacing w:after="160"/>
+        <w:ind w:left="720" w:hanging="576"/>
+      </w:pPr>
+      <w:r>
+        <w:rPr>
+          <w:b/>
+          <w:bCs/>
+        </w:rPr>
+        <w:t xml:space="preserve">REQUEST FOR ADMISSION NO. 73:  </w:t>
+      </w:r>
+      <w:r>
+        <w:rPr>
+          <w:bCs/>
+        </w:rPr>
+        <w:t>Admit that "DENT IN DOWNSPOUT WITH CREASE PRESENT" is the caption of photograph A-99 of Photo Appendix A.</w:t>
+      </w:r>
+    </w:p>
+    <w:p>
+      <w:pPr>
+        <w:keepLines/>
+        <w:spacing w:after="160"/>
+        <w:ind w:left="720" w:hanging="576"/>
+      </w:pPr>
+      <w:r>
+        <w:rPr>
+          <w:b/>
+          <w:bCs/>
+        </w:rPr>
+        <w:t xml:space="preserve">REQUEST FOR ADMISSION NO. 74:  </w:t>
+      </w:r>
+      <w:r>
+        <w:rPr>
+          <w:bCs/>
+        </w:rPr>
+        <w:t>Admit that "VIEW OF DENTS IN FLASHING AT BASE OF WALL ALONG DECK" is the caption of photograph A-103 of Photo Appendix A.</w:t>
       </w:r>
     </w:p>
     <w:p>
@@ -2511,7 +2506,7 @@
         <w:rPr>
           <w:bCs/>
         </w:rPr>
-        <w:t>Admit that page 5 of The Prieve Report states: "A dent with a scrape mark present appears in the bottom screen frame of the east facing sliding door."</w:t>
+        <w:t>Admit that "DENT IN SCREEN AT DOOR WINDOW SCRAPE MARK PRESENT" is the caption of photograph A-141 of Photo Appendix A.</w:t>
       </w:r>
     </w:p>
     <w:p>
@@ -2531,7 +2526,7 @@
         <w:rPr>
           <w:bCs/>
         </w:rPr>
-        <w:t>Admit that photograph A-42 of Photo Appendix A depicts a dent in a downspout extension at The Property.</w:t>
+        <w:t>Admit that You have not at any time obtained any engineering analysis, engineering report, or engineering opinion concerning the cause of the conditions depicted at photographs A-42, A-92, A-93, A-98, A-99, A-103, and A-141 of Photo Appendix A.</w:t>
       </w:r>
     </w:p>
     <w:p>
@@ -2551,7 +2546,7 @@
         <w:rPr>
           <w:bCs/>
         </w:rPr>
-        <w:t>Admit that photograph A-92 of Photo Appendix A depicts a dented downspout at The Property.</w:t>
+        <w:t>Admit that Photo Appendix A contains no photograph of the two-sash fixed window that is the only other window on the rear (east) elevation of the attached garage at The Property, south of the garage window depicted at photographs A-213 through A-217.</w:t>
       </w:r>
     </w:p>
     <w:p>
@@ -2566,286 +2561,6 @@
           <w:bCs/>
         </w:rPr>
         <w:t xml:space="preserve">REQUEST FOR ADMISSION NO. 78:  </w:t>
-      </w:r>
-      <w:r>
-        <w:rPr>
-          <w:bCs/>
-        </w:rPr>
-        <w:t>Admit that photograph A-93 of Photo Appendix A depicts a dented downspout at The Property.</w:t>
-      </w:r>
-    </w:p>
-    <w:p>
-      <w:pPr>
-        <w:keepLines/>
-        <w:spacing w:after="160"/>
-        <w:ind w:left="720" w:hanging="576"/>
-      </w:pPr>
-      <w:r>
-        <w:rPr>
-          <w:b/>
-          <w:bCs/>
-        </w:rPr>
-        <w:t xml:space="preserve">REQUEST FOR ADMISSION NO. 79:  </w:t>
-      </w:r>
-      <w:r>
-        <w:rPr>
-          <w:bCs/>
-        </w:rPr>
-        <w:t>Admit that photograph A-98 of Photo Appendix A depicts a dented downspout at The Property.</w:t>
-      </w:r>
-    </w:p>
-    <w:p>
-      <w:pPr>
-        <w:keepLines/>
-        <w:spacing w:after="160"/>
-        <w:ind w:left="720" w:hanging="576"/>
-      </w:pPr>
-      <w:r>
-        <w:rPr>
-          <w:b/>
-          <w:bCs/>
-        </w:rPr>
-        <w:t xml:space="preserve">REQUEST FOR ADMISSION NO. 80:  </w:t>
-      </w:r>
-      <w:r>
-        <w:rPr>
-          <w:bCs/>
-        </w:rPr>
-        <w:t>Admit that photograph A-99 of Photo Appendix A depicts a dented downspout at The Property.</w:t>
-      </w:r>
-    </w:p>
-    <w:p>
-      <w:pPr>
-        <w:keepLines/>
-        <w:spacing w:after="160"/>
-        <w:ind w:left="720" w:hanging="576"/>
-      </w:pPr>
-      <w:r>
-        <w:rPr>
-          <w:b/>
-          <w:bCs/>
-        </w:rPr>
-        <w:t xml:space="preserve">REQUEST FOR ADMISSION NO. 81:  </w:t>
-      </w:r>
-      <w:r>
-        <w:rPr>
-          <w:bCs/>
-        </w:rPr>
-        <w:t>Admit that photograph A-103 of Photo Appendix A depicts dented flashing at The Property.</w:t>
-      </w:r>
-    </w:p>
-    <w:p>
-      <w:pPr>
-        <w:keepLines/>
-        <w:spacing w:after="160"/>
-        <w:ind w:left="720" w:hanging="576"/>
-      </w:pPr>
-      <w:r>
-        <w:rPr>
-          <w:b/>
-          <w:bCs/>
-        </w:rPr>
-        <w:t xml:space="preserve">REQUEST FOR ADMISSION NO. 82:  </w:t>
-      </w:r>
-      <w:r>
-        <w:rPr>
-          <w:bCs/>
-        </w:rPr>
-        <w:t>Admit that Photo Appendix A is a genuine copy of the photographic appendix prepared by Prieve Engineering, LLC, File Number 241008.</w:t>
-      </w:r>
-    </w:p>
-    <w:p>
-      <w:pPr>
-        <w:keepLines/>
-        <w:spacing w:after="160"/>
-        <w:ind w:left="720" w:hanging="576"/>
-      </w:pPr>
-      <w:r>
-        <w:rPr>
-          <w:b/>
-          <w:bCs/>
-        </w:rPr>
-        <w:t xml:space="preserve">REQUEST FOR ADMISSION NO. 83:  </w:t>
-      </w:r>
-      <w:r>
-        <w:rPr>
-          <w:bCs/>
-        </w:rPr>
-        <w:t>Admit that "DOWNSPOUT EXTENSION AT FRONT, VIEW OF DENT AT UPPER EDGE" is the caption of photograph A-42 of Photo Appendix A.</w:t>
-      </w:r>
-    </w:p>
-    <w:p>
-      <w:pPr>
-        <w:keepLines/>
-        <w:spacing w:after="160"/>
-        <w:ind w:left="720" w:hanging="576"/>
-      </w:pPr>
-      <w:r>
-        <w:rPr>
-          <w:b/>
-          <w:bCs/>
-        </w:rPr>
-        <w:t xml:space="preserve">REQUEST FOR ADMISSION NO. 84:  </w:t>
-      </w:r>
-      <w:r>
-        <w:rPr>
-          <w:bCs/>
-        </w:rPr>
-        <w:t>Admit that "VIEW OF DOWNSPOUT, DENT PRESENT" is the caption of photograph A-92 of Photo Appendix A.</w:t>
-      </w:r>
-    </w:p>
-    <w:p>
-      <w:pPr>
-        <w:keepLines/>
-        <w:spacing w:after="160"/>
-        <w:ind w:left="720" w:hanging="576"/>
-      </w:pPr>
-      <w:r>
-        <w:rPr>
-          <w:b/>
-          <w:bCs/>
-        </w:rPr>
-        <w:t xml:space="preserve">REQUEST FOR ADMISSION NO. 85:  </w:t>
-      </w:r>
-      <w:r>
-        <w:rPr>
-          <w:bCs/>
-        </w:rPr>
-        <w:t>Admit that "ADJACENT AREA SHOWING DENT IN DOWNSPOUT" is the caption of photograph A-93 of Photo Appendix A.</w:t>
-      </w:r>
-    </w:p>
-    <w:p>
-      <w:pPr>
-        <w:keepLines/>
-        <w:spacing w:after="160"/>
-        <w:ind w:left="720" w:hanging="576"/>
-      </w:pPr>
-      <w:r>
-        <w:rPr>
-          <w:b/>
-          <w:bCs/>
-        </w:rPr>
-        <w:t xml:space="preserve">REQUEST FOR ADMISSION NO. 86:  </w:t>
-      </w:r>
-      <w:r>
-        <w:rPr>
-          <w:bCs/>
-        </w:rPr>
-        <w:t>Admit that "DOWNSPOUT AT EASET [sic] SIDE SHOWING DENT" is the caption of photograph A-98 of Photo Appendix A.</w:t>
-      </w:r>
-    </w:p>
-    <w:p>
-      <w:pPr>
-        <w:keepLines/>
-        <w:spacing w:after="160"/>
-        <w:ind w:left="720" w:hanging="576"/>
-      </w:pPr>
-      <w:r>
-        <w:rPr>
-          <w:b/>
-          <w:bCs/>
-        </w:rPr>
-        <w:t xml:space="preserve">REQUEST FOR ADMISSION NO. 87:  </w:t>
-      </w:r>
-      <w:r>
-        <w:rPr>
-          <w:bCs/>
-        </w:rPr>
-        <w:t>Admit that "DENT IN DOWNSPOUT WITH CREASE PRESENT" is the caption of photograph A-99 of Photo Appendix A.</w:t>
-      </w:r>
-    </w:p>
-    <w:p>
-      <w:pPr>
-        <w:keepLines/>
-        <w:spacing w:after="160"/>
-        <w:ind w:left="720" w:hanging="576"/>
-      </w:pPr>
-      <w:r>
-        <w:rPr>
-          <w:b/>
-          <w:bCs/>
-        </w:rPr>
-        <w:t xml:space="preserve">REQUEST FOR ADMISSION NO. 88:  </w:t>
-      </w:r>
-      <w:r>
-        <w:rPr>
-          <w:bCs/>
-        </w:rPr>
-        <w:t>Admit that "VIEW OF DENTS IN FLASHING AT BASE OF WALL ALONG DECK" is the caption of photograph A-103 of Photo Appendix A.</w:t>
-      </w:r>
-    </w:p>
-    <w:p>
-      <w:pPr>
-        <w:keepLines/>
-        <w:spacing w:after="160"/>
-        <w:ind w:left="720" w:hanging="576"/>
-      </w:pPr>
-      <w:r>
-        <w:rPr>
-          <w:b/>
-          <w:bCs/>
-        </w:rPr>
-        <w:t xml:space="preserve">REQUEST FOR ADMISSION NO. 89:  </w:t>
-      </w:r>
-      <w:r>
-        <w:rPr>
-          <w:bCs/>
-        </w:rPr>
-        <w:t>Admit that "DENT IN SCREEN AT DOOR WINDOW SCRAPE MARK PRESENT" is the caption of photograph A-141 of Photo Appendix A.</w:t>
-      </w:r>
-    </w:p>
-    <w:p>
-      <w:pPr>
-        <w:keepLines/>
-        <w:spacing w:after="160"/>
-        <w:ind w:left="720" w:hanging="576"/>
-      </w:pPr>
-      <w:r>
-        <w:rPr>
-          <w:b/>
-          <w:bCs/>
-        </w:rPr>
-        <w:t xml:space="preserve">REQUEST FOR ADMISSION NO. 90:  </w:t>
-      </w:r>
-      <w:r>
-        <w:rPr>
-          <w:bCs/>
-        </w:rPr>
-        <w:t>Admit that You have not at any time obtained any engineering analysis, engineering report, or engineering opinion concerning the cause of the conditions depicted at photographs A-42, A-92, A-93, A-98, A-99, A-103, and A-141 of Photo Appendix A.</w:t>
-      </w:r>
-    </w:p>
-    <w:p>
-      <w:pPr>
-        <w:keepLines/>
-        <w:spacing w:after="160"/>
-        <w:ind w:left="720" w:hanging="576"/>
-      </w:pPr>
-      <w:r>
-        <w:rPr>
-          <w:b/>
-          <w:bCs/>
-        </w:rPr>
-        <w:t xml:space="preserve">REQUEST FOR ADMISSION NO. 91:  </w:t>
-      </w:r>
-      <w:r>
-        <w:rPr>
-          <w:bCs/>
-        </w:rPr>
-        <w:t>Admit that Photo Appendix A contains no photograph of the two-sash fixed window that is the only other window on the rear (east) elevation of the attached garage at The Property, south of the garage window depicted at photographs A-213 through A-217.</w:t>
-      </w:r>
-    </w:p>
-    <w:p>
-      <w:pPr>
-        <w:keepLines/>
-        <w:spacing w:after="160"/>
-        <w:ind w:left="720" w:hanging="576"/>
-      </w:pPr>
-      <w:r>
-        <w:rPr>
-          <w:b/>
-          <w:bCs/>
-        </w:rPr>
-        <w:t xml:space="preserve">REQUEST FOR ADMISSION NO. 92:  </w:t>
       </w:r>
       <w:r>
         <w:rPr>
@@ -2881,7 +2596,287 @@
         <w:rPr>
           <w:iCs/>
         </w:rPr>
-        <w:t>The first Request in this section concerns the genuineness of The Prieve Report. The next twenty Requests each ask You to admit that a dent or indentation, identified by the sentence of The Prieve Report quoted in the Request, was present at The Property; they do not ask You to admit the cause of any dent or indentation. The remaining Requests in this section concern what The Prieve Report does not state or identify. To be read with Requests Nos. 67 through 75.</w:t>
+        <w:t>The first Request in this section concerns the genuineness of The Prieve Report. The next twenty Requests each ask You to admit that a dent or indentation, identified by the sentence of The Prieve Report quoted in the Request, was present at The Property; they do not ask You to admit the cause of any dent or indentation. The remaining Requests in this section concern what The Prieve Report does not state or identify. To be read with Requests Nos. 55 through 61.</w:t>
+      </w:r>
+    </w:p>
+    <w:p>
+      <w:pPr>
+        <w:keepLines/>
+        <w:spacing w:after="160"/>
+        <w:ind w:left="720" w:hanging="576"/>
+      </w:pPr>
+      <w:r>
+        <w:rPr>
+          <w:b/>
+          <w:bCs/>
+        </w:rPr>
+        <w:t xml:space="preserve">REQUEST FOR ADMISSION NO. 79:  </w:t>
+      </w:r>
+      <w:r>
+        <w:rPr>
+          <w:bCs/>
+        </w:rPr>
+        <w:t>Admit that The Prieve Report is a genuine copy of the report prepared by Prieve Engineering, LLC, File Number 241008.</w:t>
+      </w:r>
+    </w:p>
+    <w:p>
+      <w:pPr>
+        <w:keepLines/>
+        <w:spacing w:after="160"/>
+        <w:ind w:left="720" w:hanging="576"/>
+      </w:pPr>
+      <w:r>
+        <w:rPr>
+          <w:b/>
+          <w:bCs/>
+        </w:rPr>
+        <w:t xml:space="preserve">REQUEST FOR ADMISSION NO. 80:  </w:t>
+      </w:r>
+      <w:r>
+        <w:rPr>
+          <w:bCs/>
+        </w:rPr>
+        <w:t>Admit that the dents described on page 4 of The Prieve Report in the sentence "Rounded dents were observed at sashes of this window unit" were present at The Property on October 9, 2024.</w:t>
+      </w:r>
+    </w:p>
+    <w:p>
+      <w:pPr>
+        <w:keepLines/>
+        <w:spacing w:after="160"/>
+        <w:ind w:left="720" w:hanging="576"/>
+      </w:pPr>
+      <w:r>
+        <w:rPr>
+          <w:b/>
+          <w:bCs/>
+        </w:rPr>
+        <w:t xml:space="preserve">REQUEST FOR ADMISSION NO. 81:  </w:t>
+      </w:r>
+      <w:r>
+        <w:rPr>
+          <w:bCs/>
+        </w:rPr>
+        <w:t>Admit that the dents described on page 4 of The Prieve Report in the sentence "Two dents with sharp marks/indentations appear long [sic] the left side of the left sash as shown in photograph A-45" were present at The Property on October 9, 2024.</w:t>
+      </w:r>
+    </w:p>
+    <w:p>
+      <w:pPr>
+        <w:keepLines/>
+        <w:spacing w:after="160"/>
+        <w:ind w:left="720" w:hanging="576"/>
+      </w:pPr>
+      <w:r>
+        <w:rPr>
+          <w:b/>
+          <w:bCs/>
+        </w:rPr>
+        <w:t xml:space="preserve">REQUEST FOR ADMISSION NO. 82:  </w:t>
+      </w:r>
+      <w:r>
+        <w:rPr>
+          <w:bCs/>
+        </w:rPr>
+        <w:t>Admit that the dent described on page 4 of The Prieve Report in the sentence "A dent appears in a window sash with a scrape mark present inside the dent as shown in photograph A-64" was present at The Property on October 9, 2024.</w:t>
+      </w:r>
+    </w:p>
+    <w:p>
+      <w:pPr>
+        <w:keepLines/>
+        <w:spacing w:after="160"/>
+        <w:ind w:left="720" w:hanging="576"/>
+      </w:pPr>
+      <w:r>
+        <w:rPr>
+          <w:b/>
+          <w:bCs/>
+        </w:rPr>
+        <w:t xml:space="preserve">REQUEST FOR ADMISSION NO. 83:  </w:t>
+      </w:r>
+      <w:r>
+        <w:rPr>
+          <w:bCs/>
+        </w:rPr>
+        <w:t>Admit that the dent described on page 5 of The Prieve Report in the sentence "A dent with scrape marks was observed in the frame of the upper southeast facing window as shown in photograph A-107" was present at The Property on October 9, 2024.</w:t>
+      </w:r>
+    </w:p>
+    <w:p>
+      <w:pPr>
+        <w:keepLines/>
+        <w:spacing w:after="160"/>
+        <w:ind w:left="720" w:hanging="576"/>
+      </w:pPr>
+      <w:r>
+        <w:rPr>
+          <w:b/>
+          <w:bCs/>
+        </w:rPr>
+        <w:t xml:space="preserve">REQUEST FOR ADMISSION NO. 84:  </w:t>
+      </w:r>
+      <w:r>
+        <w:rPr>
+          <w:bCs/>
+        </w:rPr>
+        <w:t>Admit that the indentation described on page 5 of The Prieve Report in the sentence "An indentation appears on the left side of the center window accessory groove not consistent with hail along with a mark in the frame with loss of finishes as shown in photograph A-113" was present at The Property on October 9, 2024.</w:t>
+      </w:r>
+    </w:p>
+    <w:p>
+      <w:pPr>
+        <w:keepLines/>
+        <w:spacing w:after="160"/>
+        <w:ind w:left="720" w:hanging="576"/>
+      </w:pPr>
+      <w:r>
+        <w:rPr>
+          <w:b/>
+          <w:bCs/>
+        </w:rPr>
+        <w:t xml:space="preserve">REQUEST FOR ADMISSION NO. 85:  </w:t>
+      </w:r>
+      <w:r>
+        <w:rPr>
+          <w:bCs/>
+        </w:rPr>
+        <w:t>Admit that the dents described on page 5 of The Prieve Report in the sentence "Two dents appear in the face of the sash at the lower left corner of the main window with scrape marks present inside and around areas of dents" were present at The Property on October 9, 2024.</w:t>
+      </w:r>
+    </w:p>
+    <w:p>
+      <w:pPr>
+        <w:keepLines/>
+        <w:spacing w:after="160"/>
+        <w:ind w:left="720" w:hanging="576"/>
+      </w:pPr>
+      <w:r>
+        <w:rPr>
+          <w:b/>
+          <w:bCs/>
+        </w:rPr>
+        <w:t xml:space="preserve">REQUEST FOR ADMISSION NO. 86:  </w:t>
+      </w:r>
+      <w:r>
+        <w:rPr>
+          <w:bCs/>
+        </w:rPr>
+        <w:t>Admit that the dent described on page 5 of The Prieve Report in the sentence "A dent with marks present appears in the face of the drip cap of the upper center window unit" was present at The Property on October 9, 2024.</w:t>
+      </w:r>
+    </w:p>
+    <w:p>
+      <w:pPr>
+        <w:keepLines/>
+        <w:spacing w:after="160"/>
+        <w:ind w:left="720" w:hanging="576"/>
+      </w:pPr>
+      <w:r>
+        <w:rPr>
+          <w:b/>
+          <w:bCs/>
+        </w:rPr>
+        <w:t xml:space="preserve">REQUEST FOR ADMISSION NO. 87:  </w:t>
+      </w:r>
+      <w:r>
+        <w:rPr>
+          <w:bCs/>
+        </w:rPr>
+        <w:t>Admit that the dent described on page 5 of The Prieve Report in the sentence "A dent appears in the bottom accessory groove of the upper northeast facing window not consistent with hail" was present at The Property on October 9, 2024.</w:t>
+      </w:r>
+    </w:p>
+    <w:p>
+      <w:pPr>
+        <w:keepLines/>
+        <w:spacing w:after="160"/>
+        <w:ind w:left="720" w:hanging="576"/>
+      </w:pPr>
+      <w:r>
+        <w:rPr>
+          <w:b/>
+          <w:bCs/>
+        </w:rPr>
+        <w:t xml:space="preserve">REQUEST FOR ADMISSION NO. 88:  </w:t>
+      </w:r>
+      <w:r>
+        <w:rPr>
+          <w:bCs/>
+        </w:rPr>
+        <w:t>Admit that the dent described on page 5 of The Prieve Report in the sentence "A dent appears along the left accessory groove of the southeast facing window not consistent with hail" was present at The Property on October 9, 2024.</w:t>
+      </w:r>
+    </w:p>
+    <w:p>
+      <w:pPr>
+        <w:keepLines/>
+        <w:spacing w:after="160"/>
+        <w:ind w:left="720" w:hanging="576"/>
+      </w:pPr>
+      <w:r>
+        <w:rPr>
+          <w:b/>
+          <w:bCs/>
+        </w:rPr>
+        <w:t xml:space="preserve">REQUEST FOR ADMISSION NO. 89:  </w:t>
+      </w:r>
+      <w:r>
+        <w:rPr>
+          <w:bCs/>
+        </w:rPr>
+        <w:t>Admit that the dent described on page 5 of The Prieve Report in the sentence "Various scrape marks and a dent appear along the bottom frame of the center window not consistent with hail" was present at The Property on October 9, 2024.</w:t>
+      </w:r>
+    </w:p>
+    <w:p>
+      <w:pPr>
+        <w:keepLines/>
+        <w:spacing w:after="160"/>
+        <w:ind w:left="720" w:hanging="576"/>
+      </w:pPr>
+      <w:r>
+        <w:rPr>
+          <w:b/>
+          <w:bCs/>
+        </w:rPr>
+        <w:t xml:space="preserve">REQUEST FOR ADMISSION NO. 90:  </w:t>
+      </w:r>
+      <w:r>
+        <w:rPr>
+          <w:bCs/>
+        </w:rPr>
+        <w:t>Admit that the dents described on page 5 of The Prieve Report in the sentence "Dents with scrape marks appear at the lower left corner of the sash of the northeast facing window not consistent with hail" were present at The Property on October 9, 2024.</w:t>
+      </w:r>
+    </w:p>
+    <w:p>
+      <w:pPr>
+        <w:keepLines/>
+        <w:spacing w:after="160"/>
+        <w:ind w:left="720" w:hanging="576"/>
+      </w:pPr>
+      <w:r>
+        <w:rPr>
+          <w:b/>
+          <w:bCs/>
+        </w:rPr>
+        <w:t xml:space="preserve">REQUEST FOR ADMISSION NO. 91:  </w:t>
+      </w:r>
+      <w:r>
+        <w:rPr>
+          <w:bCs/>
+        </w:rPr>
+        <w:t>Admit that the dent described on page 5 of The Prieve Report in the sentence "A dent appears along the bottom accessory groove not consistent with hail" was present at The Property on October 9, 2024.</w:t>
+      </w:r>
+    </w:p>
+    <w:p>
+      <w:pPr>
+        <w:keepLines/>
+        <w:spacing w:after="160"/>
+        <w:ind w:left="720" w:hanging="576"/>
+      </w:pPr>
+      <w:r>
+        <w:rPr>
+          <w:b/>
+          <w:bCs/>
+        </w:rPr>
+        <w:t xml:space="preserve">REQUEST FOR ADMISSION NO. 92:  </w:t>
+      </w:r>
+      <w:r>
+        <w:rPr>
+          <w:bCs/>
+        </w:rPr>
+        <w:t>Admit that the dent described on page 5 of The Prieve Report in the sentence "A similar dent appears along the left side as shown in photograph A-163 not consistent with hail" was present at The Property on October 9, 2024.</w:t>
       </w:r>
     </w:p>
     <w:p>
@@ -2901,7 +2896,7 @@
         <w:rPr>
           <w:bCs/>
         </w:rPr>
-        <w:t>Admit that The Prieve Report is a genuine copy of the report prepared by Prieve Engineering, LLC, File Number 241008.</w:t>
+        <w:t>Admit that the dents described on page 5 of The Prieve Report in the sentence "Scrape marks and dents with sharp marks appear at the southeast facing window as shown in photographs A-165 and A-166" were present at The Property on October 9, 2024.</w:t>
       </w:r>
     </w:p>
     <w:p>
@@ -2921,7 +2916,7 @@
         <w:rPr>
           <w:bCs/>
         </w:rPr>
-        <w:t>Admit that the dents described on page 4 of The Prieve Report in the sentence "Rounded dents were observed at sashes of this window unit" were present at The Property on October 9, 2024.</w:t>
+        <w:t>Admit that the dent described on page 5 of The Prieve Report in the sentence "A dent was observed along the bottom accessory groove of the northeast facing window as shown in photograph A-174" was present at The Property on October 9, 2024.</w:t>
       </w:r>
     </w:p>
     <w:p>
@@ -2941,7 +2936,7 @@
         <w:rPr>
           <w:bCs/>
         </w:rPr>
-        <w:t>Admit that the dents described on page 4 of The Prieve Report in the sentence "Two dents with sharp marks/indentations appear long [sic] the left side of the left sash as shown in photograph A-45" were present at The Property on October 9, 2024.</w:t>
+        <w:t>Admit that the dents described on page 5 of The Prieve Report in the sentence "Two dents appear at the lower left corner of the left casement which are generally smooth" were present at The Property on October 9, 2024.</w:t>
       </w:r>
     </w:p>
     <w:p>
@@ -2961,7 +2956,7 @@
         <w:rPr>
           <w:bCs/>
         </w:rPr>
-        <w:t>Admit that the dent described on page 4 of The Prieve Report in the sentence "A dent appears in a window sash with a scrape mark present inside the dent as shown in photograph A-64" was present at The Property on October 9, 2024.</w:t>
+        <w:t>Admit that the dent described on page 5 of The Prieve Report in the sentence "A dent appears in the bottom accessory groove of the window not consistent with hail" was present at The Property on October 9, 2024.</w:t>
       </w:r>
     </w:p>
     <w:p>
@@ -2981,7 +2976,7 @@
         <w:rPr>
           <w:bCs/>
         </w:rPr>
-        <w:t>Admit that the dent described on page 5 of The Prieve Report in the sentence "A dent with scrape marks was observed in the frame of the upper southeast facing window as shown in photograph A-107" was present at The Property on October 9, 2024.</w:t>
+        <w:t>Admit that the dent described on page 5 of The Prieve Report in the sentence "A scrape mark and dent appear at the right side of the east facing window not consistent with hail" was present at The Property on October 9, 2024.</w:t>
       </w:r>
     </w:p>
     <w:p>
@@ -3001,7 +2996,7 @@
         <w:rPr>
           <w:bCs/>
         </w:rPr>
-        <w:t>Admit that the indentation described on page 5 of The Prieve Report in the sentence "An indentation appears on the left side of the center window accessory groove not consistent with hail along with a mark in the frame with loss of finishes as shown in photograph A-113" was present at The Property on October 9, 2024.</w:t>
+        <w:t>Admit that the dent described on page 6 of The Prieve Report in the sentence "A dent appears in the left accessory groove similar to those observed elsewhere" was present at The Property on October 9, 2024.</w:t>
       </w:r>
     </w:p>
     <w:p>
@@ -3021,7 +3016,7 @@
         <w:rPr>
           <w:bCs/>
         </w:rPr>
-        <w:t>Admit that the dents described on page 5 of The Prieve Report in the sentence "Two dents appear in the face of the sash at the lower left corner of the main window with scrape marks present inside and around areas of dents" were present at The Property on October 9, 2024.</w:t>
+        <w:t>Admit that the dent described on page 6 of The Prieve Report in the sentence "A dent appears in the left accessory groove at the lower corner of the window" was present at The Property on October 9, 2024.</w:t>
       </w:r>
     </w:p>
     <w:p>
@@ -3041,7 +3036,7 @@
         <w:rPr>
           <w:bCs/>
         </w:rPr>
-        <w:t>Admit that the dent described on page 5 of The Prieve Report in the sentence "A dent with marks present appears in the face of the drip cap of the upper center window unit" was present at The Property on October 9, 2024.</w:t>
+        <w:t>Admit that The Prieve Report does not identify any object, other than hail, that caused any dent or indentation described in The Prieve Report.</w:t>
       </w:r>
     </w:p>
     <w:p>
@@ -3061,7 +3056,7 @@
         <w:rPr>
           <w:bCs/>
         </w:rPr>
-        <w:t>Admit that the dent described on page 5 of The Prieve Report in the sentence "A dent appears in the bottom accessory groove of the upper northeast facing window not consistent with hail" was present at The Property on October 9, 2024.</w:t>
+        <w:t>Admit that The Prieve Report does not identify when, how, or by whom any dent described in The Prieve Report was caused "during or following installation of windows."</w:t>
       </w:r>
     </w:p>
     <w:p>
@@ -3081,7 +3076,7 @@
         <w:rPr>
           <w:bCs/>
         </w:rPr>
-        <w:t>Admit that the dent described on page 5 of The Prieve Report in the sentence "A dent appears along the left accessory groove of the southeast facing window not consistent with hail" was present at The Property on October 9, 2024.</w:t>
+        <w:t>Admit that The Prieve Report does not state the size of any hailstone that fell at The Property on July 13 or 14, 2024.</w:t>
       </w:r>
     </w:p>
     <w:p>
@@ -3101,7 +3096,7 @@
         <w:rPr>
           <w:bCs/>
         </w:rPr>
-        <w:t>Admit that the dent described on page 5 of The Prieve Report in the sentence "Various scrape marks and a dent appear along the bottom frame of the center window not consistent with hail" was present at The Property on October 9, 2024.</w:t>
+        <w:t>Admit that The Prieve Report does not state the minimum hailstone size required to dent the window frames or sashes at The Property.</w:t>
       </w:r>
     </w:p>
     <w:p>
@@ -3121,7 +3116,7 @@
         <w:rPr>
           <w:bCs/>
         </w:rPr>
-        <w:t>Admit that the dents described on page 5 of The Prieve Report in the sentence "Dents with scrape marks appear at the lower left corner of the sash of the northeast facing window not consistent with hail" were present at The Property on October 9, 2024.</w:t>
+        <w:t>Admit that The Prieve Report does not state the criteria used to determine whether a dent is consistent with hail.</w:t>
       </w:r>
     </w:p>
     <w:p>
@@ -3141,7 +3136,7 @@
         <w:rPr>
           <w:bCs/>
         </w:rPr>
-        <w:t>Admit that the dent described on page 5 of The Prieve Report in the sentence "A dent appears along the bottom accessory groove not consistent with hail" was present at The Property on October 9, 2024.</w:t>
+        <w:t>Admit that The Prieve Report does not state the size, depth, or dimensions of any dent, mark, or indentation described in it.</w:t>
       </w:r>
     </w:p>
     <w:p>
@@ -3161,7 +3156,7 @@
         <w:rPr>
           <w:bCs/>
         </w:rPr>
-        <w:t>Admit that the dent described on page 5 of The Prieve Report in the sentence "A similar dent appears along the left side as shown in photograph A-163 not consistent with hail" was present at The Property on October 9, 2024.</w:t>
+        <w:t>Admit that The Prieve Report does not state the date on which any dent described in it was caused.</w:t>
       </w:r>
     </w:p>
     <w:p>
@@ -3181,7 +3176,7 @@
         <w:rPr>
           <w:bCs/>
         </w:rPr>
-        <w:t>Admit that the dents described on page 5 of The Prieve Report in the sentence "Scrape marks and dents with sharp marks appear at the southeast facing window as shown in photographs A-165 and A-166" were present at The Property on October 9, 2024.</w:t>
+        <w:t>Admit that The Prieve Report does not identify any publication, study, or test method in support of any opinion stated in it.</w:t>
       </w:r>
     </w:p>
     <w:p>
@@ -3201,7 +3196,7 @@
         <w:rPr>
           <w:bCs/>
         </w:rPr>
-        <w:t>Admit that the dent described on page 5 of The Prieve Report in the sentence "A dent was observed along the bottom accessory groove of the northeast facing window as shown in photograph A-174" was present at The Property on October 9, 2024.</w:t>
+        <w:t>Admit that The Prieve Report does not identify the "customary and usual standards" referred to on page 2 of The Prieve Report.</w:t>
       </w:r>
     </w:p>
     <w:p>
@@ -3221,7 +3216,7 @@
         <w:rPr>
           <w:bCs/>
         </w:rPr>
-        <w:t>Admit that the dents described on page 5 of The Prieve Report in the sentence "Two dents appear at the lower left corner of the left casement which are generally smooth" were present at The Property on October 9, 2024.</w:t>
+        <w:t>Admit that The Prieve Report does not state any wind speed at The Property on July 13 or 14, 2024.</w:t>
       </w:r>
     </w:p>
     <w:p>
@@ -3241,7 +3236,7 @@
         <w:rPr>
           <w:bCs/>
         </w:rPr>
-        <w:t>Admit that the dent described on page 5 of The Prieve Report in the sentence "A dent appears in the bottom accessory groove of the window not consistent with hail" was present at The Property on October 9, 2024.</w:t>
+        <w:t>Admit that the most recent hail event identified in the "Weather Records" section of The Prieve Report is September 6, 2020.</w:t>
       </w:r>
     </w:p>
     <w:p>
@@ -3261,7 +3256,7 @@
         <w:rPr>
           <w:bCs/>
         </w:rPr>
-        <w:t>Admit that the dent described on page 5 of The Prieve Report in the sentence "A scrape mark and dent appear at the right side of the east facing window not consistent with hail" was present at The Property on October 9, 2024.</w:t>
+        <w:t>Admit that page 6 of The Prieve Report states: "No smooth or rounded dents were observed in the frame or sashes."</w:t>
       </w:r>
     </w:p>
     <w:p>
@@ -3276,286 +3271,6 @@
           <w:bCs/>
         </w:rPr>
         <w:t xml:space="preserve">REQUEST FOR ADMISSION NO. 112:  </w:t>
-      </w:r>
-      <w:r>
-        <w:rPr>
-          <w:bCs/>
-        </w:rPr>
-        <w:t>Admit that the dent described on page 6 of The Prieve Report in the sentence "A dent appears in the left accessory groove similar to those observed elsewhere" was present at The Property on October 9, 2024.</w:t>
-      </w:r>
-    </w:p>
-    <w:p>
-      <w:pPr>
-        <w:keepLines/>
-        <w:spacing w:after="160"/>
-        <w:ind w:left="720" w:hanging="576"/>
-      </w:pPr>
-      <w:r>
-        <w:rPr>
-          <w:b/>
-          <w:bCs/>
-        </w:rPr>
-        <w:t xml:space="preserve">REQUEST FOR ADMISSION NO. 113:  </w:t>
-      </w:r>
-      <w:r>
-        <w:rPr>
-          <w:bCs/>
-        </w:rPr>
-        <w:t>Admit that the dent described on page 6 of The Prieve Report in the sentence "A dent appears in the left accessory groove at the lower corner of the window" was present at The Property on October 9, 2024.</w:t>
-      </w:r>
-    </w:p>
-    <w:p>
-      <w:pPr>
-        <w:keepLines/>
-        <w:spacing w:after="160"/>
-        <w:ind w:left="720" w:hanging="576"/>
-      </w:pPr>
-      <w:r>
-        <w:rPr>
-          <w:b/>
-          <w:bCs/>
-        </w:rPr>
-        <w:t xml:space="preserve">REQUEST FOR ADMISSION NO. 114:  </w:t>
-      </w:r>
-      <w:r>
-        <w:rPr>
-          <w:bCs/>
-        </w:rPr>
-        <w:t>Admit that The Prieve Report does not identify any object, other than hail, that caused any dent or indentation described in The Prieve Report.</w:t>
-      </w:r>
-    </w:p>
-    <w:p>
-      <w:pPr>
-        <w:keepLines/>
-        <w:spacing w:after="160"/>
-        <w:ind w:left="720" w:hanging="576"/>
-      </w:pPr>
-      <w:r>
-        <w:rPr>
-          <w:b/>
-          <w:bCs/>
-        </w:rPr>
-        <w:t xml:space="preserve">REQUEST FOR ADMISSION NO. 115:  </w:t>
-      </w:r>
-      <w:r>
-        <w:rPr>
-          <w:bCs/>
-        </w:rPr>
-        <w:t>Admit that The Prieve Report does not identify when, how, or by whom any dent described in The Prieve Report was caused "during or following installation of windows."</w:t>
-      </w:r>
-    </w:p>
-    <w:p>
-      <w:pPr>
-        <w:keepLines/>
-        <w:spacing w:after="160"/>
-        <w:ind w:left="720" w:hanging="576"/>
-      </w:pPr>
-      <w:r>
-        <w:rPr>
-          <w:b/>
-          <w:bCs/>
-        </w:rPr>
-        <w:t xml:space="preserve">REQUEST FOR ADMISSION NO. 116:  </w:t>
-      </w:r>
-      <w:r>
-        <w:rPr>
-          <w:bCs/>
-        </w:rPr>
-        <w:t>Admit that The Prieve Report does not state the size of any hailstone that fell at The Property on July 13 or 14, 2024.</w:t>
-      </w:r>
-    </w:p>
-    <w:p>
-      <w:pPr>
-        <w:keepLines/>
-        <w:spacing w:after="160"/>
-        <w:ind w:left="720" w:hanging="576"/>
-      </w:pPr>
-      <w:r>
-        <w:rPr>
-          <w:b/>
-          <w:bCs/>
-        </w:rPr>
-        <w:t xml:space="preserve">REQUEST FOR ADMISSION NO. 117:  </w:t>
-      </w:r>
-      <w:r>
-        <w:rPr>
-          <w:bCs/>
-        </w:rPr>
-        <w:t>Admit that The Prieve Report does not state the minimum hailstone size required to dent the window frames or sashes at The Property.</w:t>
-      </w:r>
-    </w:p>
-    <w:p>
-      <w:pPr>
-        <w:keepLines/>
-        <w:spacing w:after="160"/>
-        <w:ind w:left="720" w:hanging="576"/>
-      </w:pPr>
-      <w:r>
-        <w:rPr>
-          <w:b/>
-          <w:bCs/>
-        </w:rPr>
-        <w:t xml:space="preserve">REQUEST FOR ADMISSION NO. 118:  </w:t>
-      </w:r>
-      <w:r>
-        <w:rPr>
-          <w:bCs/>
-        </w:rPr>
-        <w:t>Admit that The Prieve Report does not state the criteria used to determine whether a dent is consistent with hail.</w:t>
-      </w:r>
-    </w:p>
-    <w:p>
-      <w:pPr>
-        <w:keepLines/>
-        <w:spacing w:after="160"/>
-        <w:ind w:left="720" w:hanging="576"/>
-      </w:pPr>
-      <w:r>
-        <w:rPr>
-          <w:b/>
-          <w:bCs/>
-        </w:rPr>
-        <w:t xml:space="preserve">REQUEST FOR ADMISSION NO. 119:  </w:t>
-      </w:r>
-      <w:r>
-        <w:rPr>
-          <w:bCs/>
-        </w:rPr>
-        <w:t>Admit that The Prieve Report does not state the size, depth, or dimensions of any dent, mark, or indentation described in it.</w:t>
-      </w:r>
-    </w:p>
-    <w:p>
-      <w:pPr>
-        <w:keepLines/>
-        <w:spacing w:after="160"/>
-        <w:ind w:left="720" w:hanging="576"/>
-      </w:pPr>
-      <w:r>
-        <w:rPr>
-          <w:b/>
-          <w:bCs/>
-        </w:rPr>
-        <w:t xml:space="preserve">REQUEST FOR ADMISSION NO. 120:  </w:t>
-      </w:r>
-      <w:r>
-        <w:rPr>
-          <w:bCs/>
-        </w:rPr>
-        <w:t>Admit that The Prieve Report does not state the date on which any dent described in it was caused.</w:t>
-      </w:r>
-    </w:p>
-    <w:p>
-      <w:pPr>
-        <w:keepLines/>
-        <w:spacing w:after="160"/>
-        <w:ind w:left="720" w:hanging="576"/>
-      </w:pPr>
-      <w:r>
-        <w:rPr>
-          <w:b/>
-          <w:bCs/>
-        </w:rPr>
-        <w:t xml:space="preserve">REQUEST FOR ADMISSION NO. 121:  </w:t>
-      </w:r>
-      <w:r>
-        <w:rPr>
-          <w:bCs/>
-        </w:rPr>
-        <w:t>Admit that The Prieve Report does not identify any publication, study, or test method in support of any opinion stated in it.</w:t>
-      </w:r>
-    </w:p>
-    <w:p>
-      <w:pPr>
-        <w:keepLines/>
-        <w:spacing w:after="160"/>
-        <w:ind w:left="720" w:hanging="576"/>
-      </w:pPr>
-      <w:r>
-        <w:rPr>
-          <w:b/>
-          <w:bCs/>
-        </w:rPr>
-        <w:t xml:space="preserve">REQUEST FOR ADMISSION NO. 122:  </w:t>
-      </w:r>
-      <w:r>
-        <w:rPr>
-          <w:bCs/>
-        </w:rPr>
-        <w:t>Admit that The Prieve Report does not identify the "customary and usual standards" referred to on page 2 of The Prieve Report.</w:t>
-      </w:r>
-    </w:p>
-    <w:p>
-      <w:pPr>
-        <w:keepLines/>
-        <w:spacing w:after="160"/>
-        <w:ind w:left="720" w:hanging="576"/>
-      </w:pPr>
-      <w:r>
-        <w:rPr>
-          <w:b/>
-          <w:bCs/>
-        </w:rPr>
-        <w:t xml:space="preserve">REQUEST FOR ADMISSION NO. 123:  </w:t>
-      </w:r>
-      <w:r>
-        <w:rPr>
-          <w:bCs/>
-        </w:rPr>
-        <w:t>Admit that The Prieve Report does not state any wind speed at The Property on July 13 or 14, 2024.</w:t>
-      </w:r>
-    </w:p>
-    <w:p>
-      <w:pPr>
-        <w:keepLines/>
-        <w:spacing w:after="160"/>
-        <w:ind w:left="720" w:hanging="576"/>
-      </w:pPr>
-      <w:r>
-        <w:rPr>
-          <w:b/>
-          <w:bCs/>
-        </w:rPr>
-        <w:t xml:space="preserve">REQUEST FOR ADMISSION NO. 124:  </w:t>
-      </w:r>
-      <w:r>
-        <w:rPr>
-          <w:bCs/>
-        </w:rPr>
-        <w:t>Admit that the most recent hail event identified in the "Weather Records" section of The Prieve Report is September 6, 2020.</w:t>
-      </w:r>
-    </w:p>
-    <w:p>
-      <w:pPr>
-        <w:keepLines/>
-        <w:spacing w:after="160"/>
-        <w:ind w:left="720" w:hanging="576"/>
-      </w:pPr>
-      <w:r>
-        <w:rPr>
-          <w:b/>
-          <w:bCs/>
-        </w:rPr>
-        <w:t xml:space="preserve">REQUEST FOR ADMISSION NO. 125:  </w:t>
-      </w:r>
-      <w:r>
-        <w:rPr>
-          <w:bCs/>
-        </w:rPr>
-        <w:t>Admit that page 6 of The Prieve Report states: "No smooth or rounded dents were observed in the frame or sashes."</w:t>
-      </w:r>
-    </w:p>
-    <w:p>
-      <w:pPr>
-        <w:keepLines/>
-        <w:spacing w:after="160"/>
-        <w:ind w:left="720" w:hanging="576"/>
-      </w:pPr>
-      <w:r>
-        <w:rPr>
-          <w:b/>
-          <w:bCs/>
-        </w:rPr>
-        <w:t xml:space="preserve">REQUEST FOR ADMISSION NO. 126:  </w:t>
       </w:r>
       <w:r>
         <w:rPr>
@@ -3591,7 +3306,7 @@
           <w:b/>
           <w:bCs/>
         </w:rPr>
-        <w:t xml:space="preserve">REQUEST FOR ADMISSION NO. 127:  </w:t>
+        <w:t xml:space="preserve">REQUEST FOR ADMISSION NO. 113:  </w:t>
       </w:r>
       <w:r>
         <w:rPr>
@@ -3611,7 +3326,7 @@
           <w:b/>
           <w:bCs/>
         </w:rPr>
-        <w:t xml:space="preserve">REQUEST FOR ADMISSION NO. 128:  </w:t>
+        <w:t xml:space="preserve">REQUEST FOR ADMISSION NO. 114:  </w:t>
       </w:r>
       <w:r>
         <w:rPr>
@@ -3631,7 +3346,7 @@
           <w:b/>
           <w:bCs/>
         </w:rPr>
-        <w:t xml:space="preserve">REQUEST FOR ADMISSION NO. 129:  </w:t>
+        <w:t xml:space="preserve">REQUEST FOR ADMISSION NO. 115:  </w:t>
       </w:r>
       <w:r>
         <w:rPr>
@@ -3651,7 +3366,7 @@
           <w:b/>
           <w:bCs/>
         </w:rPr>
-        <w:t xml:space="preserve">REQUEST FOR ADMISSION NO. 130:  </w:t>
+        <w:t xml:space="preserve">REQUEST FOR ADMISSION NO. 116:  </w:t>
       </w:r>
       <w:r>
         <w:rPr>
@@ -3671,7 +3386,7 @@
           <w:b/>
           <w:bCs/>
         </w:rPr>
-        <w:t xml:space="preserve">REQUEST FOR ADMISSION NO. 131:  </w:t>
+        <w:t xml:space="preserve">REQUEST FOR ADMISSION NO. 117:  </w:t>
       </w:r>
       <w:r>
         <w:rPr>
@@ -3691,7 +3406,7 @@
           <w:b/>
           <w:bCs/>
         </w:rPr>
-        <w:t xml:space="preserve">REQUEST FOR ADMISSION NO. 132:  </w:t>
+        <w:t xml:space="preserve">REQUEST FOR ADMISSION NO. 118:  </w:t>
       </w:r>
       <w:r>
         <w:rPr>
@@ -3711,7 +3426,7 @@
           <w:b/>
           <w:bCs/>
         </w:rPr>
-        <w:t xml:space="preserve">REQUEST FOR ADMISSION NO. 133:  </w:t>
+        <w:t xml:space="preserve">REQUEST FOR ADMISSION NO. 119:  </w:t>
       </w:r>
       <w:r>
         <w:rPr>
@@ -3731,7 +3446,7 @@
           <w:b/>
           <w:bCs/>
         </w:rPr>
-        <w:t xml:space="preserve">REQUEST FOR ADMISSION NO. 134:  </w:t>
+        <w:t xml:space="preserve">REQUEST FOR ADMISSION NO. 120:  </w:t>
       </w:r>
       <w:r>
         <w:rPr>
@@ -3751,7 +3466,7 @@
           <w:b/>
           <w:bCs/>
         </w:rPr>
-        <w:t xml:space="preserve">REQUEST FOR ADMISSION NO. 135:  </w:t>
+        <w:t xml:space="preserve">REQUEST FOR ADMISSION NO. 121:  </w:t>
       </w:r>
       <w:r>
         <w:rPr>
@@ -3771,7 +3486,7 @@
           <w:b/>
           <w:bCs/>
         </w:rPr>
-        <w:t xml:space="preserve">REQUEST FOR ADMISSION NO. 136:  </w:t>
+        <w:t xml:space="preserve">REQUEST FOR ADMISSION NO. 122:  </w:t>
       </w:r>
       <w:r>
         <w:rPr>
@@ -3807,7 +3522,7 @@
           <w:b/>
           <w:bCs/>
         </w:rPr>
-        <w:t xml:space="preserve">REQUEST FOR ADMISSION NO. 137:  </w:t>
+        <w:t xml:space="preserve">REQUEST FOR ADMISSION NO. 123:  </w:t>
       </w:r>
       <w:r>
         <w:rPr>
@@ -3827,7 +3542,7 @@
           <w:b/>
           <w:bCs/>
         </w:rPr>
-        <w:t xml:space="preserve">REQUEST FOR ADMISSION NO. 138:  </w:t>
+        <w:t xml:space="preserve">REQUEST FOR ADMISSION NO. 124:  </w:t>
       </w:r>
       <w:r>
         <w:rPr>
@@ -3847,7 +3562,7 @@
           <w:b/>
           <w:bCs/>
         </w:rPr>
-        <w:t xml:space="preserve">REQUEST FOR ADMISSION NO. 139:  </w:t>
+        <w:t xml:space="preserve">REQUEST FOR ADMISSION NO. 125:  </w:t>
       </w:r>
       <w:r>
         <w:rPr>
@@ -3867,7 +3582,7 @@
           <w:b/>
           <w:bCs/>
         </w:rPr>
-        <w:t xml:space="preserve">REQUEST FOR ADMISSION NO. 140:  </w:t>
+        <w:t xml:space="preserve">REQUEST FOR ADMISSION NO. 126:  </w:t>
       </w:r>
       <w:r>
         <w:rPr>
@@ -3887,7 +3602,7 @@
           <w:b/>
           <w:bCs/>
         </w:rPr>
-        <w:t xml:space="preserve">REQUEST FOR ADMISSION NO. 141:  </w:t>
+        <w:t xml:space="preserve">REQUEST FOR ADMISSION NO. 127:  </w:t>
       </w:r>
       <w:r>
         <w:rPr>
@@ -3907,7 +3622,7 @@
           <w:b/>
           <w:bCs/>
         </w:rPr>
-        <w:t xml:space="preserve">REQUEST FOR ADMISSION NO. 142:  </w:t>
+        <w:t xml:space="preserve">REQUEST FOR ADMISSION NO. 128:  </w:t>
       </w:r>
       <w:r>
         <w:rPr>
@@ -3943,7 +3658,7 @@
           <w:b/>
           <w:bCs/>
         </w:rPr>
-        <w:t xml:space="preserve">REQUEST FOR ADMISSION NO. 143:  </w:t>
+        <w:t xml:space="preserve">REQUEST FOR ADMISSION NO. 129:  </w:t>
       </w:r>
       <w:r>
         <w:rPr>
@@ -3963,7 +3678,7 @@
           <w:b/>
           <w:bCs/>
         </w:rPr>
-        <w:t xml:space="preserve">REQUEST FOR ADMISSION NO. 144:  </w:t>
+        <w:t xml:space="preserve">REQUEST FOR ADMISSION NO. 130:  </w:t>
       </w:r>
       <w:r>
         <w:rPr>
@@ -3983,27 +3698,7 @@
           <w:b/>
           <w:bCs/>
         </w:rPr>
-        <w:t xml:space="preserve">REQUEST FOR ADMISSION NO. 145:  </w:t>
-      </w:r>
-      <w:r>
-        <w:rPr>
-          <w:bCs/>
-        </w:rPr>
-        <w:t>Admit that You have not produced to Plaintiffs any written report of Nicholas Brau's September 6, 2024 inspection.</w:t>
-      </w:r>
-    </w:p>
-    <w:p>
-      <w:pPr>
-        <w:keepLines/>
-        <w:spacing w:after="160"/>
-        <w:ind w:left="720" w:hanging="576"/>
-      </w:pPr>
-      <w:r>
-        <w:rPr>
-          <w:b/>
-          <w:bCs/>
-        </w:rPr>
-        <w:t xml:space="preserve">REQUEST FOR ADMISSION NO. 146:  </w:t>
+        <w:t xml:space="preserve">REQUEST FOR ADMISSION NO. 131:  </w:t>
       </w:r>
       <w:r>
         <w:rPr>
@@ -4021,27 +3716,7 @@
         <w:rPr>
           <w:i/>
         </w:rPr>
-        <w:t>See also Request for Admission No. 30.</w:t>
-      </w:r>
-    </w:p>
-    <w:p>
-      <w:pPr>
-        <w:keepLines/>
-        <w:spacing w:after="160"/>
-        <w:ind w:left="720" w:hanging="576"/>
-      </w:pPr>
-      <w:r>
-        <w:rPr>
-          <w:b/>
-          <w:bCs/>
-        </w:rPr>
-        <w:t xml:space="preserve">REQUEST FOR ADMISSION NO. 147:  </w:t>
-      </w:r>
-      <w:r>
-        <w:rPr>
-          <w:bCs/>
-        </w:rPr>
-        <w:t>Admit that You have made no payment of any kind to any contractor, repair firm, or other third party for the repair or replacement of any part of The Property on account of the July 13, 2024 loss, including any payment for emergency or temporary repairs.</w:t>
+        <w:t>See also Request for Admission No. 22.</w:t>
       </w:r>
     </w:p>
     <w:p>
@@ -4071,21 +3746,21 @@
         <w:rPr>
           <w:iCs/>
         </w:rPr>
-        <w:t>Requests 148 through 157 concern the persons who handled The Claim and the records of the September 6, 2024 inspection, and are to be read with Requests Nos. 8 through 12, 40, and 143 through 145.</w:t>
-      </w:r>
-    </w:p>
-    <w:p>
-      <w:pPr>
-        <w:keepLines/>
-        <w:spacing w:after="160"/>
-        <w:ind w:left="720" w:hanging="576"/>
-      </w:pPr>
-      <w:r>
-        <w:rPr>
-          <w:b/>
-          <w:bCs/>
-        </w:rPr>
-        <w:t xml:space="preserve">REQUEST FOR ADMISSION NO. 148:  </w:t>
+        <w:t>Requests 132 through 141 concern the persons who handled The Claim and the records of the September 6, 2024 inspection, and are to be read with Requests Nos. 4 through 8, 29, 129, and 130.</w:t>
+      </w:r>
+    </w:p>
+    <w:p>
+      <w:pPr>
+        <w:keepLines/>
+        <w:spacing w:after="160"/>
+        <w:ind w:left="720" w:hanging="576"/>
+      </w:pPr>
+      <w:r>
+        <w:rPr>
+          <w:b/>
+          <w:bCs/>
+        </w:rPr>
+        <w:t xml:space="preserve">REQUEST FOR ADMISSION NO. 132:  </w:t>
       </w:r>
       <w:r>
         <w:rPr>
@@ -4105,7 +3780,7 @@
           <w:b/>
           <w:bCs/>
         </w:rPr>
-        <w:t xml:space="preserve">REQUEST FOR ADMISSION NO. 149:  </w:t>
+        <w:t xml:space="preserve">REQUEST FOR ADMISSION NO. 133:  </w:t>
       </w:r>
       <w:r>
         <w:rPr>
@@ -4125,7 +3800,7 @@
           <w:b/>
           <w:bCs/>
         </w:rPr>
-        <w:t xml:space="preserve">REQUEST FOR ADMISSION NO. 150:  </w:t>
+        <w:t xml:space="preserve">REQUEST FOR ADMISSION NO. 134:  </w:t>
       </w:r>
       <w:r>
         <w:rPr>
@@ -4145,7 +3820,7 @@
           <w:b/>
           <w:bCs/>
         </w:rPr>
-        <w:t xml:space="preserve">REQUEST FOR ADMISSION NO. 151:  </w:t>
+        <w:t xml:space="preserve">REQUEST FOR ADMISSION NO. 135:  </w:t>
       </w:r>
       <w:r>
         <w:rPr>
@@ -4165,7 +3840,7 @@
           <w:b/>
           <w:bCs/>
         </w:rPr>
-        <w:t xml:space="preserve">REQUEST FOR ADMISSION NO. 152:  </w:t>
+        <w:t xml:space="preserve">REQUEST FOR ADMISSION NO. 136:  </w:t>
       </w:r>
       <w:r>
         <w:rPr>
@@ -4185,7 +3860,7 @@
           <w:b/>
           <w:bCs/>
         </w:rPr>
-        <w:t xml:space="preserve">REQUEST FOR ADMISSION NO. 153:  </w:t>
+        <w:t xml:space="preserve">REQUEST FOR ADMISSION NO. 137:  </w:t>
       </w:r>
       <w:r>
         <w:rPr>
@@ -4205,7 +3880,7 @@
           <w:b/>
           <w:bCs/>
         </w:rPr>
-        <w:t xml:space="preserve">REQUEST FOR ADMISSION NO. 154:  </w:t>
+        <w:t xml:space="preserve">REQUEST FOR ADMISSION NO. 138:  </w:t>
       </w:r>
       <w:r>
         <w:rPr>
@@ -4225,7 +3900,7 @@
           <w:b/>
           <w:bCs/>
         </w:rPr>
-        <w:t xml:space="preserve">REQUEST FOR ADMISSION NO. 155:  </w:t>
+        <w:t xml:space="preserve">REQUEST FOR ADMISSION NO. 139:  </w:t>
       </w:r>
       <w:r>
         <w:rPr>
@@ -4245,7 +3920,7 @@
           <w:b/>
           <w:bCs/>
         </w:rPr>
-        <w:t xml:space="preserve">REQUEST FOR ADMISSION NO. 156:  </w:t>
+        <w:t xml:space="preserve">REQUEST FOR ADMISSION NO. 140:  </w:t>
       </w:r>
       <w:r>
         <w:rPr>
@@ -4265,7 +3940,7 @@
           <w:b/>
           <w:bCs/>
         </w:rPr>
-        <w:t xml:space="preserve">REQUEST FOR ADMISSION NO. 157:  </w:t>
+        <w:t xml:space="preserve">REQUEST FOR ADMISSION NO. 141:  </w:t>
       </w:r>
       <w:r>
         <w:rPr>
@@ -4301,7 +3976,7 @@
           <w:b/>
           <w:bCs/>
         </w:rPr>
-        <w:t xml:space="preserve">REQUEST FOR ADMISSION NO. 158:  </w:t>
+        <w:t xml:space="preserve">REQUEST FOR ADMISSION NO. 142:  </w:t>
       </w:r>
       <w:r>
         <w:rPr>
@@ -4321,27 +3996,7 @@
           <w:b/>
           <w:bCs/>
         </w:rPr>
-        <w:t xml:space="preserve">REQUEST FOR ADMISSION NO. 159:  </w:t>
-      </w:r>
-      <w:r>
-        <w:rPr>
-          <w:bCs/>
-        </w:rPr>
-        <w:t>Admit that The First Photo Set and The Second Photo Set together contain 138 numbered photographs of The Property.</w:t>
-      </w:r>
-    </w:p>
-    <w:p>
-      <w:pPr>
-        <w:keepLines/>
-        <w:spacing w:after="160"/>
-        <w:ind w:left="720" w:hanging="576"/>
-      </w:pPr>
-      <w:r>
-        <w:rPr>
-          <w:b/>
-          <w:bCs/>
-        </w:rPr>
-        <w:t xml:space="preserve">REQUEST FOR ADMISSION NO. 160:  </w:t>
+        <w:t xml:space="preserve">REQUEST FOR ADMISSION NO. 143:  </w:t>
       </w:r>
       <w:r>
         <w:rPr>
@@ -4361,7 +4016,7 @@
           <w:b/>
           <w:bCs/>
         </w:rPr>
-        <w:t xml:space="preserve">REQUEST FOR ADMISSION NO. 161:  </w:t>
+        <w:t xml:space="preserve">REQUEST FOR ADMISSION NO. 144:  </w:t>
       </w:r>
       <w:r>
         <w:rPr>
@@ -4381,7 +4036,7 @@
           <w:b/>
           <w:bCs/>
         </w:rPr>
-        <w:t xml:space="preserve">REQUEST FOR ADMISSION NO. 162:  </w:t>
+        <w:t xml:space="preserve">REQUEST FOR ADMISSION NO. 145:  </w:t>
       </w:r>
       <w:r>
         <w:rPr>
@@ -4401,7 +4056,7 @@
           <w:b/>
           <w:bCs/>
         </w:rPr>
-        <w:t xml:space="preserve">REQUEST FOR ADMISSION NO. 163:  </w:t>
+        <w:t xml:space="preserve">REQUEST FOR ADMISSION NO. 146:  </w:t>
       </w:r>
       <w:r>
         <w:rPr>
@@ -4421,7 +4076,7 @@
           <w:b/>
           <w:bCs/>
         </w:rPr>
-        <w:t xml:space="preserve">REQUEST FOR ADMISSION NO. 164:  </w:t>
+        <w:t xml:space="preserve">REQUEST FOR ADMISSION NO. 147:  </w:t>
       </w:r>
       <w:r>
         <w:rPr>
@@ -4441,7 +4096,7 @@
           <w:b/>
           <w:bCs/>
         </w:rPr>
-        <w:t xml:space="preserve">REQUEST FOR ADMISSION NO. 165:  </w:t>
+        <w:t xml:space="preserve">REQUEST FOR ADMISSION NO. 148:  </w:t>
       </w:r>
       <w:r>
         <w:rPr>
@@ -4461,7 +4116,7 @@
           <w:b/>
           <w:bCs/>
         </w:rPr>
-        <w:t xml:space="preserve">REQUEST FOR ADMISSION NO. 166:  </w:t>
+        <w:t xml:space="preserve">REQUEST FOR ADMISSION NO. 149:  </w:t>
       </w:r>
       <w:r>
         <w:rPr>
@@ -4481,7 +4136,7 @@
           <w:b/>
           <w:bCs/>
         </w:rPr>
-        <w:t xml:space="preserve">REQUEST FOR ADMISSION NO. 167:  </w:t>
+        <w:t xml:space="preserve">REQUEST FOR ADMISSION NO. 150:  </w:t>
       </w:r>
       <w:r>
         <w:rPr>
@@ -4501,7 +4156,7 @@
           <w:b/>
           <w:bCs/>
         </w:rPr>
-        <w:t xml:space="preserve">REQUEST FOR ADMISSION NO. 168:  </w:t>
+        <w:t xml:space="preserve">REQUEST FOR ADMISSION NO. 151:  </w:t>
       </w:r>
       <w:r>
         <w:rPr>
@@ -4521,7 +4176,7 @@
           <w:b/>
           <w:bCs/>
         </w:rPr>
-        <w:t xml:space="preserve">REQUEST FOR ADMISSION NO. 169:  </w:t>
+        <w:t xml:space="preserve">REQUEST FOR ADMISSION NO. 152:  </w:t>
       </w:r>
       <w:r>
         <w:rPr>
@@ -4557,7 +4212,7 @@
           <w:b/>
           <w:bCs/>
         </w:rPr>
-        <w:t xml:space="preserve">REQUEST FOR ADMISSION NO. 170:  </w:t>
+        <w:t xml:space="preserve">REQUEST FOR ADMISSION NO. 153:  </w:t>
       </w:r>
       <w:r>
         <w:rPr>
@@ -4577,73 +4232,13 @@
           <w:b/>
           <w:bCs/>
         </w:rPr>
-        <w:t xml:space="preserve">REQUEST FOR ADMISSION NO. 171:  </w:t>
-      </w:r>
-      <w:r>
-        <w:rPr>
-          <w:bCs/>
-        </w:rPr>
-        <w:t>Admit that the message identified in the preceding request was sent from the address myadjuster@farmersinsurance.com and bore the subject line "Claim # 7007986837-1-1, Loss Date 07/13/2024, Important Claim Information [3CAB117Z3]."</w:t>
-      </w:r>
-    </w:p>
-    <w:p>
-      <w:pPr>
-        <w:keepLines/>
-        <w:spacing w:after="160"/>
-        <w:ind w:left="720" w:hanging="576"/>
-      </w:pPr>
-      <w:r>
-        <w:rPr>
-          <w:b/>
-          <w:bCs/>
-        </w:rPr>
-        <w:t xml:space="preserve">REQUEST FOR ADMISSION NO. 172:  </w:t>
-      </w:r>
-      <w:r>
-        <w:rPr>
-          <w:bCs/>
-        </w:rPr>
-        <w:t>Admit that the message identified in Request No. 170 was signed by Nicholas Brau, Claims Spec Rep Prop, Fire Insurance Exchange.</w:t>
-      </w:r>
-    </w:p>
-    <w:p>
-      <w:pPr>
-        <w:keepLines/>
-        <w:spacing w:after="160"/>
-        <w:ind w:left="720" w:hanging="576"/>
-      </w:pPr>
-      <w:r>
-        <w:rPr>
-          <w:b/>
-          <w:bCs/>
-        </w:rPr>
-        <w:t xml:space="preserve">REQUEST FOR ADMISSION NO. 173:  </w:t>
-      </w:r>
-      <w:r>
-        <w:rPr>
-          <w:bCs/>
-        </w:rPr>
-        <w:t>Admit that the message identified in Request No. 170 also stated, "If you need information as to why additional windows were not included in the award then you will need to contact your appraiser to obtain that information."</w:t>
-      </w:r>
-    </w:p>
-    <w:p>
-      <w:pPr>
-        <w:keepLines/>
-        <w:spacing w:after="160"/>
-        <w:ind w:left="720" w:hanging="576"/>
-      </w:pPr>
-      <w:r>
-        <w:rPr>
-          <w:b/>
-          <w:bCs/>
-        </w:rPr>
-        <w:t xml:space="preserve">REQUEST FOR ADMISSION NO. 174:  </w:t>
-      </w:r>
-      <w:r>
-        <w:rPr>
-          <w:bCs/>
-        </w:rPr>
-        <w:t>Admit that, as of October 29, 2025, information relating to The Claim existed that You had not released to Plaintiffs.</w:t>
+        <w:t xml:space="preserve">REQUEST FOR ADMISSION NO. 154:  </w:t>
+      </w:r>
+      <w:r>
+        <w:rPr>
+          <w:bCs/>
+        </w:rPr>
+        <w:t>Admit that the message identified in Request No. 153 was signed by Nicholas Brau, Claims Spec Rep Prop, Fire Insurance Exchange.</w:t>
       </w:r>
     </w:p>
     <w:p>
@@ -4673,7 +4268,7 @@
           <w:b/>
           <w:bCs/>
         </w:rPr>
-        <w:t xml:space="preserve">REQUEST FOR ADMISSION NO. 175:  </w:t>
+        <w:t xml:space="preserve">REQUEST FOR ADMISSION NO. 155:  </w:t>
       </w:r>
       <w:r>
         <w:rPr>
@@ -4693,33 +4288,13 @@
           <w:b/>
           <w:bCs/>
         </w:rPr>
-        <w:t xml:space="preserve">REQUEST FOR ADMISSION NO. 176:  </w:t>
+        <w:t xml:space="preserve">REQUEST FOR ADMISSION NO. 156:  </w:t>
       </w:r>
       <w:r>
         <w:rPr>
           <w:bCs/>
         </w:rPr>
         <w:t>Admit that Jillian Bell was employed or engaged by Fire Insurance Exchange on October 21, 2025.</w:t>
-      </w:r>
-    </w:p>
-    <w:p>
-      <w:pPr>
-        <w:keepLines/>
-        <w:spacing w:after="160"/>
-        <w:ind w:left="720" w:hanging="576"/>
-      </w:pPr>
-      <w:r>
-        <w:rPr>
-          <w:b/>
-          <w:bCs/>
-        </w:rPr>
-        <w:t xml:space="preserve">REQUEST FOR ADMISSION NO. 177:  </w:t>
-      </w:r>
-      <w:r>
-        <w:rPr>
-          <w:bCs/>
-        </w:rPr>
-        <w:t>Admit that the electronic mail address myadjuster@farmersinsurance.com is used by more than one of Your employees or representatives to communicate with policyholders.</w:t>
       </w:r>
     </w:p>
     <w:p>
@@ -4749,7 +4324,7 @@
           <w:b/>
           <w:bCs/>
         </w:rPr>
-        <w:t xml:space="preserve">REQUEST FOR ADMISSION NO. 178:  </w:t>
+        <w:t xml:space="preserve">REQUEST FOR ADMISSION NO. 157:  </w:t>
       </w:r>
       <w:r>
         <w:rPr>
@@ -4769,7 +4344,7 @@
           <w:b/>
           <w:bCs/>
         </w:rPr>
-        <w:t xml:space="preserve">REQUEST FOR ADMISSION NO. 179:  </w:t>
+        <w:t xml:space="preserve">REQUEST FOR ADMISSION NO. 158:  </w:t>
       </w:r>
       <w:r>
         <w:rPr>
@@ -4789,7 +4364,7 @@
           <w:b/>
           <w:bCs/>
         </w:rPr>
-        <w:t xml:space="preserve">REQUEST FOR ADMISSION NO. 180:  </w:t>
+        <w:t xml:space="preserve">REQUEST FOR ADMISSION NO. 159:  </w:t>
       </w:r>
       <w:r>
         <w:rPr>
@@ -4809,7 +4384,7 @@
           <w:b/>
           <w:bCs/>
         </w:rPr>
-        <w:t xml:space="preserve">REQUEST FOR ADMISSION NO. 181:  </w:t>
+        <w:t xml:space="preserve">REQUEST FOR ADMISSION NO. 160:  </w:t>
       </w:r>
       <w:r>
         <w:rPr>
@@ -4829,7 +4404,7 @@
           <w:b/>
           <w:bCs/>
         </w:rPr>
-        <w:t xml:space="preserve">REQUEST FOR ADMISSION NO. 182:  </w:t>
+        <w:t xml:space="preserve">REQUEST FOR ADMISSION NO. 161:  </w:t>
       </w:r>
       <w:r>
         <w:rPr>
@@ -4849,7 +4424,7 @@
           <w:b/>
           <w:bCs/>
         </w:rPr>
-        <w:t xml:space="preserve">REQUEST FOR ADMISSION NO. 183:  </w:t>
+        <w:t xml:space="preserve">REQUEST FOR ADMISSION NO. 162:  </w:t>
       </w:r>
       <w:r>
         <w:rPr>
@@ -4869,7 +4444,7 @@
           <w:b/>
           <w:bCs/>
         </w:rPr>
-        <w:t xml:space="preserve">REQUEST FOR ADMISSION NO. 184:  </w:t>
+        <w:t xml:space="preserve">REQUEST FOR ADMISSION NO. 163:  </w:t>
       </w:r>
       <w:r>
         <w:rPr>
@@ -4889,7 +4464,7 @@
           <w:b/>
           <w:bCs/>
         </w:rPr>
-        <w:t xml:space="preserve">REQUEST FOR ADMISSION NO. 185:  </w:t>
+        <w:t xml:space="preserve">REQUEST FOR ADMISSION NO. 164:  </w:t>
       </w:r>
       <w:r>
         <w:rPr>
@@ -4939,7 +4514,7 @@
           <w:b/>
           <w:bCs/>
         </w:rPr>
-        <w:t xml:space="preserve">REQUEST FOR ADMISSION NO. 186:  </w:t>
+        <w:t xml:space="preserve">REQUEST FOR ADMISSION NO. 165:  </w:t>
       </w:r>
       <w:r>
         <w:rPr>
@@ -4959,7 +4534,7 @@
           <w:b/>
           <w:bCs/>
         </w:rPr>
-        <w:t xml:space="preserve">REQUEST FOR ADMISSION NO. 187:  </w:t>
+        <w:t xml:space="preserve">REQUEST FOR ADMISSION NO. 166:  </w:t>
       </w:r>
       <w:r>
         <w:rPr>
@@ -4979,7 +4554,7 @@
           <w:b/>
           <w:bCs/>
         </w:rPr>
-        <w:t xml:space="preserve">REQUEST FOR ADMISSION NO. 188:  </w:t>
+        <w:t xml:space="preserve">REQUEST FOR ADMISSION NO. 167:  </w:t>
       </w:r>
       <w:r>
         <w:rPr>
@@ -4999,7 +4574,7 @@
           <w:b/>
           <w:bCs/>
         </w:rPr>
-        <w:t xml:space="preserve">REQUEST FOR ADMISSION NO. 189:  </w:t>
+        <w:t xml:space="preserve">REQUEST FOR ADMISSION NO. 168:  </w:t>
       </w:r>
       <w:r>
         <w:rPr>
@@ -5019,7 +4594,7 @@
           <w:b/>
           <w:bCs/>
         </w:rPr>
-        <w:t xml:space="preserve">REQUEST FOR ADMISSION NO. 190:  </w:t>
+        <w:t xml:space="preserve">REQUEST FOR ADMISSION NO. 169:  </w:t>
       </w:r>
       <w:r>
         <w:rPr>
@@ -5069,7 +4644,7 @@
           <w:b/>
           <w:bCs/>
         </w:rPr>
-        <w:t xml:space="preserve">REQUEST FOR ADMISSION NO. 191:  </w:t>
+        <w:t xml:space="preserve">REQUEST FOR ADMISSION NO. 170:  </w:t>
       </w:r>
       <w:r>
         <w:rPr>
@@ -5089,7 +4664,7 @@
           <w:b/>
           <w:bCs/>
         </w:rPr>
-        <w:t xml:space="preserve">REQUEST FOR ADMISSION NO. 192:  </w:t>
+        <w:t xml:space="preserve">REQUEST FOR ADMISSION NO. 171:  </w:t>
       </w:r>
       <w:r>
         <w:rPr>
@@ -5109,7 +4684,7 @@
           <w:b/>
           <w:bCs/>
         </w:rPr>
-        <w:t xml:space="preserve">REQUEST FOR ADMISSION NO. 193:  </w:t>
+        <w:t xml:space="preserve">REQUEST FOR ADMISSION NO. 172:  </w:t>
       </w:r>
       <w:r>
         <w:rPr>
@@ -5129,7 +4704,7 @@
           <w:b/>
           <w:bCs/>
         </w:rPr>
-        <w:t xml:space="preserve">REQUEST FOR ADMISSION NO. 194:  </w:t>
+        <w:t xml:space="preserve">REQUEST FOR ADMISSION NO. 173:  </w:t>
       </w:r>
       <w:r>
         <w:rPr>
@@ -5179,7 +4754,7 @@
           <w:b/>
           <w:bCs/>
         </w:rPr>
-        <w:t xml:space="preserve">REQUEST FOR ADMISSION NO. 195:  </w:t>
+        <w:t xml:space="preserve">REQUEST FOR ADMISSION NO. 174:  </w:t>
       </w:r>
       <w:r>
         <w:rPr>
@@ -5199,7 +4774,7 @@
           <w:b/>
           <w:bCs/>
         </w:rPr>
-        <w:t xml:space="preserve">REQUEST FOR ADMISSION NO. 196:  </w:t>
+        <w:t xml:space="preserve">REQUEST FOR ADMISSION NO. 175:  </w:t>
       </w:r>
       <w:r>
         <w:rPr>
@@ -5219,7 +4794,7 @@
           <w:b/>
           <w:bCs/>
         </w:rPr>
-        <w:t xml:space="preserve">REQUEST FOR ADMISSION NO. 197:  </w:t>
+        <w:t xml:space="preserve">REQUEST FOR ADMISSION NO. 176:  </w:t>
       </w:r>
       <w:r>
         <w:rPr>
@@ -5239,7 +4814,7 @@
           <w:b/>
           <w:bCs/>
         </w:rPr>
-        <w:t xml:space="preserve">REQUEST FOR ADMISSION NO. 198:  </w:t>
+        <w:t xml:space="preserve">REQUEST FOR ADMISSION NO. 177:  </w:t>
       </w:r>
       <w:r>
         <w:rPr>
@@ -5259,7 +4834,7 @@
           <w:b/>
           <w:bCs/>
         </w:rPr>
-        <w:t xml:space="preserve">REQUEST FOR ADMISSION NO. 199:  </w:t>
+        <w:t xml:space="preserve">REQUEST FOR ADMISSION NO. 178:  </w:t>
       </w:r>
       <w:r>
         <w:rPr>
@@ -5279,7 +4854,7 @@
           <w:b/>
           <w:bCs/>
         </w:rPr>
-        <w:t xml:space="preserve">REQUEST FOR ADMISSION NO. 200:  </w:t>
+        <w:t xml:space="preserve">REQUEST FOR ADMISSION NO. 179:  </w:t>
       </w:r>
       <w:r>
         <w:rPr>
@@ -5315,21 +4890,21 @@
         <w:rPr>
           <w:iCs/>
         </w:rPr>
-        <w:t>Requests 201 through 204 concern Your September 24, 2025 electronic mail message to Plaintiff Yibiao Lu, and are to be read with Requests Nos. 31 and 177.</w:t>
-      </w:r>
-    </w:p>
-    <w:p>
-      <w:pPr>
-        <w:keepLines/>
-        <w:spacing w:after="160"/>
-        <w:ind w:left="720" w:hanging="576"/>
-      </w:pPr>
-      <w:r>
-        <w:rPr>
-          <w:b/>
-          <w:bCs/>
-        </w:rPr>
-        <w:t xml:space="preserve">REQUEST FOR ADMISSION NO. 201:  </w:t>
+        <w:t>Requests 180 through 183 concern Your September 24, 2025 electronic mail message to Plaintiff Yibiao Lu.</w:t>
+      </w:r>
+    </w:p>
+    <w:p>
+      <w:pPr>
+        <w:keepLines/>
+        <w:spacing w:after="160"/>
+        <w:ind w:left="720" w:hanging="576"/>
+      </w:pPr>
+      <w:r>
+        <w:rPr>
+          <w:b/>
+          <w:bCs/>
+        </w:rPr>
+        <w:t xml:space="preserve">REQUEST FOR ADMISSION NO. 180:  </w:t>
       </w:r>
       <w:r>
         <w:rPr>
@@ -5349,7 +4924,7 @@
           <w:b/>
           <w:bCs/>
         </w:rPr>
-        <w:t xml:space="preserve">REQUEST FOR ADMISSION NO. 202:  </w:t>
+        <w:t xml:space="preserve">REQUEST FOR ADMISSION NO. 181:  </w:t>
       </w:r>
       <w:r>
         <w:rPr>
@@ -5369,7 +4944,7 @@
           <w:b/>
           <w:bCs/>
         </w:rPr>
-        <w:t xml:space="preserve">REQUEST FOR ADMISSION NO. 203:  </w:t>
+        <w:t xml:space="preserve">REQUEST FOR ADMISSION NO. 182:  </w:t>
       </w:r>
       <w:r>
         <w:rPr>
@@ -5389,7 +4964,7 @@
           <w:b/>
           <w:bCs/>
         </w:rPr>
-        <w:t xml:space="preserve">REQUEST FOR ADMISSION NO. 204:  </w:t>
+        <w:t xml:space="preserve">REQUEST FOR ADMISSION NO. 183:  </w:t>
       </w:r>
       <w:r>
         <w:rPr>
@@ -5425,21 +5000,21 @@
         <w:rPr>
           <w:iCs/>
         </w:rPr>
-        <w:t>Requests 205 and 206 concern Plaintiff Yibiao Lu’s October 7, 2025 electronic mail message, and are to be read with Requests Nos. 42 and 143 through 145.</w:t>
-      </w:r>
-    </w:p>
-    <w:p>
-      <w:pPr>
-        <w:keepLines/>
-        <w:spacing w:after="160"/>
-        <w:ind w:left="720" w:hanging="576"/>
-      </w:pPr>
-      <w:r>
-        <w:rPr>
-          <w:b/>
-          <w:bCs/>
-        </w:rPr>
-        <w:t xml:space="preserve">REQUEST FOR ADMISSION NO. 205:  </w:t>
+        <w:t>Requests 184 and 185 concern Plaintiff Yibiao Lu’s October 7, 2025 electronic mail message, and are to be read with Requests Nos. 31, 129, and 130.</w:t>
+      </w:r>
+    </w:p>
+    <w:p>
+      <w:pPr>
+        <w:keepLines/>
+        <w:spacing w:after="160"/>
+        <w:ind w:left="720" w:hanging="576"/>
+      </w:pPr>
+      <w:r>
+        <w:rPr>
+          <w:b/>
+          <w:bCs/>
+        </w:rPr>
+        <w:t xml:space="preserve">REQUEST FOR ADMISSION NO. 184:  </w:t>
       </w:r>
       <w:r>
         <w:rPr>
@@ -5459,7 +5034,7 @@
           <w:b/>
           <w:bCs/>
         </w:rPr>
-        <w:t xml:space="preserve">REQUEST FOR ADMISSION NO. 206:  </w:t>
+        <w:t xml:space="preserve">REQUEST FOR ADMISSION NO. 185:  </w:t>
       </w:r>
       <w:r>
         <w:rPr>
@@ -5629,15 +5204,7 @@
         <w:spacing w:after="160" w:line="276" w:lineRule="auto"/>
       </w:pPr>
       <w:r>
-        <w:t xml:space="preserve">I, </w:t>
-      </w:r>
-      <w:proofErr w:type="spellStart"/>
-      <w:r>
-        <w:t>Yibiao</w:t>
-      </w:r>
-      <w:proofErr w:type="spellEnd"/>
-      <w:r>
-        <w:t xml:space="preserve"> Lu, state and declare as follows:</w:t>
+        <w:t xml:space="preserve">I, Yibiao Lu, state and declare as follows:</w:t>
       </w:r>
     </w:p>
     <w:p>
@@ -5647,8 +5214,6 @@
       </w:pPr>
       <w:r>
         <w:t>1.</w:t>
-      </w:r>
-      <w:r>
         <w:tab/>
         <w:t>I am over the age of 18 years and a Plaintiff in this action. I personally made the service described below by electronic mail, in the manner the parties have agreed. Minn. R. Civ. P. 5.02(b); Minn. Gen. R. Prac. 14.03(d)(2).</w:t>
       </w:r>
@@ -5663,7 +5228,6 @@
         <w:tab/>
         <w:t xml:space="preserve">On ______________, 2026, I served a true and correct copy of </w:t>
       </w:r>
-      <w:r/>
       <w:r>
         <w:rPr>
           <w:i/>
@@ -5739,8 +5303,6 @@
       </w:pPr>
       <w:r>
         <w:t>3.</w:t>
-      </w:r>
-      <w:r>
         <w:tab/>
         <w:t>The transmission was sent from bill_y_lu@yahoo.com.</w:t>
       </w:r>
@@ -5752,8 +5314,6 @@
       </w:pPr>
       <w:r>
         <w:t>4.</w:t>
-      </w:r>
-      <w:r>
         <w:tab/>
         <w:t>These discovery requests are served, not filed, in accordance with Minn. R. Civ. P. 5.04(b).</w:t>
       </w:r>
@@ -5802,8 +5362,6 @@
       </w:pPr>
       <w:r>
         <w:t>Name:</w:t>
-      </w:r>
-      <w:r>
         <w:tab/>
         <w:t>Yibiao Lu</w:t>
       </w:r>
@@ -5817,8 +5375,6 @@
       </w:pPr>
       <w:r>
         <w:t>Address:</w:t>
-      </w:r>
-      <w:r>
         <w:tab/>
         <w:t>17756 George Moran Dr.</w:t>
       </w:r>
@@ -5832,8 +5388,6 @@
       </w:pPr>
       <w:r>
         <w:t>City/State/Zip:</w:t>
-      </w:r>
-      <w:r>
         <w:tab/>
         <w:t>Eden Prairie, MN 55347</w:t>
       </w:r>
@@ -5847,8 +5401,6 @@
       </w:pPr>
       <w:r>
         <w:t>Telephone:</w:t>
-      </w:r>
-      <w:r>
         <w:tab/>
         <w:t>763-843-2859</w:t>
       </w:r>
@@ -5862,8 +5414,6 @@
       </w:pPr>
       <w:r>
         <w:t>E-mail address:</w:t>
-      </w:r>
-      <w:r>
         <w:tab/>
         <w:t>bill_y_lu@yahoo.com</w:t>
       </w:r>

</xml_diff>

<commit_message>
For RFAs: added a note after 130 to look at 184 and 185 for context
</commit_message>
<xml_diff>
--- a/Filings/RequestForAdmission/FirstSet/Plaintiffs_First_Set_of_Requests_for_Admission_to_FIE.docx
+++ b/Filings/RequestForAdmission/FirstSet/Plaintiffs_First_Set_of_Requests_for_Admission_to_FIE.docx
@@ -3685,6 +3685,18 @@
           <w:bCs/>
         </w:rPr>
         <w:t>Admit that the "requested date" referred to in the statement quoted in the preceding request was September 6, 2024.</w:t>
+      </w:r>
+    </w:p>
+    <w:p>
+      <w:pPr>
+        <w:keepNext/>
+        <w:spacing w:after="160" w:line="276" w:lineRule="auto"/>
+      </w:pPr>
+      <w:r>
+        <w:rPr>
+          <w:i/>
+        </w:rPr>
+        <w:t>See also Requests for Admission Nos. 184 and 185.</w:t>
       </w:r>
     </w:p>
     <w:p>

</xml_diff>

<commit_message>
reformatted to make sure the note for 130 is not on separate page
</commit_message>
<xml_diff>
--- a/Filings/RequestForAdmission/FirstSet/Plaintiffs_First_Set_of_Requests_for_Admission_to_FIE.docx
+++ b/Filings/RequestForAdmission/FirstSet/Plaintiffs_First_Set_of_Requests_for_Admission_to_FIE.docx
@@ -47,7 +47,7 @@
           <w:p/>
           <w:p>
             <w:r>
-              <w:t xml:space="preserve">Yibiao Lu and Jie Hu,</w:t>
+              <w:t>Yibiao Lu and Jie Hu,</w:t>
             </w:r>
           </w:p>
           <w:p/>
@@ -186,7 +186,7 @@
         <w:t xml:space="preserve">TO: </w:t>
       </w:r>
       <w:r>
-        <w:t xml:space="preserve">Defendant Fire Insurance Exchange, by and through its attorney-in-fact Fire Underwriters Association, and its attorneys of record.</w:t>
+        <w:t>Defendant Fire Insurance Exchange, by and through its attorney-in-fact Fire Underwriters Association, and its attorneys of record.</w:t>
       </w:r>
     </w:p>
     <w:p>
@@ -194,7 +194,7 @@
         <w:spacing w:after="160" w:line="276" w:lineRule="auto"/>
       </w:pPr>
       <w:r>
-        <w:t xml:space="preserve">PLEASE TAKE NOTICE that, pursuant to Rules 26 and 36 of the Minnesota Rules of Civil Procedure, Plaintiffs Yibiao Lu and Jie Hu request that Defendant admit, for purposes of this action only, the truth of each of the following matters within thirty (30) days after service. Each matter is admitted unless, within that period, Defendant serves a written answer or objection addressed to the matter, signed by the party or its attorney, as required by Minn. R. Civ. P. 36.01.</w:t>
+        <w:t>PLEASE TAKE NOTICE that, pursuant to Rules 26 and 36 of the Minnesota Rules of Civil Procedure, Plaintiffs Yibiao Lu and Jie Hu request that Defendant admit, for purposes of this action only, the truth of each of the following matters within thirty (30) days after service. Each matter is admitted unless, within that period, Defendant serves a written answer or objection addressed to the matter, signed by the party or its attorney, as required by Minn. R. Civ. P. 36.01.</w:t>
       </w:r>
     </w:p>
     <w:p>
@@ -317,6 +317,7 @@
           <w:b/>
           <w:bCs/>
         </w:rPr>
+        <w:lastRenderedPageBreak/>
         <w:t>"The February 18, 2022 Settlement Package"</w:t>
       </w:r>
       <w:r>
@@ -513,7 +514,14 @@
         <w:rPr>
           <w:bCs/>
         </w:rPr>
-        <w:t xml:space="preserve"> means a caption of a photograph in The First Photo Set or The Second Photo Set that ends with the word "No," either standing alone or followed by an underscore and one or more numerals, whether one digit or two (for example, "Window Wrap North Damaged - No_7" and "Window Wrap North Damaged - No_20").</w:t>
+        <w:t xml:space="preserve"> means a caption of a photograph in The First Photo Set or The Second Photo Set that ends with the word "No," either standing alone or followed by an </w:t>
+      </w:r>
+      <w:r>
+        <w:rPr>
+          <w:bCs/>
+        </w:rPr>
+        <w:lastRenderedPageBreak/>
+        <w:t>underscore and one or more numerals, whether one digit or two (for example, "Window Wrap North Damaged - No_7" and "Window Wrap North Damaged - No_20").</w:t>
       </w:r>
     </w:p>
     <w:p>
@@ -599,6 +607,12 @@
           <w:bCs/>
         </w:rPr>
         <w:t>1.</w:t>
+      </w:r>
+      <w:r>
+        <w:rPr>
+          <w:b/>
+          <w:bCs/>
+        </w:rPr>
         <w:tab/>
         <w:t>Answering.</w:t>
       </w:r>
@@ -620,6 +634,12 @@
           <w:bCs/>
         </w:rPr>
         <w:t>2.</w:t>
+      </w:r>
+      <w:r>
+        <w:rPr>
+          <w:b/>
+          <w:bCs/>
+        </w:rPr>
         <w:tab/>
         <w:t>Lack of knowledge.</w:t>
       </w:r>
@@ -641,6 +661,12 @@
           <w:bCs/>
         </w:rPr>
         <w:t>3.</w:t>
+      </w:r>
+      <w:r>
+        <w:rPr>
+          <w:b/>
+          <w:bCs/>
+        </w:rPr>
         <w:tab/>
         <w:t>Effect of non-response.</w:t>
       </w:r>
@@ -662,6 +688,12 @@
           <w:bCs/>
         </w:rPr>
         <w:t>4.</w:t>
+      </w:r>
+      <w:r>
+        <w:rPr>
+          <w:b/>
+          <w:bCs/>
+        </w:rPr>
         <w:tab/>
         <w:t>Continuing duty.</w:t>
       </w:r>
@@ -683,6 +715,12 @@
           <w:bCs/>
         </w:rPr>
         <w:t>5.</w:t>
+      </w:r>
+      <w:r>
+        <w:rPr>
+          <w:b/>
+          <w:bCs/>
+        </w:rPr>
         <w:tab/>
         <w:t>Objections.</w:t>
       </w:r>
@@ -703,7 +741,14 @@
           <w:b/>
           <w:bCs/>
         </w:rPr>
+        <w:lastRenderedPageBreak/>
         <w:t>6.</w:t>
+      </w:r>
+      <w:r>
+        <w:rPr>
+          <w:b/>
+          <w:bCs/>
+        </w:rPr>
         <w:tab/>
         <w:t>Dates.</w:t>
       </w:r>
@@ -725,6 +770,12 @@
           <w:bCs/>
         </w:rPr>
         <w:t>7.</w:t>
+      </w:r>
+      <w:r>
+        <w:rPr>
+          <w:b/>
+          <w:bCs/>
+        </w:rPr>
         <w:tab/>
         <w:t>Cost of an unfounded denial.</w:t>
       </w:r>
@@ -746,6 +797,12 @@
           <w:bCs/>
         </w:rPr>
         <w:t>8.</w:t>
+      </w:r>
+      <w:r>
+        <w:rPr>
+          <w:b/>
+          <w:bCs/>
+        </w:rPr>
         <w:tab/>
         <w:t>No attachments.</w:t>
       </w:r>
@@ -767,6 +824,12 @@
           <w:bCs/>
         </w:rPr>
         <w:t>9.</w:t>
+      </w:r>
+      <w:r>
+        <w:rPr>
+          <w:b/>
+          <w:bCs/>
+        </w:rPr>
         <w:tab/>
         <w:t>Answering on behalf of others.</w:t>
       </w:r>
@@ -788,6 +851,12 @@
           <w:bCs/>
         </w:rPr>
         <w:t>10.</w:t>
+      </w:r>
+      <w:r>
+        <w:rPr>
+          <w:b/>
+          <w:bCs/>
+        </w:rPr>
         <w:tab/>
         <w:t>Attorney-client communications and litigation counsel.</w:t>
       </w:r>
@@ -902,6 +971,7 @@
           <w:i/>
           <w:iCs/>
         </w:rPr>
+        <w:lastRenderedPageBreak/>
         <w:t>B.  Identity and capacity of the acting entity</w:t>
       </w:r>
     </w:p>
@@ -1226,6 +1296,7 @@
           <w:b/>
           <w:bCs/>
         </w:rPr>
+        <w:lastRenderedPageBreak/>
         <w:t xml:space="preserve">REQUEST FOR ADMISSION NO. 18:  </w:t>
       </w:r>
       <w:r>
@@ -1502,6 +1573,7 @@
           <w:b/>
           <w:bCs/>
         </w:rPr>
+        <w:lastRenderedPageBreak/>
         <w:t xml:space="preserve">REQUEST FOR ADMISSION NO. 31:  </w:t>
       </w:r>
       <w:r>
@@ -1794,6 +1866,7 @@
           <w:i/>
           <w:iCs/>
         </w:rPr>
+        <w:lastRenderedPageBreak/>
         <w:t>F.  The Marring provision and its hail exception</w:t>
       </w:r>
     </w:p>
@@ -2052,6 +2125,7 @@
           <w:b/>
           <w:bCs/>
         </w:rPr>
+        <w:lastRenderedPageBreak/>
         <w:t xml:space="preserve">REQUEST FOR ADMISSION NO. 54:  </w:t>
       </w:r>
       <w:r>
@@ -2380,6 +2454,7 @@
           <w:b/>
           <w:bCs/>
         </w:rPr>
+        <w:lastRenderedPageBreak/>
         <w:t xml:space="preserve">REQUEST FOR ADMISSION NO. 69:  </w:t>
       </w:r>
       <w:r>
@@ -2630,6 +2705,7 @@
           <w:b/>
           <w:bCs/>
         </w:rPr>
+        <w:lastRenderedPageBreak/>
         <w:t xml:space="preserve">REQUEST FOR ADMISSION NO. 80:  </w:t>
       </w:r>
       <w:r>
@@ -2830,6 +2906,7 @@
           <w:b/>
           <w:bCs/>
         </w:rPr>
+        <w:lastRenderedPageBreak/>
         <w:t xml:space="preserve">REQUEST FOR ADMISSION NO. 90:  </w:t>
       </w:r>
       <w:r>
@@ -3070,6 +3147,7 @@
           <w:b/>
           <w:bCs/>
         </w:rPr>
+        <w:lastRenderedPageBreak/>
         <w:t xml:space="preserve">REQUEST FOR ADMISSION NO. 102:  </w:t>
       </w:r>
       <w:r>
@@ -3386,6 +3464,7 @@
           <w:b/>
           <w:bCs/>
         </w:rPr>
+        <w:lastRenderedPageBreak/>
         <w:t xml:space="preserve">REQUEST FOR ADMISSION NO. 117:  </w:t>
       </w:r>
       <w:r>
@@ -3672,12 +3751,24 @@
         <w:keepLines/>
         <w:spacing w:after="160"/>
         <w:ind w:left="720" w:hanging="576"/>
-      </w:pPr>
-      <w:r>
-        <w:rPr>
-          <w:b/>
-          <w:bCs/>
-        </w:rPr>
+        <w:rPr>
+          <w:b/>
+          <w:bCs/>
+        </w:rPr>
+      </w:pPr>
+    </w:p>
+    <w:p>
+      <w:pPr>
+        <w:keepLines/>
+        <w:spacing w:after="80"/>
+        <w:ind w:left="720" w:hanging="576"/>
+      </w:pPr>
+      <w:r>
+        <w:rPr>
+          <w:b/>
+          <w:bCs/>
+        </w:rPr>
+        <w:lastRenderedPageBreak/>
         <w:t xml:space="preserve">REQUEST FOR ADMISSION NO. 130:  </w:t>
       </w:r>
       <w:r>
@@ -3974,6 +4065,7 @@
           <w:i/>
           <w:iCs/>
         </w:rPr>
+        <w:lastRenderedPageBreak/>
         <w:t>N.  The September 3, 2024 Denial Package and its photograph logs</w:t>
       </w:r>
     </w:p>
@@ -4300,6 +4392,7 @@
           <w:b/>
           <w:bCs/>
         </w:rPr>
+        <w:lastRenderedPageBreak/>
         <w:t xml:space="preserve">REQUEST FOR ADMISSION NO. 156:  </w:t>
       </w:r>
       <w:r>
@@ -4586,6 +4679,7 @@
           <w:b/>
           <w:bCs/>
         </w:rPr>
+        <w:lastRenderedPageBreak/>
         <w:t xml:space="preserve">REQUEST FOR ADMISSION NO. 168:  </w:t>
       </w:r>
       <w:r>
@@ -4888,6 +4982,7 @@
           <w:i/>
           <w:iCs/>
         </w:rPr>
+        <w:lastRenderedPageBreak/>
         <w:t>U.  The September 24, 2025 message and its signer</w:t>
       </w:r>
     </w:p>
@@ -5061,7 +5156,6 @@
         <w:spacing w:after="160" w:line="276" w:lineRule="auto"/>
       </w:pPr>
       <w:r>
-        <w:rPr/>
         <w:t>Plaintiffs reserve the right to serve additional requests for admission. Minn. R. Civ. P. 36 imposes no numerical limit on requests for admission.</w:t>
       </w:r>
     </w:p>
@@ -5225,6 +5319,7 @@
           <w:b/>
           <w:bCs/>
         </w:rPr>
+        <w:lastRenderedPageBreak/>
         <w:t>CERTIFICATE OF SERVICE</w:t>
       </w:r>
     </w:p>
@@ -5233,7 +5328,6 @@
         <w:spacing w:after="160" w:line="276" w:lineRule="auto"/>
       </w:pPr>
       <w:r>
-        <w:rPr/>
         <w:t xml:space="preserve">I, Yibiao Lu, Plaintiff </w:t>
       </w:r>
       <w:r>
@@ -5243,7 +5337,6 @@
         <w:t>pro se</w:t>
       </w:r>
       <w:r>
-        <w:rPr/>
         <w:t xml:space="preserve">, state that on September 20, 2026, I served a true and correct copy of </w:t>
       </w:r>
       <w:r>
@@ -5253,7 +5346,6 @@
         <w:t>Plaintiffs’ First Set of Requests for Admission to Defendant Fire Insurance Exchange</w:t>
       </w:r>
       <w:r>
-        <w:rPr/>
         <w:t xml:space="preserve"> upon Defendant's counsel of record, by electronic mail in the manner the parties have agreed, as a PDF attachment sent from bill_y_lu@yahoo.com to:</w:t>
       </w:r>
     </w:p>
@@ -5281,7 +5373,6 @@
         <w:ind w:left="1080"/>
       </w:pPr>
       <w:r>
-        <w:rPr/>
         <w:t xml:space="preserve">KENNEDY LAW FIRM P.C., </w:t>
       </w:r>
       <w:r>
@@ -5294,10 +5385,8 @@
     <w:p>
       <w:pPr>
         <w:spacing w:after="160" w:line="276" w:lineRule="auto"/>
-        <w:ind/>
-      </w:pPr>
-      <w:r>
-        <w:rPr/>
+      </w:pPr>
+      <w:r>
         <w:t>Minn. R. Civ. P. 5.02(b); Minn. Gen. R. Prac. 14.03(d)(2). These discovery requests are served, not filed. Minn. R. Civ. P. 5.04(b).</w:t>
       </w:r>
     </w:p>
@@ -5322,7 +5411,6 @@
         <w:spacing w:after="160" w:line="276" w:lineRule="auto"/>
       </w:pPr>
       <w:r>
-        <w:rPr/>
         <w:t>____________________________________</w:t>
       </w:r>
     </w:p>
@@ -5331,7 +5419,6 @@
         <w:spacing w:after="160" w:line="276" w:lineRule="auto"/>
       </w:pPr>
       <w:r>
-        <w:rPr/>
         <w:t xml:space="preserve">Yibiao Lu, Plaintiff </w:t>
       </w:r>
       <w:r>

</xml_diff>

<commit_message>
Move original 57, 60-76, 80-101, 106, and 110-112 to second set
</commit_message>
<xml_diff>
--- a/Filings/RequestForAdmission/FirstSet/Plaintiffs_First_Set_of_Requests_for_Admission_to_FIE.docx
+++ b/Filings/RequestForAdmission/FirstSet/Plaintiffs_First_Set_of_Requests_for_Admission_to_FIE.docx
@@ -915,7 +915,33 @@
         <w:rPr>
           <w:bCs/>
         </w:rPr>
-        <w:t>Admit that Your September 3, 2024 letter to Plaintiffs stated, "our investigation found your policy provides coverage for direct physical loss to insured property, less uninsured or excluded."</w:t>
+        <w:t xml:space="preserve">Admit that </w:t>
+      </w:r>
+      <w:r>
+        <w:rPr>
+          <w:bCs/>
+        </w:rPr>
+        <w:t xml:space="preserve">The September 3, </w:t>
+      </w:r>
+      <w:proofErr w:type="gramStart"/>
+      <w:r>
+        <w:rPr>
+          <w:bCs/>
+        </w:rPr>
+        <w:t>2024</w:t>
+      </w:r>
+      <w:proofErr w:type="gramEnd"/>
+      <w:r>
+        <w:rPr>
+          <w:bCs/>
+        </w:rPr>
+        <w:t xml:space="preserve"> Denial Package</w:t>
+      </w:r>
+      <w:r>
+        <w:rPr>
+          <w:bCs/>
+        </w:rPr>
+        <w:t xml:space="preserve"> to Plaintiffs stated, "our investigation found your policy provides coverage for direct physical loss to insured property, less uninsured or excluded."</w:t>
       </w:r>
     </w:p>
     <w:p>
@@ -1066,7 +1092,33 @@
         <w:rPr>
           <w:bCs/>
         </w:rPr>
-        <w:t>Admit that Fire Insurance Exchange made the coverage decision communicated in Your September 3, 2024 letter to Plaintiffs.</w:t>
+        <w:t xml:space="preserve">Admit that Fire Insurance Exchange made the coverage decision communicated in </w:t>
+      </w:r>
+      <w:r>
+        <w:rPr>
+          <w:bCs/>
+        </w:rPr>
+        <w:t xml:space="preserve">The September 3, </w:t>
+      </w:r>
+      <w:proofErr w:type="gramStart"/>
+      <w:r>
+        <w:rPr>
+          <w:bCs/>
+        </w:rPr>
+        <w:t>2024</w:t>
+      </w:r>
+      <w:proofErr w:type="gramEnd"/>
+      <w:r>
+        <w:rPr>
+          <w:bCs/>
+        </w:rPr>
+        <w:t xml:space="preserve"> Denial Package</w:t>
+      </w:r>
+      <w:r>
+        <w:rPr>
+          <w:bCs/>
+        </w:rPr>
+        <w:t xml:space="preserve"> to Plaintiffs.</w:t>
       </w:r>
     </w:p>
     <w:p>
@@ -1519,7 +1571,33 @@
         <w:rPr>
           <w:bCs/>
         </w:rPr>
-        <w:t>Admit that Your September 3, 2024 letter to Plaintiffs stated, "There were no other damages observed."</w:t>
+        <w:t xml:space="preserve">Admit that </w:t>
+      </w:r>
+      <w:r>
+        <w:rPr>
+          <w:bCs/>
+        </w:rPr>
+        <w:t xml:space="preserve">The September 3, </w:t>
+      </w:r>
+      <w:proofErr w:type="gramStart"/>
+      <w:r>
+        <w:rPr>
+          <w:bCs/>
+        </w:rPr>
+        <w:t>2024</w:t>
+      </w:r>
+      <w:proofErr w:type="gramEnd"/>
+      <w:r>
+        <w:rPr>
+          <w:bCs/>
+        </w:rPr>
+        <w:t xml:space="preserve"> Denial Package</w:t>
+      </w:r>
+      <w:r>
+        <w:rPr>
+          <w:bCs/>
+        </w:rPr>
+        <w:t xml:space="preserve"> to Plaintiffs stated, "There were no other damages observed."</w:t>
       </w:r>
     </w:p>
     <w:p>
@@ -1600,7 +1678,47 @@
         <w:rPr>
           <w:bCs/>
         </w:rPr>
-        <w:t>Admit that the inspection referred to in Your September 3, 2024 letter as "we had your home inspected" was the August 29, 2024 inspection performed by Hancock Claims Consultants.</w:t>
+        <w:t xml:space="preserve">Admit that the inspection referred to in </w:t>
+      </w:r>
+      <w:r>
+        <w:rPr>
+          <w:bCs/>
+        </w:rPr>
+        <w:t xml:space="preserve">The September 3, </w:t>
+      </w:r>
+      <w:proofErr w:type="gramStart"/>
+      <w:r>
+        <w:rPr>
+          <w:bCs/>
+        </w:rPr>
+        <w:t>2024</w:t>
+      </w:r>
+      <w:proofErr w:type="gramEnd"/>
+      <w:r>
+        <w:rPr>
+          <w:bCs/>
+        </w:rPr>
+        <w:t xml:space="preserve"> Denial Package</w:t>
+      </w:r>
+      <w:r>
+        <w:rPr>
+          <w:bCs/>
+        </w:rPr>
+        <w:t xml:space="preserve"> as "we had your home inspected" was the August 29, </w:t>
+      </w:r>
+      <w:proofErr w:type="gramStart"/>
+      <w:r>
+        <w:rPr>
+          <w:bCs/>
+        </w:rPr>
+        <w:t>2024</w:t>
+      </w:r>
+      <w:proofErr w:type="gramEnd"/>
+      <w:r>
+        <w:rPr>
+          <w:bCs/>
+        </w:rPr>
+        <w:t xml:space="preserve"> inspection performed by Hancock Claims Consultants.</w:t>
       </w:r>
     </w:p>
     <w:p>
@@ -1620,7 +1738,19 @@
         <w:rPr>
           <w:bCs/>
         </w:rPr>
-        <w:t>Admit that, in connection with The Claim, You did not obtain any engineering analysis, engineering report, or engineering opinion concerning The Property before issuing Your September 3, 2024 letter.</w:t>
+        <w:t xml:space="preserve">Admit that, in connection with The Claim, You did not obtain any engineering analysis, engineering report, or engineering opinion concerning The Property before issuing </w:t>
+      </w:r>
+      <w:r>
+        <w:rPr>
+          <w:bCs/>
+        </w:rPr>
+        <w:t>The September 3, 2024 Denial Package</w:t>
+      </w:r>
+      <w:r>
+        <w:rPr>
+          <w:bCs/>
+        </w:rPr>
+        <w:t>.</w:t>
       </w:r>
     </w:p>
     <w:p>
@@ -1660,7 +1790,33 @@
         <w:rPr>
           <w:bCs/>
         </w:rPr>
-        <w:t>Admit that Nicholas Brau did not inspect The Property before Your September 3, 2024 letter was issued.</w:t>
+        <w:t xml:space="preserve">Admit that Nicholas Brau did not inspect The Property before </w:t>
+      </w:r>
+      <w:r>
+        <w:rPr>
+          <w:bCs/>
+        </w:rPr>
+        <w:t xml:space="preserve">The September 3, </w:t>
+      </w:r>
+      <w:proofErr w:type="gramStart"/>
+      <w:r>
+        <w:rPr>
+          <w:bCs/>
+        </w:rPr>
+        <w:t>2024</w:t>
+      </w:r>
+      <w:proofErr w:type="gramEnd"/>
+      <w:r>
+        <w:rPr>
+          <w:bCs/>
+        </w:rPr>
+        <w:t xml:space="preserve"> Denial Package</w:t>
+      </w:r>
+      <w:r>
+        <w:rPr>
+          <w:bCs/>
+        </w:rPr>
+        <w:t xml:space="preserve"> was issued.</w:t>
       </w:r>
     </w:p>
     <w:p>
@@ -1991,7 +2147,7 @@
         <w:rPr>
           <w:iCs/>
         </w:rPr>
-        <w:t>Requests 48 through 54 concern the engagement of Prieve Engineering, LLC, Your November 4, 2024 letter, and the work-product status of Your claim file, and are to be read with Requests Nos. 55 through 61.</w:t>
+        <w:t>Requests 48 through 54 concern the engagement of Prieve Engineering, LLC, Your November 4, 2024 letter, and the work-product status of Your claim file, and are to be read with Requests Nos. 55 through 58.</w:t>
       </w:r>
     </w:p>
     <w:p>
@@ -2208,7 +2364,7 @@
         <w:rPr>
           <w:bCs/>
         </w:rPr>
-        <w:t>Admit that The Prieve Report states: "Similar past estimated hail appears in a summary from the NOAA Storm Events Database with most recent hail in Eden Prairie reported in 2020."</w:t>
+        <w:t>Admit that The Prieve Report contains no quantitative impact-force calculation.</w:t>
       </w:r>
     </w:p>
     <w:p>
@@ -2228,7 +2384,7 @@
         <w:rPr>
           <w:bCs/>
         </w:rPr>
-        <w:t>Admit that The Prieve Report contains no quantitative impact-force calculation.</w:t>
+        <w:t>Admit that The Prieve Report contains no terminal-velocity calculation.</w:t>
       </w:r>
     </w:p>
     <w:p>
@@ -2248,7 +2404,7 @@
         <w:rPr>
           <w:bCs/>
         </w:rPr>
-        <w:t>Admit that The Prieve Report contains no terminal-velocity calculation.</w:t>
+        <w:t>Admit that Photo Appendix A contains no photograph of the two-sash fixed window that is the only other window on the rear (east) elevation of the attached garage at The Property, south of the garage window depicted at photographs A-213 through A-217.</w:t>
       </w:r>
     </w:p>
     <w:p>
@@ -2268,7 +2424,577 @@
         <w:rPr>
           <w:bCs/>
         </w:rPr>
-        <w:t>Admit that The Prieve Report documents dents, marks, or indentations across at least twenty-five distinct windows at The Property.</w:t>
+        <w:t>Admit that no person acting for You or retained by You has inspected the window described in the preceding request.</w:t>
+      </w:r>
+    </w:p>
+    <w:p>
+      <w:pPr>
+        <w:keepLines/>
+        <w:spacing w:after="160"/>
+        <w:ind w:left="720" w:hanging="576"/>
+      </w:pPr>
+      <w:r>
+        <w:rPr>
+          <w:b/>
+          <w:bCs/>
+        </w:rPr>
+        <w:t xml:space="preserve">REQUEST FOR ADMISSION NO. 61:  </w:t>
+      </w:r>
+      <w:r>
+        <w:rPr>
+          <w:bCs/>
+        </w:rPr>
+        <w:t>Admit that The Prieve Report is a genuine copy of the report prepared by Prieve Engineering, LLC, File Number 241008.</w:t>
+      </w:r>
+    </w:p>
+    <w:p>
+      <w:pPr>
+        <w:keepLines/>
+        <w:spacing w:after="160"/>
+        <w:ind w:left="720" w:hanging="576"/>
+      </w:pPr>
+      <w:r>
+        <w:rPr>
+          <w:b/>
+          <w:bCs/>
+        </w:rPr>
+        <w:t xml:space="preserve">REQUEST FOR ADMISSION NO. 62:  </w:t>
+      </w:r>
+      <w:r>
+        <w:rPr>
+          <w:bCs/>
+        </w:rPr>
+        <w:t>Admit that The Prieve Report does not state the size of any hailstone that fell at The Property on July 13 or 14, 2024.</w:t>
+      </w:r>
+    </w:p>
+    <w:p>
+      <w:pPr>
+        <w:keepLines/>
+        <w:spacing w:after="160"/>
+        <w:ind w:left="720" w:hanging="576"/>
+      </w:pPr>
+      <w:r>
+        <w:rPr>
+          <w:b/>
+          <w:bCs/>
+        </w:rPr>
+        <w:t xml:space="preserve">REQUEST FOR ADMISSION NO. 63:  </w:t>
+      </w:r>
+      <w:r>
+        <w:rPr>
+          <w:bCs/>
+        </w:rPr>
+        <w:t>Admit that The Prieve Report does not state the minimum hailstone size required to dent the window frames or sashes at The Property.</w:t>
+      </w:r>
+    </w:p>
+    <w:p>
+      <w:pPr>
+        <w:keepLines/>
+        <w:spacing w:after="160"/>
+        <w:ind w:left="720" w:hanging="576"/>
+      </w:pPr>
+      <w:r>
+        <w:rPr>
+          <w:b/>
+          <w:bCs/>
+        </w:rPr>
+        <w:t xml:space="preserve">REQUEST FOR ADMISSION NO. 64:  </w:t>
+      </w:r>
+      <w:r>
+        <w:rPr>
+          <w:bCs/>
+        </w:rPr>
+        <w:t>Admit that The Prieve Report does not state the criteria used to determine whether a dent is consistent with hail.</w:t>
+      </w:r>
+    </w:p>
+    <w:p>
+      <w:pPr>
+        <w:keepLines/>
+        <w:spacing w:after="160"/>
+        <w:ind w:left="720" w:hanging="576"/>
+      </w:pPr>
+      <w:r>
+        <w:rPr>
+          <w:b/>
+          <w:bCs/>
+        </w:rPr>
+        <w:t xml:space="preserve">REQUEST FOR ADMISSION NO. 65:  </w:t>
+      </w:r>
+      <w:r>
+        <w:rPr>
+          <w:bCs/>
+        </w:rPr>
+        <w:t>Admit that The Prieve Report does not state the size, depth, or dimensions of any dent, mark, or indentation described in it.</w:t>
+      </w:r>
+    </w:p>
+    <w:p>
+      <w:pPr>
+        <w:keepLines/>
+        <w:spacing w:after="160"/>
+        <w:ind w:left="720" w:hanging="576"/>
+      </w:pPr>
+      <w:r>
+        <w:rPr>
+          <w:b/>
+          <w:bCs/>
+        </w:rPr>
+        <w:t xml:space="preserve">REQUEST FOR ADMISSION NO. 66:  </w:t>
+      </w:r>
+      <w:r>
+        <w:rPr>
+          <w:bCs/>
+        </w:rPr>
+        <w:t>Admit that The Prieve Report does not identify any publication, study, or test method in support of any opinion stated in it.</w:t>
+      </w:r>
+    </w:p>
+    <w:p>
+      <w:pPr>
+        <w:keepLines/>
+        <w:spacing w:after="160"/>
+        <w:ind w:left="720" w:hanging="576"/>
+      </w:pPr>
+      <w:r>
+        <w:rPr>
+          <w:b/>
+          <w:bCs/>
+        </w:rPr>
+        <w:t xml:space="preserve">REQUEST FOR ADMISSION NO. 67:  </w:t>
+      </w:r>
+      <w:r>
+        <w:rPr>
+          <w:bCs/>
+        </w:rPr>
+        <w:t>Admit that The Prieve Report does not identify the "customary and usual standards" referred to on page 2 of The Prieve Report.</w:t>
+      </w:r>
+    </w:p>
+    <w:p>
+      <w:pPr>
+        <w:keepLines/>
+        <w:spacing w:after="160"/>
+        <w:ind w:left="720" w:hanging="576"/>
+      </w:pPr>
+      <w:r>
+        <w:rPr>
+          <w:b/>
+          <w:bCs/>
+        </w:rPr>
+        <w:t xml:space="preserve">REQUEST FOR ADMISSION NO. 68:  </w:t>
+      </w:r>
+      <w:r>
+        <w:rPr>
+          <w:bCs/>
+        </w:rPr>
+        <w:t>Admit that The Prieve Report does not state any wind speed at The Property on July 13 or 14, 2024.</w:t>
+      </w:r>
+    </w:p>
+    <w:p>
+      <w:pPr>
+        <w:keepNext/>
+        <w:keepLines/>
+        <w:spacing w:before="200" w:after="120"/>
+      </w:pPr>
+      <w:r>
+        <w:rPr>
+          <w:b/>
+          <w:bCs/>
+          <w:i/>
+          <w:iCs/>
+        </w:rPr>
+        <w:lastRenderedPageBreak/>
+        <w:t>I.  The 2020 Claim</w:t>
+      </w:r>
+    </w:p>
+    <w:p>
+      <w:pPr>
+        <w:keepLines/>
+        <w:spacing w:after="160"/>
+        <w:ind w:left="720" w:hanging="576"/>
+      </w:pPr>
+      <w:r>
+        <w:rPr>
+          <w:b/>
+          <w:bCs/>
+        </w:rPr>
+        <w:t xml:space="preserve">REQUEST FOR ADMISSION NO. 69:  </w:t>
+      </w:r>
+      <w:r>
+        <w:rPr>
+          <w:bCs/>
+        </w:rPr>
+        <w:t>Admit that line item 1 of the estimate within The February 18, 2022 Settlement Package reads "R&amp;R Wood window - casement, 12-23 sf" and states a quantity of 2.00 EA.</w:t>
+      </w:r>
+    </w:p>
+    <w:p>
+      <w:pPr>
+        <w:keepLines/>
+        <w:spacing w:after="160"/>
+        <w:ind w:left="720" w:hanging="576"/>
+      </w:pPr>
+      <w:r>
+        <w:rPr>
+          <w:b/>
+          <w:bCs/>
+        </w:rPr>
+        <w:t xml:space="preserve">REQUEST FOR ADMISSION NO. 70:  </w:t>
+      </w:r>
+      <w:r>
+        <w:rPr>
+          <w:bCs/>
+        </w:rPr>
+        <w:t>Admit that the only line items of the estimate within The February 18, 2022 Settlement Package that refer to windows are line items 1 ("R&amp;R Wood window - casement, 12-23 sf"), 2 ("Window blind - horizontal or vertical - Detach &amp; reset"), 3 ("Additional charge for a retrofit window, 24-40 sf"), and 32 ("Window treatment repair").</w:t>
+      </w:r>
+    </w:p>
+    <w:p>
+      <w:pPr>
+        <w:keepLines/>
+        <w:spacing w:after="160"/>
+        <w:ind w:left="720" w:hanging="576"/>
+      </w:pPr>
+      <w:r>
+        <w:rPr>
+          <w:b/>
+          <w:bCs/>
+        </w:rPr>
+        <w:t xml:space="preserve">REQUEST FOR ADMISSION NO. 71:  </w:t>
+      </w:r>
+      <w:r>
+        <w:rPr>
+          <w:bCs/>
+        </w:rPr>
+        <w:t>Admit that the estimate within The February 18, 2022 Settlement Package states "Type of Loss: Hail."</w:t>
+      </w:r>
+    </w:p>
+    <w:p>
+      <w:pPr>
+        <w:keepLines/>
+        <w:spacing w:after="160"/>
+        <w:ind w:left="720" w:hanging="576"/>
+      </w:pPr>
+      <w:r>
+        <w:rPr>
+          <w:b/>
+          <w:bCs/>
+        </w:rPr>
+        <w:t xml:space="preserve">REQUEST FOR ADMISSION NO. 72:  </w:t>
+      </w:r>
+      <w:r>
+        <w:rPr>
+          <w:bCs/>
+        </w:rPr>
+        <w:t>Admit that the estimate within The February 18, 2022 Settlement Package does not identify the location at The Property of the item or items addressed by line item 1.</w:t>
+      </w:r>
+    </w:p>
+    <w:p>
+      <w:pPr>
+        <w:keepLines/>
+        <w:spacing w:after="160"/>
+        <w:ind w:left="720" w:hanging="576"/>
+      </w:pPr>
+      <w:r>
+        <w:rPr>
+          <w:b/>
+          <w:bCs/>
+        </w:rPr>
+        <w:t xml:space="preserve">REQUEST FOR ADMISSION NO. 73:  </w:t>
+      </w:r>
+      <w:r>
+        <w:rPr>
+          <w:bCs/>
+        </w:rPr>
+        <w:t>Admit that Your claim records for The Property identify no hail loss with a date of loss after September 5, 2020, other than The Claim.</w:t>
+      </w:r>
+    </w:p>
+    <w:p>
+      <w:pPr>
+        <w:keepLines/>
+        <w:spacing w:after="160"/>
+        <w:ind w:left="720" w:hanging="576"/>
+      </w:pPr>
+      <w:r>
+        <w:rPr>
+          <w:b/>
+          <w:bCs/>
+        </w:rPr>
+        <w:t xml:space="preserve">REQUEST FOR ADMISSION NO. 74:  </w:t>
+      </w:r>
+      <w:r>
+        <w:rPr>
+          <w:bCs/>
+        </w:rPr>
+        <w:t>Admit that on October 7, 2021, You received a request from Plaintiff Yibiao Lu for an extension of time to complete repairs or replacement and to recover replacement cost benefits on The 2020 Claim.</w:t>
+      </w:r>
+    </w:p>
+    <w:p>
+      <w:pPr>
+        <w:keepLines/>
+        <w:spacing w:after="160"/>
+        <w:ind w:left="720" w:hanging="576"/>
+      </w:pPr>
+      <w:r>
+        <w:rPr>
+          <w:b/>
+          <w:bCs/>
+        </w:rPr>
+        <w:t xml:space="preserve">REQUEST FOR ADMISSION NO. 75:  </w:t>
+      </w:r>
+      <w:r>
+        <w:rPr>
+          <w:bCs/>
+        </w:rPr>
+        <w:t>Admit that Your October 12, 2021 letter to Plaintiff Yibiao Lu concerning The 2020 Claim stated: "We're happy to extend your replacement cost deadline to February 15, 2022."</w:t>
+      </w:r>
+    </w:p>
+    <w:p>
+      <w:pPr>
+        <w:keepLines/>
+        <w:spacing w:after="160"/>
+        <w:ind w:left="720" w:hanging="576"/>
+      </w:pPr>
+      <w:r>
+        <w:rPr>
+          <w:b/>
+          <w:bCs/>
+        </w:rPr>
+        <w:t xml:space="preserve">REQUEST FOR ADMISSION NO. 76:  </w:t>
+      </w:r>
+      <w:r>
+        <w:rPr>
+          <w:bCs/>
+        </w:rPr>
+        <w:t>Admit that You did not extend the replacement cost deadline for The 2020 Claim beyond February 15, 2022.</w:t>
+      </w:r>
+    </w:p>
+    <w:p>
+      <w:pPr>
+        <w:keepLines/>
+        <w:spacing w:after="160"/>
+        <w:ind w:left="720" w:hanging="576"/>
+      </w:pPr>
+      <w:r>
+        <w:rPr>
+          <w:b/>
+          <w:bCs/>
+        </w:rPr>
+        <w:t xml:space="preserve">REQUEST FOR ADMISSION NO. 77:  </w:t>
+      </w:r>
+      <w:r>
+        <w:rPr>
+          <w:bCs/>
+        </w:rPr>
+        <w:t>Admit that Your February 17, 2022 electronic mail message to Plaintiff Yibiao Lu concerning The 2020 Claim stated: "I am unable to ask for additional time without detailed information as to why the work was not able to be completed in the timeline provided by the contractor."</w:t>
+      </w:r>
+    </w:p>
+    <w:p>
+      <w:pPr>
+        <w:keepLines/>
+        <w:spacing w:after="160"/>
+        <w:ind w:left="720" w:hanging="576"/>
+      </w:pPr>
+      <w:r>
+        <w:rPr>
+          <w:b/>
+          <w:bCs/>
+        </w:rPr>
+        <w:t xml:space="preserve">REQUEST FOR ADMISSION NO. 78:  </w:t>
+      </w:r>
+      <w:r>
+        <w:rPr>
+          <w:bCs/>
+        </w:rPr>
+        <w:t>Admit that before February 17, 2022, You received from Plaintiff Yibiao Lu a request for an extension of the replacement cost deadline on The 2020 Claim beyond February 15, 2022.</w:t>
+      </w:r>
+    </w:p>
+    <w:p>
+      <w:pPr>
+        <w:keepNext/>
+        <w:keepLines/>
+        <w:spacing w:before="200" w:after="120"/>
+      </w:pPr>
+      <w:r>
+        <w:rPr>
+          <w:b/>
+          <w:bCs/>
+          <w:i/>
+          <w:iCs/>
+        </w:rPr>
+        <w:t>J.  The engineer-report requirement and Plaintiffs' submissions</w:t>
+      </w:r>
+    </w:p>
+    <w:p>
+      <w:pPr>
+        <w:keepLines/>
+        <w:spacing w:after="160"/>
+        <w:ind w:left="720" w:hanging="576"/>
+      </w:pPr>
+      <w:r>
+        <w:rPr>
+          <w:b/>
+          <w:bCs/>
+        </w:rPr>
+        <w:t xml:space="preserve">REQUEST FOR ADMISSION NO. 79:  </w:t>
+      </w:r>
+      <w:r>
+        <w:rPr>
+          <w:bCs/>
+        </w:rPr>
+        <w:t>Admit that on February 3, 2025, Your field claim supervisor Bradlee Monson told Plaintiff Yibiao Lu that You would not review evidence unless it was provided by an engineer.</w:t>
+      </w:r>
+    </w:p>
+    <w:p>
+      <w:pPr>
+        <w:keepLines/>
+        <w:spacing w:after="160"/>
+        <w:ind w:left="720" w:hanging="576"/>
+      </w:pPr>
+      <w:r>
+        <w:rPr>
+          <w:b/>
+          <w:bCs/>
+        </w:rPr>
+        <w:t xml:space="preserve">REQUEST FOR ADMISSION NO. 80:  </w:t>
+      </w:r>
+      <w:r>
+        <w:rPr>
+          <w:bCs/>
+        </w:rPr>
+        <w:t>Admit that You have no written policy, procedure, or guideline describing the peer review referred to in Your answer to paragraph 24 of the Complaint.</w:t>
+      </w:r>
+    </w:p>
+    <w:p>
+      <w:pPr>
+        <w:keepLines/>
+        <w:spacing w:after="160"/>
+        <w:ind w:left="720" w:hanging="576"/>
+      </w:pPr>
+      <w:r>
+        <w:rPr>
+          <w:b/>
+          <w:bCs/>
+        </w:rPr>
+        <w:lastRenderedPageBreak/>
+        <w:t xml:space="preserve">REQUEST FOR ADMISSION NO. 81:  </w:t>
+      </w:r>
+      <w:r>
+        <w:rPr>
+          <w:bCs/>
+        </w:rPr>
+        <w:t>Admit that You received Plaintiffs' January 31, 2025 submission concerning post-2020 storm activity and gutter replacement.</w:t>
+      </w:r>
+    </w:p>
+    <w:p>
+      <w:pPr>
+        <w:keepLines/>
+        <w:spacing w:after="160"/>
+        <w:ind w:left="720" w:hanging="576"/>
+      </w:pPr>
+      <w:r>
+        <w:rPr>
+          <w:b/>
+          <w:bCs/>
+        </w:rPr>
+        <w:t xml:space="preserve">REQUEST FOR ADMISSION NO. 82:  </w:t>
+      </w:r>
+      <w:r>
+        <w:rPr>
+          <w:bCs/>
+        </w:rPr>
+        <w:t>Admit that You received Plaintiffs' February 10, 2025 submission containing City of Eden Prairie permit records and a neighbor canvass.</w:t>
+      </w:r>
+    </w:p>
+    <w:p>
+      <w:pPr>
+        <w:keepLines/>
+        <w:spacing w:after="160"/>
+        <w:ind w:left="720" w:hanging="576"/>
+      </w:pPr>
+      <w:r>
+        <w:rPr>
+          <w:b/>
+          <w:bCs/>
+        </w:rPr>
+        <w:t xml:space="preserve">REQUEST FOR ADMISSION NO. 83:  </w:t>
+      </w:r>
+      <w:r>
+        <w:rPr>
+          <w:bCs/>
+        </w:rPr>
+        <w:t>Admit that You received, directly or through Peter Pietila, Plaintiffs' May 28, 2025 submission containing National Weather Service and Interactive Hail Maps material.</w:t>
+      </w:r>
+    </w:p>
+    <w:p>
+      <w:pPr>
+        <w:keepLines/>
+        <w:spacing w:after="160"/>
+        <w:ind w:left="720" w:hanging="576"/>
+      </w:pPr>
+      <w:r>
+        <w:rPr>
+          <w:b/>
+          <w:bCs/>
+        </w:rPr>
+        <w:t xml:space="preserve">REQUEST FOR ADMISSION NO. 84:  </w:t>
+      </w:r>
+      <w:r>
+        <w:rPr>
+          <w:bCs/>
+        </w:rPr>
+        <w:t>Admit that You did not reopen The Claim after receiving the submissions identified in the three preceding requests.</w:t>
+      </w:r>
+    </w:p>
+    <w:p>
+      <w:pPr>
+        <w:keepNext/>
+        <w:keepLines/>
+        <w:spacing w:before="200" w:after="120"/>
+      </w:pPr>
+      <w:r>
+        <w:rPr>
+          <w:b/>
+          <w:bCs/>
+          <w:i/>
+          <w:iCs/>
+        </w:rPr>
+        <w:t>K.  Missing records and non-payment</w:t>
+      </w:r>
+    </w:p>
+    <w:p>
+      <w:pPr>
+        <w:keepLines/>
+        <w:spacing w:after="160"/>
+        <w:ind w:left="720" w:hanging="576"/>
+      </w:pPr>
+      <w:r>
+        <w:rPr>
+          <w:b/>
+          <w:bCs/>
+        </w:rPr>
+        <w:t xml:space="preserve">REQUEST FOR ADMISSION NO. 85:  </w:t>
+      </w:r>
+      <w:r>
+        <w:rPr>
+          <w:bCs/>
+        </w:rPr>
+        <w:t>Admit that Your October 10, 2025 letter to Plaintiffs stated, "The file does not contain a report on the requested date."</w:t>
+      </w:r>
+    </w:p>
+    <w:p>
+      <w:pPr>
+        <w:keepLines/>
+        <w:spacing w:after="160"/>
+        <w:ind w:left="720" w:hanging="576"/>
+      </w:pPr>
+      <w:r>
+        <w:rPr>
+          <w:b/>
+          <w:bCs/>
+        </w:rPr>
+        <w:t xml:space="preserve">REQUEST FOR ADMISSION NO. 86:  </w:t>
+      </w:r>
+      <w:r>
+        <w:rPr>
+          <w:bCs/>
+        </w:rPr>
+        <w:t>Admit that the "requested date" referred to in the statement quoted in the preceding request was September 6, 2024.</w:t>
       </w:r>
     </w:p>
     <w:p>
@@ -2280,368 +3006,39 @@
         <w:rPr>
           <w:i/>
         </w:rPr>
-        <w:t>See also Requests for Admission Nos. 79 through 103.</w:t>
-      </w:r>
-    </w:p>
-    <w:p>
-      <w:pPr>
-        <w:keepLines/>
-        <w:spacing w:after="160"/>
-        <w:ind w:left="720" w:hanging="576"/>
-      </w:pPr>
-      <w:r>
-        <w:rPr>
-          <w:b/>
-          <w:bCs/>
-        </w:rPr>
-        <w:t xml:space="preserve">REQUEST FOR ADMISSION NO. 61:  </w:t>
-      </w:r>
-      <w:r>
-        <w:rPr>
-          <w:bCs/>
-        </w:rPr>
-        <w:t>Admit that page 5 of The Prieve Report states: "A dent with a scrape mark present appears in the bottom screen frame of the east facing sliding door."</w:t>
-      </w:r>
-    </w:p>
-    <w:p>
-      <w:pPr>
-        <w:keepLines/>
-        <w:spacing w:after="160"/>
-        <w:ind w:left="720" w:hanging="576"/>
-      </w:pPr>
-      <w:r>
-        <w:rPr>
-          <w:b/>
-          <w:bCs/>
-        </w:rPr>
-        <w:t xml:space="preserve">REQUEST FOR ADMISSION NO. 62:  </w:t>
-      </w:r>
-      <w:r>
-        <w:rPr>
-          <w:bCs/>
-        </w:rPr>
-        <w:t>Admit that photograph A-42 of Photo Appendix A depicts a dent in a downspout extension at The Property.</w:t>
-      </w:r>
-    </w:p>
-    <w:p>
-      <w:pPr>
-        <w:keepLines/>
-        <w:spacing w:after="160"/>
-        <w:ind w:left="720" w:hanging="576"/>
-      </w:pPr>
-      <w:r>
-        <w:rPr>
-          <w:b/>
-          <w:bCs/>
-        </w:rPr>
-        <w:t xml:space="preserve">REQUEST FOR ADMISSION NO. 63:  </w:t>
-      </w:r>
-      <w:r>
-        <w:rPr>
-          <w:bCs/>
-        </w:rPr>
-        <w:t>Admit that photograph A-92 of Photo Appendix A depicts a dented downspout at The Property.</w:t>
-      </w:r>
-    </w:p>
-    <w:p>
-      <w:pPr>
-        <w:keepLines/>
-        <w:spacing w:after="160"/>
-        <w:ind w:left="720" w:hanging="576"/>
-      </w:pPr>
-      <w:r>
-        <w:rPr>
-          <w:b/>
-          <w:bCs/>
-        </w:rPr>
-        <w:t xml:space="preserve">REQUEST FOR ADMISSION NO. 64:  </w:t>
-      </w:r>
-      <w:r>
-        <w:rPr>
-          <w:bCs/>
-        </w:rPr>
-        <w:t>Admit that photograph A-93 of Photo Appendix A depicts a dented downspout at The Property.</w:t>
-      </w:r>
-    </w:p>
-    <w:p>
-      <w:pPr>
-        <w:keepLines/>
-        <w:spacing w:after="160"/>
-        <w:ind w:left="720" w:hanging="576"/>
-      </w:pPr>
-      <w:r>
-        <w:rPr>
-          <w:b/>
-          <w:bCs/>
-        </w:rPr>
-        <w:t xml:space="preserve">REQUEST FOR ADMISSION NO. 65:  </w:t>
-      </w:r>
-      <w:r>
-        <w:rPr>
-          <w:bCs/>
-        </w:rPr>
-        <w:t>Admit that photograph A-98 of Photo Appendix A depicts a dented downspout at The Property.</w:t>
-      </w:r>
-    </w:p>
-    <w:p>
-      <w:pPr>
-        <w:keepLines/>
-        <w:spacing w:after="160"/>
-        <w:ind w:left="720" w:hanging="576"/>
-      </w:pPr>
-      <w:r>
-        <w:rPr>
-          <w:b/>
-          <w:bCs/>
-        </w:rPr>
-        <w:t xml:space="preserve">REQUEST FOR ADMISSION NO. 66:  </w:t>
-      </w:r>
-      <w:r>
-        <w:rPr>
-          <w:bCs/>
-        </w:rPr>
-        <w:t>Admit that photograph A-99 of Photo Appendix A depicts a dented downspout at The Property.</w:t>
-      </w:r>
-    </w:p>
-    <w:p>
-      <w:pPr>
-        <w:keepLines/>
-        <w:spacing w:after="160"/>
-        <w:ind w:left="720" w:hanging="576"/>
-      </w:pPr>
-      <w:r>
-        <w:rPr>
-          <w:b/>
-          <w:bCs/>
-        </w:rPr>
-        <w:t xml:space="preserve">REQUEST FOR ADMISSION NO. 67:  </w:t>
-      </w:r>
-      <w:r>
-        <w:rPr>
-          <w:bCs/>
-        </w:rPr>
-        <w:t>Admit that photograph A-103 of Photo Appendix A depicts dented flashing at The Property.</w:t>
-      </w:r>
-    </w:p>
-    <w:p>
-      <w:pPr>
-        <w:keepLines/>
-        <w:spacing w:after="160"/>
-        <w:ind w:left="720" w:hanging="576"/>
-      </w:pPr>
-      <w:r>
-        <w:rPr>
-          <w:b/>
-          <w:bCs/>
-        </w:rPr>
-        <w:t xml:space="preserve">REQUEST FOR ADMISSION NO. 68:  </w:t>
-      </w:r>
-      <w:r>
-        <w:rPr>
-          <w:bCs/>
-        </w:rPr>
-        <w:t>Admit that Photo Appendix A is a genuine copy of the photographic appendix prepared by Prieve Engineering, LLC, File Number 241008.</w:t>
-      </w:r>
-    </w:p>
-    <w:p>
-      <w:pPr>
-        <w:keepLines/>
-        <w:spacing w:after="160"/>
-        <w:ind w:left="720" w:hanging="576"/>
-      </w:pPr>
-      <w:r>
-        <w:rPr>
-          <w:b/>
-          <w:bCs/>
-        </w:rPr>
-        <w:lastRenderedPageBreak/>
-        <w:t xml:space="preserve">REQUEST FOR ADMISSION NO. 69:  </w:t>
-      </w:r>
-      <w:r>
-        <w:rPr>
-          <w:bCs/>
-        </w:rPr>
-        <w:t>Admit that "DOWNSPOUT EXTENSION AT FRONT, VIEW OF DENT AT UPPER EDGE" is the caption of photograph A-42 of Photo Appendix A.</w:t>
-      </w:r>
-    </w:p>
-    <w:p>
-      <w:pPr>
-        <w:keepLines/>
-        <w:spacing w:after="160"/>
-        <w:ind w:left="720" w:hanging="576"/>
-      </w:pPr>
-      <w:r>
-        <w:rPr>
-          <w:b/>
-          <w:bCs/>
-        </w:rPr>
-        <w:t xml:space="preserve">REQUEST FOR ADMISSION NO. 70:  </w:t>
-      </w:r>
-      <w:r>
-        <w:rPr>
-          <w:bCs/>
-        </w:rPr>
-        <w:t>Admit that "VIEW OF DOWNSPOUT, DENT PRESENT" is the caption of photograph A-92 of Photo Appendix A.</w:t>
-      </w:r>
-    </w:p>
-    <w:p>
-      <w:pPr>
-        <w:keepLines/>
-        <w:spacing w:after="160"/>
-        <w:ind w:left="720" w:hanging="576"/>
-      </w:pPr>
-      <w:r>
-        <w:rPr>
-          <w:b/>
-          <w:bCs/>
-        </w:rPr>
-        <w:t xml:space="preserve">REQUEST FOR ADMISSION NO. 71:  </w:t>
-      </w:r>
-      <w:r>
-        <w:rPr>
-          <w:bCs/>
-        </w:rPr>
-        <w:t>Admit that "ADJACENT AREA SHOWING DENT IN DOWNSPOUT" is the caption of photograph A-93 of Photo Appendix A.</w:t>
-      </w:r>
-    </w:p>
-    <w:p>
-      <w:pPr>
-        <w:keepLines/>
-        <w:spacing w:after="160"/>
-        <w:ind w:left="720" w:hanging="576"/>
-      </w:pPr>
-      <w:r>
-        <w:rPr>
-          <w:b/>
-          <w:bCs/>
-        </w:rPr>
-        <w:t xml:space="preserve">REQUEST FOR ADMISSION NO. 72:  </w:t>
-      </w:r>
-      <w:r>
-        <w:rPr>
-          <w:bCs/>
-        </w:rPr>
-        <w:t>Admit that "DOWNSPOUT AT EASET [sic] SIDE SHOWING DENT" is the caption of photograph A-98 of Photo Appendix A.</w:t>
-      </w:r>
-    </w:p>
-    <w:p>
-      <w:pPr>
-        <w:keepLines/>
-        <w:spacing w:after="160"/>
-        <w:ind w:left="720" w:hanging="576"/>
-      </w:pPr>
-      <w:r>
-        <w:rPr>
-          <w:b/>
-          <w:bCs/>
-        </w:rPr>
-        <w:t xml:space="preserve">REQUEST FOR ADMISSION NO. 73:  </w:t>
-      </w:r>
-      <w:r>
-        <w:rPr>
-          <w:bCs/>
-        </w:rPr>
-        <w:t>Admit that "DENT IN DOWNSPOUT WITH CREASE PRESENT" is the caption of photograph A-99 of Photo Appendix A.</w:t>
-      </w:r>
-    </w:p>
-    <w:p>
-      <w:pPr>
-        <w:keepLines/>
-        <w:spacing w:after="160"/>
-        <w:ind w:left="720" w:hanging="576"/>
-      </w:pPr>
-      <w:r>
-        <w:rPr>
-          <w:b/>
-          <w:bCs/>
-        </w:rPr>
-        <w:t xml:space="preserve">REQUEST FOR ADMISSION NO. 74:  </w:t>
-      </w:r>
-      <w:r>
-        <w:rPr>
-          <w:bCs/>
-        </w:rPr>
-        <w:t>Admit that "VIEW OF DENTS IN FLASHING AT BASE OF WALL ALONG DECK" is the caption of photograph A-103 of Photo Appendix A.</w:t>
-      </w:r>
-    </w:p>
-    <w:p>
-      <w:pPr>
-        <w:keepLines/>
-        <w:spacing w:after="160"/>
-        <w:ind w:left="720" w:hanging="576"/>
-      </w:pPr>
-      <w:r>
-        <w:rPr>
-          <w:b/>
-          <w:bCs/>
-        </w:rPr>
-        <w:t xml:space="preserve">REQUEST FOR ADMISSION NO. 75:  </w:t>
-      </w:r>
-      <w:r>
-        <w:rPr>
-          <w:bCs/>
-        </w:rPr>
-        <w:t>Admit that "DENT IN SCREEN AT DOOR WINDOW SCRAPE MARK PRESENT" is the caption of photograph A-141 of Photo Appendix A.</w:t>
-      </w:r>
-    </w:p>
-    <w:p>
-      <w:pPr>
-        <w:keepLines/>
-        <w:spacing w:after="160"/>
-        <w:ind w:left="720" w:hanging="576"/>
-      </w:pPr>
-      <w:r>
-        <w:rPr>
-          <w:b/>
-          <w:bCs/>
-        </w:rPr>
-        <w:t xml:space="preserve">REQUEST FOR ADMISSION NO. 76:  </w:t>
-      </w:r>
-      <w:r>
-        <w:rPr>
-          <w:bCs/>
-        </w:rPr>
-        <w:t>Admit that You have not at any time obtained any engineering analysis, engineering report, or engineering opinion concerning the cause of the conditions depicted at photographs A-42, A-92, A-93, A-98, A-99, A-103, and A-141 of Photo Appendix A.</w:t>
-      </w:r>
-    </w:p>
-    <w:p>
-      <w:pPr>
-        <w:keepLines/>
-        <w:spacing w:after="160"/>
-        <w:ind w:left="720" w:hanging="576"/>
-      </w:pPr>
-      <w:r>
-        <w:rPr>
-          <w:b/>
-          <w:bCs/>
-        </w:rPr>
-        <w:t xml:space="preserve">REQUEST FOR ADMISSION NO. 77:  </w:t>
-      </w:r>
-      <w:r>
-        <w:rPr>
-          <w:bCs/>
-        </w:rPr>
-        <w:t>Admit that Photo Appendix A contains no photograph of the two-sash fixed window that is the only other window on the rear (east) elevation of the attached garage at The Property, south of the garage window depicted at photographs A-213 through A-217.</w:t>
-      </w:r>
-    </w:p>
-    <w:p>
-      <w:pPr>
-        <w:keepLines/>
-        <w:spacing w:after="160"/>
-        <w:ind w:left="720" w:hanging="576"/>
-      </w:pPr>
-      <w:r>
-        <w:rPr>
-          <w:b/>
-          <w:bCs/>
-        </w:rPr>
-        <w:t xml:space="preserve">REQUEST FOR ADMISSION NO. 78:  </w:t>
-      </w:r>
-      <w:r>
-        <w:rPr>
-          <w:bCs/>
-        </w:rPr>
-        <w:t>Admit that no person acting for You or retained by You has inspected the window described in the preceding request.</w:t>
+        <w:t>See also Requests for Admission Nos. 140 and 141.</w:t>
+      </w:r>
+    </w:p>
+    <w:p>
+      <w:pPr>
+        <w:keepLines/>
+        <w:spacing w:after="160"/>
+        <w:ind w:left="720" w:hanging="576"/>
+      </w:pPr>
+      <w:r>
+        <w:rPr>
+          <w:b/>
+          <w:bCs/>
+        </w:rPr>
+        <w:t xml:space="preserve">REQUEST FOR ADMISSION NO. 87:  </w:t>
+      </w:r>
+      <w:r>
+        <w:rPr>
+          <w:bCs/>
+        </w:rPr>
+        <w:t>Admit that You have paid Plaintiffs nothing on The Claim.</w:t>
+      </w:r>
+    </w:p>
+    <w:p>
+      <w:pPr>
+        <w:keepNext/>
+        <w:spacing w:after="160" w:line="276" w:lineRule="auto"/>
+      </w:pPr>
+      <w:r>
+        <w:rPr>
+          <w:i/>
+        </w:rPr>
+        <w:t>See also Request for Admission No. 22.</w:t>
       </w:r>
     </w:p>
     <w:p>
@@ -2657,7 +3054,7 @@
           <w:i/>
           <w:iCs/>
         </w:rPr>
-        <w:t>I.  Dents recorded in The Prieve Report, and what the report does not state</w:t>
+        <w:t>L.  Claim handlers and the September 6, 2024 inspection records</w:t>
       </w:r>
     </w:p>
     <w:p>
@@ -2671,27 +3068,127 @@
         <w:rPr>
           <w:iCs/>
         </w:rPr>
-        <w:t>The first Request in this section concerns the genuineness of The Prieve Report. The next twenty Requests each ask You to admit that a dent or indentation, identified by the sentence of The Prieve Report quoted in the Request, was present at The Property; they do not ask You to admit the cause of any dent or indentation. The remaining Requests in this section concern what The Prieve Report does not state or identify. To be read with Requests Nos. 55 through 61.</w:t>
-      </w:r>
-    </w:p>
-    <w:p>
-      <w:pPr>
-        <w:keepLines/>
-        <w:spacing w:after="160"/>
-        <w:ind w:left="720" w:hanging="576"/>
-      </w:pPr>
-      <w:r>
-        <w:rPr>
-          <w:b/>
-          <w:bCs/>
-        </w:rPr>
-        <w:t xml:space="preserve">REQUEST FOR ADMISSION NO. 79:  </w:t>
-      </w:r>
-      <w:r>
-        <w:rPr>
-          <w:bCs/>
-        </w:rPr>
-        <w:t>Admit that The Prieve Report is a genuine copy of the report prepared by Prieve Engineering, LLC, File Number 241008.</w:t>
+        <w:t>Requests 88 through 97 concern the persons who handled The Claim and the records of the September 6, 2024 inspection, and are to be read with Requests Nos. 4 through 8, 29, 85, and 86.</w:t>
+      </w:r>
+    </w:p>
+    <w:p>
+      <w:pPr>
+        <w:keepLines/>
+        <w:spacing w:after="160"/>
+        <w:ind w:left="720" w:hanging="576"/>
+      </w:pPr>
+      <w:r>
+        <w:rPr>
+          <w:b/>
+          <w:bCs/>
+        </w:rPr>
+        <w:t xml:space="preserve">REQUEST FOR ADMISSION NO. 88:  </w:t>
+      </w:r>
+      <w:r>
+        <w:rPr>
+          <w:bCs/>
+        </w:rPr>
+        <w:t>Admit that Christian Dudley acted on behalf of Fire Insurance Exchange in handling The Claim.</w:t>
+      </w:r>
+    </w:p>
+    <w:p>
+      <w:pPr>
+        <w:keepLines/>
+        <w:spacing w:after="160"/>
+        <w:ind w:left="720" w:hanging="576"/>
+      </w:pPr>
+      <w:r>
+        <w:rPr>
+          <w:b/>
+          <w:bCs/>
+        </w:rPr>
+        <w:t xml:space="preserve">REQUEST FOR ADMISSION NO. 89:  </w:t>
+      </w:r>
+      <w:r>
+        <w:rPr>
+          <w:bCs/>
+        </w:rPr>
+        <w:t>Admit that Nicholas Brau acted on behalf of Fire Insurance Exchange in handling The Claim.</w:t>
+      </w:r>
+    </w:p>
+    <w:p>
+      <w:pPr>
+        <w:keepLines/>
+        <w:spacing w:after="160"/>
+        <w:ind w:left="720" w:hanging="576"/>
+      </w:pPr>
+      <w:r>
+        <w:rPr>
+          <w:b/>
+          <w:bCs/>
+        </w:rPr>
+        <w:t xml:space="preserve">REQUEST FOR ADMISSION NO. 90:  </w:t>
+      </w:r>
+      <w:r>
+        <w:rPr>
+          <w:bCs/>
+        </w:rPr>
+        <w:t>Admit that Bradlee Monson acted on behalf of Fire Insurance Exchange in handling The Claim.</w:t>
+      </w:r>
+    </w:p>
+    <w:p>
+      <w:pPr>
+        <w:keepLines/>
+        <w:spacing w:after="160"/>
+        <w:ind w:left="720" w:hanging="576"/>
+      </w:pPr>
+      <w:r>
+        <w:rPr>
+          <w:b/>
+          <w:bCs/>
+        </w:rPr>
+        <w:t xml:space="preserve">REQUEST FOR ADMISSION NO. 91:  </w:t>
+      </w:r>
+      <w:r>
+        <w:rPr>
+          <w:bCs/>
+        </w:rPr>
+        <w:t>Admit that Zorphlon Miller acted on behalf of Fire Insurance Exchange in handling The Claim.</w:t>
+      </w:r>
+    </w:p>
+    <w:p>
+      <w:pPr>
+        <w:keepLines/>
+        <w:spacing w:after="160"/>
+        <w:ind w:left="720" w:hanging="576"/>
+      </w:pPr>
+      <w:r>
+        <w:rPr>
+          <w:b/>
+          <w:bCs/>
+        </w:rPr>
+        <w:t xml:space="preserve">REQUEST FOR ADMISSION NO. 92:  </w:t>
+      </w:r>
+      <w:r>
+        <w:rPr>
+          <w:bCs/>
+        </w:rPr>
+        <w:t>Admit that Jillian Bell acted on behalf of Fire Insurance Exchange in handling The Claim.</w:t>
+      </w:r>
+    </w:p>
+    <w:p>
+      <w:pPr>
+        <w:keepLines/>
+        <w:spacing w:after="160"/>
+        <w:ind w:left="720" w:hanging="576"/>
+      </w:pPr>
+      <w:r>
+        <w:rPr>
+          <w:b/>
+          <w:bCs/>
+        </w:rPr>
+        <w:t xml:space="preserve">REQUEST FOR ADMISSION NO. 93:  </w:t>
+      </w:r>
+      <w:r>
+        <w:rPr>
+          <w:bCs/>
+        </w:rPr>
+        <w:t>Admit that during the September 6, 2024 inspection of The Property, Nicholas Brau made handwritten notes, measurements, or sketches concerning the windows at The Property.</w:t>
       </w:r>
     </w:p>
     <w:p>
@@ -2706,294 +3203,13 @@
           <w:bCs/>
         </w:rPr>
         <w:lastRenderedPageBreak/>
-        <w:t xml:space="preserve">REQUEST FOR ADMISSION NO. 80:  </w:t>
-      </w:r>
-      <w:r>
-        <w:rPr>
-          <w:bCs/>
-        </w:rPr>
-        <w:t>Admit that the dents described on page 4 of The Prieve Report in the sentence "Rounded dents were observed at sashes of this window unit" were present at The Property on October 9, 2024.</w:t>
-      </w:r>
-    </w:p>
-    <w:p>
-      <w:pPr>
-        <w:keepLines/>
-        <w:spacing w:after="160"/>
-        <w:ind w:left="720" w:hanging="576"/>
-      </w:pPr>
-      <w:r>
-        <w:rPr>
-          <w:b/>
-          <w:bCs/>
-        </w:rPr>
-        <w:t xml:space="preserve">REQUEST FOR ADMISSION NO. 81:  </w:t>
-      </w:r>
-      <w:r>
-        <w:rPr>
-          <w:bCs/>
-        </w:rPr>
-        <w:t>Admit that the dents described on page 4 of The Prieve Report in the sentence "Two dents with sharp marks/indentations appear long [sic] the left side of the left sash as shown in photograph A-45" were present at The Property on October 9, 2024.</w:t>
-      </w:r>
-    </w:p>
-    <w:p>
-      <w:pPr>
-        <w:keepLines/>
-        <w:spacing w:after="160"/>
-        <w:ind w:left="720" w:hanging="576"/>
-      </w:pPr>
-      <w:r>
-        <w:rPr>
-          <w:b/>
-          <w:bCs/>
-        </w:rPr>
-        <w:t xml:space="preserve">REQUEST FOR ADMISSION NO. 82:  </w:t>
-      </w:r>
-      <w:r>
-        <w:rPr>
-          <w:bCs/>
-        </w:rPr>
-        <w:t>Admit that the dent described on page 4 of The Prieve Report in the sentence "A dent appears in a window sash with a scrape mark present inside the dent as shown in photograph A-64" was present at The Property on October 9, 2024.</w:t>
-      </w:r>
-    </w:p>
-    <w:p>
-      <w:pPr>
-        <w:keepLines/>
-        <w:spacing w:after="160"/>
-        <w:ind w:left="720" w:hanging="576"/>
-      </w:pPr>
-      <w:r>
-        <w:rPr>
-          <w:b/>
-          <w:bCs/>
-        </w:rPr>
-        <w:t xml:space="preserve">REQUEST FOR ADMISSION NO. 83:  </w:t>
-      </w:r>
-      <w:r>
-        <w:rPr>
-          <w:bCs/>
-        </w:rPr>
-        <w:t>Admit that the dent described on page 5 of The Prieve Report in the sentence "A dent with scrape marks was observed in the frame of the upper southeast facing window as shown in photograph A-107" was present at The Property on October 9, 2024.</w:t>
-      </w:r>
-    </w:p>
-    <w:p>
-      <w:pPr>
-        <w:keepLines/>
-        <w:spacing w:after="160"/>
-        <w:ind w:left="720" w:hanging="576"/>
-      </w:pPr>
-      <w:r>
-        <w:rPr>
-          <w:b/>
-          <w:bCs/>
-        </w:rPr>
-        <w:t xml:space="preserve">REQUEST FOR ADMISSION NO. 84:  </w:t>
-      </w:r>
-      <w:r>
-        <w:rPr>
-          <w:bCs/>
-        </w:rPr>
-        <w:t>Admit that the indentation described on page 5 of The Prieve Report in the sentence "An indentation appears on the left side of the center window accessory groove not consistent with hail along with a mark in the frame with loss of finishes as shown in photograph A-113" was present at The Property on October 9, 2024.</w:t>
-      </w:r>
-    </w:p>
-    <w:p>
-      <w:pPr>
-        <w:keepLines/>
-        <w:spacing w:after="160"/>
-        <w:ind w:left="720" w:hanging="576"/>
-      </w:pPr>
-      <w:r>
-        <w:rPr>
-          <w:b/>
-          <w:bCs/>
-        </w:rPr>
-        <w:t xml:space="preserve">REQUEST FOR ADMISSION NO. 85:  </w:t>
-      </w:r>
-      <w:r>
-        <w:rPr>
-          <w:bCs/>
-        </w:rPr>
-        <w:t>Admit that the dents described on page 5 of The Prieve Report in the sentence "Two dents appear in the face of the sash at the lower left corner of the main window with scrape marks present inside and around areas of dents" were present at The Property on October 9, 2024.</w:t>
-      </w:r>
-    </w:p>
-    <w:p>
-      <w:pPr>
-        <w:keepLines/>
-        <w:spacing w:after="160"/>
-        <w:ind w:left="720" w:hanging="576"/>
-      </w:pPr>
-      <w:r>
-        <w:rPr>
-          <w:b/>
-          <w:bCs/>
-        </w:rPr>
-        <w:t xml:space="preserve">REQUEST FOR ADMISSION NO. 86:  </w:t>
-      </w:r>
-      <w:r>
-        <w:rPr>
-          <w:bCs/>
-        </w:rPr>
-        <w:t>Admit that the dent described on page 5 of The Prieve Report in the sentence "A dent with marks present appears in the face of the drip cap of the upper center window unit" was present at The Property on October 9, 2024.</w:t>
-      </w:r>
-    </w:p>
-    <w:p>
-      <w:pPr>
-        <w:keepLines/>
-        <w:spacing w:after="160"/>
-        <w:ind w:left="720" w:hanging="576"/>
-      </w:pPr>
-      <w:r>
-        <w:rPr>
-          <w:b/>
-          <w:bCs/>
-        </w:rPr>
-        <w:t xml:space="preserve">REQUEST FOR ADMISSION NO. 87:  </w:t>
-      </w:r>
-      <w:r>
-        <w:rPr>
-          <w:bCs/>
-        </w:rPr>
-        <w:t>Admit that the dent described on page 5 of The Prieve Report in the sentence "A dent appears in the bottom accessory groove of the upper northeast facing window not consistent with hail" was present at The Property on October 9, 2024.</w:t>
-      </w:r>
-    </w:p>
-    <w:p>
-      <w:pPr>
-        <w:keepLines/>
-        <w:spacing w:after="160"/>
-        <w:ind w:left="720" w:hanging="576"/>
-      </w:pPr>
-      <w:r>
-        <w:rPr>
-          <w:b/>
-          <w:bCs/>
-        </w:rPr>
-        <w:t xml:space="preserve">REQUEST FOR ADMISSION NO. 88:  </w:t>
-      </w:r>
-      <w:r>
-        <w:rPr>
-          <w:bCs/>
-        </w:rPr>
-        <w:t>Admit that the dent described on page 5 of The Prieve Report in the sentence "A dent appears along the left accessory groove of the southeast facing window not consistent with hail" was present at The Property on October 9, 2024.</w:t>
-      </w:r>
-    </w:p>
-    <w:p>
-      <w:pPr>
-        <w:keepLines/>
-        <w:spacing w:after="160"/>
-        <w:ind w:left="720" w:hanging="576"/>
-      </w:pPr>
-      <w:r>
-        <w:rPr>
-          <w:b/>
-          <w:bCs/>
-        </w:rPr>
-        <w:t xml:space="preserve">REQUEST FOR ADMISSION NO. 89:  </w:t>
-      </w:r>
-      <w:r>
-        <w:rPr>
-          <w:bCs/>
-        </w:rPr>
-        <w:t>Admit that the dent described on page 5 of The Prieve Report in the sentence "Various scrape marks and a dent appear along the bottom frame of the center window not consistent with hail" was present at The Property on October 9, 2024.</w:t>
-      </w:r>
-    </w:p>
-    <w:p>
-      <w:pPr>
-        <w:keepLines/>
-        <w:spacing w:after="160"/>
-        <w:ind w:left="720" w:hanging="576"/>
-      </w:pPr>
-      <w:r>
-        <w:rPr>
-          <w:b/>
-          <w:bCs/>
-        </w:rPr>
-        <w:lastRenderedPageBreak/>
-        <w:t xml:space="preserve">REQUEST FOR ADMISSION NO. 90:  </w:t>
-      </w:r>
-      <w:r>
-        <w:rPr>
-          <w:bCs/>
-        </w:rPr>
-        <w:t>Admit that the dents described on page 5 of The Prieve Report in the sentence "Dents with scrape marks appear at the lower left corner of the sash of the northeast facing window not consistent with hail" were present at The Property on October 9, 2024.</w:t>
-      </w:r>
-    </w:p>
-    <w:p>
-      <w:pPr>
-        <w:keepLines/>
-        <w:spacing w:after="160"/>
-        <w:ind w:left="720" w:hanging="576"/>
-      </w:pPr>
-      <w:r>
-        <w:rPr>
-          <w:b/>
-          <w:bCs/>
-        </w:rPr>
-        <w:t xml:space="preserve">REQUEST FOR ADMISSION NO. 91:  </w:t>
-      </w:r>
-      <w:r>
-        <w:rPr>
-          <w:bCs/>
-        </w:rPr>
-        <w:t>Admit that the dent described on page 5 of The Prieve Report in the sentence "A dent appears along the bottom accessory groove not consistent with hail" was present at The Property on October 9, 2024.</w:t>
-      </w:r>
-    </w:p>
-    <w:p>
-      <w:pPr>
-        <w:keepLines/>
-        <w:spacing w:after="160"/>
-        <w:ind w:left="720" w:hanging="576"/>
-      </w:pPr>
-      <w:r>
-        <w:rPr>
-          <w:b/>
-          <w:bCs/>
-        </w:rPr>
-        <w:t xml:space="preserve">REQUEST FOR ADMISSION NO. 92:  </w:t>
-      </w:r>
-      <w:r>
-        <w:rPr>
-          <w:bCs/>
-        </w:rPr>
-        <w:t>Admit that the dent described on page 5 of The Prieve Report in the sentence "A similar dent appears along the left side as shown in photograph A-163 not consistent with hail" was present at The Property on October 9, 2024.</w:t>
-      </w:r>
-    </w:p>
-    <w:p>
-      <w:pPr>
-        <w:keepLines/>
-        <w:spacing w:after="160"/>
-        <w:ind w:left="720" w:hanging="576"/>
-      </w:pPr>
-      <w:r>
-        <w:rPr>
-          <w:b/>
-          <w:bCs/>
-        </w:rPr>
-        <w:t xml:space="preserve">REQUEST FOR ADMISSION NO. 93:  </w:t>
-      </w:r>
-      <w:r>
-        <w:rPr>
-          <w:bCs/>
-        </w:rPr>
-        <w:t>Admit that the dents described on page 5 of The Prieve Report in the sentence "Scrape marks and dents with sharp marks appear at the southeast facing window as shown in photographs A-165 and A-166" were present at The Property on October 9, 2024.</w:t>
-      </w:r>
-    </w:p>
-    <w:p>
-      <w:pPr>
-        <w:keepLines/>
-        <w:spacing w:after="160"/>
-        <w:ind w:left="720" w:hanging="576"/>
-      </w:pPr>
-      <w:r>
-        <w:rPr>
-          <w:b/>
-          <w:bCs/>
-        </w:rPr>
         <w:t xml:space="preserve">REQUEST FOR ADMISSION NO. 94:  </w:t>
       </w:r>
       <w:r>
         <w:rPr>
           <w:bCs/>
         </w:rPr>
-        <w:t>Admit that the dent described on page 5 of The Prieve Report in the sentence "A dent was observed along the bottom accessory groove of the northeast facing window as shown in photograph A-174" was present at The Property on October 9, 2024.</w:t>
+        <w:t>Admit that on October 29, 2025, notes, measurements, or sketches made by Nicholas Brau in connection with the September 6, 2024 inspection of The Property were in Your possession, custody, or control.</w:t>
       </w:r>
     </w:p>
     <w:p>
@@ -3013,7 +3229,7 @@
         <w:rPr>
           <w:bCs/>
         </w:rPr>
-        <w:t>Admit that the dents described on page 5 of The Prieve Report in the sentence "Two dents appear at the lower left corner of the left casement which are generally smooth" were present at The Property on October 9, 2024.</w:t>
+        <w:t>Admit that no document You have produced or released to Plaintiffs records Nicholas Brau's observations from the September 6, 2024 inspection of The Property.</w:t>
       </w:r>
     </w:p>
     <w:p>
@@ -3033,7 +3249,7 @@
         <w:rPr>
           <w:bCs/>
         </w:rPr>
-        <w:t>Admit that the dent described on page 5 of The Prieve Report in the sentence "A dent appears in the bottom accessory groove of the window not consistent with hail" was present at The Property on October 9, 2024.</w:t>
+        <w:t>Admit that, as of September 6, 2024, You had not issued any litigation hold, preservation notice, or document-preservation instruction directing the preservation of documents concerning The Claim.</w:t>
       </w:r>
     </w:p>
     <w:p>
@@ -3053,308 +3269,7 @@
         <w:rPr>
           <w:bCs/>
         </w:rPr>
-        <w:t>Admit that the dent described on page 5 of The Prieve Report in the sentence "A scrape mark and dent appear at the right side of the east facing window not consistent with hail" was present at The Property on October 9, 2024.</w:t>
-      </w:r>
-    </w:p>
-    <w:p>
-      <w:pPr>
-        <w:keepLines/>
-        <w:spacing w:after="160"/>
-        <w:ind w:left="720" w:hanging="576"/>
-      </w:pPr>
-      <w:r>
-        <w:rPr>
-          <w:b/>
-          <w:bCs/>
-        </w:rPr>
-        <w:t xml:space="preserve">REQUEST FOR ADMISSION NO. 98:  </w:t>
-      </w:r>
-      <w:r>
-        <w:rPr>
-          <w:bCs/>
-        </w:rPr>
-        <w:t>Admit that the dent described on page 6 of The Prieve Report in the sentence "A dent appears in the left accessory groove similar to those observed elsewhere" was present at The Property on October 9, 2024.</w:t>
-      </w:r>
-    </w:p>
-    <w:p>
-      <w:pPr>
-        <w:keepLines/>
-        <w:spacing w:after="160"/>
-        <w:ind w:left="720" w:hanging="576"/>
-      </w:pPr>
-      <w:r>
-        <w:rPr>
-          <w:b/>
-          <w:bCs/>
-        </w:rPr>
-        <w:t xml:space="preserve">REQUEST FOR ADMISSION NO. 99:  </w:t>
-      </w:r>
-      <w:r>
-        <w:rPr>
-          <w:bCs/>
-        </w:rPr>
-        <w:t>Admit that the dent described on page 6 of The Prieve Report in the sentence "A dent appears in the left accessory groove at the lower corner of the window" was present at The Property on October 9, 2024.</w:t>
-      </w:r>
-    </w:p>
-    <w:p>
-      <w:pPr>
-        <w:keepLines/>
-        <w:spacing w:after="160"/>
-        <w:ind w:left="720" w:hanging="576"/>
-      </w:pPr>
-      <w:r>
-        <w:rPr>
-          <w:b/>
-          <w:bCs/>
-        </w:rPr>
-        <w:t xml:space="preserve">REQUEST FOR ADMISSION NO. 100:  </w:t>
-      </w:r>
-      <w:r>
-        <w:rPr>
-          <w:bCs/>
-        </w:rPr>
-        <w:t>Admit that The Prieve Report does not identify any object, other than hail, that caused any dent or indentation described in The Prieve Report.</w:t>
-      </w:r>
-    </w:p>
-    <w:p>
-      <w:pPr>
-        <w:keepLines/>
-        <w:spacing w:after="160"/>
-        <w:ind w:left="720" w:hanging="576"/>
-      </w:pPr>
-      <w:r>
-        <w:rPr>
-          <w:b/>
-          <w:bCs/>
-        </w:rPr>
-        <w:t xml:space="preserve">REQUEST FOR ADMISSION NO. 101:  </w:t>
-      </w:r>
-      <w:r>
-        <w:rPr>
-          <w:bCs/>
-        </w:rPr>
-        <w:t>Admit that The Prieve Report does not identify when, how, or by whom any dent described in The Prieve Report was caused "during or following installation of windows."</w:t>
-      </w:r>
-    </w:p>
-    <w:p>
-      <w:pPr>
-        <w:keepLines/>
-        <w:spacing w:after="160"/>
-        <w:ind w:left="720" w:hanging="576"/>
-      </w:pPr>
-      <w:r>
-        <w:rPr>
-          <w:b/>
-          <w:bCs/>
-        </w:rPr>
-        <w:lastRenderedPageBreak/>
-        <w:t xml:space="preserve">REQUEST FOR ADMISSION NO. 102:  </w:t>
-      </w:r>
-      <w:r>
-        <w:rPr>
-          <w:bCs/>
-        </w:rPr>
-        <w:t>Admit that The Prieve Report does not state the size of any hailstone that fell at The Property on July 13 or 14, 2024.</w:t>
-      </w:r>
-    </w:p>
-    <w:p>
-      <w:pPr>
-        <w:keepLines/>
-        <w:spacing w:after="160"/>
-        <w:ind w:left="720" w:hanging="576"/>
-      </w:pPr>
-      <w:r>
-        <w:rPr>
-          <w:b/>
-          <w:bCs/>
-        </w:rPr>
-        <w:t xml:space="preserve">REQUEST FOR ADMISSION NO. 103:  </w:t>
-      </w:r>
-      <w:r>
-        <w:rPr>
-          <w:bCs/>
-        </w:rPr>
-        <w:t>Admit that The Prieve Report does not state the minimum hailstone size required to dent the window frames or sashes at The Property.</w:t>
-      </w:r>
-    </w:p>
-    <w:p>
-      <w:pPr>
-        <w:keepLines/>
-        <w:spacing w:after="160"/>
-        <w:ind w:left="720" w:hanging="576"/>
-      </w:pPr>
-      <w:r>
-        <w:rPr>
-          <w:b/>
-          <w:bCs/>
-        </w:rPr>
-        <w:t xml:space="preserve">REQUEST FOR ADMISSION NO. 104:  </w:t>
-      </w:r>
-      <w:r>
-        <w:rPr>
-          <w:bCs/>
-        </w:rPr>
-        <w:t>Admit that The Prieve Report does not state the criteria used to determine whether a dent is consistent with hail.</w:t>
-      </w:r>
-    </w:p>
-    <w:p>
-      <w:pPr>
-        <w:keepLines/>
-        <w:spacing w:after="160"/>
-        <w:ind w:left="720" w:hanging="576"/>
-      </w:pPr>
-      <w:r>
-        <w:rPr>
-          <w:b/>
-          <w:bCs/>
-        </w:rPr>
-        <w:t xml:space="preserve">REQUEST FOR ADMISSION NO. 105:  </w:t>
-      </w:r>
-      <w:r>
-        <w:rPr>
-          <w:bCs/>
-        </w:rPr>
-        <w:t>Admit that The Prieve Report does not state the size, depth, or dimensions of any dent, mark, or indentation described in it.</w:t>
-      </w:r>
-    </w:p>
-    <w:p>
-      <w:pPr>
-        <w:keepLines/>
-        <w:spacing w:after="160"/>
-        <w:ind w:left="720" w:hanging="576"/>
-      </w:pPr>
-      <w:r>
-        <w:rPr>
-          <w:b/>
-          <w:bCs/>
-        </w:rPr>
-        <w:t xml:space="preserve">REQUEST FOR ADMISSION NO. 106:  </w:t>
-      </w:r>
-      <w:r>
-        <w:rPr>
-          <w:bCs/>
-        </w:rPr>
-        <w:t>Admit that The Prieve Report does not state the date on which any dent described in it was caused.</w:t>
-      </w:r>
-    </w:p>
-    <w:p>
-      <w:pPr>
-        <w:keepLines/>
-        <w:spacing w:after="160"/>
-        <w:ind w:left="720" w:hanging="576"/>
-      </w:pPr>
-      <w:r>
-        <w:rPr>
-          <w:b/>
-          <w:bCs/>
-        </w:rPr>
-        <w:t xml:space="preserve">REQUEST FOR ADMISSION NO. 107:  </w:t>
-      </w:r>
-      <w:r>
-        <w:rPr>
-          <w:bCs/>
-        </w:rPr>
-        <w:t>Admit that The Prieve Report does not identify any publication, study, or test method in support of any opinion stated in it.</w:t>
-      </w:r>
-    </w:p>
-    <w:p>
-      <w:pPr>
-        <w:keepLines/>
-        <w:spacing w:after="160"/>
-        <w:ind w:left="720" w:hanging="576"/>
-      </w:pPr>
-      <w:r>
-        <w:rPr>
-          <w:b/>
-          <w:bCs/>
-        </w:rPr>
-        <w:t xml:space="preserve">REQUEST FOR ADMISSION NO. 108:  </w:t>
-      </w:r>
-      <w:r>
-        <w:rPr>
-          <w:bCs/>
-        </w:rPr>
-        <w:t>Admit that The Prieve Report does not identify the "customary and usual standards" referred to on page 2 of The Prieve Report.</w:t>
-      </w:r>
-    </w:p>
-    <w:p>
-      <w:pPr>
-        <w:keepLines/>
-        <w:spacing w:after="160"/>
-        <w:ind w:left="720" w:hanging="576"/>
-      </w:pPr>
-      <w:r>
-        <w:rPr>
-          <w:b/>
-          <w:bCs/>
-        </w:rPr>
-        <w:t xml:space="preserve">REQUEST FOR ADMISSION NO. 109:  </w:t>
-      </w:r>
-      <w:r>
-        <w:rPr>
-          <w:bCs/>
-        </w:rPr>
-        <w:t>Admit that The Prieve Report does not state any wind speed at The Property on July 13 or 14, 2024.</w:t>
-      </w:r>
-    </w:p>
-    <w:p>
-      <w:pPr>
-        <w:keepLines/>
-        <w:spacing w:after="160"/>
-        <w:ind w:left="720" w:hanging="576"/>
-      </w:pPr>
-      <w:r>
-        <w:rPr>
-          <w:b/>
-          <w:bCs/>
-        </w:rPr>
-        <w:t xml:space="preserve">REQUEST FOR ADMISSION NO. 110:  </w:t>
-      </w:r>
-      <w:r>
-        <w:rPr>
-          <w:bCs/>
-        </w:rPr>
-        <w:t>Admit that the most recent hail event identified in the "Weather Records" section of The Prieve Report is September 6, 2020.</w:t>
-      </w:r>
-    </w:p>
-    <w:p>
-      <w:pPr>
-        <w:keepLines/>
-        <w:spacing w:after="160"/>
-        <w:ind w:left="720" w:hanging="576"/>
-      </w:pPr>
-      <w:r>
-        <w:rPr>
-          <w:b/>
-          <w:bCs/>
-        </w:rPr>
-        <w:t xml:space="preserve">REQUEST FOR ADMISSION NO. 111:  </w:t>
-      </w:r>
-      <w:r>
-        <w:rPr>
-          <w:bCs/>
-        </w:rPr>
-        <w:t>Admit that page 6 of The Prieve Report states: "No smooth or rounded dents were observed in the frame or sashes."</w:t>
-      </w:r>
-    </w:p>
-    <w:p>
-      <w:pPr>
-        <w:keepLines/>
-        <w:spacing w:after="160"/>
-        <w:ind w:left="720" w:hanging="576"/>
-      </w:pPr>
-      <w:r>
-        <w:rPr>
-          <w:b/>
-          <w:bCs/>
-        </w:rPr>
-        <w:t xml:space="preserve">REQUEST FOR ADMISSION NO. 112:  </w:t>
-      </w:r>
-      <w:r>
-        <w:rPr>
-          <w:bCs/>
-        </w:rPr>
-        <w:t>Admit that page 6 of The Prieve Report states: "No hail dents appear at sashes or frames of kitchen windows."</w:t>
+        <w:t>Admit that, as of November 4, 2024, You had not issued any litigation hold, preservation notice, or document-preservation instruction directing the preservation of documents concerning The Claim.</w:t>
       </w:r>
     </w:p>
     <w:p>
@@ -3370,208 +3285,227 @@
           <w:i/>
           <w:iCs/>
         </w:rPr>
-        <w:t>J.  The 2020 Claim</w:t>
-      </w:r>
-    </w:p>
-    <w:p>
-      <w:pPr>
-        <w:keepLines/>
-        <w:spacing w:after="160"/>
-        <w:ind w:left="720" w:hanging="576"/>
-      </w:pPr>
-      <w:r>
-        <w:rPr>
-          <w:b/>
-          <w:bCs/>
-        </w:rPr>
-        <w:t xml:space="preserve">REQUEST FOR ADMISSION NO. 113:  </w:t>
-      </w:r>
-      <w:r>
-        <w:rPr>
-          <w:bCs/>
-        </w:rPr>
-        <w:t>Admit that line item 1 of the estimate within The February 18, 2022 Settlement Package reads "R&amp;R Wood window - casement, 12-23 sf" and states a quantity of 2.00 EA.</w:t>
-      </w:r>
-    </w:p>
-    <w:p>
-      <w:pPr>
-        <w:keepLines/>
-        <w:spacing w:after="160"/>
-        <w:ind w:left="720" w:hanging="576"/>
-      </w:pPr>
-      <w:r>
-        <w:rPr>
-          <w:b/>
-          <w:bCs/>
-        </w:rPr>
-        <w:t xml:space="preserve">REQUEST FOR ADMISSION NO. 114:  </w:t>
-      </w:r>
-      <w:r>
-        <w:rPr>
-          <w:bCs/>
-        </w:rPr>
-        <w:t>Admit that the only line items of the estimate within The February 18, 2022 Settlement Package that refer to windows are line items 1 ("R&amp;R Wood window - casement, 12-23 sf"), 2 ("Window blind - horizontal or vertical - Detach &amp; reset"), 3 ("Additional charge for a retrofit window, 24-40 sf"), and 32 ("Window treatment repair").</w:t>
-      </w:r>
-    </w:p>
-    <w:p>
-      <w:pPr>
-        <w:keepLines/>
-        <w:spacing w:after="160"/>
-        <w:ind w:left="720" w:hanging="576"/>
-      </w:pPr>
-      <w:r>
-        <w:rPr>
-          <w:b/>
-          <w:bCs/>
-        </w:rPr>
-        <w:t xml:space="preserve">REQUEST FOR ADMISSION NO. 115:  </w:t>
-      </w:r>
-      <w:r>
-        <w:rPr>
-          <w:bCs/>
-        </w:rPr>
-        <w:t>Admit that the estimate within The February 18, 2022 Settlement Package states "Type of Loss: Hail."</w:t>
-      </w:r>
-    </w:p>
-    <w:p>
-      <w:pPr>
-        <w:keepLines/>
-        <w:spacing w:after="160"/>
-        <w:ind w:left="720" w:hanging="576"/>
-      </w:pPr>
-      <w:r>
-        <w:rPr>
-          <w:b/>
-          <w:bCs/>
-        </w:rPr>
-        <w:t xml:space="preserve">REQUEST FOR ADMISSION NO. 116:  </w:t>
-      </w:r>
-      <w:r>
-        <w:rPr>
-          <w:bCs/>
-        </w:rPr>
-        <w:t>Admit that the estimate within The February 18, 2022 Settlement Package does not identify the location at The Property of the item or items addressed by line item 1.</w:t>
-      </w:r>
-    </w:p>
-    <w:p>
-      <w:pPr>
-        <w:keepLines/>
-        <w:spacing w:after="160"/>
-        <w:ind w:left="720" w:hanging="576"/>
-      </w:pPr>
-      <w:r>
-        <w:rPr>
-          <w:b/>
-          <w:bCs/>
-        </w:rPr>
-        <w:lastRenderedPageBreak/>
-        <w:t xml:space="preserve">REQUEST FOR ADMISSION NO. 117:  </w:t>
-      </w:r>
-      <w:r>
-        <w:rPr>
-          <w:bCs/>
-        </w:rPr>
-        <w:t>Admit that Your claim records for The Property identify no hail loss with a date of loss after September 5, 2020, other than The Claim.</w:t>
-      </w:r>
-    </w:p>
-    <w:p>
-      <w:pPr>
-        <w:keepLines/>
-        <w:spacing w:after="160"/>
-        <w:ind w:left="720" w:hanging="576"/>
-      </w:pPr>
-      <w:r>
-        <w:rPr>
-          <w:b/>
-          <w:bCs/>
-        </w:rPr>
-        <w:t xml:space="preserve">REQUEST FOR ADMISSION NO. 118:  </w:t>
-      </w:r>
-      <w:r>
-        <w:rPr>
-          <w:bCs/>
-        </w:rPr>
-        <w:t>Admit that on October 7, 2021, You received a request from Plaintiff Yibiao Lu for an extension of time to complete repairs or replacement and to recover replacement cost benefits on The 2020 Claim.</w:t>
-      </w:r>
-    </w:p>
-    <w:p>
-      <w:pPr>
-        <w:keepLines/>
-        <w:spacing w:after="160"/>
-        <w:ind w:left="720" w:hanging="576"/>
-      </w:pPr>
-      <w:r>
-        <w:rPr>
-          <w:b/>
-          <w:bCs/>
-        </w:rPr>
-        <w:t xml:space="preserve">REQUEST FOR ADMISSION NO. 119:  </w:t>
-      </w:r>
-      <w:r>
-        <w:rPr>
-          <w:bCs/>
-        </w:rPr>
-        <w:t>Admit that Your October 12, 2021 letter to Plaintiff Yibiao Lu concerning The 2020 Claim stated: "We're happy to extend your replacement cost deadline to February 15, 2022."</w:t>
-      </w:r>
-    </w:p>
-    <w:p>
-      <w:pPr>
-        <w:keepLines/>
-        <w:spacing w:after="160"/>
-        <w:ind w:left="720" w:hanging="576"/>
-      </w:pPr>
-      <w:r>
-        <w:rPr>
-          <w:b/>
-          <w:bCs/>
-        </w:rPr>
-        <w:t xml:space="preserve">REQUEST FOR ADMISSION NO. 120:  </w:t>
-      </w:r>
-      <w:r>
-        <w:rPr>
-          <w:bCs/>
-        </w:rPr>
-        <w:t>Admit that You did not extend the replacement cost deadline for The 2020 Claim beyond February 15, 2022.</w:t>
-      </w:r>
-    </w:p>
-    <w:p>
-      <w:pPr>
-        <w:keepLines/>
-        <w:spacing w:after="160"/>
-        <w:ind w:left="720" w:hanging="576"/>
-      </w:pPr>
-      <w:r>
-        <w:rPr>
-          <w:b/>
-          <w:bCs/>
-        </w:rPr>
-        <w:t xml:space="preserve">REQUEST FOR ADMISSION NO. 121:  </w:t>
-      </w:r>
-      <w:r>
-        <w:rPr>
-          <w:bCs/>
-        </w:rPr>
-        <w:t>Admit that Your February 17, 2022 electronic mail message to Plaintiff Yibiao Lu concerning The 2020 Claim stated: "I am unable to ask for additional time without detailed information as to why the work was not able to be completed in the timeline provided by the contractor."</w:t>
-      </w:r>
-    </w:p>
-    <w:p>
-      <w:pPr>
-        <w:keepLines/>
-        <w:spacing w:after="160"/>
-        <w:ind w:left="720" w:hanging="576"/>
-      </w:pPr>
-      <w:r>
-        <w:rPr>
-          <w:b/>
-          <w:bCs/>
-        </w:rPr>
-        <w:t xml:space="preserve">REQUEST FOR ADMISSION NO. 122:  </w:t>
-      </w:r>
-      <w:r>
-        <w:rPr>
-          <w:bCs/>
-        </w:rPr>
-        <w:t>Admit that before February 17, 2022, You received from Plaintiff Yibiao Lu a request for an extension of the replacement cost deadline on The 2020 Claim beyond February 15, 2022.</w:t>
+        <w:t>M.  The September 3, 2024 Denial Package and its photograph logs</w:t>
+      </w:r>
+    </w:p>
+    <w:p>
+      <w:pPr>
+        <w:keepLines/>
+        <w:spacing w:after="160"/>
+        <w:ind w:left="720" w:hanging="576"/>
+      </w:pPr>
+      <w:r>
+        <w:rPr>
+          <w:b/>
+          <w:bCs/>
+        </w:rPr>
+        <w:t xml:space="preserve">REQUEST FOR ADMISSION NO. 98:  </w:t>
+      </w:r>
+      <w:r>
+        <w:rPr>
+          <w:bCs/>
+        </w:rPr>
+        <w:t>Admit that You sent The September 3, 2024 Denial Package to Plaintiffs on or about September 3, 2024.</w:t>
+      </w:r>
+    </w:p>
+    <w:p>
+      <w:pPr>
+        <w:keepLines/>
+        <w:spacing w:after="160"/>
+        <w:ind w:left="720" w:hanging="576"/>
+      </w:pPr>
+      <w:r>
+        <w:rPr>
+          <w:b/>
+          <w:bCs/>
+        </w:rPr>
+        <w:t xml:space="preserve">REQUEST FOR ADMISSION NO. 99:  </w:t>
+      </w:r>
+      <w:r>
+        <w:rPr>
+          <w:bCs/>
+        </w:rPr>
+        <w:t>Admit that each of the 38 photographs in The First Photo Set bears a No-Damage Caption.</w:t>
+      </w:r>
+    </w:p>
+    <w:p>
+      <w:pPr>
+        <w:keepLines/>
+        <w:spacing w:after="160"/>
+        <w:ind w:left="720" w:hanging="576"/>
+      </w:pPr>
+      <w:r>
+        <w:rPr>
+          <w:b/>
+          <w:bCs/>
+        </w:rPr>
+        <w:t xml:space="preserve">REQUEST FOR ADMISSION NO. 100:  </w:t>
+      </w:r>
+      <w:r>
+        <w:rPr>
+          <w:bCs/>
+        </w:rPr>
+        <w:t>Admit that 94 of the 100 photographs in The Second Photo Set bear a No-Damage Caption.</w:t>
+      </w:r>
+    </w:p>
+    <w:p>
+      <w:pPr>
+        <w:keepLines/>
+        <w:spacing w:after="160"/>
+        <w:ind w:left="720" w:hanging="576"/>
+      </w:pPr>
+      <w:r>
+        <w:rPr>
+          <w:b/>
+          <w:bCs/>
+        </w:rPr>
+        <w:t xml:space="preserve">REQUEST FOR ADMISSION NO. 101:  </w:t>
+      </w:r>
+      <w:r>
+        <w:rPr>
+          <w:bCs/>
+        </w:rPr>
+        <w:t>Admit that The Second Photo Set contains 34 photographs whose captions begin with the word "Siding."</w:t>
+      </w:r>
+    </w:p>
+    <w:p>
+      <w:pPr>
+        <w:keepLines/>
+        <w:spacing w:after="160"/>
+        <w:ind w:left="720" w:hanging="576"/>
+      </w:pPr>
+      <w:r>
+        <w:rPr>
+          <w:b/>
+          <w:bCs/>
+        </w:rPr>
+        <w:t xml:space="preserve">REQUEST FOR ADMISSION NO. 102:  </w:t>
+      </w:r>
+      <w:r>
+        <w:rPr>
+          <w:bCs/>
+        </w:rPr>
+        <w:t>Admit that each photograph in The Second Photo Set whose caption begins with the word "Siding" bears a No-Damage Caption.</w:t>
+      </w:r>
+    </w:p>
+    <w:p>
+      <w:pPr>
+        <w:keepLines/>
+        <w:spacing w:after="160"/>
+        <w:ind w:left="720" w:hanging="576"/>
+      </w:pPr>
+      <w:r>
+        <w:rPr>
+          <w:b/>
+          <w:bCs/>
+        </w:rPr>
+        <w:t xml:space="preserve">REQUEST FOR ADMISSION NO. 103:  </w:t>
+      </w:r>
+      <w:r>
+        <w:rPr>
+          <w:bCs/>
+        </w:rPr>
+        <w:t>Admit that photographs numbered 98, 99, and 100 of The Second Photo Set are photographs of downspouts at The Property.</w:t>
+      </w:r>
+    </w:p>
+    <w:p>
+      <w:pPr>
+        <w:keepLines/>
+        <w:spacing w:after="160"/>
+        <w:ind w:left="720" w:hanging="576"/>
+      </w:pPr>
+      <w:r>
+        <w:rPr>
+          <w:b/>
+          <w:bCs/>
+        </w:rPr>
+        <w:t xml:space="preserve">REQUEST FOR ADMISSION NO. 104:  </w:t>
+      </w:r>
+      <w:r>
+        <w:rPr>
+          <w:bCs/>
+        </w:rPr>
+        <w:t>Admit that each of photographs numbered 98, 99, and 100 of The Second Photo Set bears a No-Damage Caption.</w:t>
+      </w:r>
+    </w:p>
+    <w:p>
+      <w:pPr>
+        <w:keepLines/>
+        <w:spacing w:after="160"/>
+        <w:ind w:left="720" w:hanging="576"/>
+      </w:pPr>
+      <w:r>
+        <w:rPr>
+          <w:b/>
+          <w:bCs/>
+        </w:rPr>
+        <w:t xml:space="preserve">REQUEST FOR ADMISSION NO. 105:  </w:t>
+      </w:r>
+      <w:r>
+        <w:rPr>
+          <w:bCs/>
+        </w:rPr>
+        <w:t>Admit that The First Photo Set and The Second Photo Set were prepared by Hancock Claims Consultants in connection with its August 29, 2024 inspection of The Property.</w:t>
+      </w:r>
+    </w:p>
+    <w:p>
+      <w:pPr>
+        <w:keepLines/>
+        <w:spacing w:after="160"/>
+        <w:ind w:left="720" w:hanging="576"/>
+      </w:pPr>
+      <w:r>
+        <w:rPr>
+          <w:b/>
+          <w:bCs/>
+        </w:rPr>
+        <w:t xml:space="preserve">REQUEST FOR ADMISSION NO. 106:  </w:t>
+      </w:r>
+      <w:r>
+        <w:rPr>
+          <w:bCs/>
+        </w:rPr>
+        <w:t>Admit that, in a No-Damage Caption, the underscore and numeral following the word "No" distinguish multiple photographs bearing the same underlying caption and do not denote a different condition, assessment, or finding.</w:t>
+      </w:r>
+    </w:p>
+    <w:p>
+      <w:pPr>
+        <w:keepLines/>
+        <w:spacing w:after="160"/>
+        <w:ind w:left="720" w:hanging="576"/>
+      </w:pPr>
+      <w:r>
+        <w:rPr>
+          <w:b/>
+          <w:bCs/>
+        </w:rPr>
+        <w:t xml:space="preserve">REQUEST FOR ADMISSION NO. 107:  </w:t>
+      </w:r>
+      <w:r>
+        <w:rPr>
+          <w:bCs/>
+        </w:rPr>
+        <w:t>Admit that Your October 10, 2025 letter to Plaintiffs was signed by Zorphlon Miller, Senior General Claims Adjuster.</w:t>
+      </w:r>
+    </w:p>
+    <w:p>
+      <w:pPr>
+        <w:keepLines/>
+        <w:spacing w:after="160"/>
+        <w:ind w:left="720" w:hanging="576"/>
+      </w:pPr>
+      <w:r>
+        <w:rPr>
+          <w:b/>
+          <w:bCs/>
+        </w:rPr>
+        <w:t xml:space="preserve">REQUEST FOR ADMISSION NO. 108:  </w:t>
+      </w:r>
+      <w:r>
+        <w:rPr>
+          <w:bCs/>
+        </w:rPr>
+        <w:t>Admit that Your October 10, 2025 letter to Plaintiffs stated, "I have attached the coverage position and photos sent by Mr. Dudley."</w:t>
       </w:r>
     </w:p>
     <w:p>
@@ -3587,127 +3521,48 @@
           <w:i/>
           <w:iCs/>
         </w:rPr>
-        <w:t>K.  The engineer-report requirement and Plaintiffs' submissions</w:t>
-      </w:r>
-    </w:p>
-    <w:p>
-      <w:pPr>
-        <w:keepLines/>
-        <w:spacing w:after="160"/>
-        <w:ind w:left="720" w:hanging="576"/>
-      </w:pPr>
-      <w:r>
-        <w:rPr>
-          <w:b/>
-          <w:bCs/>
-        </w:rPr>
-        <w:t xml:space="preserve">REQUEST FOR ADMISSION NO. 123:  </w:t>
-      </w:r>
-      <w:r>
-        <w:rPr>
-          <w:bCs/>
-        </w:rPr>
-        <w:t>Admit that on February 3, 2025, Your field claim supervisor Bradlee Monson told Plaintiff Yibiao Lu that You would not review evidence unless it was provided by an engineer.</w:t>
-      </w:r>
-    </w:p>
-    <w:p>
-      <w:pPr>
-        <w:keepLines/>
-        <w:spacing w:after="160"/>
-        <w:ind w:left="720" w:hanging="576"/>
-      </w:pPr>
-      <w:r>
-        <w:rPr>
-          <w:b/>
-          <w:bCs/>
-        </w:rPr>
-        <w:t xml:space="preserve">REQUEST FOR ADMISSION NO. 124:  </w:t>
-      </w:r>
-      <w:r>
-        <w:rPr>
-          <w:bCs/>
-        </w:rPr>
-        <w:t>Admit that You have no written policy, procedure, or guideline describing the peer review referred to in Your answer to paragraph 24 of the Complaint.</w:t>
-      </w:r>
-    </w:p>
-    <w:p>
-      <w:pPr>
-        <w:keepLines/>
-        <w:spacing w:after="160"/>
-        <w:ind w:left="720" w:hanging="576"/>
-      </w:pPr>
-      <w:r>
-        <w:rPr>
-          <w:b/>
-          <w:bCs/>
-        </w:rPr>
-        <w:t xml:space="preserve">REQUEST FOR ADMISSION NO. 125:  </w:t>
-      </w:r>
-      <w:r>
-        <w:rPr>
-          <w:bCs/>
-        </w:rPr>
-        <w:t>Admit that You received Plaintiffs' January 31, 2025 submission concerning post-2020 storm activity and gutter replacement.</w:t>
-      </w:r>
-    </w:p>
-    <w:p>
-      <w:pPr>
-        <w:keepLines/>
-        <w:spacing w:after="160"/>
-        <w:ind w:left="720" w:hanging="576"/>
-      </w:pPr>
-      <w:r>
-        <w:rPr>
-          <w:b/>
-          <w:bCs/>
-        </w:rPr>
-        <w:t xml:space="preserve">REQUEST FOR ADMISSION NO. 126:  </w:t>
-      </w:r>
-      <w:r>
-        <w:rPr>
-          <w:bCs/>
-        </w:rPr>
-        <w:t>Admit that You received Plaintiffs' February 10, 2025 submission containing City of Eden Prairie permit records and a neighbor canvass.</w:t>
-      </w:r>
-    </w:p>
-    <w:p>
-      <w:pPr>
-        <w:keepLines/>
-        <w:spacing w:after="160"/>
-        <w:ind w:left="720" w:hanging="576"/>
-      </w:pPr>
-      <w:r>
-        <w:rPr>
-          <w:b/>
-          <w:bCs/>
-        </w:rPr>
-        <w:t xml:space="preserve">REQUEST FOR ADMISSION NO. 127:  </w:t>
-      </w:r>
-      <w:r>
-        <w:rPr>
-          <w:bCs/>
-        </w:rPr>
-        <w:t>Admit that You received, directly or through Peter Pietila, Plaintiffs' May 28, 2025 submission containing National Weather Service and Interactive Hail Maps material.</w:t>
-      </w:r>
-    </w:p>
-    <w:p>
-      <w:pPr>
-        <w:keepLines/>
-        <w:spacing w:after="160"/>
-        <w:ind w:left="720" w:hanging="576"/>
-      </w:pPr>
-      <w:r>
-        <w:rPr>
-          <w:b/>
-          <w:bCs/>
-        </w:rPr>
-        <w:t xml:space="preserve">REQUEST FOR ADMISSION NO. 128:  </w:t>
-      </w:r>
-      <w:r>
-        <w:rPr>
-          <w:bCs/>
-        </w:rPr>
-        <w:t>Admit that You did not reopen The Claim after receiving the submissions identified in the three preceding requests.</w:t>
+        <w:lastRenderedPageBreak/>
+        <w:t>N.  The October 29, 2025 email</w:t>
+      </w:r>
+    </w:p>
+    <w:p>
+      <w:pPr>
+        <w:keepLines/>
+        <w:spacing w:after="160"/>
+        <w:ind w:left="720" w:hanging="576"/>
+      </w:pPr>
+      <w:r>
+        <w:rPr>
+          <w:b/>
+          <w:bCs/>
+        </w:rPr>
+        <w:t xml:space="preserve">REQUEST FOR ADMISSION NO. 109:  </w:t>
+      </w:r>
+      <w:r>
+        <w:rPr>
+          <w:bCs/>
+        </w:rPr>
+        <w:t>Admit that on October 29, 2025, Nicholas Brau sent Plaintiffs an electronic mail message stating, "All the information we can release has already been sent to you."</w:t>
+      </w:r>
+    </w:p>
+    <w:p>
+      <w:pPr>
+        <w:keepLines/>
+        <w:spacing w:after="160"/>
+        <w:ind w:left="720" w:hanging="576"/>
+      </w:pPr>
+      <w:r>
+        <w:rPr>
+          <w:b/>
+          <w:bCs/>
+        </w:rPr>
+        <w:t xml:space="preserve">REQUEST FOR ADMISSION NO. 110:  </w:t>
+      </w:r>
+      <w:r>
+        <w:rPr>
+          <w:bCs/>
+        </w:rPr>
+        <w:t>Admit that the message identified in Request No. 109 was signed by Nicholas Brau, Claims Spec Rep Prop, Fire Insurance Exchange.</w:t>
       </w:r>
     </w:p>
     <w:p>
@@ -3723,103 +3578,47 @@
           <w:i/>
           <w:iCs/>
         </w:rPr>
-        <w:t>L.  Missing records and non-payment</w:t>
-      </w:r>
-    </w:p>
-    <w:p>
-      <w:pPr>
-        <w:keepLines/>
-        <w:spacing w:after="160"/>
-        <w:ind w:left="720" w:hanging="576"/>
-      </w:pPr>
-      <w:r>
-        <w:rPr>
-          <w:b/>
-          <w:bCs/>
-        </w:rPr>
-        <w:t xml:space="preserve">REQUEST FOR ADMISSION NO. 129:  </w:t>
-      </w:r>
-      <w:r>
-        <w:rPr>
-          <w:bCs/>
-        </w:rPr>
-        <w:t>Admit that Your October 10, 2025 letter to Plaintiffs stated, "The file does not contain a report on the requested date."</w:t>
-      </w:r>
-    </w:p>
-    <w:p>
-      <w:pPr>
-        <w:keepLines/>
-        <w:spacing w:after="160"/>
-        <w:ind w:left="720" w:hanging="576"/>
-        <w:rPr>
-          <w:b/>
-          <w:bCs/>
-        </w:rPr>
-      </w:pPr>
-    </w:p>
-    <w:p>
-      <w:pPr>
-        <w:keepLines/>
-        <w:spacing w:after="80"/>
-        <w:ind w:left="720" w:hanging="576"/>
-      </w:pPr>
-      <w:r>
-        <w:rPr>
-          <w:b/>
-          <w:bCs/>
-        </w:rPr>
-        <w:lastRenderedPageBreak/>
-        <w:t xml:space="preserve">REQUEST FOR ADMISSION NO. 130:  </w:t>
-      </w:r>
-      <w:r>
-        <w:rPr>
-          <w:bCs/>
-        </w:rPr>
-        <w:t>Admit that the "requested date" referred to in the statement quoted in the preceding request was September 6, 2024.</w:t>
-      </w:r>
-    </w:p>
-    <w:p>
-      <w:pPr>
-        <w:keepNext/>
-        <w:spacing w:after="160" w:line="276" w:lineRule="auto"/>
-      </w:pPr>
-      <w:r>
-        <w:rPr>
-          <w:i/>
-        </w:rPr>
-        <w:t>See also Requests for Admission Nos. 184 and 185.</w:t>
-      </w:r>
-    </w:p>
-    <w:p>
-      <w:pPr>
-        <w:keepLines/>
-        <w:spacing w:after="160"/>
-        <w:ind w:left="720" w:hanging="576"/>
-      </w:pPr>
-      <w:r>
-        <w:rPr>
-          <w:b/>
-          <w:bCs/>
-        </w:rPr>
-        <w:t xml:space="preserve">REQUEST FOR ADMISSION NO. 131:  </w:t>
-      </w:r>
-      <w:r>
-        <w:rPr>
-          <w:bCs/>
-        </w:rPr>
-        <w:t>Admit that You have paid Plaintiffs nothing on The Claim.</w:t>
-      </w:r>
-    </w:p>
-    <w:p>
-      <w:pPr>
-        <w:keepNext/>
-        <w:spacing w:after="160" w:line="276" w:lineRule="auto"/>
-      </w:pPr>
-      <w:r>
-        <w:rPr>
-          <w:i/>
-        </w:rPr>
-        <w:t>See also Request for Admission No. 22.</w:t>
+        <w:t>O.  The October 21, 2025 reply and the handling of post-appraisal correspondence</w:t>
+      </w:r>
+    </w:p>
+    <w:p>
+      <w:pPr>
+        <w:keepLines/>
+        <w:spacing w:after="160"/>
+        <w:ind w:left="720" w:hanging="576"/>
+      </w:pPr>
+      <w:r>
+        <w:rPr>
+          <w:b/>
+          <w:bCs/>
+        </w:rPr>
+        <w:t xml:space="preserve">REQUEST FOR ADMISSION NO. 111:  </w:t>
+      </w:r>
+      <w:r>
+        <w:rPr>
+          <w:bCs/>
+        </w:rPr>
+        <w:t>Admit that Your October 21, 2025 electronic mail message to Plaintiffs was signed by Jillian Bell, Senior General Claims Adjuster, Fire Insurance Exchange.</w:t>
+      </w:r>
+    </w:p>
+    <w:p>
+      <w:pPr>
+        <w:keepLines/>
+        <w:spacing w:after="160"/>
+        <w:ind w:left="720" w:hanging="576"/>
+      </w:pPr>
+      <w:r>
+        <w:rPr>
+          <w:b/>
+          <w:bCs/>
+        </w:rPr>
+        <w:t xml:space="preserve">REQUEST FOR ADMISSION NO. 112:  </w:t>
+      </w:r>
+      <w:r>
+        <w:rPr>
+          <w:bCs/>
+        </w:rPr>
+        <w:t>Admit that Jillian Bell was employed or engaged by Fire Insurance Exchange on October 21, 2025.</w:t>
       </w:r>
     </w:p>
     <w:p>
@@ -3835,7 +3634,184 @@
           <w:i/>
           <w:iCs/>
         </w:rPr>
-        <w:t>M.  Claim handlers and the September 6, 2024 inspection records</w:t>
+        <w:t>P.  Party identity, agency, and the Hancock inspector</w:t>
+      </w:r>
+    </w:p>
+    <w:p>
+      <w:pPr>
+        <w:keepLines/>
+        <w:spacing w:after="160"/>
+        <w:ind w:left="720" w:hanging="576"/>
+      </w:pPr>
+      <w:r>
+        <w:rPr>
+          <w:b/>
+          <w:bCs/>
+        </w:rPr>
+        <w:t xml:space="preserve">REQUEST FOR ADMISSION NO. 113:  </w:t>
+      </w:r>
+      <w:r>
+        <w:rPr>
+          <w:bCs/>
+        </w:rPr>
+        <w:t>Admit that You do not contend that any person should be the defendant in this action in place of Fire Insurance Exchange.</w:t>
+      </w:r>
+    </w:p>
+    <w:p>
+      <w:pPr>
+        <w:keepLines/>
+        <w:spacing w:after="160"/>
+        <w:ind w:left="720" w:hanging="576"/>
+      </w:pPr>
+      <w:r>
+        <w:rPr>
+          <w:b/>
+          <w:bCs/>
+        </w:rPr>
+        <w:t xml:space="preserve">REQUEST FOR ADMISSION NO. 114:  </w:t>
+      </w:r>
+      <w:r>
+        <w:rPr>
+          <w:bCs/>
+        </w:rPr>
+        <w:t>Admit that You do not contend that any person must be added as a defendant in this action.</w:t>
+      </w:r>
+    </w:p>
+    <w:p>
+      <w:pPr>
+        <w:keepLines/>
+        <w:spacing w:after="160"/>
+        <w:ind w:left="720" w:hanging="576"/>
+      </w:pPr>
+      <w:r>
+        <w:rPr>
+          <w:b/>
+          <w:bCs/>
+        </w:rPr>
+        <w:t xml:space="preserve">REQUEST FOR ADMISSION NO. 115:  </w:t>
+      </w:r>
+      <w:r>
+        <w:rPr>
+          <w:bCs/>
+        </w:rPr>
+        <w:t>Admit that You do not contend that Fire Insurance Exchange is misnamed or misdescribed in the caption of this action.</w:t>
+      </w:r>
+    </w:p>
+    <w:p>
+      <w:pPr>
+        <w:keepLines/>
+        <w:spacing w:after="160"/>
+        <w:ind w:left="720" w:hanging="576"/>
+      </w:pPr>
+      <w:r>
+        <w:rPr>
+          <w:b/>
+          <w:bCs/>
+        </w:rPr>
+        <w:t xml:space="preserve">REQUEST FOR ADMISSION NO. 116:  </w:t>
+      </w:r>
+      <w:r>
+        <w:rPr>
+          <w:bCs/>
+        </w:rPr>
+        <w:t>Admit that, in its dealings with Plaintiffs concerning The Policy and The Claim, Fire Insurance Exchange did business under the name "Farmers Insurance."</w:t>
+      </w:r>
+    </w:p>
+    <w:p>
+      <w:pPr>
+        <w:keepLines/>
+        <w:spacing w:after="160"/>
+        <w:ind w:left="720" w:hanging="576"/>
+      </w:pPr>
+      <w:r>
+        <w:rPr>
+          <w:b/>
+          <w:bCs/>
+        </w:rPr>
+        <w:t xml:space="preserve">REQUEST FOR ADMISSION NO. 117:  </w:t>
+      </w:r>
+      <w:r>
+        <w:rPr>
+          <w:bCs/>
+        </w:rPr>
+        <w:t>Admit that Zorphlon Miller was employed or engaged by Fire Insurance Exchange on October 10, 2025.</w:t>
+      </w:r>
+    </w:p>
+    <w:p>
+      <w:pPr>
+        <w:keepLines/>
+        <w:spacing w:after="160"/>
+        <w:ind w:left="720" w:hanging="576"/>
+      </w:pPr>
+      <w:r>
+        <w:rPr>
+          <w:b/>
+          <w:bCs/>
+        </w:rPr>
+        <w:t xml:space="preserve">REQUEST FOR ADMISSION NO. 118:  </w:t>
+      </w:r>
+      <w:r>
+        <w:rPr>
+          <w:bCs/>
+        </w:rPr>
+        <w:t>Admit that Peter Pietila acted as Your agent in connection with The Policy.</w:t>
+      </w:r>
+    </w:p>
+    <w:p>
+      <w:pPr>
+        <w:keepLines/>
+        <w:spacing w:after="160"/>
+        <w:ind w:left="720" w:hanging="576"/>
+      </w:pPr>
+      <w:r>
+        <w:rPr>
+          <w:b/>
+          <w:bCs/>
+        </w:rPr>
+        <w:t xml:space="preserve">REQUEST FOR ADMISSION NO. 119:  </w:t>
+      </w:r>
+      <w:r>
+        <w:rPr>
+          <w:bCs/>
+        </w:rPr>
+        <w:t>Admit that Jayden Grimm performed the August 29, 2024 inspection of The Property on behalf of Hancock Claims Consultants.</w:t>
+      </w:r>
+    </w:p>
+    <w:p>
+      <w:pPr>
+        <w:keepLines/>
+        <w:spacing w:after="160"/>
+        <w:ind w:left="720" w:hanging="576"/>
+      </w:pPr>
+      <w:r>
+        <w:rPr>
+          <w:b/>
+          <w:bCs/>
+        </w:rPr>
+        <w:t xml:space="preserve">REQUEST FOR ADMISSION NO. 120:  </w:t>
+      </w:r>
+      <w:r>
+        <w:rPr>
+          <w:bCs/>
+        </w:rPr>
+        <w:t>Admit that Jayden Grimm was the only individual who inspected The Property on behalf of Hancock Claims Consultants on August 29, 2024.</w:t>
+      </w:r>
+    </w:p>
+    <w:p>
+      <w:pPr>
+        <w:keepNext/>
+        <w:keepLines/>
+        <w:spacing w:before="200" w:after="120"/>
+      </w:pPr>
+      <w:r>
+        <w:rPr>
+          <w:b/>
+          <w:bCs/>
+          <w:i/>
+          <w:iCs/>
+        </w:rPr>
+        <w:lastRenderedPageBreak/>
+        <w:t>Q.  The Policy's own provisions bearing on capacity, suit, and forum</w:t>
       </w:r>
     </w:p>
     <w:p>
@@ -3849,207 +3825,107 @@
         <w:rPr>
           <w:iCs/>
         </w:rPr>
-        <w:t>Requests 132 through 141 concern the persons who handled The Claim and the records of the September 6, 2024 inspection, and are to be read with Requests Nos. 4 through 8, 29, 129, and 130.</w:t>
-      </w:r>
-    </w:p>
-    <w:p>
-      <w:pPr>
-        <w:keepLines/>
-        <w:spacing w:after="160"/>
-        <w:ind w:left="720" w:hanging="576"/>
-      </w:pPr>
-      <w:r>
-        <w:rPr>
-          <w:b/>
-          <w:bCs/>
-        </w:rPr>
-        <w:t xml:space="preserve">REQUEST FOR ADMISSION NO. 132:  </w:t>
-      </w:r>
-      <w:r>
-        <w:rPr>
-          <w:bCs/>
-        </w:rPr>
-        <w:t>Admit that Christian Dudley acted on behalf of Fire Insurance Exchange in handling The Claim.</w:t>
-      </w:r>
-    </w:p>
-    <w:p>
-      <w:pPr>
-        <w:keepLines/>
-        <w:spacing w:after="160"/>
-        <w:ind w:left="720" w:hanging="576"/>
-      </w:pPr>
-      <w:r>
-        <w:rPr>
-          <w:b/>
-          <w:bCs/>
-        </w:rPr>
-        <w:t xml:space="preserve">REQUEST FOR ADMISSION NO. 133:  </w:t>
-      </w:r>
-      <w:r>
-        <w:rPr>
-          <w:bCs/>
-        </w:rPr>
-        <w:t>Admit that Nicholas Brau acted on behalf of Fire Insurance Exchange in handling The Claim.</w:t>
-      </w:r>
-    </w:p>
-    <w:p>
-      <w:pPr>
-        <w:keepLines/>
-        <w:spacing w:after="160"/>
-        <w:ind w:left="720" w:hanging="576"/>
-      </w:pPr>
-      <w:r>
-        <w:rPr>
-          <w:b/>
-          <w:bCs/>
-        </w:rPr>
-        <w:t xml:space="preserve">REQUEST FOR ADMISSION NO. 134:  </w:t>
-      </w:r>
-      <w:r>
-        <w:rPr>
-          <w:bCs/>
-        </w:rPr>
-        <w:t>Admit that Bradlee Monson acted on behalf of Fire Insurance Exchange in handling The Claim.</w:t>
-      </w:r>
-    </w:p>
-    <w:p>
-      <w:pPr>
-        <w:keepLines/>
-        <w:spacing w:after="160"/>
-        <w:ind w:left="720" w:hanging="576"/>
-      </w:pPr>
-      <w:r>
-        <w:rPr>
-          <w:b/>
-          <w:bCs/>
-        </w:rPr>
-        <w:t xml:space="preserve">REQUEST FOR ADMISSION NO. 135:  </w:t>
-      </w:r>
-      <w:r>
-        <w:rPr>
-          <w:bCs/>
-        </w:rPr>
-        <w:t>Admit that Zorphlon Miller acted on behalf of Fire Insurance Exchange in handling The Claim.</w:t>
-      </w:r>
-    </w:p>
-    <w:p>
-      <w:pPr>
-        <w:keepLines/>
-        <w:spacing w:after="160"/>
-        <w:ind w:left="720" w:hanging="576"/>
-      </w:pPr>
-      <w:r>
-        <w:rPr>
-          <w:b/>
-          <w:bCs/>
-        </w:rPr>
-        <w:t xml:space="preserve">REQUEST FOR ADMISSION NO. 136:  </w:t>
-      </w:r>
-      <w:r>
-        <w:rPr>
-          <w:bCs/>
-        </w:rPr>
-        <w:t>Admit that Jillian Bell acted on behalf of Fire Insurance Exchange in handling The Claim.</w:t>
-      </w:r>
-    </w:p>
-    <w:p>
-      <w:pPr>
-        <w:keepLines/>
-        <w:spacing w:after="160"/>
-        <w:ind w:left="720" w:hanging="576"/>
-      </w:pPr>
-      <w:r>
-        <w:rPr>
-          <w:b/>
-          <w:bCs/>
-        </w:rPr>
-        <w:t xml:space="preserve">REQUEST FOR ADMISSION NO. 137:  </w:t>
-      </w:r>
-      <w:r>
-        <w:rPr>
-          <w:bCs/>
-        </w:rPr>
-        <w:t>Admit that during the September 6, 2024 inspection of The Property, Nicholas Brau made handwritten notes, measurements, or sketches concerning the windows at The Property.</w:t>
-      </w:r>
-    </w:p>
-    <w:p>
-      <w:pPr>
-        <w:keepLines/>
-        <w:spacing w:after="160"/>
-        <w:ind w:left="720" w:hanging="576"/>
-      </w:pPr>
-      <w:r>
-        <w:rPr>
-          <w:b/>
-          <w:bCs/>
-        </w:rPr>
-        <w:t xml:space="preserve">REQUEST FOR ADMISSION NO. 138:  </w:t>
-      </w:r>
-      <w:r>
-        <w:rPr>
-          <w:bCs/>
-        </w:rPr>
-        <w:t>Admit that on October 29, 2025, notes, measurements, or sketches made by Nicholas Brau in connection with the September 6, 2024 inspection of The Property were in Your possession, custody, or control.</w:t>
-      </w:r>
-    </w:p>
-    <w:p>
-      <w:pPr>
-        <w:keepLines/>
-        <w:spacing w:after="160"/>
-        <w:ind w:left="720" w:hanging="576"/>
-      </w:pPr>
-      <w:r>
-        <w:rPr>
-          <w:b/>
-          <w:bCs/>
-        </w:rPr>
-        <w:t xml:space="preserve">REQUEST FOR ADMISSION NO. 139:  </w:t>
-      </w:r>
-      <w:r>
-        <w:rPr>
-          <w:bCs/>
-        </w:rPr>
-        <w:t>Admit that no document You have produced or released to Plaintiffs records Nicholas Brau's observations from the September 6, 2024 inspection of The Property.</w:t>
-      </w:r>
-    </w:p>
-    <w:p>
-      <w:pPr>
-        <w:keepLines/>
-        <w:spacing w:after="160"/>
-        <w:ind w:left="720" w:hanging="576"/>
-      </w:pPr>
-      <w:r>
-        <w:rPr>
-          <w:b/>
-          <w:bCs/>
-        </w:rPr>
-        <w:t xml:space="preserve">REQUEST FOR ADMISSION NO. 140:  </w:t>
-      </w:r>
-      <w:r>
-        <w:rPr>
-          <w:bCs/>
-        </w:rPr>
-        <w:t>Admit that, as of September 6, 2024, You had not issued any litigation hold, preservation notice, or document-preservation instruction directing the preservation of documents concerning The Claim.</w:t>
-      </w:r>
-    </w:p>
-    <w:p>
-      <w:pPr>
-        <w:keepLines/>
-        <w:spacing w:after="160"/>
-        <w:ind w:left="720" w:hanging="576"/>
-      </w:pPr>
-      <w:r>
-        <w:rPr>
-          <w:b/>
-          <w:bCs/>
-        </w:rPr>
-        <w:t xml:space="preserve">REQUEST FOR ADMISSION NO. 141:  </w:t>
-      </w:r>
-      <w:r>
-        <w:rPr>
-          <w:bCs/>
-        </w:rPr>
-        <w:t>Admit that, as of November 4, 2024, You had not issued any litigation hold, preservation notice, or document-preservation instruction directing the preservation of documents concerning The Claim.</w:t>
+        <w:t>Relevant to Defendant's First Affirmative Defense, which alleges "there exists a lack of jurisdiction over Defendant FIE."</w:t>
+      </w:r>
+    </w:p>
+    <w:p>
+      <w:pPr>
+        <w:keepLines/>
+        <w:spacing w:after="160"/>
+        <w:ind w:left="720" w:hanging="576"/>
+      </w:pPr>
+      <w:r>
+        <w:rPr>
+          <w:b/>
+          <w:bCs/>
+        </w:rPr>
+        <w:t xml:space="preserve">REQUEST FOR ADMISSION NO. 121:  </w:t>
+      </w:r>
+      <w:r>
+        <w:rPr>
+          <w:bCs/>
+        </w:rPr>
+        <w:t>Admit that The Policy Form, at "General Conditions Applying to The Entire Policy," provision 15 ("Reciprocal provisions"), states: "We may sue or be sued in our own name, as though we were an individual, if necessary to enforce any claims which arise under this policy."</w:t>
+      </w:r>
+    </w:p>
+    <w:p>
+      <w:pPr>
+        <w:keepLines/>
+        <w:spacing w:after="160"/>
+        <w:ind w:left="720" w:hanging="576"/>
+      </w:pPr>
+      <w:r>
+        <w:rPr>
+          <w:b/>
+          <w:bCs/>
+        </w:rPr>
+        <w:t xml:space="preserve">REQUEST FOR ADMISSION NO. 122:  </w:t>
+      </w:r>
+      <w:r>
+        <w:rPr>
+          <w:bCs/>
+        </w:rPr>
+        <w:t>Admit that The Policy Form, at "General Conditions Applying to The Entire Policy," provision 11 ("What law will apply"), states: "The laws of the state where the residence premises is located shall govern any and all claims or disputes in any way related to this policy."</w:t>
+      </w:r>
+    </w:p>
+    <w:p>
+      <w:pPr>
+        <w:keepLines/>
+        <w:spacing w:after="160"/>
+        <w:ind w:left="720" w:hanging="576"/>
+      </w:pPr>
+      <w:r>
+        <w:rPr>
+          <w:b/>
+          <w:bCs/>
+        </w:rPr>
+        <w:t xml:space="preserve">REQUEST FOR ADMISSION NO. 123:  </w:t>
+      </w:r>
+      <w:r>
+        <w:rPr>
+          <w:bCs/>
+        </w:rPr>
+        <w:t>Admit that the text of The Policy Form in force on July 13, 2024 is identical to the text of Form 56-5543 2nd Edition (7-08) included in the "Home Insurance New Policy" documents for The Policy that You sent to Plaintiff Yibiao Lu under a cover letter dated December 8, 2014.</w:t>
+      </w:r>
+    </w:p>
+    <w:p>
+      <w:pPr>
+        <w:keepLines/>
+        <w:spacing w:after="160"/>
+        <w:ind w:left="720" w:hanging="576"/>
+      </w:pPr>
+      <w:r>
+        <w:rPr>
+          <w:b/>
+          <w:bCs/>
+        </w:rPr>
+        <w:t xml:space="preserve">REQUEST FOR ADMISSION NO. 124:  </w:t>
+      </w:r>
+      <w:r>
+        <w:rPr>
+          <w:bCs/>
+        </w:rPr>
+        <w:t>Admit that the homeowner's policy form in force for The Policy on July 13, 2024 was Farmers Next Generation Homeowners Policy Minnesota, Form 56-5543 2nd Edition.</w:t>
+      </w:r>
+    </w:p>
+    <w:p>
+      <w:pPr>
+        <w:keepLines/>
+        <w:spacing w:after="160"/>
+        <w:ind w:left="720" w:hanging="576"/>
+      </w:pPr>
+      <w:r>
+        <w:rPr>
+          <w:b/>
+          <w:bCs/>
+        </w:rPr>
+        <w:t xml:space="preserve">REQUEST FOR ADMISSION NO. 125:  </w:t>
+      </w:r>
+      <w:r>
+        <w:rPr>
+          <w:bCs/>
+        </w:rPr>
+        <w:t>Admit that the "Subscription Agreement Notice" included in Your renewal documents for The Policy for the policy period October 22, 2023 to October 22, 2024 designates Fire Underwriters Association as attorney-in-fact.</w:t>
       </w:r>
     </w:p>
     <w:p>
@@ -4065,228 +3941,101 @@
           <w:i/>
           <w:iCs/>
         </w:rPr>
-        <w:lastRenderedPageBreak/>
-        <w:t>N.  The September 3, 2024 Denial Package and its photograph logs</w:t>
-      </w:r>
-    </w:p>
-    <w:p>
-      <w:pPr>
-        <w:keepLines/>
-        <w:spacing w:after="160"/>
-        <w:ind w:left="720" w:hanging="576"/>
-      </w:pPr>
-      <w:r>
-        <w:rPr>
-          <w:b/>
-          <w:bCs/>
-        </w:rPr>
-        <w:t xml:space="preserve">REQUEST FOR ADMISSION NO. 142:  </w:t>
-      </w:r>
-      <w:r>
-        <w:rPr>
-          <w:bCs/>
-        </w:rPr>
-        <w:t>Admit that You sent The September 3, 2024 Denial Package to Plaintiffs on or about September 3, 2024.</w:t>
-      </w:r>
-    </w:p>
-    <w:p>
-      <w:pPr>
-        <w:keepLines/>
-        <w:spacing w:after="160"/>
-        <w:ind w:left="720" w:hanging="576"/>
-      </w:pPr>
-      <w:r>
-        <w:rPr>
-          <w:b/>
-          <w:bCs/>
-        </w:rPr>
-        <w:t xml:space="preserve">REQUEST FOR ADMISSION NO. 143:  </w:t>
-      </w:r>
-      <w:r>
-        <w:rPr>
-          <w:bCs/>
-        </w:rPr>
-        <w:t>Admit that each of the 38 photographs in The First Photo Set bears a No-Damage Caption.</w:t>
-      </w:r>
-    </w:p>
-    <w:p>
-      <w:pPr>
-        <w:keepLines/>
-        <w:spacing w:after="160"/>
-        <w:ind w:left="720" w:hanging="576"/>
-      </w:pPr>
-      <w:r>
-        <w:rPr>
-          <w:b/>
-          <w:bCs/>
-        </w:rPr>
-        <w:t xml:space="preserve">REQUEST FOR ADMISSION NO. 144:  </w:t>
-      </w:r>
-      <w:r>
-        <w:rPr>
-          <w:bCs/>
-        </w:rPr>
-        <w:t>Admit that 94 of the 100 photographs in The Second Photo Set bear a No-Damage Caption.</w:t>
-      </w:r>
-    </w:p>
-    <w:p>
-      <w:pPr>
-        <w:keepLines/>
-        <w:spacing w:after="160"/>
-        <w:ind w:left="720" w:hanging="576"/>
-      </w:pPr>
-      <w:r>
-        <w:rPr>
-          <w:b/>
-          <w:bCs/>
-        </w:rPr>
-        <w:t xml:space="preserve">REQUEST FOR ADMISSION NO. 145:  </w:t>
-      </w:r>
-      <w:r>
-        <w:rPr>
-          <w:bCs/>
-        </w:rPr>
-        <w:t>Admit that The Second Photo Set contains 34 photographs whose captions begin with the word "Siding."</w:t>
-      </w:r>
-    </w:p>
-    <w:p>
-      <w:pPr>
-        <w:keepLines/>
-        <w:spacing w:after="160"/>
-        <w:ind w:left="720" w:hanging="576"/>
-      </w:pPr>
-      <w:r>
-        <w:rPr>
-          <w:b/>
-          <w:bCs/>
-        </w:rPr>
-        <w:t xml:space="preserve">REQUEST FOR ADMISSION NO. 146:  </w:t>
-      </w:r>
-      <w:r>
-        <w:rPr>
-          <w:bCs/>
-        </w:rPr>
-        <w:t>Admit that each photograph in The Second Photo Set whose caption begins with the word "Siding" bears a No-Damage Caption.</w:t>
-      </w:r>
-    </w:p>
-    <w:p>
-      <w:pPr>
-        <w:keepLines/>
-        <w:spacing w:after="160"/>
-        <w:ind w:left="720" w:hanging="576"/>
-      </w:pPr>
-      <w:r>
-        <w:rPr>
-          <w:b/>
-          <w:bCs/>
-        </w:rPr>
-        <w:t xml:space="preserve">REQUEST FOR ADMISSION NO. 147:  </w:t>
-      </w:r>
-      <w:r>
-        <w:rPr>
-          <w:bCs/>
-        </w:rPr>
-        <w:t>Admit that photographs numbered 98, 99, and 100 of The Second Photo Set are photographs of downspouts at The Property.</w:t>
-      </w:r>
-    </w:p>
-    <w:p>
-      <w:pPr>
-        <w:keepLines/>
-        <w:spacing w:after="160"/>
-        <w:ind w:left="720" w:hanging="576"/>
-      </w:pPr>
-      <w:r>
-        <w:rPr>
-          <w:b/>
-          <w:bCs/>
-        </w:rPr>
-        <w:t xml:space="preserve">REQUEST FOR ADMISSION NO. 148:  </w:t>
-      </w:r>
-      <w:r>
-        <w:rPr>
-          <w:bCs/>
-        </w:rPr>
-        <w:t>Admit that each of photographs numbered 98, 99, and 100 of The Second Photo Set bears a No-Damage Caption.</w:t>
-      </w:r>
-    </w:p>
-    <w:p>
-      <w:pPr>
-        <w:keepLines/>
-        <w:spacing w:after="160"/>
-        <w:ind w:left="720" w:hanging="576"/>
-      </w:pPr>
-      <w:r>
-        <w:rPr>
-          <w:b/>
-          <w:bCs/>
-        </w:rPr>
-        <w:t xml:space="preserve">REQUEST FOR ADMISSION NO. 149:  </w:t>
-      </w:r>
-      <w:r>
-        <w:rPr>
-          <w:bCs/>
-        </w:rPr>
-        <w:t>Admit that The First Photo Set and The Second Photo Set were prepared by Hancock Claims Consultants in connection with its August 29, 2024 inspection of The Property.</w:t>
-      </w:r>
-    </w:p>
-    <w:p>
-      <w:pPr>
-        <w:keepLines/>
-        <w:spacing w:after="160"/>
-        <w:ind w:left="720" w:hanging="576"/>
-      </w:pPr>
-      <w:r>
-        <w:rPr>
-          <w:b/>
-          <w:bCs/>
-        </w:rPr>
-        <w:t xml:space="preserve">REQUEST FOR ADMISSION NO. 150:  </w:t>
-      </w:r>
-      <w:r>
-        <w:rPr>
-          <w:bCs/>
-        </w:rPr>
-        <w:t>Admit that, in a No-Damage Caption, the underscore and numeral following the word "No" distinguish multiple photographs bearing the same underlying caption and do not denote a different condition, assessment, or finding.</w:t>
-      </w:r>
-    </w:p>
-    <w:p>
-      <w:pPr>
-        <w:keepLines/>
-        <w:spacing w:after="160"/>
-        <w:ind w:left="720" w:hanging="576"/>
-      </w:pPr>
-      <w:r>
-        <w:rPr>
-          <w:b/>
-          <w:bCs/>
-        </w:rPr>
-        <w:t xml:space="preserve">REQUEST FOR ADMISSION NO. 151:  </w:t>
-      </w:r>
-      <w:r>
-        <w:rPr>
-          <w:bCs/>
-        </w:rPr>
-        <w:t>Admit that Your October 10, 2025 letter to Plaintiffs was signed by Zorphlon Miller, Senior General Claims Adjuster.</w:t>
-      </w:r>
-    </w:p>
-    <w:p>
-      <w:pPr>
-        <w:keepLines/>
-        <w:spacing w:after="160"/>
-        <w:ind w:left="720" w:hanging="576"/>
-      </w:pPr>
-      <w:r>
-        <w:rPr>
-          <w:b/>
-          <w:bCs/>
-        </w:rPr>
-        <w:t xml:space="preserve">REQUEST FOR ADMISSION NO. 152:  </w:t>
-      </w:r>
-      <w:r>
-        <w:rPr>
-          <w:bCs/>
-        </w:rPr>
-        <w:t>Admit that Your October 10, 2025 letter to Plaintiffs stated, "I have attached the coverage position and photos sent by Mr. Dudley."</w:t>
+        <w:t>R.  Service of process and jurisdiction</w:t>
+      </w:r>
+    </w:p>
+    <w:p>
+      <w:pPr>
+        <w:keepNext/>
+        <w:keepLines/>
+        <w:spacing w:after="160" w:line="276" w:lineRule="auto"/>
+        <w:ind w:left="720"/>
+      </w:pPr>
+      <w:r>
+        <w:rPr>
+          <w:iCs/>
+        </w:rPr>
+        <w:t>Relevant to Defendant's First Affirmative Defense, which alleges "there exists a lack of jurisdiction over Defendant FIE."</w:t>
+      </w:r>
+    </w:p>
+    <w:p>
+      <w:pPr>
+        <w:keepLines/>
+        <w:spacing w:after="160"/>
+        <w:ind w:left="720" w:hanging="576"/>
+      </w:pPr>
+      <w:r>
+        <w:rPr>
+          <w:b/>
+          <w:bCs/>
+        </w:rPr>
+        <w:t xml:space="preserve">REQUEST FOR ADMISSION NO. 126:  </w:t>
+      </w:r>
+      <w:r>
+        <w:rPr>
+          <w:bCs/>
+        </w:rPr>
+        <w:t>Admit that You received the Summons and Complaint in this action on or before July 8, 2026.</w:t>
+      </w:r>
+    </w:p>
+    <w:p>
+      <w:pPr>
+        <w:keepLines/>
+        <w:spacing w:after="160"/>
+        <w:ind w:left="720" w:hanging="576"/>
+      </w:pPr>
+      <w:r>
+        <w:rPr>
+          <w:b/>
+          <w:bCs/>
+        </w:rPr>
+        <w:t xml:space="preserve">REQUEST FOR ADMISSION NO. 127:  </w:t>
+      </w:r>
+      <w:r>
+        <w:rPr>
+          <w:bCs/>
+        </w:rPr>
+        <w:t>Admit that service of the Summons and Complaint in this action upon Fire Insurance Exchange under Minn. Stat. § 45.028 was effective no later than July 8, 2026.</w:t>
+      </w:r>
+    </w:p>
+    <w:p>
+      <w:pPr>
+        <w:keepLines/>
+        <w:spacing w:after="160"/>
+        <w:ind w:left="720" w:hanging="576"/>
+      </w:pPr>
+      <w:r>
+        <w:rPr>
+          <w:b/>
+          <w:bCs/>
+        </w:rPr>
+        <w:t xml:space="preserve">REQUEST FOR ADMISSION NO. 128:  </w:t>
+      </w:r>
+      <w:r>
+        <w:rPr>
+          <w:bCs/>
+        </w:rPr>
+        <w:t>Admit that You do not contend that service of the Summons and Complaint upon Fire Insurance Exchange was insufficient.</w:t>
+      </w:r>
+    </w:p>
+    <w:p>
+      <w:pPr>
+        <w:keepLines/>
+        <w:spacing w:after="160"/>
+        <w:ind w:left="720" w:hanging="576"/>
+      </w:pPr>
+      <w:r>
+        <w:rPr>
+          <w:b/>
+          <w:bCs/>
+        </w:rPr>
+        <w:t xml:space="preserve">REQUEST FOR ADMISSION NO. 129:  </w:t>
+      </w:r>
+      <w:r>
+        <w:rPr>
+          <w:bCs/>
+        </w:rPr>
+        <w:t>Admit that You do not contend that this Court lacks personal jurisdiction over Fire Insurance Exchange.</w:t>
       </w:r>
     </w:p>
     <w:p>
@@ -4302,47 +4051,142 @@
           <w:i/>
           <w:iCs/>
         </w:rPr>
-        <w:t>O.  The October 29, 2025 email</w:t>
-      </w:r>
-    </w:p>
-    <w:p>
-      <w:pPr>
-        <w:keepLines/>
-        <w:spacing w:after="160"/>
-        <w:ind w:left="720" w:hanging="576"/>
-      </w:pPr>
-      <w:r>
-        <w:rPr>
-          <w:b/>
-          <w:bCs/>
-        </w:rPr>
-        <w:t xml:space="preserve">REQUEST FOR ADMISSION NO. 153:  </w:t>
-      </w:r>
-      <w:r>
-        <w:rPr>
-          <w:bCs/>
-        </w:rPr>
-        <w:t>Admit that on October 29, 2025, Nicholas Brau sent Plaintiffs an electronic mail message stating, "All the information we can release has already been sent to you."</w:t>
-      </w:r>
-    </w:p>
-    <w:p>
-      <w:pPr>
-        <w:keepLines/>
-        <w:spacing w:after="160"/>
-        <w:ind w:left="720" w:hanging="576"/>
-      </w:pPr>
-      <w:r>
-        <w:rPr>
-          <w:b/>
-          <w:bCs/>
-        </w:rPr>
-        <w:t xml:space="preserve">REQUEST FOR ADMISSION NO. 154:  </w:t>
-      </w:r>
-      <w:r>
-        <w:rPr>
-          <w:bCs/>
-        </w:rPr>
-        <w:t>Admit that the message identified in Request No. 153 was signed by Nicholas Brau, Claims Spec Rep Prop, Fire Insurance Exchange.</w:t>
+        <w:lastRenderedPageBreak/>
+        <w:t>S.  Plaintiff Jie Hu's status under The Policy</w:t>
+      </w:r>
+    </w:p>
+    <w:p>
+      <w:pPr>
+        <w:keepNext/>
+        <w:keepLines/>
+        <w:spacing w:after="160" w:line="276" w:lineRule="auto"/>
+        <w:ind w:left="720"/>
+      </w:pPr>
+      <w:r>
+        <w:rPr>
+          <w:iCs/>
+        </w:rPr>
+        <w:t>Relevant to Complaint ¶4, which Defendant's Answer did not admit as to Plaintiff Jie Hu, and to Defendant's First Affirmative Defense.</w:t>
+      </w:r>
+    </w:p>
+    <w:p>
+      <w:pPr>
+        <w:keepLines/>
+        <w:spacing w:after="160"/>
+        <w:ind w:left="720" w:hanging="576"/>
+      </w:pPr>
+      <w:r>
+        <w:rPr>
+          <w:b/>
+          <w:bCs/>
+        </w:rPr>
+        <w:t xml:space="preserve">REQUEST FOR ADMISSION NO. 130:  </w:t>
+      </w:r>
+      <w:r>
+        <w:rPr>
+          <w:bCs/>
+        </w:rPr>
+        <w:t>Admit that The Policy Form, under "Definitions," states: "Throughout this policy, 'you' and 'your' mean the 'named insured' shown in the Declarations or renewal notice and your spouse or registered domestic partner under applicable state law if a resident of the same household with you."</w:t>
+      </w:r>
+    </w:p>
+    <w:p>
+      <w:pPr>
+        <w:keepLines/>
+        <w:spacing w:after="160"/>
+        <w:ind w:left="720" w:hanging="576"/>
+      </w:pPr>
+      <w:r>
+        <w:rPr>
+          <w:b/>
+          <w:bCs/>
+        </w:rPr>
+        <w:t xml:space="preserve">REQUEST FOR ADMISSION NO. 131:  </w:t>
+      </w:r>
+      <w:r>
+        <w:rPr>
+          <w:bCs/>
+        </w:rPr>
+        <w:t>Admit that on July 13, 2024, Jie Hu was the spouse of Yibiao Lu.</w:t>
+      </w:r>
+    </w:p>
+    <w:p>
+      <w:pPr>
+        <w:keepLines/>
+        <w:spacing w:after="160"/>
+        <w:ind w:left="720" w:hanging="576"/>
+      </w:pPr>
+      <w:r>
+        <w:rPr>
+          <w:b/>
+          <w:bCs/>
+        </w:rPr>
+        <w:t xml:space="preserve">REQUEST FOR ADMISSION NO. 132:  </w:t>
+      </w:r>
+      <w:r>
+        <w:rPr>
+          <w:bCs/>
+        </w:rPr>
+        <w:t>Admit that on July 13, 2024, Jie Hu resided at The Property in the same household as Yibiao Lu.</w:t>
+      </w:r>
+    </w:p>
+    <w:p>
+      <w:pPr>
+        <w:keepLines/>
+        <w:spacing w:after="160"/>
+        <w:ind w:left="720" w:hanging="576"/>
+      </w:pPr>
+      <w:r>
+        <w:rPr>
+          <w:b/>
+          <w:bCs/>
+        </w:rPr>
+        <w:t xml:space="preserve">REQUEST FOR ADMISSION NO. 133:  </w:t>
+      </w:r>
+      <w:r>
+        <w:rPr>
+          <w:bCs/>
+        </w:rPr>
+        <w:t>Admit that Jie Hu is an insured under The Policy with respect to The Claim.</w:t>
+      </w:r>
+    </w:p>
+    <w:p>
+      <w:pPr>
+        <w:keepLines/>
+        <w:spacing w:after="160"/>
+        <w:ind w:left="720" w:hanging="576"/>
+      </w:pPr>
+      <w:r>
+        <w:rPr>
+          <w:b/>
+          <w:bCs/>
+        </w:rPr>
+        <w:t xml:space="preserve">REQUEST FOR ADMISSION NO. 134:  </w:t>
+      </w:r>
+      <w:r>
+        <w:rPr>
+          <w:bCs/>
+        </w:rPr>
+        <w:t>Admit that You do not contend that Jie Hu lacks standing to assert a claim under The Policy arising from The Claim.</w:t>
+      </w:r>
+    </w:p>
+    <w:p>
+      <w:pPr>
+        <w:keepLines/>
+        <w:spacing w:after="160"/>
+        <w:ind w:left="720" w:hanging="576"/>
+      </w:pPr>
+      <w:r>
+        <w:rPr>
+          <w:b/>
+          <w:bCs/>
+        </w:rPr>
+        <w:t xml:space="preserve">REQUEST FOR ADMISSION NO. 135:  </w:t>
+      </w:r>
+      <w:r>
+        <w:rPr>
+          <w:bCs/>
+        </w:rPr>
+        <w:t>Admit that You do not contend that Jie Hu is not a proper party plaintiff in this action.</w:t>
       </w:r>
     </w:p>
     <w:p>
@@ -4358,48 +4202,101 @@
           <w:i/>
           <w:iCs/>
         </w:rPr>
-        <w:t>P.  The October 21, 2025 reply and the handling of post-appraisal correspondence</w:t>
-      </w:r>
-    </w:p>
-    <w:p>
-      <w:pPr>
-        <w:keepLines/>
-        <w:spacing w:after="160"/>
-        <w:ind w:left="720" w:hanging="576"/>
-      </w:pPr>
-      <w:r>
-        <w:rPr>
-          <w:b/>
-          <w:bCs/>
-        </w:rPr>
-        <w:t xml:space="preserve">REQUEST FOR ADMISSION NO. 155:  </w:t>
-      </w:r>
-      <w:r>
-        <w:rPr>
-          <w:bCs/>
-        </w:rPr>
-        <w:t>Admit that Your October 21, 2025 electronic mail message to Plaintiffs was signed by Jillian Bell, Senior General Claims Adjuster, Fire Insurance Exchange.</w:t>
-      </w:r>
-    </w:p>
-    <w:p>
-      <w:pPr>
-        <w:keepLines/>
-        <w:spacing w:after="160"/>
-        <w:ind w:left="720" w:hanging="576"/>
-      </w:pPr>
-      <w:r>
-        <w:rPr>
-          <w:b/>
-          <w:bCs/>
-        </w:rPr>
-        <w:lastRenderedPageBreak/>
-        <w:t xml:space="preserve">REQUEST FOR ADMISSION NO. 156:  </w:t>
-      </w:r>
-      <w:r>
-        <w:rPr>
-          <w:bCs/>
-        </w:rPr>
-        <w:t>Admit that Jillian Bell was employed or engaged by Fire Insurance Exchange on October 21, 2025.</w:t>
+        <w:t>T.  The September 24, 2025 message and its signer</w:t>
+      </w:r>
+    </w:p>
+    <w:p>
+      <w:pPr>
+        <w:keepNext/>
+        <w:keepLines/>
+        <w:spacing w:after="160" w:line="276" w:lineRule="auto"/>
+        <w:ind w:left="720"/>
+      </w:pPr>
+      <w:r>
+        <w:rPr>
+          <w:iCs/>
+        </w:rPr>
+        <w:t>Requests 136 through 139 concern Your September 24, 2025 electronic mail message to Plaintiff Yibiao Lu.</w:t>
+      </w:r>
+    </w:p>
+    <w:p>
+      <w:pPr>
+        <w:keepLines/>
+        <w:spacing w:after="160"/>
+        <w:ind w:left="720" w:hanging="576"/>
+      </w:pPr>
+      <w:r>
+        <w:rPr>
+          <w:b/>
+          <w:bCs/>
+        </w:rPr>
+        <w:t xml:space="preserve">REQUEST FOR ADMISSION NO. 136:  </w:t>
+      </w:r>
+      <w:r>
+        <w:rPr>
+          <w:bCs/>
+        </w:rPr>
+        <w:t>Admit that Your September 24, 2025 electronic mail message to Plaintiff Yibiao Lu was signed by Twonda Miller, Senior General Claims Adjuster, Fire Insurance Exchange.</w:t>
+      </w:r>
+    </w:p>
+    <w:p>
+      <w:pPr>
+        <w:keepLines/>
+        <w:spacing w:after="160"/>
+        <w:ind w:left="720" w:hanging="576"/>
+      </w:pPr>
+      <w:r>
+        <w:rPr>
+          <w:b/>
+          <w:bCs/>
+        </w:rPr>
+        <w:t xml:space="preserve">REQUEST FOR ADMISSION NO. 137:  </w:t>
+      </w:r>
+      <w:r>
+        <w:rPr>
+          <w:bCs/>
+        </w:rPr>
+        <w:t>Admit that Twonda Miller acted on behalf of Fire Insurance Exchange in handling The Claim.</w:t>
+      </w:r>
+    </w:p>
+    <w:p>
+      <w:pPr>
+        <w:keepLines/>
+        <w:spacing w:after="160"/>
+        <w:ind w:left="720" w:hanging="576"/>
+      </w:pPr>
+      <w:r>
+        <w:rPr>
+          <w:b/>
+          <w:bCs/>
+        </w:rPr>
+        <w:t xml:space="preserve">REQUEST FOR ADMISSION NO. 138:  </w:t>
+      </w:r>
+      <w:r>
+        <w:rPr>
+          <w:bCs/>
+        </w:rPr>
+        <w:t>Admit that Your September 24, 2025 electronic mail message to Plaintiff Yibiao Lu stated, "Unfortunately, the umpire did not provide a report or estimate."</w:t>
+      </w:r>
+    </w:p>
+    <w:p>
+      <w:pPr>
+        <w:keepLines/>
+        <w:spacing w:after="160"/>
+        <w:ind w:left="720" w:hanging="576"/>
+      </w:pPr>
+      <w:r>
+        <w:rPr>
+          <w:b/>
+          <w:bCs/>
+        </w:rPr>
+        <w:t xml:space="preserve">REQUEST FOR ADMISSION NO. 139:  </w:t>
+      </w:r>
+      <w:r>
+        <w:rPr>
+          <w:bCs/>
+        </w:rPr>
+        <w:t>Admit that Your September 24, 2025 electronic mail message to Plaintiff Yibiao Lu stated, "Our only recommendation is to refer you to your appraiser for any additional details he may have in his file."</w:t>
       </w:r>
     </w:p>
     <w:p>
@@ -4415,183 +4312,8 @@
           <w:i/>
           <w:iCs/>
         </w:rPr>
-        <w:t>Q.  Party identity, agency, and the Hancock inspector</w:t>
-      </w:r>
-    </w:p>
-    <w:p>
-      <w:pPr>
-        <w:keepLines/>
-        <w:spacing w:after="160"/>
-        <w:ind w:left="720" w:hanging="576"/>
-      </w:pPr>
-      <w:r>
-        <w:rPr>
-          <w:b/>
-          <w:bCs/>
-        </w:rPr>
-        <w:t xml:space="preserve">REQUEST FOR ADMISSION NO. 157:  </w:t>
-      </w:r>
-      <w:r>
-        <w:rPr>
-          <w:bCs/>
-        </w:rPr>
-        <w:t>Admit that You do not contend that any person should be the defendant in this action in place of Fire Insurance Exchange.</w:t>
-      </w:r>
-    </w:p>
-    <w:p>
-      <w:pPr>
-        <w:keepLines/>
-        <w:spacing w:after="160"/>
-        <w:ind w:left="720" w:hanging="576"/>
-      </w:pPr>
-      <w:r>
-        <w:rPr>
-          <w:b/>
-          <w:bCs/>
-        </w:rPr>
-        <w:t xml:space="preserve">REQUEST FOR ADMISSION NO. 158:  </w:t>
-      </w:r>
-      <w:r>
-        <w:rPr>
-          <w:bCs/>
-        </w:rPr>
-        <w:t>Admit that You do not contend that any person must be added as a defendant in this action.</w:t>
-      </w:r>
-    </w:p>
-    <w:p>
-      <w:pPr>
-        <w:keepLines/>
-        <w:spacing w:after="160"/>
-        <w:ind w:left="720" w:hanging="576"/>
-      </w:pPr>
-      <w:r>
-        <w:rPr>
-          <w:b/>
-          <w:bCs/>
-        </w:rPr>
-        <w:t xml:space="preserve">REQUEST FOR ADMISSION NO. 159:  </w:t>
-      </w:r>
-      <w:r>
-        <w:rPr>
-          <w:bCs/>
-        </w:rPr>
-        <w:t>Admit that You do not contend that Fire Insurance Exchange is misnamed or misdescribed in the caption of this action.</w:t>
-      </w:r>
-    </w:p>
-    <w:p>
-      <w:pPr>
-        <w:keepLines/>
-        <w:spacing w:after="160"/>
-        <w:ind w:left="720" w:hanging="576"/>
-      </w:pPr>
-      <w:r>
-        <w:rPr>
-          <w:b/>
-          <w:bCs/>
-        </w:rPr>
-        <w:t xml:space="preserve">REQUEST FOR ADMISSION NO. 160:  </w:t>
-      </w:r>
-      <w:r>
-        <w:rPr>
-          <w:bCs/>
-        </w:rPr>
-        <w:t>Admit that, in its dealings with Plaintiffs concerning The Policy and The Claim, Fire Insurance Exchange did business under the name "Farmers Insurance."</w:t>
-      </w:r>
-    </w:p>
-    <w:p>
-      <w:pPr>
-        <w:keepLines/>
-        <w:spacing w:after="160"/>
-        <w:ind w:left="720" w:hanging="576"/>
-      </w:pPr>
-      <w:r>
-        <w:rPr>
-          <w:b/>
-          <w:bCs/>
-        </w:rPr>
-        <w:t xml:space="preserve">REQUEST FOR ADMISSION NO. 161:  </w:t>
-      </w:r>
-      <w:r>
-        <w:rPr>
-          <w:bCs/>
-        </w:rPr>
-        <w:t>Admit that Zorphlon Miller was employed or engaged by Fire Insurance Exchange on October 10, 2025.</w:t>
-      </w:r>
-    </w:p>
-    <w:p>
-      <w:pPr>
-        <w:keepLines/>
-        <w:spacing w:after="160"/>
-        <w:ind w:left="720" w:hanging="576"/>
-      </w:pPr>
-      <w:r>
-        <w:rPr>
-          <w:b/>
-          <w:bCs/>
-        </w:rPr>
-        <w:t xml:space="preserve">REQUEST FOR ADMISSION NO. 162:  </w:t>
-      </w:r>
-      <w:r>
-        <w:rPr>
-          <w:bCs/>
-        </w:rPr>
-        <w:t>Admit that Peter Pietila acted as Your agent in connection with The Policy.</w:t>
-      </w:r>
-    </w:p>
-    <w:p>
-      <w:pPr>
-        <w:keepLines/>
-        <w:spacing w:after="160"/>
-        <w:ind w:left="720" w:hanging="576"/>
-      </w:pPr>
-      <w:r>
-        <w:rPr>
-          <w:b/>
-          <w:bCs/>
-        </w:rPr>
-        <w:t xml:space="preserve">REQUEST FOR ADMISSION NO. 163:  </w:t>
-      </w:r>
-      <w:r>
-        <w:rPr>
-          <w:bCs/>
-        </w:rPr>
-        <w:t>Admit that Jayden Grimm performed the August 29, 2024 inspection of The Property on behalf of Hancock Claims Consultants.</w:t>
-      </w:r>
-    </w:p>
-    <w:p>
-      <w:pPr>
-        <w:keepLines/>
-        <w:spacing w:after="160"/>
-        <w:ind w:left="720" w:hanging="576"/>
-      </w:pPr>
-      <w:r>
-        <w:rPr>
-          <w:b/>
-          <w:bCs/>
-        </w:rPr>
-        <w:t xml:space="preserve">REQUEST FOR ADMISSION NO. 164:  </w:t>
-      </w:r>
-      <w:r>
-        <w:rPr>
-          <w:bCs/>
-        </w:rPr>
-        <w:t>Admit that Jayden Grimm was the only individual who inspected The Property on behalf of Hancock Claims Consultants on August 29, 2024.</w:t>
-      </w:r>
-    </w:p>
-    <w:p>
-      <w:pPr>
-        <w:keepNext/>
-        <w:keepLines/>
-        <w:spacing w:before="200" w:after="120"/>
-      </w:pPr>
-      <w:r>
-        <w:rPr>
-          <w:b/>
-          <w:bCs/>
-          <w:i/>
-          <w:iCs/>
-        </w:rPr>
-        <w:t>R.  The Policy's own provisions bearing on capacity, suit, and forum</w:t>
+        <w:lastRenderedPageBreak/>
+        <w:t>U.  The October 7, 2025 request for Nicholas Brau’s inspection report or notes</w:t>
       </w:r>
     </w:p>
     <w:p>
@@ -4605,523 +4327,21 @@
         <w:rPr>
           <w:iCs/>
         </w:rPr>
-        <w:t>Relevant to Defendant's First Affirmative Defense, which alleges "there exists a lack of jurisdiction over Defendant FIE."</w:t>
-      </w:r>
-    </w:p>
-    <w:p>
-      <w:pPr>
-        <w:keepLines/>
-        <w:spacing w:after="160"/>
-        <w:ind w:left="720" w:hanging="576"/>
-      </w:pPr>
-      <w:r>
-        <w:rPr>
-          <w:b/>
-          <w:bCs/>
-        </w:rPr>
-        <w:t xml:space="preserve">REQUEST FOR ADMISSION NO. 165:  </w:t>
-      </w:r>
-      <w:r>
-        <w:rPr>
-          <w:bCs/>
-        </w:rPr>
-        <w:t>Admit that The Policy Form, at "General Conditions Applying to The Entire Policy," provision 15 ("Reciprocal provisions"), states: "We may sue or be sued in our own name, as though we were an individual, if necessary to enforce any claims which arise under this policy."</w:t>
-      </w:r>
-    </w:p>
-    <w:p>
-      <w:pPr>
-        <w:keepLines/>
-        <w:spacing w:after="160"/>
-        <w:ind w:left="720" w:hanging="576"/>
-      </w:pPr>
-      <w:r>
-        <w:rPr>
-          <w:b/>
-          <w:bCs/>
-        </w:rPr>
-        <w:t xml:space="preserve">REQUEST FOR ADMISSION NO. 166:  </w:t>
-      </w:r>
-      <w:r>
-        <w:rPr>
-          <w:bCs/>
-        </w:rPr>
-        <w:t>Admit that The Policy Form, at "General Conditions Applying to The Entire Policy," provision 11 ("What law will apply"), states: "The laws of the state where the residence premises is located shall govern any and all claims or disputes in any way related to this policy."</w:t>
-      </w:r>
-    </w:p>
-    <w:p>
-      <w:pPr>
-        <w:keepLines/>
-        <w:spacing w:after="160"/>
-        <w:ind w:left="720" w:hanging="576"/>
-      </w:pPr>
-      <w:r>
-        <w:rPr>
-          <w:b/>
-          <w:bCs/>
-        </w:rPr>
-        <w:t xml:space="preserve">REQUEST FOR ADMISSION NO. 167:  </w:t>
-      </w:r>
-      <w:r>
-        <w:rPr>
-          <w:bCs/>
-        </w:rPr>
-        <w:t>Admit that the text of The Policy Form in force on July 13, 2024 is identical to the text of Form 56-5543 2nd Edition (7-08) included in the "Home Insurance New Policy" documents for The Policy that You sent to Plaintiff Yibiao Lu under a cover letter dated December 8, 2014.</w:t>
-      </w:r>
-    </w:p>
-    <w:p>
-      <w:pPr>
-        <w:keepLines/>
-        <w:spacing w:after="160"/>
-        <w:ind w:left="720" w:hanging="576"/>
-      </w:pPr>
-      <w:r>
-        <w:rPr>
-          <w:b/>
-          <w:bCs/>
-        </w:rPr>
-        <w:lastRenderedPageBreak/>
-        <w:t xml:space="preserve">REQUEST FOR ADMISSION NO. 168:  </w:t>
-      </w:r>
-      <w:r>
-        <w:rPr>
-          <w:bCs/>
-        </w:rPr>
-        <w:t>Admit that the homeowner's policy form in force for The Policy on July 13, 2024 was Farmers Next Generation Homeowners Policy Minnesota, Form 56-5543 2nd Edition.</w:t>
-      </w:r>
-    </w:p>
-    <w:p>
-      <w:pPr>
-        <w:keepLines/>
-        <w:spacing w:after="160"/>
-        <w:ind w:left="720" w:hanging="576"/>
-      </w:pPr>
-      <w:r>
-        <w:rPr>
-          <w:b/>
-          <w:bCs/>
-        </w:rPr>
-        <w:t xml:space="preserve">REQUEST FOR ADMISSION NO. 169:  </w:t>
-      </w:r>
-      <w:r>
-        <w:rPr>
-          <w:bCs/>
-        </w:rPr>
-        <w:t>Admit that the "Subscription Agreement Notice" included in Your renewal documents for The Policy for the policy period October 22, 2023 to October 22, 2024 designates Fire Underwriters Association as attorney-in-fact.</w:t>
-      </w:r>
-    </w:p>
-    <w:p>
-      <w:pPr>
-        <w:keepNext/>
-        <w:keepLines/>
-        <w:spacing w:before="200" w:after="120"/>
-      </w:pPr>
-      <w:r>
-        <w:rPr>
-          <w:b/>
-          <w:bCs/>
-          <w:i/>
-          <w:iCs/>
-        </w:rPr>
-        <w:t>S.  Service of process and jurisdiction</w:t>
-      </w:r>
-    </w:p>
-    <w:p>
-      <w:pPr>
-        <w:keepNext/>
-        <w:keepLines/>
-        <w:spacing w:after="160" w:line="276" w:lineRule="auto"/>
-        <w:ind w:left="720"/>
-      </w:pPr>
-      <w:r>
-        <w:rPr>
-          <w:iCs/>
-        </w:rPr>
-        <w:t>Relevant to Defendant's First Affirmative Defense, which alleges "there exists a lack of jurisdiction over Defendant FIE."</w:t>
-      </w:r>
-    </w:p>
-    <w:p>
-      <w:pPr>
-        <w:keepLines/>
-        <w:spacing w:after="160"/>
-        <w:ind w:left="720" w:hanging="576"/>
-      </w:pPr>
-      <w:r>
-        <w:rPr>
-          <w:b/>
-          <w:bCs/>
-        </w:rPr>
-        <w:t xml:space="preserve">REQUEST FOR ADMISSION NO. 170:  </w:t>
-      </w:r>
-      <w:r>
-        <w:rPr>
-          <w:bCs/>
-        </w:rPr>
-        <w:t>Admit that You received the Summons and Complaint in this action on or before July 8, 2026.</w:t>
-      </w:r>
-    </w:p>
-    <w:p>
-      <w:pPr>
-        <w:keepLines/>
-        <w:spacing w:after="160"/>
-        <w:ind w:left="720" w:hanging="576"/>
-      </w:pPr>
-      <w:r>
-        <w:rPr>
-          <w:b/>
-          <w:bCs/>
-        </w:rPr>
-        <w:t xml:space="preserve">REQUEST FOR ADMISSION NO. 171:  </w:t>
-      </w:r>
-      <w:r>
-        <w:rPr>
-          <w:bCs/>
-        </w:rPr>
-        <w:t>Admit that service of the Summons and Complaint in this action upon Fire Insurance Exchange under Minn. Stat. § 45.028 was effective no later than July 8, 2026.</w:t>
-      </w:r>
-    </w:p>
-    <w:p>
-      <w:pPr>
-        <w:keepLines/>
-        <w:spacing w:after="160"/>
-        <w:ind w:left="720" w:hanging="576"/>
-      </w:pPr>
-      <w:r>
-        <w:rPr>
-          <w:b/>
-          <w:bCs/>
-        </w:rPr>
-        <w:t xml:space="preserve">REQUEST FOR ADMISSION NO. 172:  </w:t>
-      </w:r>
-      <w:r>
-        <w:rPr>
-          <w:bCs/>
-        </w:rPr>
-        <w:t>Admit that You do not contend that service of the Summons and Complaint upon Fire Insurance Exchange was insufficient.</w:t>
-      </w:r>
-    </w:p>
-    <w:p>
-      <w:pPr>
-        <w:keepLines/>
-        <w:spacing w:after="160"/>
-        <w:ind w:left="720" w:hanging="576"/>
-      </w:pPr>
-      <w:r>
-        <w:rPr>
-          <w:b/>
-          <w:bCs/>
-        </w:rPr>
-        <w:t xml:space="preserve">REQUEST FOR ADMISSION NO. 173:  </w:t>
-      </w:r>
-      <w:r>
-        <w:rPr>
-          <w:bCs/>
-        </w:rPr>
-        <w:t>Admit that You do not contend that this Court lacks personal jurisdiction over Fire Insurance Exchange.</w:t>
-      </w:r>
-    </w:p>
-    <w:p>
-      <w:pPr>
-        <w:keepNext/>
-        <w:keepLines/>
-        <w:spacing w:before="200" w:after="120"/>
-      </w:pPr>
-      <w:r>
-        <w:rPr>
-          <w:b/>
-          <w:bCs/>
-          <w:i/>
-          <w:iCs/>
-        </w:rPr>
-        <w:t>T.  Plaintiff Jie Hu's status under The Policy</w:t>
-      </w:r>
-    </w:p>
-    <w:p>
-      <w:pPr>
-        <w:keepNext/>
-        <w:keepLines/>
-        <w:spacing w:after="160" w:line="276" w:lineRule="auto"/>
-        <w:ind w:left="720"/>
-      </w:pPr>
-      <w:r>
-        <w:rPr>
-          <w:iCs/>
-        </w:rPr>
-        <w:t>Relevant to Complaint ¶4, which Defendant's Answer did not admit as to Plaintiff Jie Hu, and to Defendant's First Affirmative Defense.</w:t>
-      </w:r>
-    </w:p>
-    <w:p>
-      <w:pPr>
-        <w:keepLines/>
-        <w:spacing w:after="160"/>
-        <w:ind w:left="720" w:hanging="576"/>
-      </w:pPr>
-      <w:r>
-        <w:rPr>
-          <w:b/>
-          <w:bCs/>
-        </w:rPr>
-        <w:t xml:space="preserve">REQUEST FOR ADMISSION NO. 174:  </w:t>
-      </w:r>
-      <w:r>
-        <w:rPr>
-          <w:bCs/>
-        </w:rPr>
-        <w:t>Admit that The Policy Form, under "Definitions," states: "Throughout this policy, 'you' and 'your' mean the 'named insured' shown in the Declarations or renewal notice and your spouse or registered domestic partner under applicable state law if a resident of the same household with you."</w:t>
-      </w:r>
-    </w:p>
-    <w:p>
-      <w:pPr>
-        <w:keepLines/>
-        <w:spacing w:after="160"/>
-        <w:ind w:left="720" w:hanging="576"/>
-      </w:pPr>
-      <w:r>
-        <w:rPr>
-          <w:b/>
-          <w:bCs/>
-        </w:rPr>
-        <w:t xml:space="preserve">REQUEST FOR ADMISSION NO. 175:  </w:t>
-      </w:r>
-      <w:r>
-        <w:rPr>
-          <w:bCs/>
-        </w:rPr>
-        <w:t>Admit that on July 13, 2024, Jie Hu was the spouse of Yibiao Lu.</w:t>
-      </w:r>
-    </w:p>
-    <w:p>
-      <w:pPr>
-        <w:keepLines/>
-        <w:spacing w:after="160"/>
-        <w:ind w:left="720" w:hanging="576"/>
-      </w:pPr>
-      <w:r>
-        <w:rPr>
-          <w:b/>
-          <w:bCs/>
-        </w:rPr>
-        <w:t xml:space="preserve">REQUEST FOR ADMISSION NO. 176:  </w:t>
-      </w:r>
-      <w:r>
-        <w:rPr>
-          <w:bCs/>
-        </w:rPr>
-        <w:t>Admit that on July 13, 2024, Jie Hu resided at The Property in the same household as Yibiao Lu.</w:t>
-      </w:r>
-    </w:p>
-    <w:p>
-      <w:pPr>
-        <w:keepLines/>
-        <w:spacing w:after="160"/>
-        <w:ind w:left="720" w:hanging="576"/>
-      </w:pPr>
-      <w:r>
-        <w:rPr>
-          <w:b/>
-          <w:bCs/>
-        </w:rPr>
-        <w:t xml:space="preserve">REQUEST FOR ADMISSION NO. 177:  </w:t>
-      </w:r>
-      <w:r>
-        <w:rPr>
-          <w:bCs/>
-        </w:rPr>
-        <w:t>Admit that Jie Hu is an insured under The Policy with respect to The Claim.</w:t>
-      </w:r>
-    </w:p>
-    <w:p>
-      <w:pPr>
-        <w:keepLines/>
-        <w:spacing w:after="160"/>
-        <w:ind w:left="720" w:hanging="576"/>
-      </w:pPr>
-      <w:r>
-        <w:rPr>
-          <w:b/>
-          <w:bCs/>
-        </w:rPr>
-        <w:t xml:space="preserve">REQUEST FOR ADMISSION NO. 178:  </w:t>
-      </w:r>
-      <w:r>
-        <w:rPr>
-          <w:bCs/>
-        </w:rPr>
-        <w:t>Admit that You do not contend that Jie Hu lacks standing to assert a claim under The Policy arising from The Claim.</w:t>
-      </w:r>
-    </w:p>
-    <w:p>
-      <w:pPr>
-        <w:keepLines/>
-        <w:spacing w:after="160"/>
-        <w:ind w:left="720" w:hanging="576"/>
-      </w:pPr>
-      <w:r>
-        <w:rPr>
-          <w:b/>
-          <w:bCs/>
-        </w:rPr>
-        <w:t xml:space="preserve">REQUEST FOR ADMISSION NO. 179:  </w:t>
-      </w:r>
-      <w:r>
-        <w:rPr>
-          <w:bCs/>
-        </w:rPr>
-        <w:t>Admit that You do not contend that Jie Hu is not a proper party plaintiff in this action.</w:t>
-      </w:r>
-    </w:p>
-    <w:p>
-      <w:pPr>
-        <w:keepNext/>
-        <w:keepLines/>
-        <w:spacing w:before="200" w:after="120"/>
-      </w:pPr>
-      <w:r>
-        <w:rPr>
-          <w:b/>
-          <w:bCs/>
-          <w:i/>
-          <w:iCs/>
-        </w:rPr>
-        <w:lastRenderedPageBreak/>
-        <w:t>U.  The September 24, 2025 message and its signer</w:t>
-      </w:r>
-    </w:p>
-    <w:p>
-      <w:pPr>
-        <w:keepNext/>
-        <w:keepLines/>
-        <w:spacing w:after="160" w:line="276" w:lineRule="auto"/>
-        <w:ind w:left="720"/>
-      </w:pPr>
-      <w:r>
-        <w:rPr>
-          <w:iCs/>
-        </w:rPr>
-        <w:t>Requests 180 through 183 concern Your September 24, 2025 electronic mail message to Plaintiff Yibiao Lu.</w:t>
-      </w:r>
-    </w:p>
-    <w:p>
-      <w:pPr>
-        <w:keepLines/>
-        <w:spacing w:after="160"/>
-        <w:ind w:left="720" w:hanging="576"/>
-      </w:pPr>
-      <w:r>
-        <w:rPr>
-          <w:b/>
-          <w:bCs/>
-        </w:rPr>
-        <w:t xml:space="preserve">REQUEST FOR ADMISSION NO. 180:  </w:t>
-      </w:r>
-      <w:r>
-        <w:rPr>
-          <w:bCs/>
-        </w:rPr>
-        <w:t>Admit that Your September 24, 2025 electronic mail message to Plaintiff Yibiao Lu was signed by Twonda Miller, Senior General Claims Adjuster, Fire Insurance Exchange.</w:t>
-      </w:r>
-    </w:p>
-    <w:p>
-      <w:pPr>
-        <w:keepLines/>
-        <w:spacing w:after="160"/>
-        <w:ind w:left="720" w:hanging="576"/>
-      </w:pPr>
-      <w:r>
-        <w:rPr>
-          <w:b/>
-          <w:bCs/>
-        </w:rPr>
-        <w:t xml:space="preserve">REQUEST FOR ADMISSION NO. 181:  </w:t>
-      </w:r>
-      <w:r>
-        <w:rPr>
-          <w:bCs/>
-        </w:rPr>
-        <w:t>Admit that Twonda Miller acted on behalf of Fire Insurance Exchange in handling The Claim.</w:t>
-      </w:r>
-    </w:p>
-    <w:p>
-      <w:pPr>
-        <w:keepLines/>
-        <w:spacing w:after="160"/>
-        <w:ind w:left="720" w:hanging="576"/>
-      </w:pPr>
-      <w:r>
-        <w:rPr>
-          <w:b/>
-          <w:bCs/>
-        </w:rPr>
-        <w:t xml:space="preserve">REQUEST FOR ADMISSION NO. 182:  </w:t>
-      </w:r>
-      <w:r>
-        <w:rPr>
-          <w:bCs/>
-        </w:rPr>
-        <w:t>Admit that Your September 24, 2025 electronic mail message to Plaintiff Yibiao Lu stated, "Unfortunately, the umpire did not provide a report or estimate."</w:t>
-      </w:r>
-    </w:p>
-    <w:p>
-      <w:pPr>
-        <w:keepLines/>
-        <w:spacing w:after="160"/>
-        <w:ind w:left="720" w:hanging="576"/>
-      </w:pPr>
-      <w:r>
-        <w:rPr>
-          <w:b/>
-          <w:bCs/>
-        </w:rPr>
-        <w:t xml:space="preserve">REQUEST FOR ADMISSION NO. 183:  </w:t>
-      </w:r>
-      <w:r>
-        <w:rPr>
-          <w:bCs/>
-        </w:rPr>
-        <w:t>Admit that Your September 24, 2025 electronic mail message to Plaintiff Yibiao Lu stated, "Our only recommendation is to refer you to your appraiser for any additional details he may have in his file."</w:t>
-      </w:r>
-    </w:p>
-    <w:p>
-      <w:pPr>
-        <w:keepNext/>
-        <w:keepLines/>
-        <w:spacing w:before="200" w:after="120"/>
-      </w:pPr>
-      <w:r>
-        <w:rPr>
-          <w:b/>
-          <w:bCs/>
-          <w:i/>
-          <w:iCs/>
-        </w:rPr>
-        <w:t>V.  The October 7, 2025 request for Nicholas Brau’s inspection report or notes</w:t>
-      </w:r>
-    </w:p>
-    <w:p>
-      <w:pPr>
-        <w:keepNext/>
-        <w:keepLines/>
-        <w:spacing w:after="160" w:line="276" w:lineRule="auto"/>
-        <w:ind w:left="720"/>
-      </w:pPr>
-      <w:r>
-        <w:rPr>
-          <w:iCs/>
-        </w:rPr>
-        <w:t>Requests 184 and 185 concern Plaintiff Yibiao Lu’s October 7, 2025 electronic mail message, and are to be read with Requests Nos. 31, 129, and 130.</w:t>
-      </w:r>
-    </w:p>
-    <w:p>
-      <w:pPr>
-        <w:keepLines/>
-        <w:spacing w:after="160"/>
-        <w:ind w:left="720" w:hanging="576"/>
-      </w:pPr>
-      <w:r>
-        <w:rPr>
-          <w:b/>
-          <w:bCs/>
-        </w:rPr>
-        <w:t xml:space="preserve">REQUEST FOR ADMISSION NO. 184:  </w:t>
+        <w:t>Requests 140 and 141 concern Plaintiff Yibiao Lu’s October 7, 2025 electronic mail message, and are to be read with Requests Nos. 31, 85, and 86.</w:t>
+      </w:r>
+    </w:p>
+    <w:p>
+      <w:pPr>
+        <w:keepLines/>
+        <w:spacing w:after="160"/>
+        <w:ind w:left="720" w:hanging="576"/>
+      </w:pPr>
+      <w:r>
+        <w:rPr>
+          <w:b/>
+          <w:bCs/>
+        </w:rPr>
+        <w:t xml:space="preserve">REQUEST FOR ADMISSION NO. 140:  </w:t>
       </w:r>
       <w:r>
         <w:rPr>
@@ -5141,7 +4361,7 @@
           <w:b/>
           <w:bCs/>
         </w:rPr>
-        <w:t xml:space="preserve">REQUEST FOR ADMISSION NO. 185:  </w:t>
+        <w:t xml:space="preserve">REQUEST FOR ADMISSION NO. 141:  </w:t>
       </w:r>
       <w:r>
         <w:rPr>

</xml_diff>

<commit_message>
Served first set of interrogatories update content of 3 RFAs
</commit_message>
<xml_diff>
--- a/Filings/RequestForAdmission/FirstSet/Plaintiffs_First_Set_of_Requests_for_Admission_to_FIE.docx
+++ b/Filings/RequestForAdmission/FirstSet/Plaintiffs_First_Set_of_Requests_for_Admission_to_FIE.docx
@@ -1637,7 +1637,33 @@
         <w:rPr>
           <w:bCs/>
         </w:rPr>
-        <w:t>Admit that during the September 6, 2024 inspection of The Property, Nicholas Brau measured one or more windows at The Property.</w:t>
+        <w:t xml:space="preserve">Admit that during the September 6, </w:t>
+      </w:r>
+      <w:proofErr w:type="gramStart"/>
+      <w:r>
+        <w:rPr>
+          <w:bCs/>
+        </w:rPr>
+        <w:t>2024</w:t>
+      </w:r>
+      <w:proofErr w:type="gramEnd"/>
+      <w:r>
+        <w:rPr>
+          <w:bCs/>
+        </w:rPr>
+        <w:t xml:space="preserve"> inspection of The Property, Nicholas Brau measured </w:t>
+      </w:r>
+      <w:r>
+        <w:rPr>
+          <w:bCs/>
+        </w:rPr>
+        <w:t>multiple</w:t>
+      </w:r>
+      <w:r>
+        <w:rPr>
+          <w:bCs/>
+        </w:rPr>
+        <w:t xml:space="preserve"> windows at The Property.</w:t>
       </w:r>
     </w:p>
     <w:p>
@@ -3188,7 +3214,37 @@
         <w:rPr>
           <w:bCs/>
         </w:rPr>
-        <w:t>Admit that during the September 6, 2024 inspection of The Property, Nicholas Brau made handwritten notes, measurements, or sketches concerning the windows at The Property.</w:t>
+        <w:t xml:space="preserve">Admit that during the September 6, 2024 inspection of The Property, Nicholas Brau made handwritten notes, </w:t>
+      </w:r>
+      <w:r>
+        <w:rPr>
+          <w:bCs/>
+        </w:rPr>
+        <w:t xml:space="preserve">photos, </w:t>
+      </w:r>
+      <w:r>
+        <w:rPr>
+          <w:bCs/>
+        </w:rPr>
+        <w:t>measurements</w:t>
+      </w:r>
+      <w:r>
+        <w:rPr>
+          <w:bCs/>
+        </w:rPr>
+        <w:t>,</w:t>
+      </w:r>
+      <w:r>
+        <w:rPr>
+          <w:bCs/>
+        </w:rPr>
+        <w:t xml:space="preserve"> </w:t>
+      </w:r>
+      <w:r>
+        <w:rPr>
+          <w:bCs/>
+        </w:rPr>
+        <w:t>or sketches concerning the windows at The Property.</w:t>
       </w:r>
     </w:p>
     <w:p>
@@ -3209,7 +3265,33 @@
         <w:rPr>
           <w:bCs/>
         </w:rPr>
-        <w:t>Admit that on October 29, 2025, notes, measurements, or sketches made by Nicholas Brau in connection with the September 6, 2024 inspection of The Property were in Your possession, custody, or control.</w:t>
+        <w:t xml:space="preserve">Admit that on October 29, 2025, notes, </w:t>
+      </w:r>
+      <w:r>
+        <w:rPr>
+          <w:bCs/>
+        </w:rPr>
+        <w:t xml:space="preserve">photos, </w:t>
+      </w:r>
+      <w:r>
+        <w:rPr>
+          <w:bCs/>
+        </w:rPr>
+        <w:t xml:space="preserve">measurements, or sketches made by Nicholas Brau in connection with the September 6, </w:t>
+      </w:r>
+      <w:proofErr w:type="gramStart"/>
+      <w:r>
+        <w:rPr>
+          <w:bCs/>
+        </w:rPr>
+        <w:t>2024</w:t>
+      </w:r>
+      <w:proofErr w:type="gramEnd"/>
+      <w:r>
+        <w:rPr>
+          <w:bCs/>
+        </w:rPr>
+        <w:t xml:space="preserve"> inspection of The Property were in Your possession, custody, or control.</w:t>
       </w:r>
     </w:p>
     <w:p>

</xml_diff>